<commit_message>
The story's people: 13 new characters in the table, their pixel-art portraits and the new looks they need
Co-Authored-By: Claude <noreply@anthropic.com>
Claude-Session: https://claude.ai/code/session_01RpWbq89r71C1p9HP7EcbZ5
</commit_message>
<xml_diff>
--- a/docs/Characters.docx
+++ b/docs/Characters.docx
@@ -2740,6 +2740,3542 @@
         </w:tc>
       </w:tr>
     </w:tbl>
+    <w:p>
+      <w:pPr>
+        <w:pStyle w:val="Heading1"/>
+      </w:pPr>
+      <w:r>
+        <w:t>DANNY CRUZ  (Y)</w:t>
+      </w:r>
+    </w:p>
+    <w:p>
+      <w:r>
+        <w:drawing>
+          <wp:inline xmlns:a="http://schemas.openxmlformats.org/drawingml/2006/main" xmlns:pic="http://schemas.openxmlformats.org/drawingml/2006/picture">
+            <wp:extent cx="1152000" cy="1152000"/>
+            <wp:docPr id="31" name="Picture 31"/>
+            <wp:cNvGraphicFramePr>
+              <a:graphicFrameLocks noChangeAspect="1"/>
+            </wp:cNvGraphicFramePr>
+            <a:graphic>
+              <a:graphicData uri="http://schemas.openxmlformats.org/drawingml/2006/picture">
+                <pic:pic>
+                  <pic:nvPicPr>
+                    <pic:cNvPr id="0" name="danny-calm.png"/>
+                    <pic:cNvPicPr/>
+                  </pic:nvPicPr>
+                  <pic:blipFill>
+                    <a:blip r:embed="rId39"/>
+                    <a:stretch>
+                      <a:fillRect/>
+                    </a:stretch>
+                  </pic:blipFill>
+                  <pic:spPr>
+                    <a:xfrm>
+                      <a:off x="0" y="0"/>
+                      <a:ext cx="1152000" cy="1152000"/>
+                    </a:xfrm>
+                    <a:prstGeom prst="rect"/>
+                  </pic:spPr>
+                </pic:pic>
+              </a:graphicData>
+            </a:graphic>
+          </wp:inline>
+        </w:drawing>
+      </w:r>
+      <w:r>
+        <w:t xml:space="preserve">  </w:t>
+      </w:r>
+      <w:r>
+        <w:drawing>
+          <wp:inline xmlns:a="http://schemas.openxmlformats.org/drawingml/2006/main" xmlns:pic="http://schemas.openxmlformats.org/drawingml/2006/picture">
+            <wp:extent cx="1152000" cy="1152000"/>
+            <wp:docPr id="32" name="Picture 32"/>
+            <wp:cNvGraphicFramePr>
+              <a:graphicFrameLocks noChangeAspect="1"/>
+            </wp:cNvGraphicFramePr>
+            <a:graphic>
+              <a:graphicData uri="http://schemas.openxmlformats.org/drawingml/2006/picture">
+                <pic:pic>
+                  <pic:nvPicPr>
+                    <pic:cNvPr id="0" name="danny-angry.png"/>
+                    <pic:cNvPicPr/>
+                  </pic:nvPicPr>
+                  <pic:blipFill>
+                    <a:blip r:embed="rId40"/>
+                    <a:stretch>
+                      <a:fillRect/>
+                    </a:stretch>
+                  </pic:blipFill>
+                  <pic:spPr>
+                    <a:xfrm>
+                      <a:off x="0" y="0"/>
+                      <a:ext cx="1152000" cy="1152000"/>
+                    </a:xfrm>
+                    <a:prstGeom prst="rect"/>
+                  </pic:spPr>
+                </pic:pic>
+              </a:graphicData>
+            </a:graphic>
+          </wp:inline>
+        </w:drawing>
+      </w:r>
+      <w:r>
+        <w:t xml:space="preserve">  </w:t>
+      </w:r>
+      <w:r>
+        <w:drawing>
+          <wp:inline xmlns:a="http://schemas.openxmlformats.org/drawingml/2006/main" xmlns:pic="http://schemas.openxmlformats.org/drawingml/2006/picture">
+            <wp:extent cx="1152000" cy="1152000"/>
+            <wp:docPr id="33" name="Picture 33"/>
+            <wp:cNvGraphicFramePr>
+              <a:graphicFrameLocks noChangeAspect="1"/>
+            </wp:cNvGraphicFramePr>
+            <a:graphic>
+              <a:graphicData uri="http://schemas.openxmlformats.org/drawingml/2006/picture">
+                <pic:pic>
+                  <pic:nvPicPr>
+                    <pic:cNvPr id="0" name="danny-smile.png"/>
+                    <pic:cNvPicPr/>
+                  </pic:nvPicPr>
+                  <pic:blipFill>
+                    <a:blip r:embed="rId41"/>
+                    <a:stretch>
+                      <a:fillRect/>
+                    </a:stretch>
+                  </pic:blipFill>
+                  <pic:spPr>
+                    <a:xfrm>
+                      <a:off x="0" y="0"/>
+                      <a:ext cx="1152000" cy="1152000"/>
+                    </a:xfrm>
+                    <a:prstGeom prst="rect"/>
+                  </pic:spPr>
+                </pic:pic>
+              </a:graphicData>
+            </a:graphic>
+          </wp:inline>
+        </w:drawing>
+      </w:r>
+      <w:r>
+        <w:t xml:space="preserve">  </w:t>
+      </w:r>
+    </w:p>
+    <w:p>
+      <w:r>
+        <w:rPr>
+          <w:sz w:val="16"/>
+        </w:rPr>
+        <w:t>calm - angry - smiling</w:t>
+      </w:r>
+    </w:p>
+    <w:tbl>
+      <w:tblPr>
+        <w:tblStyle w:val="LightGrid-Accent1"/>
+        <w:tblW w:type="auto" w:w="0"/>
+        <w:tblLook w:firstColumn="1" w:firstRow="1" w:lastColumn="0" w:lastRow="0" w:noHBand="0" w:noVBand="1" w:val="04A0"/>
+      </w:tblPr>
+      <w:tblGrid>
+        <w:gridCol w:w="4320"/>
+        <w:gridCol w:w="4320"/>
+      </w:tblGrid>
+      <w:tr>
+        <w:tc>
+          <w:tcPr>
+            <w:tcW w:type="dxa" w:w="1984"/>
+          </w:tcPr>
+          <w:p>
+            <w:r>
+              <w:t>Who</w:t>
+            </w:r>
+          </w:p>
+        </w:tc>
+        <w:tc>
+          <w:tcPr>
+            <w:tcW w:type="dxa" w:w="7370"/>
+          </w:tcPr>
+          <w:p>
+            <w:r>
+              <w:t>The hero: came to Miravista on the last flight to find his missing brother Mateo; worked the boats up north (Marco calls him "boatman"). Few words, hard to stop.</w:t>
+            </w:r>
+          </w:p>
+        </w:tc>
+      </w:tr>
+      <w:tr>
+        <w:tc>
+          <w:tcPr>
+            <w:tcW w:type="dxa" w:w="1984"/>
+          </w:tcPr>
+          <w:p>
+            <w:r>
+              <w:t>Looks</w:t>
+            </w:r>
+          </w:p>
+        </w:tc>
+        <w:tc>
+          <w:tcPr>
+            <w:tcW w:type="dxa" w:w="7370"/>
+          </w:tcPr>
+          <w:p>
+            <w:r>
+              <w:t>Thirties, a hard face, a buzz cut, a scar on the cheek, a leather jacket over a white T-shirt (his portrait wears the top and hat he has on).</w:t>
+            </w:r>
+          </w:p>
+        </w:tc>
+      </w:tr>
+      <w:tr>
+        <w:tc>
+          <w:tcPr>
+            <w:tcW w:type="dxa" w:w="1984"/>
+          </w:tcPr>
+          <w:p>
+            <w:r>
+              <w:t>Bubble colour</w:t>
+            </w:r>
+          </w:p>
+        </w:tc>
+        <w:tc>
+          <w:tcPr>
+            <w:tcW w:type="dxa" w:w="7370"/>
+          </w:tcPr>
+          <w:p>
+            <w:r>
+              <w:t>#3a7dff</w:t>
+            </w:r>
+          </w:p>
+        </w:tc>
+      </w:tr>
+      <w:tr>
+        <w:tc>
+          <w:tcPr>
+            <w:tcW w:type="dxa" w:w="1984"/>
+          </w:tcPr>
+          <w:p>
+            <w:r>
+              <w:t>In the city</w:t>
+            </w:r>
+          </w:p>
+        </w:tc>
+        <w:tc>
+          <w:tcPr>
+            <w:tcW w:type="dxa" w:w="7370"/>
+          </w:tcPr>
+          <w:p>
+            <w:r>
+              <w:t>shirt #2a2420, trousers #2a3040</w:t>
+            </w:r>
+          </w:p>
+        </w:tc>
+      </w:tr>
+      <w:tr>
+        <w:tc>
+          <w:tcPr>
+            <w:tcW w:type="dxa" w:w="1984"/>
+          </w:tcPr>
+          <w:p>
+            <w:r>
+              <w:t>Portrait recipe</w:t>
+            </w:r>
+          </w:p>
+        </w:tc>
+        <w:tc>
+          <w:tcPr>
+            <w:tcW w:type="dxa" w:w="7370"/>
+          </w:tcPr>
+          <w:p>
+            <w:r>
+              <w:t>skin #c48a60; hair #1e1a1c (buzz); facial hair: none; eyes #3a2618; hat: none; glasses: none; top: leather (#2a2420 / #e8e4dc); extras: scar; mid, broad build</w:t>
+            </w:r>
+          </w:p>
+        </w:tc>
+      </w:tr>
+      <w:tr>
+        <w:tc>
+          <w:tcPr>
+            <w:tcW w:type="dxa" w:w="1984"/>
+          </w:tcPr>
+          <w:p>
+            <w:r>
+              <w:t>Mumble</w:t>
+            </w:r>
+          </w:p>
+        </w:tc>
+        <w:tc>
+          <w:tcPr>
+            <w:tcW w:type="dxa" w:w="7370"/>
+          </w:tcPr>
+          <w:p>
+            <w:r>
+              <w:t>triangle wave, 105-155 Hz, 10 syllables a second, pauses 0.1 s</w:t>
+            </w:r>
+          </w:p>
+        </w:tc>
+      </w:tr>
+    </w:tbl>
+    <w:p>
+      <w:pPr>
+        <w:pStyle w:val="Heading1"/>
+      </w:pPr>
+      <w:r>
+        <w:t>PAPA JOE  (J)</w:t>
+      </w:r>
+    </w:p>
+    <w:p>
+      <w:r>
+        <w:drawing>
+          <wp:inline xmlns:a="http://schemas.openxmlformats.org/drawingml/2006/main" xmlns:pic="http://schemas.openxmlformats.org/drawingml/2006/picture">
+            <wp:extent cx="1152000" cy="1152000"/>
+            <wp:docPr id="34" name="Picture 34"/>
+            <wp:cNvGraphicFramePr>
+              <a:graphicFrameLocks noChangeAspect="1"/>
+            </wp:cNvGraphicFramePr>
+            <a:graphic>
+              <a:graphicData uri="http://schemas.openxmlformats.org/drawingml/2006/picture">
+                <pic:pic>
+                  <pic:nvPicPr>
+                    <pic:cNvPr id="0" name="joe-calm.png"/>
+                    <pic:cNvPicPr/>
+                  </pic:nvPicPr>
+                  <pic:blipFill>
+                    <a:blip r:embed="rId42"/>
+                    <a:stretch>
+                      <a:fillRect/>
+                    </a:stretch>
+                  </pic:blipFill>
+                  <pic:spPr>
+                    <a:xfrm>
+                      <a:off x="0" y="0"/>
+                      <a:ext cx="1152000" cy="1152000"/>
+                    </a:xfrm>
+                    <a:prstGeom prst="rect"/>
+                  </pic:spPr>
+                </pic:pic>
+              </a:graphicData>
+            </a:graphic>
+          </wp:inline>
+        </w:drawing>
+      </w:r>
+      <w:r>
+        <w:t xml:space="preserve">  </w:t>
+      </w:r>
+      <w:r>
+        <w:drawing>
+          <wp:inline xmlns:a="http://schemas.openxmlformats.org/drawingml/2006/main" xmlns:pic="http://schemas.openxmlformats.org/drawingml/2006/picture">
+            <wp:extent cx="1152000" cy="1152000"/>
+            <wp:docPr id="35" name="Picture 35"/>
+            <wp:cNvGraphicFramePr>
+              <a:graphicFrameLocks noChangeAspect="1"/>
+            </wp:cNvGraphicFramePr>
+            <a:graphic>
+              <a:graphicData uri="http://schemas.openxmlformats.org/drawingml/2006/picture">
+                <pic:pic>
+                  <pic:nvPicPr>
+                    <pic:cNvPr id="0" name="joe-angry.png"/>
+                    <pic:cNvPicPr/>
+                  </pic:nvPicPr>
+                  <pic:blipFill>
+                    <a:blip r:embed="rId43"/>
+                    <a:stretch>
+                      <a:fillRect/>
+                    </a:stretch>
+                  </pic:blipFill>
+                  <pic:spPr>
+                    <a:xfrm>
+                      <a:off x="0" y="0"/>
+                      <a:ext cx="1152000" cy="1152000"/>
+                    </a:xfrm>
+                    <a:prstGeom prst="rect"/>
+                  </pic:spPr>
+                </pic:pic>
+              </a:graphicData>
+            </a:graphic>
+          </wp:inline>
+        </w:drawing>
+      </w:r>
+      <w:r>
+        <w:t xml:space="preserve">  </w:t>
+      </w:r>
+      <w:r>
+        <w:drawing>
+          <wp:inline xmlns:a="http://schemas.openxmlformats.org/drawingml/2006/main" xmlns:pic="http://schemas.openxmlformats.org/drawingml/2006/picture">
+            <wp:extent cx="1152000" cy="1152000"/>
+            <wp:docPr id="36" name="Picture 36"/>
+            <wp:cNvGraphicFramePr>
+              <a:graphicFrameLocks noChangeAspect="1"/>
+            </wp:cNvGraphicFramePr>
+            <a:graphic>
+              <a:graphicData uri="http://schemas.openxmlformats.org/drawingml/2006/picture">
+                <pic:pic>
+                  <pic:nvPicPr>
+                    <pic:cNvPr id="0" name="joe-smile.png"/>
+                    <pic:cNvPicPr/>
+                  </pic:nvPicPr>
+                  <pic:blipFill>
+                    <a:blip r:embed="rId44"/>
+                    <a:stretch>
+                      <a:fillRect/>
+                    </a:stretch>
+                  </pic:blipFill>
+                  <pic:spPr>
+                    <a:xfrm>
+                      <a:off x="0" y="0"/>
+                      <a:ext cx="1152000" cy="1152000"/>
+                    </a:xfrm>
+                    <a:prstGeom prst="rect"/>
+                  </pic:spPr>
+                </pic:pic>
+              </a:graphicData>
+            </a:graphic>
+          </wp:inline>
+        </w:drawing>
+      </w:r>
+      <w:r>
+        <w:t xml:space="preserve">  </w:t>
+      </w:r>
+    </w:p>
+    <w:p>
+      <w:r>
+        <w:rPr>
+          <w:sz w:val="16"/>
+        </w:rPr>
+        <w:t>calm - angry - smiling</w:t>
+      </w:r>
+    </w:p>
+    <w:tbl>
+      <w:tblPr>
+        <w:tblStyle w:val="LightGrid-Accent1"/>
+        <w:tblW w:type="auto" w:w="0"/>
+        <w:tblLook w:firstColumn="1" w:firstRow="1" w:lastColumn="0" w:lastRow="0" w:noHBand="0" w:noVBand="1" w:val="04A0"/>
+      </w:tblPr>
+      <w:tblGrid>
+        <w:gridCol w:w="4320"/>
+        <w:gridCol w:w="4320"/>
+      </w:tblGrid>
+      <w:tr>
+        <w:tc>
+          <w:tcPr>
+            <w:tcW w:type="dxa" w:w="1984"/>
+          </w:tcPr>
+          <w:p>
+            <w:r>
+              <w:t>Who</w:t>
+            </w:r>
+          </w:p>
+        </w:tc>
+        <w:tc>
+          <w:tcPr>
+            <w:tcW w:type="dxa" w:w="7370"/>
+          </w:tcPr>
+          <w:p>
+            <w:r>
+              <w:t>The oldest cabbie at the airport, seventy; picks Danny up on the first night, talks too much, knows everyone and gives him his first jobs.</w:t>
+            </w:r>
+          </w:p>
+        </w:tc>
+      </w:tr>
+      <w:tr>
+        <w:tc>
+          <w:tcPr>
+            <w:tcW w:type="dxa" w:w="1984"/>
+          </w:tcPr>
+          <w:p>
+            <w:r>
+              <w:t>Looks</w:t>
+            </w:r>
+          </w:p>
+        </w:tc>
+        <w:tc>
+          <w:tcPr>
+            <w:tcW w:type="dxa" w:w="7370"/>
+          </w:tcPr>
+          <w:p>
+            <w:r>
+              <w:t>Seventy, white hair and a white moustache, a flat cap, a brown cardigan over a cream shirt, reading glasses on a cord, a toothpick.</w:t>
+            </w:r>
+          </w:p>
+        </w:tc>
+      </w:tr>
+      <w:tr>
+        <w:tc>
+          <w:tcPr>
+            <w:tcW w:type="dxa" w:w="1984"/>
+          </w:tcPr>
+          <w:p>
+            <w:r>
+              <w:t>Bubble colour</w:t>
+            </w:r>
+          </w:p>
+        </w:tc>
+        <w:tc>
+          <w:tcPr>
+            <w:tcW w:type="dxa" w:w="7370"/>
+          </w:tcPr>
+          <w:p>
+            <w:r>
+              <w:t>#e6b980</w:t>
+            </w:r>
+          </w:p>
+        </w:tc>
+      </w:tr>
+      <w:tr>
+        <w:tc>
+          <w:tcPr>
+            <w:tcW w:type="dxa" w:w="1984"/>
+          </w:tcPr>
+          <w:p>
+            <w:r>
+              <w:t>In the city</w:t>
+            </w:r>
+          </w:p>
+        </w:tc>
+        <w:tc>
+          <w:tcPr>
+            <w:tcW w:type="dxa" w:w="7370"/>
+          </w:tcPr>
+          <w:p>
+            <w:r>
+              <w:t>shirt #8a5a34, trousers #5a5248</w:t>
+            </w:r>
+          </w:p>
+        </w:tc>
+      </w:tr>
+      <w:tr>
+        <w:tc>
+          <w:tcPr>
+            <w:tcW w:type="dxa" w:w="1984"/>
+          </w:tcPr>
+          <w:p>
+            <w:r>
+              <w:t>Portrait recipe</w:t>
+            </w:r>
+          </w:p>
+        </w:tc>
+        <w:tc>
+          <w:tcPr>
+            <w:tcW w:type="dxa" w:w="7370"/>
+          </w:tcPr>
+          <w:p>
+            <w:r>
+              <w:t>skin #c99a74; hair #eceae4 (sides); facial hair: moustache; eyes #4a3828; hat: flatcap; glasses: reading; top: cardigan (#8a5a34 / #e8e0cc); extras: wrinkles, toothpick; old, slim build</w:t>
+            </w:r>
+          </w:p>
+        </w:tc>
+      </w:tr>
+      <w:tr>
+        <w:tc>
+          <w:tcPr>
+            <w:tcW w:type="dxa" w:w="1984"/>
+          </w:tcPr>
+          <w:p>
+            <w:r>
+              <w:t>Mumble</w:t>
+            </w:r>
+          </w:p>
+        </w:tc>
+        <w:tc>
+          <w:tcPr>
+            <w:tcW w:type="dxa" w:w="7370"/>
+          </w:tcPr>
+          <w:p>
+            <w:r>
+              <w:t>sine wave, 120-210 Hz, 16 syllables a second, pauses 0.03 s</w:t>
+            </w:r>
+          </w:p>
+        </w:tc>
+      </w:tr>
+    </w:tbl>
+    <w:p>
+      <w:pPr>
+        <w:pStyle w:val="Heading1"/>
+      </w:pPr>
+      <w:r>
+        <w:t>ESTHER BLOOM  (E)</w:t>
+      </w:r>
+    </w:p>
+    <w:p>
+      <w:r>
+        <w:drawing>
+          <wp:inline xmlns:a="http://schemas.openxmlformats.org/drawingml/2006/main" xmlns:pic="http://schemas.openxmlformats.org/drawingml/2006/picture">
+            <wp:extent cx="1152000" cy="1152000"/>
+            <wp:docPr id="37" name="Picture 37"/>
+            <wp:cNvGraphicFramePr>
+              <a:graphicFrameLocks noChangeAspect="1"/>
+            </wp:cNvGraphicFramePr>
+            <a:graphic>
+              <a:graphicData uri="http://schemas.openxmlformats.org/drawingml/2006/picture">
+                <pic:pic>
+                  <pic:nvPicPr>
+                    <pic:cNvPr id="0" name="esther-calm.png"/>
+                    <pic:cNvPicPr/>
+                  </pic:nvPicPr>
+                  <pic:blipFill>
+                    <a:blip r:embed="rId45"/>
+                    <a:stretch>
+                      <a:fillRect/>
+                    </a:stretch>
+                  </pic:blipFill>
+                  <pic:spPr>
+                    <a:xfrm>
+                      <a:off x="0" y="0"/>
+                      <a:ext cx="1152000" cy="1152000"/>
+                    </a:xfrm>
+                    <a:prstGeom prst="rect"/>
+                  </pic:spPr>
+                </pic:pic>
+              </a:graphicData>
+            </a:graphic>
+          </wp:inline>
+        </w:drawing>
+      </w:r>
+      <w:r>
+        <w:t xml:space="preserve">  </w:t>
+      </w:r>
+      <w:r>
+        <w:drawing>
+          <wp:inline xmlns:a="http://schemas.openxmlformats.org/drawingml/2006/main" xmlns:pic="http://schemas.openxmlformats.org/drawingml/2006/picture">
+            <wp:extent cx="1152000" cy="1152000"/>
+            <wp:docPr id="38" name="Picture 38"/>
+            <wp:cNvGraphicFramePr>
+              <a:graphicFrameLocks noChangeAspect="1"/>
+            </wp:cNvGraphicFramePr>
+            <a:graphic>
+              <a:graphicData uri="http://schemas.openxmlformats.org/drawingml/2006/picture">
+                <pic:pic>
+                  <pic:nvPicPr>
+                    <pic:cNvPr id="0" name="esther-angry.png"/>
+                    <pic:cNvPicPr/>
+                  </pic:nvPicPr>
+                  <pic:blipFill>
+                    <a:blip r:embed="rId46"/>
+                    <a:stretch>
+                      <a:fillRect/>
+                    </a:stretch>
+                  </pic:blipFill>
+                  <pic:spPr>
+                    <a:xfrm>
+                      <a:off x="0" y="0"/>
+                      <a:ext cx="1152000" cy="1152000"/>
+                    </a:xfrm>
+                    <a:prstGeom prst="rect"/>
+                  </pic:spPr>
+                </pic:pic>
+              </a:graphicData>
+            </a:graphic>
+          </wp:inline>
+        </w:drawing>
+      </w:r>
+      <w:r>
+        <w:t xml:space="preserve">  </w:t>
+      </w:r>
+      <w:r>
+        <w:drawing>
+          <wp:inline xmlns:a="http://schemas.openxmlformats.org/drawingml/2006/main" xmlns:pic="http://schemas.openxmlformats.org/drawingml/2006/picture">
+            <wp:extent cx="1152000" cy="1152000"/>
+            <wp:docPr id="39" name="Picture 39"/>
+            <wp:cNvGraphicFramePr>
+              <a:graphicFrameLocks noChangeAspect="1"/>
+            </wp:cNvGraphicFramePr>
+            <a:graphic>
+              <a:graphicData uri="http://schemas.openxmlformats.org/drawingml/2006/picture">
+                <pic:pic>
+                  <pic:nvPicPr>
+                    <pic:cNvPr id="0" name="esther-smile.png"/>
+                    <pic:cNvPicPr/>
+                  </pic:nvPicPr>
+                  <pic:blipFill>
+                    <a:blip r:embed="rId47"/>
+                    <a:stretch>
+                      <a:fillRect/>
+                    </a:stretch>
+                  </pic:blipFill>
+                  <pic:spPr>
+                    <a:xfrm>
+                      <a:off x="0" y="0"/>
+                      <a:ext cx="1152000" cy="1152000"/>
+                    </a:xfrm>
+                    <a:prstGeom prst="rect"/>
+                  </pic:spPr>
+                </pic:pic>
+              </a:graphicData>
+            </a:graphic>
+          </wp:inline>
+        </w:drawing>
+      </w:r>
+      <w:r>
+        <w:t xml:space="preserve">  </w:t>
+      </w:r>
+    </w:p>
+    <w:p>
+      <w:r>
+        <w:rPr>
+          <w:sz w:val="16"/>
+        </w:rPr>
+        <w:t>calm - angry - smiling</w:t>
+      </w:r>
+    </w:p>
+    <w:tbl>
+      <w:tblPr>
+        <w:tblStyle w:val="LightGrid-Accent1"/>
+        <w:tblW w:type="auto" w:w="0"/>
+        <w:tblLook w:firstColumn="1" w:firstRow="1" w:lastColumn="0" w:lastRow="0" w:noHBand="0" w:noVBand="1" w:val="04A0"/>
+      </w:tblPr>
+      <w:tblGrid>
+        <w:gridCol w:w="4320"/>
+        <w:gridCol w:w="4320"/>
+      </w:tblGrid>
+      <w:tr>
+        <w:tc>
+          <w:tcPr>
+            <w:tcW w:type="dxa" w:w="1984"/>
+          </w:tcPr>
+          <w:p>
+            <w:r>
+              <w:t>Who</w:t>
+            </w:r>
+          </w:p>
+        </w:tc>
+        <w:tc>
+          <w:tcPr>
+            <w:tcW w:type="dxa" w:w="7370"/>
+          </w:tcPr>
+          <w:p>
+            <w:r>
+              <w:t>Owner of the Colony Hotel since the 50s, a sharp old widow who refuses every offer from Crane; gives Danny a room on credit.</w:t>
+            </w:r>
+          </w:p>
+        </w:tc>
+      </w:tr>
+      <w:tr>
+        <w:tc>
+          <w:tcPr>
+            <w:tcW w:type="dxa" w:w="1984"/>
+          </w:tcPr>
+          <w:p>
+            <w:r>
+              <w:t>Looks</w:t>
+            </w:r>
+          </w:p>
+        </w:tc>
+        <w:tc>
+          <w:tcPr>
+            <w:tcW w:type="dxa" w:w="7370"/>
+          </w:tcPr>
+          <w:p>
+            <w:r>
+              <w:t>Seventies, silver hair in a 50s wave, big round sunglasses, pearls, red lipstick, a turquoise dress like the hotel's bands, a cigarette holder.</w:t>
+            </w:r>
+          </w:p>
+        </w:tc>
+      </w:tr>
+      <w:tr>
+        <w:tc>
+          <w:tcPr>
+            <w:tcW w:type="dxa" w:w="1984"/>
+          </w:tcPr>
+          <w:p>
+            <w:r>
+              <w:t>Bubble colour</w:t>
+            </w:r>
+          </w:p>
+        </w:tc>
+        <w:tc>
+          <w:tcPr>
+            <w:tcW w:type="dxa" w:w="7370"/>
+          </w:tcPr>
+          <w:p>
+            <w:r>
+              <w:t>#ff9ad0</w:t>
+            </w:r>
+          </w:p>
+        </w:tc>
+      </w:tr>
+      <w:tr>
+        <w:tc>
+          <w:tcPr>
+            <w:tcW w:type="dxa" w:w="1984"/>
+          </w:tcPr>
+          <w:p>
+            <w:r>
+              <w:t>In the city</w:t>
+            </w:r>
+          </w:p>
+        </w:tc>
+        <w:tc>
+          <w:tcPr>
+            <w:tcW w:type="dxa" w:w="7370"/>
+          </w:tcPr>
+          <w:p>
+            <w:r>
+              <w:t>shirt #2fc4c0, trousers #2fc4c0</w:t>
+            </w:r>
+          </w:p>
+        </w:tc>
+      </w:tr>
+      <w:tr>
+        <w:tc>
+          <w:tcPr>
+            <w:tcW w:type="dxa" w:w="1984"/>
+          </w:tcPr>
+          <w:p>
+            <w:r>
+              <w:t>Portrait recipe</w:t>
+            </w:r>
+          </w:p>
+        </w:tc>
+        <w:tc>
+          <w:tcPr>
+            <w:tcW w:type="dxa" w:w="7370"/>
+          </w:tcPr>
+          <w:p>
+            <w:r>
+              <w:t>skin #e6c2a4; hair #d8d8dc (wave); facial hair: none; eyes #3a4a5a; hat: none; glasses: roundshades; top: dress (#2fc4c0 / #1f9a96); extras: wrinkles, pearls, holder, lipstick; old, slim build</w:t>
+            </w:r>
+          </w:p>
+        </w:tc>
+      </w:tr>
+      <w:tr>
+        <w:tc>
+          <w:tcPr>
+            <w:tcW w:type="dxa" w:w="1984"/>
+          </w:tcPr>
+          <w:p>
+            <w:r>
+              <w:t>Mumble</w:t>
+            </w:r>
+          </w:p>
+        </w:tc>
+        <w:tc>
+          <w:tcPr>
+            <w:tcW w:type="dxa" w:w="7370"/>
+          </w:tcPr>
+          <w:p>
+            <w:r>
+              <w:t>sine wave, 220-330 Hz, 9 syllables a second, pauses 0.16 s</w:t>
+            </w:r>
+          </w:p>
+        </w:tc>
+      </w:tr>
+    </w:tbl>
+    <w:p>
+      <w:pPr>
+        <w:pStyle w:val="Heading1"/>
+      </w:pPr>
+      <w:r>
+        <w:t>VICTOR CRANE  (C)</w:t>
+      </w:r>
+    </w:p>
+    <w:p>
+      <w:r>
+        <w:drawing>
+          <wp:inline xmlns:a="http://schemas.openxmlformats.org/drawingml/2006/main" xmlns:pic="http://schemas.openxmlformats.org/drawingml/2006/picture">
+            <wp:extent cx="1152000" cy="1152000"/>
+            <wp:docPr id="40" name="Picture 40"/>
+            <wp:cNvGraphicFramePr>
+              <a:graphicFrameLocks noChangeAspect="1"/>
+            </wp:cNvGraphicFramePr>
+            <a:graphic>
+              <a:graphicData uri="http://schemas.openxmlformats.org/drawingml/2006/picture">
+                <pic:pic>
+                  <pic:nvPicPr>
+                    <pic:cNvPr id="0" name="crane-calm.png"/>
+                    <pic:cNvPicPr/>
+                  </pic:nvPicPr>
+                  <pic:blipFill>
+                    <a:blip r:embed="rId48"/>
+                    <a:stretch>
+                      <a:fillRect/>
+                    </a:stretch>
+                  </pic:blipFill>
+                  <pic:spPr>
+                    <a:xfrm>
+                      <a:off x="0" y="0"/>
+                      <a:ext cx="1152000" cy="1152000"/>
+                    </a:xfrm>
+                    <a:prstGeom prst="rect"/>
+                  </pic:spPr>
+                </pic:pic>
+              </a:graphicData>
+            </a:graphic>
+          </wp:inline>
+        </w:drawing>
+      </w:r>
+      <w:r>
+        <w:t xml:space="preserve">  </w:t>
+      </w:r>
+      <w:r>
+        <w:drawing>
+          <wp:inline xmlns:a="http://schemas.openxmlformats.org/drawingml/2006/main" xmlns:pic="http://schemas.openxmlformats.org/drawingml/2006/picture">
+            <wp:extent cx="1152000" cy="1152000"/>
+            <wp:docPr id="41" name="Picture 41"/>
+            <wp:cNvGraphicFramePr>
+              <a:graphicFrameLocks noChangeAspect="1"/>
+            </wp:cNvGraphicFramePr>
+            <a:graphic>
+              <a:graphicData uri="http://schemas.openxmlformats.org/drawingml/2006/picture">
+                <pic:pic>
+                  <pic:nvPicPr>
+                    <pic:cNvPr id="0" name="crane-angry.png"/>
+                    <pic:cNvPicPr/>
+                  </pic:nvPicPr>
+                  <pic:blipFill>
+                    <a:blip r:embed="rId49"/>
+                    <a:stretch>
+                      <a:fillRect/>
+                    </a:stretch>
+                  </pic:blipFill>
+                  <pic:spPr>
+                    <a:xfrm>
+                      <a:off x="0" y="0"/>
+                      <a:ext cx="1152000" cy="1152000"/>
+                    </a:xfrm>
+                    <a:prstGeom prst="rect"/>
+                  </pic:spPr>
+                </pic:pic>
+              </a:graphicData>
+            </a:graphic>
+          </wp:inline>
+        </w:drawing>
+      </w:r>
+      <w:r>
+        <w:t xml:space="preserve">  </w:t>
+      </w:r>
+      <w:r>
+        <w:drawing>
+          <wp:inline xmlns:a="http://schemas.openxmlformats.org/drawingml/2006/main" xmlns:pic="http://schemas.openxmlformats.org/drawingml/2006/picture">
+            <wp:extent cx="1152000" cy="1152000"/>
+            <wp:docPr id="42" name="Picture 42"/>
+            <wp:cNvGraphicFramePr>
+              <a:graphicFrameLocks noChangeAspect="1"/>
+            </wp:cNvGraphicFramePr>
+            <a:graphic>
+              <a:graphicData uri="http://schemas.openxmlformats.org/drawingml/2006/picture">
+                <pic:pic>
+                  <pic:nvPicPr>
+                    <pic:cNvPr id="0" name="crane-smile.png"/>
+                    <pic:cNvPicPr/>
+                  </pic:nvPicPr>
+                  <pic:blipFill>
+                    <a:blip r:embed="rId50"/>
+                    <a:stretch>
+                      <a:fillRect/>
+                    </a:stretch>
+                  </pic:blipFill>
+                  <pic:spPr>
+                    <a:xfrm>
+                      <a:off x="0" y="0"/>
+                      <a:ext cx="1152000" cy="1152000"/>
+                    </a:xfrm>
+                    <a:prstGeom prst="rect"/>
+                  </pic:spPr>
+                </pic:pic>
+              </a:graphicData>
+            </a:graphic>
+          </wp:inline>
+        </w:drawing>
+      </w:r>
+      <w:r>
+        <w:t xml:space="preserve">  </w:t>
+      </w:r>
+    </w:p>
+    <w:p>
+      <w:r>
+        <w:rPr>
+          <w:sz w:val="16"/>
+        </w:rPr>
+        <w:t>calm - angry - smiling</w:t>
+      </w:r>
+    </w:p>
+    <w:tbl>
+      <w:tblPr>
+        <w:tblStyle w:val="LightGrid-Accent1"/>
+        <w:tblW w:type="auto" w:w="0"/>
+        <w:tblLook w:firstColumn="1" w:firstRow="1" w:lastColumn="0" w:lastRow="0" w:noHBand="0" w:noVBand="1" w:val="04A0"/>
+      </w:tblPr>
+      <w:tblGrid>
+        <w:gridCol w:w="4320"/>
+        <w:gridCol w:w="4320"/>
+      </w:tblGrid>
+      <w:tr>
+        <w:tc>
+          <w:tcPr>
+            <w:tcW w:type="dxa" w:w="1984"/>
+          </w:tcPr>
+          <w:p>
+            <w:r>
+              <w:t>Who</w:t>
+            </w:r>
+          </w:p>
+        </w:tc>
+        <w:tc>
+          <w:tcPr>
+            <w:tcW w:type="dxa" w:w="7370"/>
+          </w:tcPr>
+          <w:p>
+            <w:r>
+              <w:t>Crane Development - his name is on every crane in Miravista; running for mayor. Smiles on every billboard; the street knows better.</w:t>
+            </w:r>
+          </w:p>
+        </w:tc>
+      </w:tr>
+      <w:tr>
+        <w:tc>
+          <w:tcPr>
+            <w:tcW w:type="dxa" w:w="1984"/>
+          </w:tcPr>
+          <w:p>
+            <w:r>
+              <w:t>Looks</w:t>
+            </w:r>
+          </w:p>
+        </w:tc>
+        <w:tc>
+          <w:tcPr>
+            <w:tcW w:type="dxa" w:w="7370"/>
+          </w:tcPr>
+          <w:p>
+            <w:r>
+              <w:t>Fifties, silver hair swept back, a deep tan, a white linen suit over a pale blue shirt, a gold watch.</w:t>
+            </w:r>
+          </w:p>
+        </w:tc>
+      </w:tr>
+      <w:tr>
+        <w:tc>
+          <w:tcPr>
+            <w:tcW w:type="dxa" w:w="1984"/>
+          </w:tcPr>
+          <w:p>
+            <w:r>
+              <w:t>Bubble colour</w:t>
+            </w:r>
+          </w:p>
+        </w:tc>
+        <w:tc>
+          <w:tcPr>
+            <w:tcW w:type="dxa" w:w="7370"/>
+          </w:tcPr>
+          <w:p>
+            <w:r>
+              <w:t>#f4f0e6</w:t>
+            </w:r>
+          </w:p>
+        </w:tc>
+      </w:tr>
+      <w:tr>
+        <w:tc>
+          <w:tcPr>
+            <w:tcW w:type="dxa" w:w="1984"/>
+          </w:tcPr>
+          <w:p>
+            <w:r>
+              <w:t>In the city</w:t>
+            </w:r>
+          </w:p>
+        </w:tc>
+        <w:tc>
+          <w:tcPr>
+            <w:tcW w:type="dxa" w:w="7370"/>
+          </w:tcPr>
+          <w:p>
+            <w:r>
+              <w:t>shirt #f2efe6, trousers #f2efe6</w:t>
+            </w:r>
+          </w:p>
+        </w:tc>
+      </w:tr>
+      <w:tr>
+        <w:tc>
+          <w:tcPr>
+            <w:tcW w:type="dxa" w:w="1984"/>
+          </w:tcPr>
+          <w:p>
+            <w:r>
+              <w:t>Portrait recipe</w:t>
+            </w:r>
+          </w:p>
+        </w:tc>
+        <w:tc>
+          <w:tcPr>
+            <w:tcW w:type="dxa" w:w="7370"/>
+          </w:tcPr>
+          <w:p>
+            <w:r>
+              <w:t>skin #b07a4e; hair #d0d0d4 (slick); facial hair: none; eyes #5a7080; hat: none; glasses: none; top: suit (#f2efe6 / #cfe0f0); extras: none; old, normal build</w:t>
+            </w:r>
+          </w:p>
+        </w:tc>
+      </w:tr>
+      <w:tr>
+        <w:tc>
+          <w:tcPr>
+            <w:tcW w:type="dxa" w:w="1984"/>
+          </w:tcPr>
+          <w:p>
+            <w:r>
+              <w:t>Mumble</w:t>
+            </w:r>
+          </w:p>
+        </w:tc>
+        <w:tc>
+          <w:tcPr>
+            <w:tcW w:type="dxa" w:w="7370"/>
+          </w:tcPr>
+          <w:p>
+            <w:r>
+              <w:t>sine wave, 100-150 Hz, 7 syllables a second, pauses 0.2 s</w:t>
+            </w:r>
+          </w:p>
+        </w:tc>
+      </w:tr>
+    </w:tbl>
+    <w:p>
+      <w:pPr>
+        <w:pStyle w:val="Heading1"/>
+      </w:pPr>
+      <w:r>
+        <w:t>MATEO CRUZ  (Z)</w:t>
+      </w:r>
+    </w:p>
+    <w:p>
+      <w:r>
+        <w:drawing>
+          <wp:inline xmlns:a="http://schemas.openxmlformats.org/drawingml/2006/main" xmlns:pic="http://schemas.openxmlformats.org/drawingml/2006/picture">
+            <wp:extent cx="1152000" cy="1152000"/>
+            <wp:docPr id="43" name="Picture 43"/>
+            <wp:cNvGraphicFramePr>
+              <a:graphicFrameLocks noChangeAspect="1"/>
+            </wp:cNvGraphicFramePr>
+            <a:graphic>
+              <a:graphicData uri="http://schemas.openxmlformats.org/drawingml/2006/picture">
+                <pic:pic>
+                  <pic:nvPicPr>
+                    <pic:cNvPr id="0" name="mateo-calm.png"/>
+                    <pic:cNvPicPr/>
+                  </pic:nvPicPr>
+                  <pic:blipFill>
+                    <a:blip r:embed="rId51"/>
+                    <a:stretch>
+                      <a:fillRect/>
+                    </a:stretch>
+                  </pic:blipFill>
+                  <pic:spPr>
+                    <a:xfrm>
+                      <a:off x="0" y="0"/>
+                      <a:ext cx="1152000" cy="1152000"/>
+                    </a:xfrm>
+                    <a:prstGeom prst="rect"/>
+                  </pic:spPr>
+                </pic:pic>
+              </a:graphicData>
+            </a:graphic>
+          </wp:inline>
+        </w:drawing>
+      </w:r>
+      <w:r>
+        <w:t xml:space="preserve">  </w:t>
+      </w:r>
+      <w:r>
+        <w:drawing>
+          <wp:inline xmlns:a="http://schemas.openxmlformats.org/drawingml/2006/main" xmlns:pic="http://schemas.openxmlformats.org/drawingml/2006/picture">
+            <wp:extent cx="1152000" cy="1152000"/>
+            <wp:docPr id="44" name="Picture 44"/>
+            <wp:cNvGraphicFramePr>
+              <a:graphicFrameLocks noChangeAspect="1"/>
+            </wp:cNvGraphicFramePr>
+            <a:graphic>
+              <a:graphicData uri="http://schemas.openxmlformats.org/drawingml/2006/picture">
+                <pic:pic>
+                  <pic:nvPicPr>
+                    <pic:cNvPr id="0" name="mateo-angry.png"/>
+                    <pic:cNvPicPr/>
+                  </pic:nvPicPr>
+                  <pic:blipFill>
+                    <a:blip r:embed="rId52"/>
+                    <a:stretch>
+                      <a:fillRect/>
+                    </a:stretch>
+                  </pic:blipFill>
+                  <pic:spPr>
+                    <a:xfrm>
+                      <a:off x="0" y="0"/>
+                      <a:ext cx="1152000" cy="1152000"/>
+                    </a:xfrm>
+                    <a:prstGeom prst="rect"/>
+                  </pic:spPr>
+                </pic:pic>
+              </a:graphicData>
+            </a:graphic>
+          </wp:inline>
+        </w:drawing>
+      </w:r>
+      <w:r>
+        <w:t xml:space="preserve">  </w:t>
+      </w:r>
+      <w:r>
+        <w:drawing>
+          <wp:inline xmlns:a="http://schemas.openxmlformats.org/drawingml/2006/main" xmlns:pic="http://schemas.openxmlformats.org/drawingml/2006/picture">
+            <wp:extent cx="1152000" cy="1152000"/>
+            <wp:docPr id="45" name="Picture 45"/>
+            <wp:cNvGraphicFramePr>
+              <a:graphicFrameLocks noChangeAspect="1"/>
+            </wp:cNvGraphicFramePr>
+            <a:graphic>
+              <a:graphicData uri="http://schemas.openxmlformats.org/drawingml/2006/picture">
+                <pic:pic>
+                  <pic:nvPicPr>
+                    <pic:cNvPr id="0" name="mateo-smile.png"/>
+                    <pic:cNvPicPr/>
+                  </pic:nvPicPr>
+                  <pic:blipFill>
+                    <a:blip r:embed="rId53"/>
+                    <a:stretch>
+                      <a:fillRect/>
+                    </a:stretch>
+                  </pic:blipFill>
+                  <pic:spPr>
+                    <a:xfrm>
+                      <a:off x="0" y="0"/>
+                      <a:ext cx="1152000" cy="1152000"/>
+                    </a:xfrm>
+                    <a:prstGeom prst="rect"/>
+                  </pic:spPr>
+                </pic:pic>
+              </a:graphicData>
+            </a:graphic>
+          </wp:inline>
+        </w:drawing>
+      </w:r>
+      <w:r>
+        <w:t xml:space="preserve">  </w:t>
+      </w:r>
+    </w:p>
+    <w:p>
+      <w:r>
+        <w:rPr>
+          <w:sz w:val="16"/>
+        </w:rPr>
+        <w:t>calm - angry - smiling</w:t>
+      </w:r>
+    </w:p>
+    <w:tbl>
+      <w:tblPr>
+        <w:tblStyle w:val="LightGrid-Accent1"/>
+        <w:tblW w:type="auto" w:w="0"/>
+        <w:tblLook w:firstColumn="1" w:firstRow="1" w:lastColumn="0" w:lastRow="0" w:noHBand="0" w:noVBand="1" w:val="04A0"/>
+      </w:tblPr>
+      <w:tblGrid>
+        <w:gridCol w:w="4320"/>
+        <w:gridCol w:w="4320"/>
+      </w:tblGrid>
+      <w:tr>
+        <w:tc>
+          <w:tcPr>
+            <w:tcW w:type="dxa" w:w="1984"/>
+          </w:tcPr>
+          <w:p>
+            <w:r>
+              <w:t>Who</w:t>
+            </w:r>
+          </w:p>
+        </w:tc>
+        <w:tc>
+          <w:tcPr>
+            <w:tcW w:type="dxa" w:w="7370"/>
+          </w:tcPr>
+          <w:p>
+            <w:r>
+              <w:t>Danny's older brother: Crane's driver and fixer, hiding the proof that could bring Crane down, trying to get out.</w:t>
+            </w:r>
+          </w:p>
+        </w:tc>
+      </w:tr>
+      <w:tr>
+        <w:tc>
+          <w:tcPr>
+            <w:tcW w:type="dxa" w:w="1984"/>
+          </w:tcPr>
+          <w:p>
+            <w:r>
+              <w:t>Looks</w:t>
+            </w:r>
+          </w:p>
+        </w:tc>
+        <w:tc>
+          <w:tcPr>
+            <w:tcW w:type="dxa" w:w="7370"/>
+          </w:tcPr>
+          <w:p>
+            <w:r>
+              <w:t>Like Danny but neat and older: the same jaw, slicked-back hair grey at the temples, a chauffeur's dark suit and cap, tired eyes; no scar.</w:t>
+            </w:r>
+          </w:p>
+        </w:tc>
+      </w:tr>
+      <w:tr>
+        <w:tc>
+          <w:tcPr>
+            <w:tcW w:type="dxa" w:w="1984"/>
+          </w:tcPr>
+          <w:p>
+            <w:r>
+              <w:t>Bubble colour</w:t>
+            </w:r>
+          </w:p>
+        </w:tc>
+        <w:tc>
+          <w:tcPr>
+            <w:tcW w:type="dxa" w:w="7370"/>
+          </w:tcPr>
+          <w:p>
+            <w:r>
+              <w:t>#5ec8ff</w:t>
+            </w:r>
+          </w:p>
+        </w:tc>
+      </w:tr>
+      <w:tr>
+        <w:tc>
+          <w:tcPr>
+            <w:tcW w:type="dxa" w:w="1984"/>
+          </w:tcPr>
+          <w:p>
+            <w:r>
+              <w:t>In the city</w:t>
+            </w:r>
+          </w:p>
+        </w:tc>
+        <w:tc>
+          <w:tcPr>
+            <w:tcW w:type="dxa" w:w="7370"/>
+          </w:tcPr>
+          <w:p>
+            <w:r>
+              <w:t>shirt #1c1e28, trousers #1c1e28</w:t>
+            </w:r>
+          </w:p>
+        </w:tc>
+      </w:tr>
+      <w:tr>
+        <w:tc>
+          <w:tcPr>
+            <w:tcW w:type="dxa" w:w="1984"/>
+          </w:tcPr>
+          <w:p>
+            <w:r>
+              <w:t>Portrait recipe</w:t>
+            </w:r>
+          </w:p>
+        </w:tc>
+        <w:tc>
+          <w:tcPr>
+            <w:tcW w:type="dxa" w:w="7370"/>
+          </w:tcPr>
+          <w:p>
+            <w:r>
+              <w:t>skin #c48a60; hair #1e1a1c (slick); facial hair: none; eyes #3a2618; hat: chauffeur; glasses: none; top: suit (#1c1e28 / #f0ece4); extras: temples, tired; mid, normal build</w:t>
+            </w:r>
+          </w:p>
+        </w:tc>
+      </w:tr>
+      <w:tr>
+        <w:tc>
+          <w:tcPr>
+            <w:tcW w:type="dxa" w:w="1984"/>
+          </w:tcPr>
+          <w:p>
+            <w:r>
+              <w:t>Mumble</w:t>
+            </w:r>
+          </w:p>
+        </w:tc>
+        <w:tc>
+          <w:tcPr>
+            <w:tcW w:type="dxa" w:w="7370"/>
+          </w:tcPr>
+          <w:p>
+            <w:r>
+              <w:t>triangle wave, 100-150 Hz, 9 syllables a second, pauses 0.14 s</w:t>
+            </w:r>
+          </w:p>
+        </w:tc>
+      </w:tr>
+    </w:tbl>
+    <w:p>
+      <w:pPr>
+        <w:pStyle w:val="Heading1"/>
+      </w:pPr>
+      <w:r>
+        <w:t>BULL KESSLER  (B)</w:t>
+      </w:r>
+    </w:p>
+    <w:p>
+      <w:r>
+        <w:drawing>
+          <wp:inline xmlns:a="http://schemas.openxmlformats.org/drawingml/2006/main" xmlns:pic="http://schemas.openxmlformats.org/drawingml/2006/picture">
+            <wp:extent cx="1152000" cy="1152000"/>
+            <wp:docPr id="46" name="Picture 46"/>
+            <wp:cNvGraphicFramePr>
+              <a:graphicFrameLocks noChangeAspect="1"/>
+            </wp:cNvGraphicFramePr>
+            <a:graphic>
+              <a:graphicData uri="http://schemas.openxmlformats.org/drawingml/2006/picture">
+                <pic:pic>
+                  <pic:nvPicPr>
+                    <pic:cNvPr id="0" name="kessler-calm.png"/>
+                    <pic:cNvPicPr/>
+                  </pic:nvPicPr>
+                  <pic:blipFill>
+                    <a:blip r:embed="rId54"/>
+                    <a:stretch>
+                      <a:fillRect/>
+                    </a:stretch>
+                  </pic:blipFill>
+                  <pic:spPr>
+                    <a:xfrm>
+                      <a:off x="0" y="0"/>
+                      <a:ext cx="1152000" cy="1152000"/>
+                    </a:xfrm>
+                    <a:prstGeom prst="rect"/>
+                  </pic:spPr>
+                </pic:pic>
+              </a:graphicData>
+            </a:graphic>
+          </wp:inline>
+        </w:drawing>
+      </w:r>
+      <w:r>
+        <w:t xml:space="preserve">  </w:t>
+      </w:r>
+      <w:r>
+        <w:drawing>
+          <wp:inline xmlns:a="http://schemas.openxmlformats.org/drawingml/2006/main" xmlns:pic="http://schemas.openxmlformats.org/drawingml/2006/picture">
+            <wp:extent cx="1152000" cy="1152000"/>
+            <wp:docPr id="47" name="Picture 47"/>
+            <wp:cNvGraphicFramePr>
+              <a:graphicFrameLocks noChangeAspect="1"/>
+            </wp:cNvGraphicFramePr>
+            <a:graphic>
+              <a:graphicData uri="http://schemas.openxmlformats.org/drawingml/2006/picture">
+                <pic:pic>
+                  <pic:nvPicPr>
+                    <pic:cNvPr id="0" name="kessler-angry.png"/>
+                    <pic:cNvPicPr/>
+                  </pic:nvPicPr>
+                  <pic:blipFill>
+                    <a:blip r:embed="rId55"/>
+                    <a:stretch>
+                      <a:fillRect/>
+                    </a:stretch>
+                  </pic:blipFill>
+                  <pic:spPr>
+                    <a:xfrm>
+                      <a:off x="0" y="0"/>
+                      <a:ext cx="1152000" cy="1152000"/>
+                    </a:xfrm>
+                    <a:prstGeom prst="rect"/>
+                  </pic:spPr>
+                </pic:pic>
+              </a:graphicData>
+            </a:graphic>
+          </wp:inline>
+        </w:drawing>
+      </w:r>
+      <w:r>
+        <w:t xml:space="preserve">  </w:t>
+      </w:r>
+      <w:r>
+        <w:drawing>
+          <wp:inline xmlns:a="http://schemas.openxmlformats.org/drawingml/2006/main" xmlns:pic="http://schemas.openxmlformats.org/drawingml/2006/picture">
+            <wp:extent cx="1152000" cy="1152000"/>
+            <wp:docPr id="48" name="Picture 48"/>
+            <wp:cNvGraphicFramePr>
+              <a:graphicFrameLocks noChangeAspect="1"/>
+            </wp:cNvGraphicFramePr>
+            <a:graphic>
+              <a:graphicData uri="http://schemas.openxmlformats.org/drawingml/2006/picture">
+                <pic:pic>
+                  <pic:nvPicPr>
+                    <pic:cNvPr id="0" name="kessler-smile.png"/>
+                    <pic:cNvPicPr/>
+                  </pic:nvPicPr>
+                  <pic:blipFill>
+                    <a:blip r:embed="rId56"/>
+                    <a:stretch>
+                      <a:fillRect/>
+                    </a:stretch>
+                  </pic:blipFill>
+                  <pic:spPr>
+                    <a:xfrm>
+                      <a:off x="0" y="0"/>
+                      <a:ext cx="1152000" cy="1152000"/>
+                    </a:xfrm>
+                    <a:prstGeom prst="rect"/>
+                  </pic:spPr>
+                </pic:pic>
+              </a:graphicData>
+            </a:graphic>
+          </wp:inline>
+        </w:drawing>
+      </w:r>
+      <w:r>
+        <w:t xml:space="preserve">  </w:t>
+      </w:r>
+    </w:p>
+    <w:p>
+      <w:r>
+        <w:rPr>
+          <w:sz w:val="16"/>
+        </w:rPr>
+        <w:t>calm - angry - smiling</w:t>
+      </w:r>
+    </w:p>
+    <w:tbl>
+      <w:tblPr>
+        <w:tblStyle w:val="LightGrid-Accent1"/>
+        <w:tblW w:type="auto" w:w="0"/>
+        <w:tblLook w:firstColumn="1" w:firstRow="1" w:lastColumn="0" w:lastRow="0" w:noHBand="0" w:noVBand="1" w:val="04A0"/>
+      </w:tblPr>
+      <w:tblGrid>
+        <w:gridCol w:w="4320"/>
+        <w:gridCol w:w="4320"/>
+      </w:tblGrid>
+      <w:tr>
+        <w:tc>
+          <w:tcPr>
+            <w:tcW w:type="dxa" w:w="1984"/>
+          </w:tcPr>
+          <w:p>
+            <w:r>
+              <w:t>Who</w:t>
+            </w:r>
+          </w:p>
+        </w:tc>
+        <w:tc>
+          <w:tcPr>
+            <w:tcW w:type="dxa" w:w="7370"/>
+          </w:tcPr>
+          <w:p>
+            <w:r>
+              <w:t>Bruno "Bull" Kessler, Crane's muscle and the Dockside gang boss; loud, likes tough men, fears only Crane.</w:t>
+            </w:r>
+          </w:p>
+        </w:tc>
+      </w:tr>
+      <w:tr>
+        <w:tc>
+          <w:tcPr>
+            <w:tcW w:type="dxa" w:w="1984"/>
+          </w:tcPr>
+          <w:p>
+            <w:r>
+              <w:t>Looks</w:t>
+            </w:r>
+          </w:p>
+        </w:tc>
+        <w:tc>
+          <w:tcPr>
+            <w:tcW w:type="dxa" w:w="7370"/>
+          </w:tcPr>
+          <w:p>
+            <w:r>
+              <w:t>Forties, huge, a big neck, a shaved head, a blond goatee, a white tank top, gold chains, a tattoo on the shoulder.</w:t>
+            </w:r>
+          </w:p>
+        </w:tc>
+      </w:tr>
+      <w:tr>
+        <w:tc>
+          <w:tcPr>
+            <w:tcW w:type="dxa" w:w="1984"/>
+          </w:tcPr>
+          <w:p>
+            <w:r>
+              <w:t>Bubble colour</w:t>
+            </w:r>
+          </w:p>
+        </w:tc>
+        <w:tc>
+          <w:tcPr>
+            <w:tcW w:type="dxa" w:w="7370"/>
+          </w:tcPr>
+          <w:p>
+            <w:r>
+              <w:t>#ff5a1f</w:t>
+            </w:r>
+          </w:p>
+        </w:tc>
+      </w:tr>
+      <w:tr>
+        <w:tc>
+          <w:tcPr>
+            <w:tcW w:type="dxa" w:w="1984"/>
+          </w:tcPr>
+          <w:p>
+            <w:r>
+              <w:t>In the city</w:t>
+            </w:r>
+          </w:p>
+        </w:tc>
+        <w:tc>
+          <w:tcPr>
+            <w:tcW w:type="dxa" w:w="7370"/>
+          </w:tcPr>
+          <w:p>
+            <w:r>
+              <w:t>shirt #f2f2ee, trousers #3a4a6a</w:t>
+            </w:r>
+          </w:p>
+        </w:tc>
+      </w:tr>
+      <w:tr>
+        <w:tc>
+          <w:tcPr>
+            <w:tcW w:type="dxa" w:w="1984"/>
+          </w:tcPr>
+          <w:p>
+            <w:r>
+              <w:t>Portrait recipe</w:t>
+            </w:r>
+          </w:p>
+        </w:tc>
+        <w:tc>
+          <w:tcPr>
+            <w:tcW w:type="dxa" w:w="7370"/>
+          </w:tcPr>
+          <w:p>
+            <w:r>
+              <w:t>skin #d9a27a; hair #e0c070 (bald); facial hair: goatee; eyes #5a7a9a; hat: none; glasses: none; top: tanktop (#f2f2ee / #d8d8d2); extras: chain, tattoo; mid, broad build</w:t>
+            </w:r>
+          </w:p>
+        </w:tc>
+      </w:tr>
+      <w:tr>
+        <w:tc>
+          <w:tcPr>
+            <w:tcW w:type="dxa" w:w="1984"/>
+          </w:tcPr>
+          <w:p>
+            <w:r>
+              <w:t>Mumble</w:t>
+            </w:r>
+          </w:p>
+        </w:tc>
+        <w:tc>
+          <w:tcPr>
+            <w:tcW w:type="dxa" w:w="7370"/>
+          </w:tcPr>
+          <w:p>
+            <w:r>
+              <w:t>sawtooth wave, 70-110 Hz, 11 syllables a second, pauses 0.06 s</w:t>
+            </w:r>
+          </w:p>
+        </w:tc>
+      </w:tr>
+    </w:tbl>
+    <w:p>
+      <w:pPr>
+        <w:pStyle w:val="Heading1"/>
+      </w:pPr>
+      <w:r>
+        <w:t>ROSA ORTEGA  (R)</w:t>
+      </w:r>
+    </w:p>
+    <w:p>
+      <w:r>
+        <w:drawing>
+          <wp:inline xmlns:a="http://schemas.openxmlformats.org/drawingml/2006/main" xmlns:pic="http://schemas.openxmlformats.org/drawingml/2006/picture">
+            <wp:extent cx="1152000" cy="1152000"/>
+            <wp:docPr id="49" name="Picture 49"/>
+            <wp:cNvGraphicFramePr>
+              <a:graphicFrameLocks noChangeAspect="1"/>
+            </wp:cNvGraphicFramePr>
+            <a:graphic>
+              <a:graphicData uri="http://schemas.openxmlformats.org/drawingml/2006/picture">
+                <pic:pic>
+                  <pic:nvPicPr>
+                    <pic:cNvPr id="0" name="rosa-calm.png"/>
+                    <pic:cNvPicPr/>
+                  </pic:nvPicPr>
+                  <pic:blipFill>
+                    <a:blip r:embed="rId57"/>
+                    <a:stretch>
+                      <a:fillRect/>
+                    </a:stretch>
+                  </pic:blipFill>
+                  <pic:spPr>
+                    <a:xfrm>
+                      <a:off x="0" y="0"/>
+                      <a:ext cx="1152000" cy="1152000"/>
+                    </a:xfrm>
+                    <a:prstGeom prst="rect"/>
+                  </pic:spPr>
+                </pic:pic>
+              </a:graphicData>
+            </a:graphic>
+          </wp:inline>
+        </w:drawing>
+      </w:r>
+      <w:r>
+        <w:t xml:space="preserve">  </w:t>
+      </w:r>
+      <w:r>
+        <w:drawing>
+          <wp:inline xmlns:a="http://schemas.openxmlformats.org/drawingml/2006/main" xmlns:pic="http://schemas.openxmlformats.org/drawingml/2006/picture">
+            <wp:extent cx="1152000" cy="1152000"/>
+            <wp:docPr id="50" name="Picture 50"/>
+            <wp:cNvGraphicFramePr>
+              <a:graphicFrameLocks noChangeAspect="1"/>
+            </wp:cNvGraphicFramePr>
+            <a:graphic>
+              <a:graphicData uri="http://schemas.openxmlformats.org/drawingml/2006/picture">
+                <pic:pic>
+                  <pic:nvPicPr>
+                    <pic:cNvPr id="0" name="rosa-angry.png"/>
+                    <pic:cNvPicPr/>
+                  </pic:nvPicPr>
+                  <pic:blipFill>
+                    <a:blip r:embed="rId58"/>
+                    <a:stretch>
+                      <a:fillRect/>
+                    </a:stretch>
+                  </pic:blipFill>
+                  <pic:spPr>
+                    <a:xfrm>
+                      <a:off x="0" y="0"/>
+                      <a:ext cx="1152000" cy="1152000"/>
+                    </a:xfrm>
+                    <a:prstGeom prst="rect"/>
+                  </pic:spPr>
+                </pic:pic>
+              </a:graphicData>
+            </a:graphic>
+          </wp:inline>
+        </w:drawing>
+      </w:r>
+      <w:r>
+        <w:t xml:space="preserve">  </w:t>
+      </w:r>
+      <w:r>
+        <w:drawing>
+          <wp:inline xmlns:a="http://schemas.openxmlformats.org/drawingml/2006/main" xmlns:pic="http://schemas.openxmlformats.org/drawingml/2006/picture">
+            <wp:extent cx="1152000" cy="1152000"/>
+            <wp:docPr id="51" name="Picture 51"/>
+            <wp:cNvGraphicFramePr>
+              <a:graphicFrameLocks noChangeAspect="1"/>
+            </wp:cNvGraphicFramePr>
+            <a:graphic>
+              <a:graphicData uri="http://schemas.openxmlformats.org/drawingml/2006/picture">
+                <pic:pic>
+                  <pic:nvPicPr>
+                    <pic:cNvPr id="0" name="rosa-smile.png"/>
+                    <pic:cNvPicPr/>
+                  </pic:nvPicPr>
+                  <pic:blipFill>
+                    <a:blip r:embed="rId59"/>
+                    <a:stretch>
+                      <a:fillRect/>
+                    </a:stretch>
+                  </pic:blipFill>
+                  <pic:spPr>
+                    <a:xfrm>
+                      <a:off x="0" y="0"/>
+                      <a:ext cx="1152000" cy="1152000"/>
+                    </a:xfrm>
+                    <a:prstGeom prst="rect"/>
+                  </pic:spPr>
+                </pic:pic>
+              </a:graphicData>
+            </a:graphic>
+          </wp:inline>
+        </w:drawing>
+      </w:r>
+      <w:r>
+        <w:t xml:space="preserve">  </w:t>
+      </w:r>
+    </w:p>
+    <w:p>
+      <w:r>
+        <w:rPr>
+          <w:sz w:val="16"/>
+        </w:rPr>
+        <w:t>calm - angry - smiling</w:t>
+      </w:r>
+    </w:p>
+    <w:tbl>
+      <w:tblPr>
+        <w:tblStyle w:val="LightGrid-Accent1"/>
+        <w:tblW w:type="auto" w:w="0"/>
+        <w:tblLook w:firstColumn="1" w:firstRow="1" w:lastColumn="0" w:lastRow="0" w:noHBand="0" w:noVBand="1" w:val="04A0"/>
+      </w:tblPr>
+      <w:tblGrid>
+        <w:gridCol w:w="4320"/>
+        <w:gridCol w:w="4320"/>
+      </w:tblGrid>
+      <w:tr>
+        <w:tc>
+          <w:tcPr>
+            <w:tcW w:type="dxa" w:w="1984"/>
+          </w:tcPr>
+          <w:p>
+            <w:r>
+              <w:t>Who</w:t>
+            </w:r>
+          </w:p>
+        </w:tc>
+        <w:tc>
+          <w:tcPr>
+            <w:tcW w:type="dxa" w:w="7370"/>
+          </w:tcPr>
+          <w:p>
+            <w:r>
+              <w:t>Mercado's market boss: tough and warm; takes Danny in against Kessler and becomes part of his crew.</w:t>
+            </w:r>
+          </w:p>
+        </w:tc>
+      </w:tr>
+      <w:tr>
+        <w:tc>
+          <w:tcPr>
+            <w:tcW w:type="dxa" w:w="1984"/>
+          </w:tcPr>
+          <w:p>
+            <w:r>
+              <w:t>Looks</w:t>
+            </w:r>
+          </w:p>
+        </w:tc>
+        <w:tc>
+          <w:tcPr>
+            <w:tcW w:type="dxa" w:w="7370"/>
+          </w:tcPr>
+          <w:p>
+            <w:r>
+              <w:t>Forties, black hair pulled back tight, big gold hoop earrings, red lipstick, a red blouse with rolled sleeves, a gold chain.</w:t>
+            </w:r>
+          </w:p>
+        </w:tc>
+      </w:tr>
+      <w:tr>
+        <w:tc>
+          <w:tcPr>
+            <w:tcW w:type="dxa" w:w="1984"/>
+          </w:tcPr>
+          <w:p>
+            <w:r>
+              <w:t>Bubble colour</w:t>
+            </w:r>
+          </w:p>
+        </w:tc>
+        <w:tc>
+          <w:tcPr>
+            <w:tcW w:type="dxa" w:w="7370"/>
+          </w:tcPr>
+          <w:p>
+            <w:r>
+              <w:t>#d41e3c</w:t>
+            </w:r>
+          </w:p>
+        </w:tc>
+      </w:tr>
+      <w:tr>
+        <w:tc>
+          <w:tcPr>
+            <w:tcW w:type="dxa" w:w="1984"/>
+          </w:tcPr>
+          <w:p>
+            <w:r>
+              <w:t>In the city</w:t>
+            </w:r>
+          </w:p>
+        </w:tc>
+        <w:tc>
+          <w:tcPr>
+            <w:tcW w:type="dxa" w:w="7370"/>
+          </w:tcPr>
+          <w:p>
+            <w:r>
+              <w:t>shirt #c8243a, trousers #1a1a20</w:t>
+            </w:r>
+          </w:p>
+        </w:tc>
+      </w:tr>
+      <w:tr>
+        <w:tc>
+          <w:tcPr>
+            <w:tcW w:type="dxa" w:w="1984"/>
+          </w:tcPr>
+          <w:p>
+            <w:r>
+              <w:t>Portrait recipe</w:t>
+            </w:r>
+          </w:p>
+        </w:tc>
+        <w:tc>
+          <w:tcPr>
+            <w:tcW w:type="dxa" w:w="7370"/>
+          </w:tcPr>
+          <w:p>
+            <w:r>
+              <w:t>skin #c08458; hair #141018 (pulled); facial hair: none; eyes #2a1a12; hat: none; glasses: none; top: blouse (#c8243a / #9a1a2c); extras: hoops, lipstick, chain; mid, normal build</w:t>
+            </w:r>
+          </w:p>
+        </w:tc>
+      </w:tr>
+      <w:tr>
+        <w:tc>
+          <w:tcPr>
+            <w:tcW w:type="dxa" w:w="1984"/>
+          </w:tcPr>
+          <w:p>
+            <w:r>
+              <w:t>Mumble</w:t>
+            </w:r>
+          </w:p>
+        </w:tc>
+        <w:tc>
+          <w:tcPr>
+            <w:tcW w:type="dxa" w:w="7370"/>
+          </w:tcPr>
+          <w:p>
+            <w:r>
+              <w:t>triangle wave, 190-300 Hz, 12 syllables a second, pauses 0.08 s</w:t>
+            </w:r>
+          </w:p>
+        </w:tc>
+      </w:tr>
+    </w:tbl>
+    <w:p>
+      <w:pPr>
+        <w:pStyle w:val="Heading1"/>
+      </w:pPr>
+      <w:r>
+        <w:t>NINA PARK  (N)</w:t>
+      </w:r>
+    </w:p>
+    <w:p>
+      <w:r>
+        <w:drawing>
+          <wp:inline xmlns:a="http://schemas.openxmlformats.org/drawingml/2006/main" xmlns:pic="http://schemas.openxmlformats.org/drawingml/2006/picture">
+            <wp:extent cx="1152000" cy="1152000"/>
+            <wp:docPr id="52" name="Picture 52"/>
+            <wp:cNvGraphicFramePr>
+              <a:graphicFrameLocks noChangeAspect="1"/>
+            </wp:cNvGraphicFramePr>
+            <a:graphic>
+              <a:graphicData uri="http://schemas.openxmlformats.org/drawingml/2006/picture">
+                <pic:pic>
+                  <pic:nvPicPr>
+                    <pic:cNvPr id="0" name="nina-calm.png"/>
+                    <pic:cNvPicPr/>
+                  </pic:nvPicPr>
+                  <pic:blipFill>
+                    <a:blip r:embed="rId60"/>
+                    <a:stretch>
+                      <a:fillRect/>
+                    </a:stretch>
+                  </pic:blipFill>
+                  <pic:spPr>
+                    <a:xfrm>
+                      <a:off x="0" y="0"/>
+                      <a:ext cx="1152000" cy="1152000"/>
+                    </a:xfrm>
+                    <a:prstGeom prst="rect"/>
+                  </pic:spPr>
+                </pic:pic>
+              </a:graphicData>
+            </a:graphic>
+          </wp:inline>
+        </w:drawing>
+      </w:r>
+      <w:r>
+        <w:t xml:space="preserve">  </w:t>
+      </w:r>
+      <w:r>
+        <w:drawing>
+          <wp:inline xmlns:a="http://schemas.openxmlformats.org/drawingml/2006/main" xmlns:pic="http://schemas.openxmlformats.org/drawingml/2006/picture">
+            <wp:extent cx="1152000" cy="1152000"/>
+            <wp:docPr id="53" name="Picture 53"/>
+            <wp:cNvGraphicFramePr>
+              <a:graphicFrameLocks noChangeAspect="1"/>
+            </wp:cNvGraphicFramePr>
+            <a:graphic>
+              <a:graphicData uri="http://schemas.openxmlformats.org/drawingml/2006/picture">
+                <pic:pic>
+                  <pic:nvPicPr>
+                    <pic:cNvPr id="0" name="nina-angry.png"/>
+                    <pic:cNvPicPr/>
+                  </pic:nvPicPr>
+                  <pic:blipFill>
+                    <a:blip r:embed="rId61"/>
+                    <a:stretch>
+                      <a:fillRect/>
+                    </a:stretch>
+                  </pic:blipFill>
+                  <pic:spPr>
+                    <a:xfrm>
+                      <a:off x="0" y="0"/>
+                      <a:ext cx="1152000" cy="1152000"/>
+                    </a:xfrm>
+                    <a:prstGeom prst="rect"/>
+                  </pic:spPr>
+                </pic:pic>
+              </a:graphicData>
+            </a:graphic>
+          </wp:inline>
+        </w:drawing>
+      </w:r>
+      <w:r>
+        <w:t xml:space="preserve">  </w:t>
+      </w:r>
+      <w:r>
+        <w:drawing>
+          <wp:inline xmlns:a="http://schemas.openxmlformats.org/drawingml/2006/main" xmlns:pic="http://schemas.openxmlformats.org/drawingml/2006/picture">
+            <wp:extent cx="1152000" cy="1152000"/>
+            <wp:docPr id="54" name="Picture 54"/>
+            <wp:cNvGraphicFramePr>
+              <a:graphicFrameLocks noChangeAspect="1"/>
+            </wp:cNvGraphicFramePr>
+            <a:graphic>
+              <a:graphicData uri="http://schemas.openxmlformats.org/drawingml/2006/picture">
+                <pic:pic>
+                  <pic:nvPicPr>
+                    <pic:cNvPr id="0" name="nina-smile.png"/>
+                    <pic:cNvPicPr/>
+                  </pic:nvPicPr>
+                  <pic:blipFill>
+                    <a:blip r:embed="rId62"/>
+                    <a:stretch>
+                      <a:fillRect/>
+                    </a:stretch>
+                  </pic:blipFill>
+                  <pic:spPr>
+                    <a:xfrm>
+                      <a:off x="0" y="0"/>
+                      <a:ext cx="1152000" cy="1152000"/>
+                    </a:xfrm>
+                    <a:prstGeom prst="rect"/>
+                  </pic:spPr>
+                </pic:pic>
+              </a:graphicData>
+            </a:graphic>
+          </wp:inline>
+        </w:drawing>
+      </w:r>
+      <w:r>
+        <w:t xml:space="preserve">  </w:t>
+      </w:r>
+    </w:p>
+    <w:p>
+      <w:r>
+        <w:rPr>
+          <w:sz w:val="16"/>
+        </w:rPr>
+        <w:t>calm - angry - smiling</w:t>
+      </w:r>
+    </w:p>
+    <w:tbl>
+      <w:tblPr>
+        <w:tblStyle w:val="LightGrid-Accent1"/>
+        <w:tblW w:type="auto" w:w="0"/>
+        <w:tblLook w:firstColumn="1" w:firstRow="1" w:lastColumn="0" w:lastRow="0" w:noHBand="0" w:noVBand="1" w:val="04A0"/>
+      </w:tblPr>
+      <w:tblGrid>
+        <w:gridCol w:w="4320"/>
+        <w:gridCol w:w="4320"/>
+      </w:tblGrid>
+      <w:tr>
+        <w:tc>
+          <w:tcPr>
+            <w:tcW w:type="dxa" w:w="1984"/>
+          </w:tcPr>
+          <w:p>
+            <w:r>
+              <w:t>Who</w:t>
+            </w:r>
+          </w:p>
+        </w:tc>
+        <w:tc>
+          <w:tcPr>
+            <w:tcW w:type="dxa" w:w="7370"/>
+          </w:tcPr>
+          <w:p>
+            <w:r>
+              <w:t>A Bay TV reporter who has dug into Crane for years; quick and fearless; trades what she knows for Danny's help.</w:t>
+            </w:r>
+          </w:p>
+        </w:tc>
+      </w:tr>
+      <w:tr>
+        <w:tc>
+          <w:tcPr>
+            <w:tcW w:type="dxa" w:w="1984"/>
+          </w:tcPr>
+          <w:p>
+            <w:r>
+              <w:t>Looks</w:t>
+            </w:r>
+          </w:p>
+        </w:tc>
+        <w:tc>
+          <w:tcPr>
+            <w:tcW w:type="dxa" w:w="7370"/>
+          </w:tcPr>
+          <w:p>
+            <w:r>
+              <w:t>Thirties, a sharp black bob, a mustard blazer with big 90s shoulders over a black top, small gold earrings.</w:t>
+            </w:r>
+          </w:p>
+        </w:tc>
+      </w:tr>
+      <w:tr>
+        <w:tc>
+          <w:tcPr>
+            <w:tcW w:type="dxa" w:w="1984"/>
+          </w:tcPr>
+          <w:p>
+            <w:r>
+              <w:t>Bubble colour</w:t>
+            </w:r>
+          </w:p>
+        </w:tc>
+        <w:tc>
+          <w:tcPr>
+            <w:tcW w:type="dxa" w:w="7370"/>
+          </w:tcPr>
+          <w:p>
+            <w:r>
+              <w:t>#ffb000</w:t>
+            </w:r>
+          </w:p>
+        </w:tc>
+      </w:tr>
+      <w:tr>
+        <w:tc>
+          <w:tcPr>
+            <w:tcW w:type="dxa" w:w="1984"/>
+          </w:tcPr>
+          <w:p>
+            <w:r>
+              <w:t>In the city</w:t>
+            </w:r>
+          </w:p>
+        </w:tc>
+        <w:tc>
+          <w:tcPr>
+            <w:tcW w:type="dxa" w:w="7370"/>
+          </w:tcPr>
+          <w:p>
+            <w:r>
+              <w:t>shirt #d4a020, trousers #1a1a20</w:t>
+            </w:r>
+          </w:p>
+        </w:tc>
+      </w:tr>
+      <w:tr>
+        <w:tc>
+          <w:tcPr>
+            <w:tcW w:type="dxa" w:w="1984"/>
+          </w:tcPr>
+          <w:p>
+            <w:r>
+              <w:t>Portrait recipe</w:t>
+            </w:r>
+          </w:p>
+        </w:tc>
+        <w:tc>
+          <w:tcPr>
+            <w:tcW w:type="dxa" w:w="7370"/>
+          </w:tcPr>
+          <w:p>
+            <w:r>
+              <w:t>skin #e6c49e; hair #121014 (bob); facial hair: none; eyes #2a1a14; hat: none; glasses: none; top: blazer (#d4a020 / #1a1a20); extras: earring, lipstick; mid, slim build</w:t>
+            </w:r>
+          </w:p>
+        </w:tc>
+      </w:tr>
+      <w:tr>
+        <w:tc>
+          <w:tcPr>
+            <w:tcW w:type="dxa" w:w="1984"/>
+          </w:tcPr>
+          <w:p>
+            <w:r>
+              <w:t>Mumble</w:t>
+            </w:r>
+          </w:p>
+        </w:tc>
+        <w:tc>
+          <w:tcPr>
+            <w:tcW w:type="dxa" w:w="7370"/>
+          </w:tcPr>
+          <w:p>
+            <w:r>
+              <w:t>square wave, 240-380 Hz, 15 syllables a second, pauses 0.03 s</w:t>
+            </w:r>
+          </w:p>
+        </w:tc>
+      </w:tr>
+    </w:tbl>
+    <w:p>
+      <w:pPr>
+        <w:pStyle w:val="Heading1"/>
+      </w:pPr>
+      <w:r>
+        <w:t>LEONARD SACHS  (A)</w:t>
+      </w:r>
+    </w:p>
+    <w:p>
+      <w:r>
+        <w:drawing>
+          <wp:inline xmlns:a="http://schemas.openxmlformats.org/drawingml/2006/main" xmlns:pic="http://schemas.openxmlformats.org/drawingml/2006/picture">
+            <wp:extent cx="1152000" cy="1152000"/>
+            <wp:docPr id="55" name="Picture 55"/>
+            <wp:cNvGraphicFramePr>
+              <a:graphicFrameLocks noChangeAspect="1"/>
+            </wp:cNvGraphicFramePr>
+            <a:graphic>
+              <a:graphicData uri="http://schemas.openxmlformats.org/drawingml/2006/picture">
+                <pic:pic>
+                  <pic:nvPicPr>
+                    <pic:cNvPr id="0" name="sachs-calm.png"/>
+                    <pic:cNvPicPr/>
+                  </pic:nvPicPr>
+                  <pic:blipFill>
+                    <a:blip r:embed="rId63"/>
+                    <a:stretch>
+                      <a:fillRect/>
+                    </a:stretch>
+                  </pic:blipFill>
+                  <pic:spPr>
+                    <a:xfrm>
+                      <a:off x="0" y="0"/>
+                      <a:ext cx="1152000" cy="1152000"/>
+                    </a:xfrm>
+                    <a:prstGeom prst="rect"/>
+                  </pic:spPr>
+                </pic:pic>
+              </a:graphicData>
+            </a:graphic>
+          </wp:inline>
+        </w:drawing>
+      </w:r>
+      <w:r>
+        <w:t xml:space="preserve">  </w:t>
+      </w:r>
+      <w:r>
+        <w:drawing>
+          <wp:inline xmlns:a="http://schemas.openxmlformats.org/drawingml/2006/main" xmlns:pic="http://schemas.openxmlformats.org/drawingml/2006/picture">
+            <wp:extent cx="1152000" cy="1152000"/>
+            <wp:docPr id="56" name="Picture 56"/>
+            <wp:cNvGraphicFramePr>
+              <a:graphicFrameLocks noChangeAspect="1"/>
+            </wp:cNvGraphicFramePr>
+            <a:graphic>
+              <a:graphicData uri="http://schemas.openxmlformats.org/drawingml/2006/picture">
+                <pic:pic>
+                  <pic:nvPicPr>
+                    <pic:cNvPr id="0" name="sachs-angry.png"/>
+                    <pic:cNvPicPr/>
+                  </pic:nvPicPr>
+                  <pic:blipFill>
+                    <a:blip r:embed="rId64"/>
+                    <a:stretch>
+                      <a:fillRect/>
+                    </a:stretch>
+                  </pic:blipFill>
+                  <pic:spPr>
+                    <a:xfrm>
+                      <a:off x="0" y="0"/>
+                      <a:ext cx="1152000" cy="1152000"/>
+                    </a:xfrm>
+                    <a:prstGeom prst="rect"/>
+                  </pic:spPr>
+                </pic:pic>
+              </a:graphicData>
+            </a:graphic>
+          </wp:inline>
+        </w:drawing>
+      </w:r>
+      <w:r>
+        <w:t xml:space="preserve">  </w:t>
+      </w:r>
+      <w:r>
+        <w:drawing>
+          <wp:inline xmlns:a="http://schemas.openxmlformats.org/drawingml/2006/main" xmlns:pic="http://schemas.openxmlformats.org/drawingml/2006/picture">
+            <wp:extent cx="1152000" cy="1152000"/>
+            <wp:docPr id="57" name="Picture 57"/>
+            <wp:cNvGraphicFramePr>
+              <a:graphicFrameLocks noChangeAspect="1"/>
+            </wp:cNvGraphicFramePr>
+            <a:graphic>
+              <a:graphicData uri="http://schemas.openxmlformats.org/drawingml/2006/picture">
+                <pic:pic>
+                  <pic:nvPicPr>
+                    <pic:cNvPr id="0" name="sachs-smile.png"/>
+                    <pic:cNvPicPr/>
+                  </pic:nvPicPr>
+                  <pic:blipFill>
+                    <a:blip r:embed="rId65"/>
+                    <a:stretch>
+                      <a:fillRect/>
+                    </a:stretch>
+                  </pic:blipFill>
+                  <pic:spPr>
+                    <a:xfrm>
+                      <a:off x="0" y="0"/>
+                      <a:ext cx="1152000" cy="1152000"/>
+                    </a:xfrm>
+                    <a:prstGeom prst="rect"/>
+                  </pic:spPr>
+                </pic:pic>
+              </a:graphicData>
+            </a:graphic>
+          </wp:inline>
+        </w:drawing>
+      </w:r>
+      <w:r>
+        <w:t xml:space="preserve">  </w:t>
+      </w:r>
+    </w:p>
+    <w:p>
+      <w:r>
+        <w:rPr>
+          <w:sz w:val="16"/>
+        </w:rPr>
+        <w:t>calm - angry - smiling</w:t>
+      </w:r>
+    </w:p>
+    <w:tbl>
+      <w:tblPr>
+        <w:tblStyle w:val="LightGrid-Accent1"/>
+        <w:tblW w:type="auto" w:w="0"/>
+        <w:tblLook w:firstColumn="1" w:firstRow="1" w:lastColumn="0" w:lastRow="0" w:noHBand="0" w:noVBand="1" w:val="04A0"/>
+      </w:tblPr>
+      <w:tblGrid>
+        <w:gridCol w:w="4320"/>
+        <w:gridCol w:w="4320"/>
+      </w:tblGrid>
+      <w:tr>
+        <w:tc>
+          <w:tcPr>
+            <w:tcW w:type="dxa" w:w="1984"/>
+          </w:tcPr>
+          <w:p>
+            <w:r>
+              <w:t>Who</w:t>
+            </w:r>
+          </w:p>
+        </w:tc>
+        <w:tc>
+          <w:tcPr>
+            <w:tcW w:type="dxa" w:w="7370"/>
+          </w:tcPr>
+          <w:p>
+            <w:r>
+              <w:t>Crane's lawyer, who moves the money; cheerful, friendly - and dangerous under the smile.</w:t>
+            </w:r>
+          </w:p>
+        </w:tc>
+      </w:tr>
+      <w:tr>
+        <w:tc>
+          <w:tcPr>
+            <w:tcW w:type="dxa" w:w="1984"/>
+          </w:tcPr>
+          <w:p>
+            <w:r>
+              <w:t>Looks</w:t>
+            </w:r>
+          </w:p>
+        </w:tc>
+        <w:tc>
+          <w:tcPr>
+            <w:tcW w:type="dxa" w:w="7370"/>
+          </w:tcPr>
+          <w:p>
+            <w:r>
+              <w:t>Fifties, round and cheerful, thinning hair, a brown suit, a red bow tie, a pocket watch.</w:t>
+            </w:r>
+          </w:p>
+        </w:tc>
+      </w:tr>
+      <w:tr>
+        <w:tc>
+          <w:tcPr>
+            <w:tcW w:type="dxa" w:w="1984"/>
+          </w:tcPr>
+          <w:p>
+            <w:r>
+              <w:t>Bubble colour</w:t>
+            </w:r>
+          </w:p>
+        </w:tc>
+        <w:tc>
+          <w:tcPr>
+            <w:tcW w:type="dxa" w:w="7370"/>
+          </w:tcPr>
+          <w:p>
+            <w:r>
+              <w:t>#9ad08a</w:t>
+            </w:r>
+          </w:p>
+        </w:tc>
+      </w:tr>
+      <w:tr>
+        <w:tc>
+          <w:tcPr>
+            <w:tcW w:type="dxa" w:w="1984"/>
+          </w:tcPr>
+          <w:p>
+            <w:r>
+              <w:t>In the city</w:t>
+            </w:r>
+          </w:p>
+        </w:tc>
+        <w:tc>
+          <w:tcPr>
+            <w:tcW w:type="dxa" w:w="7370"/>
+          </w:tcPr>
+          <w:p>
+            <w:r>
+              <w:t>shirt #5a4a3a, trousers #5a4a3a</w:t>
+            </w:r>
+          </w:p>
+        </w:tc>
+      </w:tr>
+      <w:tr>
+        <w:tc>
+          <w:tcPr>
+            <w:tcW w:type="dxa" w:w="1984"/>
+          </w:tcPr>
+          <w:p>
+            <w:r>
+              <w:t>Portrait recipe</w:t>
+            </w:r>
+          </w:p>
+        </w:tc>
+        <w:tc>
+          <w:tcPr>
+            <w:tcW w:type="dxa" w:w="7370"/>
+          </w:tcPr>
+          <w:p>
+            <w:r>
+              <w:t>skin #f0c8a8; hair #8a7a6a (sides); facial hair: none; eyes #4a5a3a; hat: none; glasses: none; top: suit (#5a4a3a / #f0ece0); extras: bowtie, jowls; mid, broad build</w:t>
+            </w:r>
+          </w:p>
+        </w:tc>
+      </w:tr>
+      <w:tr>
+        <w:tc>
+          <w:tcPr>
+            <w:tcW w:type="dxa" w:w="1984"/>
+          </w:tcPr>
+          <w:p>
+            <w:r>
+              <w:t>Mumble</w:t>
+            </w:r>
+          </w:p>
+        </w:tc>
+        <w:tc>
+          <w:tcPr>
+            <w:tcW w:type="dxa" w:w="7370"/>
+          </w:tcPr>
+          <w:p>
+            <w:r>
+              <w:t>sine wave, 130-200 Hz, 10 syllables a second, pauses 0.12 s</w:t>
+            </w:r>
+          </w:p>
+        </w:tc>
+      </w:tr>
+    </w:tbl>
+    <w:p>
+      <w:pPr>
+        <w:pStyle w:val="Heading1"/>
+      </w:pPr>
+      <w:r>
+        <w:t>CHIEF HOLLOWAY  (H)</w:t>
+      </w:r>
+    </w:p>
+    <w:p>
+      <w:r>
+        <w:drawing>
+          <wp:inline xmlns:a="http://schemas.openxmlformats.org/drawingml/2006/main" xmlns:pic="http://schemas.openxmlformats.org/drawingml/2006/picture">
+            <wp:extent cx="1152000" cy="1152000"/>
+            <wp:docPr id="58" name="Picture 58"/>
+            <wp:cNvGraphicFramePr>
+              <a:graphicFrameLocks noChangeAspect="1"/>
+            </wp:cNvGraphicFramePr>
+            <a:graphic>
+              <a:graphicData uri="http://schemas.openxmlformats.org/drawingml/2006/picture">
+                <pic:pic>
+                  <pic:nvPicPr>
+                    <pic:cNvPr id="0" name="holloway-calm.png"/>
+                    <pic:cNvPicPr/>
+                  </pic:nvPicPr>
+                  <pic:blipFill>
+                    <a:blip r:embed="rId66"/>
+                    <a:stretch>
+                      <a:fillRect/>
+                    </a:stretch>
+                  </pic:blipFill>
+                  <pic:spPr>
+                    <a:xfrm>
+                      <a:off x="0" y="0"/>
+                      <a:ext cx="1152000" cy="1152000"/>
+                    </a:xfrm>
+                    <a:prstGeom prst="rect"/>
+                  </pic:spPr>
+                </pic:pic>
+              </a:graphicData>
+            </a:graphic>
+          </wp:inline>
+        </w:drawing>
+      </w:r>
+      <w:r>
+        <w:t xml:space="preserve">  </w:t>
+      </w:r>
+      <w:r>
+        <w:drawing>
+          <wp:inline xmlns:a="http://schemas.openxmlformats.org/drawingml/2006/main" xmlns:pic="http://schemas.openxmlformats.org/drawingml/2006/picture">
+            <wp:extent cx="1152000" cy="1152000"/>
+            <wp:docPr id="59" name="Picture 59"/>
+            <wp:cNvGraphicFramePr>
+              <a:graphicFrameLocks noChangeAspect="1"/>
+            </wp:cNvGraphicFramePr>
+            <a:graphic>
+              <a:graphicData uri="http://schemas.openxmlformats.org/drawingml/2006/picture">
+                <pic:pic>
+                  <pic:nvPicPr>
+                    <pic:cNvPr id="0" name="holloway-angry.png"/>
+                    <pic:cNvPicPr/>
+                  </pic:nvPicPr>
+                  <pic:blipFill>
+                    <a:blip r:embed="rId67"/>
+                    <a:stretch>
+                      <a:fillRect/>
+                    </a:stretch>
+                  </pic:blipFill>
+                  <pic:spPr>
+                    <a:xfrm>
+                      <a:off x="0" y="0"/>
+                      <a:ext cx="1152000" cy="1152000"/>
+                    </a:xfrm>
+                    <a:prstGeom prst="rect"/>
+                  </pic:spPr>
+                </pic:pic>
+              </a:graphicData>
+            </a:graphic>
+          </wp:inline>
+        </w:drawing>
+      </w:r>
+      <w:r>
+        <w:t xml:space="preserve">  </w:t>
+      </w:r>
+      <w:r>
+        <w:drawing>
+          <wp:inline xmlns:a="http://schemas.openxmlformats.org/drawingml/2006/main" xmlns:pic="http://schemas.openxmlformats.org/drawingml/2006/picture">
+            <wp:extent cx="1152000" cy="1152000"/>
+            <wp:docPr id="60" name="Picture 60"/>
+            <wp:cNvGraphicFramePr>
+              <a:graphicFrameLocks noChangeAspect="1"/>
+            </wp:cNvGraphicFramePr>
+            <a:graphic>
+              <a:graphicData uri="http://schemas.openxmlformats.org/drawingml/2006/picture">
+                <pic:pic>
+                  <pic:nvPicPr>
+                    <pic:cNvPr id="0" name="holloway-smile.png"/>
+                    <pic:cNvPicPr/>
+                  </pic:nvPicPr>
+                  <pic:blipFill>
+                    <a:blip r:embed="rId68"/>
+                    <a:stretch>
+                      <a:fillRect/>
+                    </a:stretch>
+                  </pic:blipFill>
+                  <pic:spPr>
+                    <a:xfrm>
+                      <a:off x="0" y="0"/>
+                      <a:ext cx="1152000" cy="1152000"/>
+                    </a:xfrm>
+                    <a:prstGeom prst="rect"/>
+                  </pic:spPr>
+                </pic:pic>
+              </a:graphicData>
+            </a:graphic>
+          </wp:inline>
+        </w:drawing>
+      </w:r>
+      <w:r>
+        <w:t xml:space="preserve">  </w:t>
+      </w:r>
+    </w:p>
+    <w:p>
+      <w:r>
+        <w:rPr>
+          <w:sz w:val="16"/>
+        </w:rPr>
+        <w:t>calm - angry - smiling</w:t>
+      </w:r>
+    </w:p>
+    <w:tbl>
+      <w:tblPr>
+        <w:tblStyle w:val="LightGrid-Accent1"/>
+        <w:tblW w:type="auto" w:w="0"/>
+        <w:tblLook w:firstColumn="1" w:firstRow="1" w:lastColumn="0" w:lastRow="0" w:noHBand="0" w:noVBand="1" w:val="04A0"/>
+      </w:tblPr>
+      <w:tblGrid>
+        <w:gridCol w:w="4320"/>
+        <w:gridCol w:w="4320"/>
+      </w:tblGrid>
+      <w:tr>
+        <w:tc>
+          <w:tcPr>
+            <w:tcW w:type="dxa" w:w="1984"/>
+          </w:tcPr>
+          <w:p>
+            <w:r>
+              <w:t>Who</w:t>
+            </w:r>
+          </w:p>
+        </w:tc>
+        <w:tc>
+          <w:tcPr>
+            <w:tcW w:type="dxa" w:w="7370"/>
+          </w:tcPr>
+          <w:p>
+            <w:r>
+              <w:t>Chief Ray Holloway, Miravista's police chief, who keeps the police off Crane.</w:t>
+            </w:r>
+          </w:p>
+        </w:tc>
+      </w:tr>
+      <w:tr>
+        <w:tc>
+          <w:tcPr>
+            <w:tcW w:type="dxa" w:w="1984"/>
+          </w:tcPr>
+          <w:p>
+            <w:r>
+              <w:t>Looks</w:t>
+            </w:r>
+          </w:p>
+        </w:tc>
+        <w:tc>
+          <w:tcPr>
+            <w:tcW w:type="dxa" w:w="7370"/>
+          </w:tcPr>
+          <w:p>
+            <w:r>
+              <w:t>Fifties, a red face, a grey flat-top, a thick moustache, the chief's navy uniform with gold braid, mirror shades.</w:t>
+            </w:r>
+          </w:p>
+        </w:tc>
+      </w:tr>
+      <w:tr>
+        <w:tc>
+          <w:tcPr>
+            <w:tcW w:type="dxa" w:w="1984"/>
+          </w:tcPr>
+          <w:p>
+            <w:r>
+              <w:t>Bubble colour</w:t>
+            </w:r>
+          </w:p>
+        </w:tc>
+        <w:tc>
+          <w:tcPr>
+            <w:tcW w:type="dxa" w:w="7370"/>
+          </w:tcPr>
+          <w:p>
+            <w:r>
+              <w:t>#8a9ab0</w:t>
+            </w:r>
+          </w:p>
+        </w:tc>
+      </w:tr>
+      <w:tr>
+        <w:tc>
+          <w:tcPr>
+            <w:tcW w:type="dxa" w:w="1984"/>
+          </w:tcPr>
+          <w:p>
+            <w:r>
+              <w:t>In the city</w:t>
+            </w:r>
+          </w:p>
+        </w:tc>
+        <w:tc>
+          <w:tcPr>
+            <w:tcW w:type="dxa" w:w="7370"/>
+          </w:tcPr>
+          <w:p>
+            <w:r>
+              <w:t>shirt #1e2a4a, trousers #1e2a4a</w:t>
+            </w:r>
+          </w:p>
+        </w:tc>
+      </w:tr>
+      <w:tr>
+        <w:tc>
+          <w:tcPr>
+            <w:tcW w:type="dxa" w:w="1984"/>
+          </w:tcPr>
+          <w:p>
+            <w:r>
+              <w:t>Portrait recipe</w:t>
+            </w:r>
+          </w:p>
+        </w:tc>
+        <w:tc>
+          <w:tcPr>
+            <w:tcW w:type="dxa" w:w="7370"/>
+          </w:tcPr>
+          <w:p>
+            <w:r>
+              <w:t>skin #e09070; hair #a8a8a8 (flattop); facial hair: moustache; eyes #4a5a6a; hat: none; glasses: shades; top: uniform (#1e2a4a / #141a2a); extras: braid; old, broad build</w:t>
+            </w:r>
+          </w:p>
+        </w:tc>
+      </w:tr>
+      <w:tr>
+        <w:tc>
+          <w:tcPr>
+            <w:tcW w:type="dxa" w:w="1984"/>
+          </w:tcPr>
+          <w:p>
+            <w:r>
+              <w:t>Mumble</w:t>
+            </w:r>
+          </w:p>
+        </w:tc>
+        <w:tc>
+          <w:tcPr>
+            <w:tcW w:type="dxa" w:w="7370"/>
+          </w:tcPr>
+          <w:p>
+            <w:r>
+              <w:t>square wave, 90-130 Hz, 8 syllables a second, pauses 0.14 s</w:t>
+            </w:r>
+          </w:p>
+        </w:tc>
+      </w:tr>
+    </w:tbl>
+    <w:p>
+      <w:pPr>
+        <w:pStyle w:val="Heading1"/>
+      </w:pPr>
+      <w:r>
+        <w:t>DEAN PRATT  (P)</w:t>
+      </w:r>
+    </w:p>
+    <w:p>
+      <w:r>
+        <w:drawing>
+          <wp:inline xmlns:a="http://schemas.openxmlformats.org/drawingml/2006/main" xmlns:pic="http://schemas.openxmlformats.org/drawingml/2006/picture">
+            <wp:extent cx="1152000" cy="1152000"/>
+            <wp:docPr id="61" name="Picture 61"/>
+            <wp:cNvGraphicFramePr>
+              <a:graphicFrameLocks noChangeAspect="1"/>
+            </wp:cNvGraphicFramePr>
+            <a:graphic>
+              <a:graphicData uri="http://schemas.openxmlformats.org/drawingml/2006/picture">
+                <pic:pic>
+                  <pic:nvPicPr>
+                    <pic:cNvPr id="0" name="pratt-calm.png"/>
+                    <pic:cNvPicPr/>
+                  </pic:nvPicPr>
+                  <pic:blipFill>
+                    <a:blip r:embed="rId69"/>
+                    <a:stretch>
+                      <a:fillRect/>
+                    </a:stretch>
+                  </pic:blipFill>
+                  <pic:spPr>
+                    <a:xfrm>
+                      <a:off x="0" y="0"/>
+                      <a:ext cx="1152000" cy="1152000"/>
+                    </a:xfrm>
+                    <a:prstGeom prst="rect"/>
+                  </pic:spPr>
+                </pic:pic>
+              </a:graphicData>
+            </a:graphic>
+          </wp:inline>
+        </w:drawing>
+      </w:r>
+      <w:r>
+        <w:t xml:space="preserve">  </w:t>
+      </w:r>
+      <w:r>
+        <w:drawing>
+          <wp:inline xmlns:a="http://schemas.openxmlformats.org/drawingml/2006/main" xmlns:pic="http://schemas.openxmlformats.org/drawingml/2006/picture">
+            <wp:extent cx="1152000" cy="1152000"/>
+            <wp:docPr id="62" name="Picture 62"/>
+            <wp:cNvGraphicFramePr>
+              <a:graphicFrameLocks noChangeAspect="1"/>
+            </wp:cNvGraphicFramePr>
+            <a:graphic>
+              <a:graphicData uri="http://schemas.openxmlformats.org/drawingml/2006/picture">
+                <pic:pic>
+                  <pic:nvPicPr>
+                    <pic:cNvPr id="0" name="pratt-angry.png"/>
+                    <pic:cNvPicPr/>
+                  </pic:nvPicPr>
+                  <pic:blipFill>
+                    <a:blip r:embed="rId70"/>
+                    <a:stretch>
+                      <a:fillRect/>
+                    </a:stretch>
+                  </pic:blipFill>
+                  <pic:spPr>
+                    <a:xfrm>
+                      <a:off x="0" y="0"/>
+                      <a:ext cx="1152000" cy="1152000"/>
+                    </a:xfrm>
+                    <a:prstGeom prst="rect"/>
+                  </pic:spPr>
+                </pic:pic>
+              </a:graphicData>
+            </a:graphic>
+          </wp:inline>
+        </w:drawing>
+      </w:r>
+      <w:r>
+        <w:t xml:space="preserve">  </w:t>
+      </w:r>
+      <w:r>
+        <w:drawing>
+          <wp:inline xmlns:a="http://schemas.openxmlformats.org/drawingml/2006/main" xmlns:pic="http://schemas.openxmlformats.org/drawingml/2006/picture">
+            <wp:extent cx="1152000" cy="1152000"/>
+            <wp:docPr id="63" name="Picture 63"/>
+            <wp:cNvGraphicFramePr>
+              <a:graphicFrameLocks noChangeAspect="1"/>
+            </wp:cNvGraphicFramePr>
+            <a:graphic>
+              <a:graphicData uri="http://schemas.openxmlformats.org/drawingml/2006/picture">
+                <pic:pic>
+                  <pic:nvPicPr>
+                    <pic:cNvPr id="0" name="pratt-smile.png"/>
+                    <pic:cNvPicPr/>
+                  </pic:nvPicPr>
+                  <pic:blipFill>
+                    <a:blip r:embed="rId71"/>
+                    <a:stretch>
+                      <a:fillRect/>
+                    </a:stretch>
+                  </pic:blipFill>
+                  <pic:spPr>
+                    <a:xfrm>
+                      <a:off x="0" y="0"/>
+                      <a:ext cx="1152000" cy="1152000"/>
+                    </a:xfrm>
+                    <a:prstGeom prst="rect"/>
+                  </pic:spPr>
+                </pic:pic>
+              </a:graphicData>
+            </a:graphic>
+          </wp:inline>
+        </w:drawing>
+      </w:r>
+      <w:r>
+        <w:t xml:space="preserve">  </w:t>
+      </w:r>
+    </w:p>
+    <w:p>
+      <w:r>
+        <w:rPr>
+          <w:sz w:val="16"/>
+        </w:rPr>
+        <w:t>calm - angry - smiling</w:t>
+      </w:r>
+    </w:p>
+    <w:tbl>
+      <w:tblPr>
+        <w:tblStyle w:val="LightGrid-Accent1"/>
+        <w:tblW w:type="auto" w:w="0"/>
+        <w:tblLook w:firstColumn="1" w:firstRow="1" w:lastColumn="0" w:lastRow="0" w:noHBand="0" w:noVBand="1" w:val="04A0"/>
+      </w:tblPr>
+      <w:tblGrid>
+        <w:gridCol w:w="4320"/>
+        <w:gridCol w:w="4320"/>
+      </w:tblGrid>
+      <w:tr>
+        <w:tc>
+          <w:tcPr>
+            <w:tcW w:type="dxa" w:w="1984"/>
+          </w:tcPr>
+          <w:p>
+            <w:r>
+              <w:t>Who</w:t>
+            </w:r>
+          </w:p>
+        </w:tc>
+        <w:tc>
+          <w:tcPr>
+            <w:tcW w:type="dxa" w:w="7370"/>
+          </w:tcPr>
+          <w:p>
+            <w:r>
+              <w:t>Councilman Dean Pratt, who sells Crane the city's land; old-school charm.</w:t>
+            </w:r>
+          </w:p>
+        </w:tc>
+      </w:tr>
+      <w:tr>
+        <w:tc>
+          <w:tcPr>
+            <w:tcW w:type="dxa" w:w="1984"/>
+          </w:tcPr>
+          <w:p>
+            <w:r>
+              <w:t>Looks</w:t>
+            </w:r>
+          </w:p>
+        </w:tc>
+        <w:tc>
+          <w:tcPr>
+            <w:tcW w:type="dxa" w:w="7370"/>
+          </w:tcPr>
+          <w:p>
+            <w:r>
+              <w:t>Sixties, white hair, a seersucker suit and a bow tie.</w:t>
+            </w:r>
+          </w:p>
+        </w:tc>
+      </w:tr>
+      <w:tr>
+        <w:tc>
+          <w:tcPr>
+            <w:tcW w:type="dxa" w:w="1984"/>
+          </w:tcPr>
+          <w:p>
+            <w:r>
+              <w:t>Bubble colour</w:t>
+            </w:r>
+          </w:p>
+        </w:tc>
+        <w:tc>
+          <w:tcPr>
+            <w:tcW w:type="dxa" w:w="7370"/>
+          </w:tcPr>
+          <w:p>
+            <w:r>
+              <w:t>#c8e0ff</w:t>
+            </w:r>
+          </w:p>
+        </w:tc>
+      </w:tr>
+      <w:tr>
+        <w:tc>
+          <w:tcPr>
+            <w:tcW w:type="dxa" w:w="1984"/>
+          </w:tcPr>
+          <w:p>
+            <w:r>
+              <w:t>In the city</w:t>
+            </w:r>
+          </w:p>
+        </w:tc>
+        <w:tc>
+          <w:tcPr>
+            <w:tcW w:type="dxa" w:w="7370"/>
+          </w:tcPr>
+          <w:p>
+            <w:r>
+              <w:t>shirt #c8d8ec, trousers #c8d8ec</w:t>
+            </w:r>
+          </w:p>
+        </w:tc>
+      </w:tr>
+      <w:tr>
+        <w:tc>
+          <w:tcPr>
+            <w:tcW w:type="dxa" w:w="1984"/>
+          </w:tcPr>
+          <w:p>
+            <w:r>
+              <w:t>Portrait recipe</w:t>
+            </w:r>
+          </w:p>
+        </w:tc>
+        <w:tc>
+          <w:tcPr>
+            <w:tcW w:type="dxa" w:w="7370"/>
+          </w:tcPr>
+          <w:p>
+            <w:r>
+              <w:t>skin #eac6a8; hair #f0eeea (combed); facial hair: none; eyes #5a7aa0; hat: none; glasses: none; top: seersucker (#9ab8dc / #f4f2ea); extras: bowtie, wrinkles; old, normal build</w:t>
+            </w:r>
+          </w:p>
+        </w:tc>
+      </w:tr>
+      <w:tr>
+        <w:tc>
+          <w:tcPr>
+            <w:tcW w:type="dxa" w:w="1984"/>
+          </w:tcPr>
+          <w:p>
+            <w:r>
+              <w:t>Mumble</w:t>
+            </w:r>
+          </w:p>
+        </w:tc>
+        <w:tc>
+          <w:tcPr>
+            <w:tcW w:type="dxa" w:w="7370"/>
+          </w:tcPr>
+          <w:p>
+            <w:r>
+              <w:t>triangle wave, 140-220 Hz, 11 syllables a second, pauses 0.1 s</w:t>
+            </w:r>
+          </w:p>
+        </w:tc>
+      </w:tr>
+    </w:tbl>
+    <w:p>
+      <w:pPr>
+        <w:pStyle w:val="Heading1"/>
+      </w:pPr>
+      <w:r>
+        <w:t>SAL MORETTI  (S)</w:t>
+      </w:r>
+    </w:p>
+    <w:p>
+      <w:r>
+        <w:drawing>
+          <wp:inline xmlns:a="http://schemas.openxmlformats.org/drawingml/2006/main" xmlns:pic="http://schemas.openxmlformats.org/drawingml/2006/picture">
+            <wp:extent cx="1152000" cy="1152000"/>
+            <wp:docPr id="64" name="Picture 64"/>
+            <wp:cNvGraphicFramePr>
+              <a:graphicFrameLocks noChangeAspect="1"/>
+            </wp:cNvGraphicFramePr>
+            <a:graphic>
+              <a:graphicData uri="http://schemas.openxmlformats.org/drawingml/2006/picture">
+                <pic:pic>
+                  <pic:nvPicPr>
+                    <pic:cNvPr id="0" name="sal-calm.png"/>
+                    <pic:cNvPicPr/>
+                  </pic:nvPicPr>
+                  <pic:blipFill>
+                    <a:blip r:embed="rId72"/>
+                    <a:stretch>
+                      <a:fillRect/>
+                    </a:stretch>
+                  </pic:blipFill>
+                  <pic:spPr>
+                    <a:xfrm>
+                      <a:off x="0" y="0"/>
+                      <a:ext cx="1152000" cy="1152000"/>
+                    </a:xfrm>
+                    <a:prstGeom prst="rect"/>
+                  </pic:spPr>
+                </pic:pic>
+              </a:graphicData>
+            </a:graphic>
+          </wp:inline>
+        </w:drawing>
+      </w:r>
+      <w:r>
+        <w:t xml:space="preserve">  </w:t>
+      </w:r>
+      <w:r>
+        <w:drawing>
+          <wp:inline xmlns:a="http://schemas.openxmlformats.org/drawingml/2006/main" xmlns:pic="http://schemas.openxmlformats.org/drawingml/2006/picture">
+            <wp:extent cx="1152000" cy="1152000"/>
+            <wp:docPr id="65" name="Picture 65"/>
+            <wp:cNvGraphicFramePr>
+              <a:graphicFrameLocks noChangeAspect="1"/>
+            </wp:cNvGraphicFramePr>
+            <a:graphic>
+              <a:graphicData uri="http://schemas.openxmlformats.org/drawingml/2006/picture">
+                <pic:pic>
+                  <pic:nvPicPr>
+                    <pic:cNvPr id="0" name="sal-angry.png"/>
+                    <pic:cNvPicPr/>
+                  </pic:nvPicPr>
+                  <pic:blipFill>
+                    <a:blip r:embed="rId73"/>
+                    <a:stretch>
+                      <a:fillRect/>
+                    </a:stretch>
+                  </pic:blipFill>
+                  <pic:spPr>
+                    <a:xfrm>
+                      <a:off x="0" y="0"/>
+                      <a:ext cx="1152000" cy="1152000"/>
+                    </a:xfrm>
+                    <a:prstGeom prst="rect"/>
+                  </pic:spPr>
+                </pic:pic>
+              </a:graphicData>
+            </a:graphic>
+          </wp:inline>
+        </w:drawing>
+      </w:r>
+      <w:r>
+        <w:t xml:space="preserve">  </w:t>
+      </w:r>
+      <w:r>
+        <w:drawing>
+          <wp:inline xmlns:a="http://schemas.openxmlformats.org/drawingml/2006/main" xmlns:pic="http://schemas.openxmlformats.org/drawingml/2006/picture">
+            <wp:extent cx="1152000" cy="1152000"/>
+            <wp:docPr id="66" name="Picture 66"/>
+            <wp:cNvGraphicFramePr>
+              <a:graphicFrameLocks noChangeAspect="1"/>
+            </wp:cNvGraphicFramePr>
+            <a:graphic>
+              <a:graphicData uri="http://schemas.openxmlformats.org/drawingml/2006/picture">
+                <pic:pic>
+                  <pic:nvPicPr>
+                    <pic:cNvPr id="0" name="sal-smile.png"/>
+                    <pic:cNvPicPr/>
+                  </pic:nvPicPr>
+                  <pic:blipFill>
+                    <a:blip r:embed="rId74"/>
+                    <a:stretch>
+                      <a:fillRect/>
+                    </a:stretch>
+                  </pic:blipFill>
+                  <pic:spPr>
+                    <a:xfrm>
+                      <a:off x="0" y="0"/>
+                      <a:ext cx="1152000" cy="1152000"/>
+                    </a:xfrm>
+                    <a:prstGeom prst="rect"/>
+                  </pic:spPr>
+                </pic:pic>
+              </a:graphicData>
+            </a:graphic>
+          </wp:inline>
+        </w:drawing>
+      </w:r>
+      <w:r>
+        <w:t xml:space="preserve">  </w:t>
+      </w:r>
+    </w:p>
+    <w:p>
+      <w:r>
+        <w:rPr>
+          <w:sz w:val="16"/>
+        </w:rPr>
+        <w:t>calm - angry - smiling</w:t>
+      </w:r>
+    </w:p>
+    <w:tbl>
+      <w:tblPr>
+        <w:tblStyle w:val="LightGrid-Accent1"/>
+        <w:tblW w:type="auto" w:w="0"/>
+        <w:tblLook w:firstColumn="1" w:firstRow="1" w:lastColumn="0" w:lastRow="0" w:noHBand="0" w:noVBand="1" w:val="04A0"/>
+      </w:tblPr>
+      <w:tblGrid>
+        <w:gridCol w:w="4320"/>
+        <w:gridCol w:w="4320"/>
+      </w:tblGrid>
+      <w:tr>
+        <w:tc>
+          <w:tcPr>
+            <w:tcW w:type="dxa" w:w="1984"/>
+          </w:tcPr>
+          <w:p>
+            <w:r>
+              <w:t>Who</w:t>
+            </w:r>
+          </w:p>
+        </w:tc>
+        <w:tc>
+          <w:tcPr>
+            <w:tcW w:type="dxa" w:w="7370"/>
+          </w:tcPr>
+          <w:p>
+            <w:r>
+              <w:t>A lifer on Iron Key: Crane's first partner in the 70s, framed by Crane for a murder Crane did; twenty years inside, calm, patient, plays chess.</w:t>
+            </w:r>
+          </w:p>
+        </w:tc>
+      </w:tr>
+      <w:tr>
+        <w:tc>
+          <w:tcPr>
+            <w:tcW w:type="dxa" w:w="1984"/>
+          </w:tcPr>
+          <w:p>
+            <w:r>
+              <w:t>Looks</w:t>
+            </w:r>
+          </w:p>
+        </w:tc>
+        <w:tc>
+          <w:tcPr>
+            <w:tcW w:type="dxa" w:w="7370"/>
+          </w:tcPr>
+          <w:p>
+            <w:r>
+              <w:t>Sixties, short grey hair combed back, a grey moustache, reading glasses, prison blues buttoned to the top; calm eyes.</w:t>
+            </w:r>
+          </w:p>
+        </w:tc>
+      </w:tr>
+      <w:tr>
+        <w:tc>
+          <w:tcPr>
+            <w:tcW w:type="dxa" w:w="1984"/>
+          </w:tcPr>
+          <w:p>
+            <w:r>
+              <w:t>Bubble colour</w:t>
+            </w:r>
+          </w:p>
+        </w:tc>
+        <w:tc>
+          <w:tcPr>
+            <w:tcW w:type="dxa" w:w="7370"/>
+          </w:tcPr>
+          <w:p>
+            <w:r>
+              <w:t>#a8b8a0</w:t>
+            </w:r>
+          </w:p>
+        </w:tc>
+      </w:tr>
+      <w:tr>
+        <w:tc>
+          <w:tcPr>
+            <w:tcW w:type="dxa" w:w="1984"/>
+          </w:tcPr>
+          <w:p>
+            <w:r>
+              <w:t>In the city</w:t>
+            </w:r>
+          </w:p>
+        </w:tc>
+        <w:tc>
+          <w:tcPr>
+            <w:tcW w:type="dxa" w:w="7370"/>
+          </w:tcPr>
+          <w:p>
+            <w:r>
+              <w:t>shirt #4a6a9a, trousers #3a5480</w:t>
+            </w:r>
+          </w:p>
+        </w:tc>
+      </w:tr>
+      <w:tr>
+        <w:tc>
+          <w:tcPr>
+            <w:tcW w:type="dxa" w:w="1984"/>
+          </w:tcPr>
+          <w:p>
+            <w:r>
+              <w:t>Portrait recipe</w:t>
+            </w:r>
+          </w:p>
+        </w:tc>
+        <w:tc>
+          <w:tcPr>
+            <w:tcW w:type="dxa" w:w="7370"/>
+          </w:tcPr>
+          <w:p>
+            <w:r>
+              <w:t>skin #d4a882; hair #a8a8ac (combed); facial hair: moustache; eyes #4a4030; hat: none; glasses: reading; top: buttoned (#4a6a9a / #3a5480); extras: wrinkles; old, slim build</w:t>
+            </w:r>
+          </w:p>
+        </w:tc>
+      </w:tr>
+      <w:tr>
+        <w:tc>
+          <w:tcPr>
+            <w:tcW w:type="dxa" w:w="1984"/>
+          </w:tcPr>
+          <w:p>
+            <w:r>
+              <w:t>Mumble</w:t>
+            </w:r>
+          </w:p>
+        </w:tc>
+        <w:tc>
+          <w:tcPr>
+            <w:tcW w:type="dxa" w:w="7370"/>
+          </w:tcPr>
+          <w:p>
+            <w:r>
+              <w:t>sine wave, 90-130 Hz, 6 syllables a second, pauses 0.24 s</w:t>
+            </w:r>
+          </w:p>
+        </w:tc>
+      </w:tr>
+    </w:tbl>
+    <w:p>
+      <w:pPr>
+        <w:pStyle w:val="Heading1"/>
+      </w:pPr>
+      <w:r>
+        <w:t>DR. IRIS KAHN  (K)</w:t>
+      </w:r>
+    </w:p>
+    <w:p>
+      <w:r>
+        <w:drawing>
+          <wp:inline xmlns:a="http://schemas.openxmlformats.org/drawingml/2006/main" xmlns:pic="http://schemas.openxmlformats.org/drawingml/2006/picture">
+            <wp:extent cx="1152000" cy="1152000"/>
+            <wp:docPr id="67" name="Picture 67"/>
+            <wp:cNvGraphicFramePr>
+              <a:graphicFrameLocks noChangeAspect="1"/>
+            </wp:cNvGraphicFramePr>
+            <a:graphic>
+              <a:graphicData uri="http://schemas.openxmlformats.org/drawingml/2006/picture">
+                <pic:pic>
+                  <pic:nvPicPr>
+                    <pic:cNvPr id="0" name="iris-calm.png"/>
+                    <pic:cNvPicPr/>
+                  </pic:nvPicPr>
+                  <pic:blipFill>
+                    <a:blip r:embed="rId75"/>
+                    <a:stretch>
+                      <a:fillRect/>
+                    </a:stretch>
+                  </pic:blipFill>
+                  <pic:spPr>
+                    <a:xfrm>
+                      <a:off x="0" y="0"/>
+                      <a:ext cx="1152000" cy="1152000"/>
+                    </a:xfrm>
+                    <a:prstGeom prst="rect"/>
+                  </pic:spPr>
+                </pic:pic>
+              </a:graphicData>
+            </a:graphic>
+          </wp:inline>
+        </w:drawing>
+      </w:r>
+      <w:r>
+        <w:t xml:space="preserve">  </w:t>
+      </w:r>
+      <w:r>
+        <w:drawing>
+          <wp:inline xmlns:a="http://schemas.openxmlformats.org/drawingml/2006/main" xmlns:pic="http://schemas.openxmlformats.org/drawingml/2006/picture">
+            <wp:extent cx="1152000" cy="1152000"/>
+            <wp:docPr id="68" name="Picture 68"/>
+            <wp:cNvGraphicFramePr>
+              <a:graphicFrameLocks noChangeAspect="1"/>
+            </wp:cNvGraphicFramePr>
+            <a:graphic>
+              <a:graphicData uri="http://schemas.openxmlformats.org/drawingml/2006/picture">
+                <pic:pic>
+                  <pic:nvPicPr>
+                    <pic:cNvPr id="0" name="iris-angry.png"/>
+                    <pic:cNvPicPr/>
+                  </pic:nvPicPr>
+                  <pic:blipFill>
+                    <a:blip r:embed="rId76"/>
+                    <a:stretch>
+                      <a:fillRect/>
+                    </a:stretch>
+                  </pic:blipFill>
+                  <pic:spPr>
+                    <a:xfrm>
+                      <a:off x="0" y="0"/>
+                      <a:ext cx="1152000" cy="1152000"/>
+                    </a:xfrm>
+                    <a:prstGeom prst="rect"/>
+                  </pic:spPr>
+                </pic:pic>
+              </a:graphicData>
+            </a:graphic>
+          </wp:inline>
+        </w:drawing>
+      </w:r>
+      <w:r>
+        <w:t xml:space="preserve">  </w:t>
+      </w:r>
+      <w:r>
+        <w:drawing>
+          <wp:inline xmlns:a="http://schemas.openxmlformats.org/drawingml/2006/main" xmlns:pic="http://schemas.openxmlformats.org/drawingml/2006/picture">
+            <wp:extent cx="1152000" cy="1152000"/>
+            <wp:docPr id="69" name="Picture 69"/>
+            <wp:cNvGraphicFramePr>
+              <a:graphicFrameLocks noChangeAspect="1"/>
+            </wp:cNvGraphicFramePr>
+            <a:graphic>
+              <a:graphicData uri="http://schemas.openxmlformats.org/drawingml/2006/picture">
+                <pic:pic>
+                  <pic:nvPicPr>
+                    <pic:cNvPr id="0" name="iris-smile.png"/>
+                    <pic:cNvPicPr/>
+                  </pic:nvPicPr>
+                  <pic:blipFill>
+                    <a:blip r:embed="rId77"/>
+                    <a:stretch>
+                      <a:fillRect/>
+                    </a:stretch>
+                  </pic:blipFill>
+                  <pic:spPr>
+                    <a:xfrm>
+                      <a:off x="0" y="0"/>
+                      <a:ext cx="1152000" cy="1152000"/>
+                    </a:xfrm>
+                    <a:prstGeom prst="rect"/>
+                  </pic:spPr>
+                </pic:pic>
+              </a:graphicData>
+            </a:graphic>
+          </wp:inline>
+        </w:drawing>
+      </w:r>
+      <w:r>
+        <w:t xml:space="preserve">  </w:t>
+      </w:r>
+    </w:p>
+    <w:p>
+      <w:r>
+        <w:rPr>
+          <w:sz w:val="16"/>
+        </w:rPr>
+        <w:t>calm - angry - smiling</w:t>
+      </w:r>
+    </w:p>
+    <w:tbl>
+      <w:tblPr>
+        <w:tblStyle w:val="LightGrid-Accent1"/>
+        <w:tblW w:type="auto" w:w="0"/>
+        <w:tblLook w:firstColumn="1" w:firstRow="1" w:lastColumn="0" w:lastRow="0" w:noHBand="0" w:noVBand="1" w:val="04A0"/>
+      </w:tblPr>
+      <w:tblGrid>
+        <w:gridCol w:w="4320"/>
+        <w:gridCol w:w="4320"/>
+      </w:tblGrid>
+      <w:tr>
+        <w:tc>
+          <w:tcPr>
+            <w:tcW w:type="dxa" w:w="1984"/>
+          </w:tcPr>
+          <w:p>
+            <w:r>
+              <w:t>Who</w:t>
+            </w:r>
+          </w:p>
+        </w:tc>
+        <w:tc>
+          <w:tcPr>
+            <w:tcW w:type="dxa" w:w="7370"/>
+          </w:tcPr>
+          <w:p>
+            <w:r>
+              <w:t>A rocket engineer at the space center, brilliant and stubborn; her last launch is all that keeps the center open.</w:t>
+            </w:r>
+          </w:p>
+        </w:tc>
+      </w:tr>
+      <w:tr>
+        <w:tc>
+          <w:tcPr>
+            <w:tcW w:type="dxa" w:w="1984"/>
+          </w:tcPr>
+          <w:p>
+            <w:r>
+              <w:t>Looks</w:t>
+            </w:r>
+          </w:p>
+        </w:tc>
+        <w:tc>
+          <w:tcPr>
+            <w:tcW w:type="dxa" w:w="7370"/>
+          </w:tcPr>
+          <w:p>
+            <w:r>
+              <w:t>Forties, dark curly hair in a messy bun, big square glasses, a white lab coat over a mission T-shirt, a pencil behind her ear.</w:t>
+            </w:r>
+          </w:p>
+        </w:tc>
+      </w:tr>
+      <w:tr>
+        <w:tc>
+          <w:tcPr>
+            <w:tcW w:type="dxa" w:w="1984"/>
+          </w:tcPr>
+          <w:p>
+            <w:r>
+              <w:t>Bubble colour</w:t>
+            </w:r>
+          </w:p>
+        </w:tc>
+        <w:tc>
+          <w:tcPr>
+            <w:tcW w:type="dxa" w:w="7370"/>
+          </w:tcPr>
+          <w:p>
+            <w:r>
+              <w:t>#6affc0</w:t>
+            </w:r>
+          </w:p>
+        </w:tc>
+      </w:tr>
+      <w:tr>
+        <w:tc>
+          <w:tcPr>
+            <w:tcW w:type="dxa" w:w="1984"/>
+          </w:tcPr>
+          <w:p>
+            <w:r>
+              <w:t>In the city</w:t>
+            </w:r>
+          </w:p>
+        </w:tc>
+        <w:tc>
+          <w:tcPr>
+            <w:tcW w:type="dxa" w:w="7370"/>
+          </w:tcPr>
+          <w:p>
+            <w:r>
+              <w:t>shirt #f0f0f0, trousers #2a2a40</w:t>
+            </w:r>
+          </w:p>
+        </w:tc>
+      </w:tr>
+      <w:tr>
+        <w:tc>
+          <w:tcPr>
+            <w:tcW w:type="dxa" w:w="1984"/>
+          </w:tcPr>
+          <w:p>
+            <w:r>
+              <w:t>Portrait recipe</w:t>
+            </w:r>
+          </w:p>
+        </w:tc>
+        <w:tc>
+          <w:tcPr>
+            <w:tcW w:type="dxa" w:w="7370"/>
+          </w:tcPr>
+          <w:p>
+            <w:r>
+              <w:t>skin #d8a888; hair #2a1c18 (bun); facial hair: none; eyes #3a2a1a; hat: none; glasses: square; top: labcoat (#f0f0f0 / #2a3a6a); extras: pencil; mid, slim build</w:t>
+            </w:r>
+          </w:p>
+        </w:tc>
+      </w:tr>
+      <w:tr>
+        <w:tc>
+          <w:tcPr>
+            <w:tcW w:type="dxa" w:w="1984"/>
+          </w:tcPr>
+          <w:p>
+            <w:r>
+              <w:t>Mumble</w:t>
+            </w:r>
+          </w:p>
+        </w:tc>
+        <w:tc>
+          <w:tcPr>
+            <w:tcW w:type="dxa" w:w="7370"/>
+          </w:tcPr>
+          <w:p>
+            <w:r>
+              <w:t>triangle wave, 230-360 Hz, 14 syllables a second, pauses 0.04 s</w:t>
+            </w:r>
+          </w:p>
+        </w:tc>
+      </w:tr>
+    </w:tbl>
     <w:sectPr>
       <w:pgSz w:w="12240" w:h="15840"/>
       <w:pgMar w:top="1440" w:right="1800" w:bottom="1440" w:left="1800" w:header="720" w:footer="720" w:gutter="0"/>

</xml_diff>

<commit_message>
Chapter 1's minor people: Manny, Uncle Saul, Lucky Lou, the fare and Kessler's men, with their portraits
Co-Authored-By: Claude <noreply@anthropic.com>
Claude-Session: https://claude.ai/code/session_01RpWbq89r71C1p9HP7EcbZ5
</commit_message>
<xml_diff>
--- a/docs/Characters.docx
+++ b/docs/Characters.docx
@@ -6271,6 +6271,1366 @@
           <w:p>
             <w:r>
               <w:t>triangle wave, 230-360 Hz, 14 syllables a second, pauses 0.04 s</w:t>
+            </w:r>
+          </w:p>
+        </w:tc>
+      </w:tr>
+    </w:tbl>
+    <w:p>
+      <w:pPr>
+        <w:pStyle w:val="Heading1"/>
+      </w:pPr>
+      <w:r>
+        <w:t>MANNY  (G)</w:t>
+      </w:r>
+    </w:p>
+    <w:p>
+      <w:r>
+        <w:drawing>
+          <wp:inline xmlns:a="http://schemas.openxmlformats.org/drawingml/2006/main" xmlns:pic="http://schemas.openxmlformats.org/drawingml/2006/picture">
+            <wp:extent cx="1152000" cy="1152000"/>
+            <wp:docPr id="70" name="Picture 70"/>
+            <wp:cNvGraphicFramePr>
+              <a:graphicFrameLocks noChangeAspect="1"/>
+            </wp:cNvGraphicFramePr>
+            <a:graphic>
+              <a:graphicData uri="http://schemas.openxmlformats.org/drawingml/2006/picture">
+                <pic:pic>
+                  <pic:nvPicPr>
+                    <pic:cNvPr id="0" name="manny-calm.png"/>
+                    <pic:cNvPicPr/>
+                  </pic:nvPicPr>
+                  <pic:blipFill>
+                    <a:blip r:embed="rId78"/>
+                    <a:stretch>
+                      <a:fillRect/>
+                    </a:stretch>
+                  </pic:blipFill>
+                  <pic:spPr>
+                    <a:xfrm>
+                      <a:off x="0" y="0"/>
+                      <a:ext cx="1152000" cy="1152000"/>
+                    </a:xfrm>
+                    <a:prstGeom prst="rect"/>
+                  </pic:spPr>
+                </pic:pic>
+              </a:graphicData>
+            </a:graphic>
+          </wp:inline>
+        </w:drawing>
+      </w:r>
+      <w:r>
+        <w:t xml:space="preserve">  </w:t>
+      </w:r>
+      <w:r>
+        <w:drawing>
+          <wp:inline xmlns:a="http://schemas.openxmlformats.org/drawingml/2006/main" xmlns:pic="http://schemas.openxmlformats.org/drawingml/2006/picture">
+            <wp:extent cx="1152000" cy="1152000"/>
+            <wp:docPr id="71" name="Picture 71"/>
+            <wp:cNvGraphicFramePr>
+              <a:graphicFrameLocks noChangeAspect="1"/>
+            </wp:cNvGraphicFramePr>
+            <a:graphic>
+              <a:graphicData uri="http://schemas.openxmlformats.org/drawingml/2006/picture">
+                <pic:pic>
+                  <pic:nvPicPr>
+                    <pic:cNvPr id="0" name="manny-angry.png"/>
+                    <pic:cNvPicPr/>
+                  </pic:nvPicPr>
+                  <pic:blipFill>
+                    <a:blip r:embed="rId79"/>
+                    <a:stretch>
+                      <a:fillRect/>
+                    </a:stretch>
+                  </pic:blipFill>
+                  <pic:spPr>
+                    <a:xfrm>
+                      <a:off x="0" y="0"/>
+                      <a:ext cx="1152000" cy="1152000"/>
+                    </a:xfrm>
+                    <a:prstGeom prst="rect"/>
+                  </pic:spPr>
+                </pic:pic>
+              </a:graphicData>
+            </a:graphic>
+          </wp:inline>
+        </w:drawing>
+      </w:r>
+      <w:r>
+        <w:t xml:space="preserve">  </w:t>
+      </w:r>
+      <w:r>
+        <w:drawing>
+          <wp:inline xmlns:a="http://schemas.openxmlformats.org/drawingml/2006/main" xmlns:pic="http://schemas.openxmlformats.org/drawingml/2006/picture">
+            <wp:extent cx="1152000" cy="1152000"/>
+            <wp:docPr id="72" name="Picture 72"/>
+            <wp:cNvGraphicFramePr>
+              <a:graphicFrameLocks noChangeAspect="1"/>
+            </wp:cNvGraphicFramePr>
+            <a:graphic>
+              <a:graphicData uri="http://schemas.openxmlformats.org/drawingml/2006/picture">
+                <pic:pic>
+                  <pic:nvPicPr>
+                    <pic:cNvPr id="0" name="manny-smile.png"/>
+                    <pic:cNvPicPr/>
+                  </pic:nvPicPr>
+                  <pic:blipFill>
+                    <a:blip r:embed="rId80"/>
+                    <a:stretch>
+                      <a:fillRect/>
+                    </a:stretch>
+                  </pic:blipFill>
+                  <pic:spPr>
+                    <a:xfrm>
+                      <a:off x="0" y="0"/>
+                      <a:ext cx="1152000" cy="1152000"/>
+                    </a:xfrm>
+                    <a:prstGeom prst="rect"/>
+                  </pic:spPr>
+                </pic:pic>
+              </a:graphicData>
+            </a:graphic>
+          </wp:inline>
+        </w:drawing>
+      </w:r>
+      <w:r>
+        <w:t xml:space="preserve">  </w:t>
+      </w:r>
+    </w:p>
+    <w:p>
+      <w:r>
+        <w:rPr>
+          <w:sz w:val="16"/>
+        </w:rPr>
+        <w:t>calm - angry - smiling</w:t>
+      </w:r>
+    </w:p>
+    <w:tbl>
+      <w:tblPr>
+        <w:tblStyle w:val="LightGrid-Accent1"/>
+        <w:tblW w:type="auto" w:w="0"/>
+        <w:tblLook w:firstColumn="1" w:firstRow="1" w:lastColumn="0" w:lastRow="0" w:noHBand="0" w:noVBand="1" w:val="04A0"/>
+      </w:tblPr>
+      <w:tblGrid>
+        <w:gridCol w:w="4320"/>
+        <w:gridCol w:w="4320"/>
+      </w:tblGrid>
+      <w:tr>
+        <w:tc>
+          <w:tcPr>
+            <w:tcW w:type="dxa" w:w="1984"/>
+          </w:tcPr>
+          <w:p>
+            <w:r>
+              <w:t>Who</w:t>
+            </w:r>
+          </w:p>
+        </w:tc>
+        <w:tc>
+          <w:tcPr>
+            <w:tcW w:type="dxa" w:w="7370"/>
+          </w:tcPr>
+          <w:p>
+            <w:r>
+              <w:t>Owner of Manny's Auto in Dockside, where Mateo worked as a mechanic; grumpy, fond of Mateo.</w:t>
+            </w:r>
+          </w:p>
+        </w:tc>
+      </w:tr>
+      <w:tr>
+        <w:tc>
+          <w:tcPr>
+            <w:tcW w:type="dxa" w:w="1984"/>
+          </w:tcPr>
+          <w:p>
+            <w:r>
+              <w:t>Looks</w:t>
+            </w:r>
+          </w:p>
+        </w:tc>
+        <w:tc>
+          <w:tcPr>
+            <w:tcW w:type="dxa" w:w="7370"/>
+          </w:tcPr>
+          <w:p>
+            <w:r>
+              <w:t>Sixties, a grey beard, short grey hair, a greasy blue jumpsuit with MANNY on it, a red rag over the shoulder.</w:t>
+            </w:r>
+          </w:p>
+        </w:tc>
+      </w:tr>
+      <w:tr>
+        <w:tc>
+          <w:tcPr>
+            <w:tcW w:type="dxa" w:w="1984"/>
+          </w:tcPr>
+          <w:p>
+            <w:r>
+              <w:t>Bubble colour</w:t>
+            </w:r>
+          </w:p>
+        </w:tc>
+        <w:tc>
+          <w:tcPr>
+            <w:tcW w:type="dxa" w:w="7370"/>
+          </w:tcPr>
+          <w:p>
+            <w:r>
+              <w:t>#d08a4a</w:t>
+            </w:r>
+          </w:p>
+        </w:tc>
+      </w:tr>
+      <w:tr>
+        <w:tc>
+          <w:tcPr>
+            <w:tcW w:type="dxa" w:w="1984"/>
+          </w:tcPr>
+          <w:p>
+            <w:r>
+              <w:t>In the city</w:t>
+            </w:r>
+          </w:p>
+        </w:tc>
+        <w:tc>
+          <w:tcPr>
+            <w:tcW w:type="dxa" w:w="7370"/>
+          </w:tcPr>
+          <w:p>
+            <w:r>
+              <w:t>shirt #2a4a8a, trousers #2a4a8a</w:t>
+            </w:r>
+          </w:p>
+        </w:tc>
+      </w:tr>
+      <w:tr>
+        <w:tc>
+          <w:tcPr>
+            <w:tcW w:type="dxa" w:w="1984"/>
+          </w:tcPr>
+          <w:p>
+            <w:r>
+              <w:t>Portrait recipe</w:t>
+            </w:r>
+          </w:p>
+        </w:tc>
+        <w:tc>
+          <w:tcPr>
+            <w:tcW w:type="dxa" w:w="7370"/>
+          </w:tcPr>
+          <w:p>
+            <w:r>
+              <w:t>skin #c8946a; hair #b8b8bc (short); facial hair: beard; eyes #4a3a2a; hat: none; glasses: none; top: jumpsuit (#2a4a8a / #1e3a6e); extras: wrinkles, rag; old, broad build</w:t>
+            </w:r>
+          </w:p>
+        </w:tc>
+      </w:tr>
+      <w:tr>
+        <w:tc>
+          <w:tcPr>
+            <w:tcW w:type="dxa" w:w="1984"/>
+          </w:tcPr>
+          <w:p>
+            <w:r>
+              <w:t>Mumble</w:t>
+            </w:r>
+          </w:p>
+        </w:tc>
+        <w:tc>
+          <w:tcPr>
+            <w:tcW w:type="dxa" w:w="7370"/>
+          </w:tcPr>
+          <w:p>
+            <w:r>
+              <w:t>sawtooth wave, 85-125 Hz, 8 syllables a second, pauses 0.16 s</w:t>
+            </w:r>
+          </w:p>
+        </w:tc>
+      </w:tr>
+    </w:tbl>
+    <w:p>
+      <w:pPr>
+        <w:pStyle w:val="Heading1"/>
+      </w:pPr>
+      <w:r>
+        <w:t>UNCLE SAUL  (U)</w:t>
+      </w:r>
+    </w:p>
+    <w:p>
+      <w:r>
+        <w:drawing>
+          <wp:inline xmlns:a="http://schemas.openxmlformats.org/drawingml/2006/main" xmlns:pic="http://schemas.openxmlformats.org/drawingml/2006/picture">
+            <wp:extent cx="1152000" cy="1152000"/>
+            <wp:docPr id="73" name="Picture 73"/>
+            <wp:cNvGraphicFramePr>
+              <a:graphicFrameLocks noChangeAspect="1"/>
+            </wp:cNvGraphicFramePr>
+            <a:graphic>
+              <a:graphicData uri="http://schemas.openxmlformats.org/drawingml/2006/picture">
+                <pic:pic>
+                  <pic:nvPicPr>
+                    <pic:cNvPr id="0" name="saul-calm.png"/>
+                    <pic:cNvPicPr/>
+                  </pic:nvPicPr>
+                  <pic:blipFill>
+                    <a:blip r:embed="rId81"/>
+                    <a:stretch>
+                      <a:fillRect/>
+                    </a:stretch>
+                  </pic:blipFill>
+                  <pic:spPr>
+                    <a:xfrm>
+                      <a:off x="0" y="0"/>
+                      <a:ext cx="1152000" cy="1152000"/>
+                    </a:xfrm>
+                    <a:prstGeom prst="rect"/>
+                  </pic:spPr>
+                </pic:pic>
+              </a:graphicData>
+            </a:graphic>
+          </wp:inline>
+        </w:drawing>
+      </w:r>
+      <w:r>
+        <w:t xml:space="preserve">  </w:t>
+      </w:r>
+      <w:r>
+        <w:drawing>
+          <wp:inline xmlns:a="http://schemas.openxmlformats.org/drawingml/2006/main" xmlns:pic="http://schemas.openxmlformats.org/drawingml/2006/picture">
+            <wp:extent cx="1152000" cy="1152000"/>
+            <wp:docPr id="74" name="Picture 74"/>
+            <wp:cNvGraphicFramePr>
+              <a:graphicFrameLocks noChangeAspect="1"/>
+            </wp:cNvGraphicFramePr>
+            <a:graphic>
+              <a:graphicData uri="http://schemas.openxmlformats.org/drawingml/2006/picture">
+                <pic:pic>
+                  <pic:nvPicPr>
+                    <pic:cNvPr id="0" name="saul-angry.png"/>
+                    <pic:cNvPicPr/>
+                  </pic:nvPicPr>
+                  <pic:blipFill>
+                    <a:blip r:embed="rId82"/>
+                    <a:stretch>
+                      <a:fillRect/>
+                    </a:stretch>
+                  </pic:blipFill>
+                  <pic:spPr>
+                    <a:xfrm>
+                      <a:off x="0" y="0"/>
+                      <a:ext cx="1152000" cy="1152000"/>
+                    </a:xfrm>
+                    <a:prstGeom prst="rect"/>
+                  </pic:spPr>
+                </pic:pic>
+              </a:graphicData>
+            </a:graphic>
+          </wp:inline>
+        </w:drawing>
+      </w:r>
+      <w:r>
+        <w:t xml:space="preserve">  </w:t>
+      </w:r>
+      <w:r>
+        <w:drawing>
+          <wp:inline xmlns:a="http://schemas.openxmlformats.org/drawingml/2006/main" xmlns:pic="http://schemas.openxmlformats.org/drawingml/2006/picture">
+            <wp:extent cx="1152000" cy="1152000"/>
+            <wp:docPr id="75" name="Picture 75"/>
+            <wp:cNvGraphicFramePr>
+              <a:graphicFrameLocks noChangeAspect="1"/>
+            </wp:cNvGraphicFramePr>
+            <a:graphic>
+              <a:graphicData uri="http://schemas.openxmlformats.org/drawingml/2006/picture">
+                <pic:pic>
+                  <pic:nvPicPr>
+                    <pic:cNvPr id="0" name="saul-smile.png"/>
+                    <pic:cNvPicPr/>
+                  </pic:nvPicPr>
+                  <pic:blipFill>
+                    <a:blip r:embed="rId83"/>
+                    <a:stretch>
+                      <a:fillRect/>
+                    </a:stretch>
+                  </pic:blipFill>
+                  <pic:spPr>
+                    <a:xfrm>
+                      <a:off x="0" y="0"/>
+                      <a:ext cx="1152000" cy="1152000"/>
+                    </a:xfrm>
+                    <a:prstGeom prst="rect"/>
+                  </pic:spPr>
+                </pic:pic>
+              </a:graphicData>
+            </a:graphic>
+          </wp:inline>
+        </w:drawing>
+      </w:r>
+      <w:r>
+        <w:t xml:space="preserve">  </w:t>
+      </w:r>
+    </w:p>
+    <w:p>
+      <w:r>
+        <w:rPr>
+          <w:sz w:val="16"/>
+        </w:rPr>
+        <w:t>calm - angry - smiling</w:t>
+      </w:r>
+    </w:p>
+    <w:tbl>
+      <w:tblPr>
+        <w:tblStyle w:val="LightGrid-Accent1"/>
+        <w:tblW w:type="auto" w:w="0"/>
+        <w:tblLook w:firstColumn="1" w:firstRow="1" w:lastColumn="0" w:lastRow="0" w:noHBand="0" w:noVBand="1" w:val="04A0"/>
+      </w:tblPr>
+      <w:tblGrid>
+        <w:gridCol w:w="4320"/>
+        <w:gridCol w:w="4320"/>
+      </w:tblGrid>
+      <w:tr>
+        <w:tc>
+          <w:tcPr>
+            <w:tcW w:type="dxa" w:w="1984"/>
+          </w:tcPr>
+          <w:p>
+            <w:r>
+              <w:t>Who</w:t>
+            </w:r>
+          </w:p>
+        </w:tc>
+        <w:tc>
+          <w:tcPr>
+            <w:tcW w:type="dxa" w:w="7370"/>
+          </w:tcPr>
+          <w:p>
+            <w:r>
+              <w:t>Papa Joe's old friend, the pawnbroker in Mercado; takes Joe's parcels, asks no questions.</w:t>
+            </w:r>
+          </w:p>
+        </w:tc>
+      </w:tr>
+      <w:tr>
+        <w:tc>
+          <w:tcPr>
+            <w:tcW w:type="dxa" w:w="1984"/>
+          </w:tcPr>
+          <w:p>
+            <w:r>
+              <w:t>Looks</w:t>
+            </w:r>
+          </w:p>
+        </w:tc>
+        <w:tc>
+          <w:tcPr>
+            <w:tcW w:type="dxa" w:w="7370"/>
+          </w:tcPr>
+          <w:p>
+            <w:r>
+              <w:t>Seventies, bald with white tufts, a jeweller's loupe pushed up on his glasses, a grey cardigan over a cream shirt.</w:t>
+            </w:r>
+          </w:p>
+        </w:tc>
+      </w:tr>
+      <w:tr>
+        <w:tc>
+          <w:tcPr>
+            <w:tcW w:type="dxa" w:w="1984"/>
+          </w:tcPr>
+          <w:p>
+            <w:r>
+              <w:t>Bubble colour</w:t>
+            </w:r>
+          </w:p>
+        </w:tc>
+        <w:tc>
+          <w:tcPr>
+            <w:tcW w:type="dxa" w:w="7370"/>
+          </w:tcPr>
+          <w:p>
+            <w:r>
+              <w:t>#d8c890</w:t>
+            </w:r>
+          </w:p>
+        </w:tc>
+      </w:tr>
+      <w:tr>
+        <w:tc>
+          <w:tcPr>
+            <w:tcW w:type="dxa" w:w="1984"/>
+          </w:tcPr>
+          <w:p>
+            <w:r>
+              <w:t>In the city</w:t>
+            </w:r>
+          </w:p>
+        </w:tc>
+        <w:tc>
+          <w:tcPr>
+            <w:tcW w:type="dxa" w:w="7370"/>
+          </w:tcPr>
+          <w:p>
+            <w:r>
+              <w:t>shirt #7a7a80, trousers #3a3a40</w:t>
+            </w:r>
+          </w:p>
+        </w:tc>
+      </w:tr>
+      <w:tr>
+        <w:tc>
+          <w:tcPr>
+            <w:tcW w:type="dxa" w:w="1984"/>
+          </w:tcPr>
+          <w:p>
+            <w:r>
+              <w:t>Portrait recipe</w:t>
+            </w:r>
+          </w:p>
+        </w:tc>
+        <w:tc>
+          <w:tcPr>
+            <w:tcW w:type="dxa" w:w="7370"/>
+          </w:tcPr>
+          <w:p>
+            <w:r>
+              <w:t>skin #e2bc9a; hair #eeeeea (sides); facial hair: none; eyes #4a4a3a; hat: none; glasses: reading; top: cardigan (#7a7a80 / #e8e4d8); extras: wrinkles, loupe; old, slim build</w:t>
+            </w:r>
+          </w:p>
+        </w:tc>
+      </w:tr>
+      <w:tr>
+        <w:tc>
+          <w:tcPr>
+            <w:tcW w:type="dxa" w:w="1984"/>
+          </w:tcPr>
+          <w:p>
+            <w:r>
+              <w:t>Mumble</w:t>
+            </w:r>
+          </w:p>
+        </w:tc>
+        <w:tc>
+          <w:tcPr>
+            <w:tcW w:type="dxa" w:w="7370"/>
+          </w:tcPr>
+          <w:p>
+            <w:r>
+              <w:t>sine wave, 150-230 Hz, 9 syllables a second, pauses 0.14 s</w:t>
+            </w:r>
+          </w:p>
+        </w:tc>
+      </w:tr>
+    </w:tbl>
+    <w:p>
+      <w:pPr>
+        <w:pStyle w:val="Heading1"/>
+      </w:pPr>
+      <w:r>
+        <w:t>LUCKY LOU  (F)</w:t>
+      </w:r>
+    </w:p>
+    <w:p>
+      <w:r>
+        <w:drawing>
+          <wp:inline xmlns:a="http://schemas.openxmlformats.org/drawingml/2006/main" xmlns:pic="http://schemas.openxmlformats.org/drawingml/2006/picture">
+            <wp:extent cx="1152000" cy="1152000"/>
+            <wp:docPr id="76" name="Picture 76"/>
+            <wp:cNvGraphicFramePr>
+              <a:graphicFrameLocks noChangeAspect="1"/>
+            </wp:cNvGraphicFramePr>
+            <a:graphic>
+              <a:graphicData uri="http://schemas.openxmlformats.org/drawingml/2006/picture">
+                <pic:pic>
+                  <pic:nvPicPr>
+                    <pic:cNvPr id="0" name="lou-calm.png"/>
+                    <pic:cNvPicPr/>
+                  </pic:nvPicPr>
+                  <pic:blipFill>
+                    <a:blip r:embed="rId84"/>
+                    <a:stretch>
+                      <a:fillRect/>
+                    </a:stretch>
+                  </pic:blipFill>
+                  <pic:spPr>
+                    <a:xfrm>
+                      <a:off x="0" y="0"/>
+                      <a:ext cx="1152000" cy="1152000"/>
+                    </a:xfrm>
+                    <a:prstGeom prst="rect"/>
+                  </pic:spPr>
+                </pic:pic>
+              </a:graphicData>
+            </a:graphic>
+          </wp:inline>
+        </w:drawing>
+      </w:r>
+      <w:r>
+        <w:t xml:space="preserve">  </w:t>
+      </w:r>
+      <w:r>
+        <w:drawing>
+          <wp:inline xmlns:a="http://schemas.openxmlformats.org/drawingml/2006/main" xmlns:pic="http://schemas.openxmlformats.org/drawingml/2006/picture">
+            <wp:extent cx="1152000" cy="1152000"/>
+            <wp:docPr id="77" name="Picture 77"/>
+            <wp:cNvGraphicFramePr>
+              <a:graphicFrameLocks noChangeAspect="1"/>
+            </wp:cNvGraphicFramePr>
+            <a:graphic>
+              <a:graphicData uri="http://schemas.openxmlformats.org/drawingml/2006/picture">
+                <pic:pic>
+                  <pic:nvPicPr>
+                    <pic:cNvPr id="0" name="lou-angry.png"/>
+                    <pic:cNvPicPr/>
+                  </pic:nvPicPr>
+                  <pic:blipFill>
+                    <a:blip r:embed="rId85"/>
+                    <a:stretch>
+                      <a:fillRect/>
+                    </a:stretch>
+                  </pic:blipFill>
+                  <pic:spPr>
+                    <a:xfrm>
+                      <a:off x="0" y="0"/>
+                      <a:ext cx="1152000" cy="1152000"/>
+                    </a:xfrm>
+                    <a:prstGeom prst="rect"/>
+                  </pic:spPr>
+                </pic:pic>
+              </a:graphicData>
+            </a:graphic>
+          </wp:inline>
+        </w:drawing>
+      </w:r>
+      <w:r>
+        <w:t xml:space="preserve">  </w:t>
+      </w:r>
+      <w:r>
+        <w:drawing>
+          <wp:inline xmlns:a="http://schemas.openxmlformats.org/drawingml/2006/main" xmlns:pic="http://schemas.openxmlformats.org/drawingml/2006/picture">
+            <wp:extent cx="1152000" cy="1152000"/>
+            <wp:docPr id="78" name="Picture 78"/>
+            <wp:cNvGraphicFramePr>
+              <a:graphicFrameLocks noChangeAspect="1"/>
+            </wp:cNvGraphicFramePr>
+            <a:graphic>
+              <a:graphicData uri="http://schemas.openxmlformats.org/drawingml/2006/picture">
+                <pic:pic>
+                  <pic:nvPicPr>
+                    <pic:cNvPr id="0" name="lou-smile.png"/>
+                    <pic:cNvPicPr/>
+                  </pic:nvPicPr>
+                  <pic:blipFill>
+                    <a:blip r:embed="rId86"/>
+                    <a:stretch>
+                      <a:fillRect/>
+                    </a:stretch>
+                  </pic:blipFill>
+                  <pic:spPr>
+                    <a:xfrm>
+                      <a:off x="0" y="0"/>
+                      <a:ext cx="1152000" cy="1152000"/>
+                    </a:xfrm>
+                    <a:prstGeom prst="rect"/>
+                  </pic:spPr>
+                </pic:pic>
+              </a:graphicData>
+            </a:graphic>
+          </wp:inline>
+        </w:drawing>
+      </w:r>
+      <w:r>
+        <w:t xml:space="preserve">  </w:t>
+      </w:r>
+    </w:p>
+    <w:p>
+      <w:r>
+        <w:rPr>
+          <w:sz w:val="16"/>
+        </w:rPr>
+        <w:t>calm - angry - smiling</w:t>
+      </w:r>
+    </w:p>
+    <w:tbl>
+      <w:tblPr>
+        <w:tblStyle w:val="LightGrid-Accent1"/>
+        <w:tblW w:type="auto" w:w="0"/>
+        <w:tblLook w:firstColumn="1" w:firstRow="1" w:lastColumn="0" w:lastRow="0" w:noHBand="0" w:noVBand="1" w:val="04A0"/>
+      </w:tblPr>
+      <w:tblGrid>
+        <w:gridCol w:w="4320"/>
+        <w:gridCol w:w="4320"/>
+      </w:tblGrid>
+      <w:tr>
+        <w:tc>
+          <w:tcPr>
+            <w:tcW w:type="dxa" w:w="1984"/>
+          </w:tcPr>
+          <w:p>
+            <w:r>
+              <w:t>Who</w:t>
+            </w:r>
+          </w:p>
+        </w:tc>
+        <w:tc>
+          <w:tcPr>
+            <w:tcW w:type="dxa" w:w="7370"/>
+          </w:tcPr>
+          <w:p>
+            <w:r>
+              <w:t>"Lucky" Lou Fontaine, a bookie who owes Papa Joe two grand from cards; loud and flashy.</w:t>
+            </w:r>
+          </w:p>
+        </w:tc>
+      </w:tr>
+      <w:tr>
+        <w:tc>
+          <w:tcPr>
+            <w:tcW w:type="dxa" w:w="1984"/>
+          </w:tcPr>
+          <w:p>
+            <w:r>
+              <w:t>Looks</w:t>
+            </w:r>
+          </w:p>
+        </w:tc>
+        <w:tc>
+          <w:tcPr>
+            <w:tcW w:type="dxa" w:w="7370"/>
+          </w:tcPr>
+          <w:p>
+            <w:r>
+              <w:t>Forties, a pencil moustache, slicked hair, a green visor, a loud check jacket, a cigar.</w:t>
+            </w:r>
+          </w:p>
+        </w:tc>
+      </w:tr>
+      <w:tr>
+        <w:tc>
+          <w:tcPr>
+            <w:tcW w:type="dxa" w:w="1984"/>
+          </w:tcPr>
+          <w:p>
+            <w:r>
+              <w:t>Bubble colour</w:t>
+            </w:r>
+          </w:p>
+        </w:tc>
+        <w:tc>
+          <w:tcPr>
+            <w:tcW w:type="dxa" w:w="7370"/>
+          </w:tcPr>
+          <w:p>
+            <w:r>
+              <w:t>#2ad480</w:t>
+            </w:r>
+          </w:p>
+        </w:tc>
+      </w:tr>
+      <w:tr>
+        <w:tc>
+          <w:tcPr>
+            <w:tcW w:type="dxa" w:w="1984"/>
+          </w:tcPr>
+          <w:p>
+            <w:r>
+              <w:t>In the city</w:t>
+            </w:r>
+          </w:p>
+        </w:tc>
+        <w:tc>
+          <w:tcPr>
+            <w:tcW w:type="dxa" w:w="7370"/>
+          </w:tcPr>
+          <w:p>
+            <w:r>
+              <w:t>shirt #c8a040, trousers #3a3a3a</w:t>
+            </w:r>
+          </w:p>
+        </w:tc>
+      </w:tr>
+      <w:tr>
+        <w:tc>
+          <w:tcPr>
+            <w:tcW w:type="dxa" w:w="1984"/>
+          </w:tcPr>
+          <w:p>
+            <w:r>
+              <w:t>Portrait recipe</w:t>
+            </w:r>
+          </w:p>
+        </w:tc>
+        <w:tc>
+          <w:tcPr>
+            <w:tcW w:type="dxa" w:w="7370"/>
+          </w:tcPr>
+          <w:p>
+            <w:r>
+              <w:t>skin #e0b088; hair #2a1a14 (slick); facial hair: pencil; eyes #3a2a1a; hat: visor; glasses: none; top: checkjacket (#c8a040 / #7a3a20); extras: cigar; mid, broad build</w:t>
+            </w:r>
+          </w:p>
+        </w:tc>
+      </w:tr>
+      <w:tr>
+        <w:tc>
+          <w:tcPr>
+            <w:tcW w:type="dxa" w:w="1984"/>
+          </w:tcPr>
+          <w:p>
+            <w:r>
+              <w:t>Mumble</w:t>
+            </w:r>
+          </w:p>
+        </w:tc>
+        <w:tc>
+          <w:tcPr>
+            <w:tcW w:type="dxa" w:w="7370"/>
+          </w:tcPr>
+          <w:p>
+            <w:r>
+              <w:t>square wave, 160-260 Hz, 13 syllables a second, pauses 0.05 s</w:t>
+            </w:r>
+          </w:p>
+        </w:tc>
+      </w:tr>
+    </w:tbl>
+    <w:p>
+      <w:pPr>
+        <w:pStyle w:val="Heading1"/>
+      </w:pPr>
+      <w:r>
+        <w:t>THE FARE  (X)</w:t>
+      </w:r>
+    </w:p>
+    <w:p>
+      <w:r>
+        <w:drawing>
+          <wp:inline xmlns:a="http://schemas.openxmlformats.org/drawingml/2006/main" xmlns:pic="http://schemas.openxmlformats.org/drawingml/2006/picture">
+            <wp:extent cx="1152000" cy="1152000"/>
+            <wp:docPr id="79" name="Picture 79"/>
+            <wp:cNvGraphicFramePr>
+              <a:graphicFrameLocks noChangeAspect="1"/>
+            </wp:cNvGraphicFramePr>
+            <a:graphic>
+              <a:graphicData uri="http://schemas.openxmlformats.org/drawingml/2006/picture">
+                <pic:pic>
+                  <pic:nvPicPr>
+                    <pic:cNvPr id="0" name="kid-calm.png"/>
+                    <pic:cNvPicPr/>
+                  </pic:nvPicPr>
+                  <pic:blipFill>
+                    <a:blip r:embed="rId87"/>
+                    <a:stretch>
+                      <a:fillRect/>
+                    </a:stretch>
+                  </pic:blipFill>
+                  <pic:spPr>
+                    <a:xfrm>
+                      <a:off x="0" y="0"/>
+                      <a:ext cx="1152000" cy="1152000"/>
+                    </a:xfrm>
+                    <a:prstGeom prst="rect"/>
+                  </pic:spPr>
+                </pic:pic>
+              </a:graphicData>
+            </a:graphic>
+          </wp:inline>
+        </w:drawing>
+      </w:r>
+      <w:r>
+        <w:t xml:space="preserve">  </w:t>
+      </w:r>
+      <w:r>
+        <w:drawing>
+          <wp:inline xmlns:a="http://schemas.openxmlformats.org/drawingml/2006/main" xmlns:pic="http://schemas.openxmlformats.org/drawingml/2006/picture">
+            <wp:extent cx="1152000" cy="1152000"/>
+            <wp:docPr id="80" name="Picture 80"/>
+            <wp:cNvGraphicFramePr>
+              <a:graphicFrameLocks noChangeAspect="1"/>
+            </wp:cNvGraphicFramePr>
+            <a:graphic>
+              <a:graphicData uri="http://schemas.openxmlformats.org/drawingml/2006/picture">
+                <pic:pic>
+                  <pic:nvPicPr>
+                    <pic:cNvPr id="0" name="kid-angry.png"/>
+                    <pic:cNvPicPr/>
+                  </pic:nvPicPr>
+                  <pic:blipFill>
+                    <a:blip r:embed="rId88"/>
+                    <a:stretch>
+                      <a:fillRect/>
+                    </a:stretch>
+                  </pic:blipFill>
+                  <pic:spPr>
+                    <a:xfrm>
+                      <a:off x="0" y="0"/>
+                      <a:ext cx="1152000" cy="1152000"/>
+                    </a:xfrm>
+                    <a:prstGeom prst="rect"/>
+                  </pic:spPr>
+                </pic:pic>
+              </a:graphicData>
+            </a:graphic>
+          </wp:inline>
+        </w:drawing>
+      </w:r>
+      <w:r>
+        <w:t xml:space="preserve">  </w:t>
+      </w:r>
+      <w:r>
+        <w:drawing>
+          <wp:inline xmlns:a="http://schemas.openxmlformats.org/drawingml/2006/main" xmlns:pic="http://schemas.openxmlformats.org/drawingml/2006/picture">
+            <wp:extent cx="1152000" cy="1152000"/>
+            <wp:docPr id="81" name="Picture 81"/>
+            <wp:cNvGraphicFramePr>
+              <a:graphicFrameLocks noChangeAspect="1"/>
+            </wp:cNvGraphicFramePr>
+            <a:graphic>
+              <a:graphicData uri="http://schemas.openxmlformats.org/drawingml/2006/picture">
+                <pic:pic>
+                  <pic:nvPicPr>
+                    <pic:cNvPr id="0" name="kid-smile.png"/>
+                    <pic:cNvPicPr/>
+                  </pic:nvPicPr>
+                  <pic:blipFill>
+                    <a:blip r:embed="rId89"/>
+                    <a:stretch>
+                      <a:fillRect/>
+                    </a:stretch>
+                  </pic:blipFill>
+                  <pic:spPr>
+                    <a:xfrm>
+                      <a:off x="0" y="0"/>
+                      <a:ext cx="1152000" cy="1152000"/>
+                    </a:xfrm>
+                    <a:prstGeom prst="rect"/>
+                  </pic:spPr>
+                </pic:pic>
+              </a:graphicData>
+            </a:graphic>
+          </wp:inline>
+        </w:drawing>
+      </w:r>
+      <w:r>
+        <w:t xml:space="preserve">  </w:t>
+      </w:r>
+    </w:p>
+    <w:p>
+      <w:r>
+        <w:rPr>
+          <w:sz w:val="16"/>
+        </w:rPr>
+        <w:t>calm - angry - smiling</w:t>
+      </w:r>
+    </w:p>
+    <w:tbl>
+      <w:tblPr>
+        <w:tblStyle w:val="LightGrid-Accent1"/>
+        <w:tblW w:type="auto" w:w="0"/>
+        <w:tblLook w:firstColumn="1" w:firstRow="1" w:lastColumn="0" w:lastRow="0" w:noHBand="0" w:noVBand="1" w:val="04A0"/>
+      </w:tblPr>
+      <w:tblGrid>
+        <w:gridCol w:w="4320"/>
+        <w:gridCol w:w="4320"/>
+      </w:tblGrid>
+      <w:tr>
+        <w:tc>
+          <w:tcPr>
+            <w:tcW w:type="dxa" w:w="1984"/>
+          </w:tcPr>
+          <w:p>
+            <w:r>
+              <w:t>Who</w:t>
+            </w:r>
+          </w:p>
+        </w:tc>
+        <w:tc>
+          <w:tcPr>
+            <w:tcW w:type="dxa" w:w="7370"/>
+          </w:tcPr>
+          <w:p>
+            <w:r>
+              <w:t>A punk kid who rides Joe's cab from the airport and runs without paying.</w:t>
+            </w:r>
+          </w:p>
+        </w:tc>
+      </w:tr>
+      <w:tr>
+        <w:tc>
+          <w:tcPr>
+            <w:tcW w:type="dxa" w:w="1984"/>
+          </w:tcPr>
+          <w:p>
+            <w:r>
+              <w:t>Looks</w:t>
+            </w:r>
+          </w:p>
+        </w:tc>
+        <w:tc>
+          <w:tcPr>
+            <w:tcW w:type="dxa" w:w="7370"/>
+          </w:tcPr>
+          <w:p>
+            <w:r>
+              <w:t>Late teens, skinny, spiky pink hair, an earring, a purple and neon-green windbreaker.</w:t>
+            </w:r>
+          </w:p>
+        </w:tc>
+      </w:tr>
+      <w:tr>
+        <w:tc>
+          <w:tcPr>
+            <w:tcW w:type="dxa" w:w="1984"/>
+          </w:tcPr>
+          <w:p>
+            <w:r>
+              <w:t>Bubble colour</w:t>
+            </w:r>
+          </w:p>
+        </w:tc>
+        <w:tc>
+          <w:tcPr>
+            <w:tcW w:type="dxa" w:w="7370"/>
+          </w:tcPr>
+          <w:p>
+            <w:r>
+              <w:t>#3affd0</w:t>
+            </w:r>
+          </w:p>
+        </w:tc>
+      </w:tr>
+      <w:tr>
+        <w:tc>
+          <w:tcPr>
+            <w:tcW w:type="dxa" w:w="1984"/>
+          </w:tcPr>
+          <w:p>
+            <w:r>
+              <w:t>In the city</w:t>
+            </w:r>
+          </w:p>
+        </w:tc>
+        <w:tc>
+          <w:tcPr>
+            <w:tcW w:type="dxa" w:w="7370"/>
+          </w:tcPr>
+          <w:p>
+            <w:r>
+              <w:t>shirt #7a3aff, trousers #1a1a24</w:t>
+            </w:r>
+          </w:p>
+        </w:tc>
+      </w:tr>
+      <w:tr>
+        <w:tc>
+          <w:tcPr>
+            <w:tcW w:type="dxa" w:w="1984"/>
+          </w:tcPr>
+          <w:p>
+            <w:r>
+              <w:t>Portrait recipe</w:t>
+            </w:r>
+          </w:p>
+        </w:tc>
+        <w:tc>
+          <w:tcPr>
+            <w:tcW w:type="dxa" w:w="7370"/>
+          </w:tcPr>
+          <w:p>
+            <w:r>
+              <w:t>skin #e8c0a0; hair #ff3aa0 (spiky); facial hair: none; eyes #3a5a7a; hat: none; glasses: none; top: windbreaker (#7a3aff / #3affd0); extras: earring; young, slim build</w:t>
+            </w:r>
+          </w:p>
+        </w:tc>
+      </w:tr>
+      <w:tr>
+        <w:tc>
+          <w:tcPr>
+            <w:tcW w:type="dxa" w:w="1984"/>
+          </w:tcPr>
+          <w:p>
+            <w:r>
+              <w:t>Mumble</w:t>
+            </w:r>
+          </w:p>
+        </w:tc>
+        <w:tc>
+          <w:tcPr>
+            <w:tcW w:type="dxa" w:w="7370"/>
+          </w:tcPr>
+          <w:p>
+            <w:r>
+              <w:t>square wave, 300-460 Hz, 16 syllables a second, pauses 0.02 s</w:t>
+            </w:r>
+          </w:p>
+        </w:tc>
+      </w:tr>
+    </w:tbl>
+    <w:p>
+      <w:pPr>
+        <w:pStyle w:val="Heading1"/>
+      </w:pPr>
+      <w:r>
+        <w:t>KESSLER MAN  (Q)</w:t>
+      </w:r>
+    </w:p>
+    <w:p>
+      <w:r>
+        <w:drawing>
+          <wp:inline xmlns:a="http://schemas.openxmlformats.org/drawingml/2006/main" xmlns:pic="http://schemas.openxmlformats.org/drawingml/2006/picture">
+            <wp:extent cx="1152000" cy="1152000"/>
+            <wp:docPr id="82" name="Picture 82"/>
+            <wp:cNvGraphicFramePr>
+              <a:graphicFrameLocks noChangeAspect="1"/>
+            </wp:cNvGraphicFramePr>
+            <a:graphic>
+              <a:graphicData uri="http://schemas.openxmlformats.org/drawingml/2006/picture">
+                <pic:pic>
+                  <pic:nvPicPr>
+                    <pic:cNvPr id="0" name="bull-calm.png"/>
+                    <pic:cNvPicPr/>
+                  </pic:nvPicPr>
+                  <pic:blipFill>
+                    <a:blip r:embed="rId90"/>
+                    <a:stretch>
+                      <a:fillRect/>
+                    </a:stretch>
+                  </pic:blipFill>
+                  <pic:spPr>
+                    <a:xfrm>
+                      <a:off x="0" y="0"/>
+                      <a:ext cx="1152000" cy="1152000"/>
+                    </a:xfrm>
+                    <a:prstGeom prst="rect"/>
+                  </pic:spPr>
+                </pic:pic>
+              </a:graphicData>
+            </a:graphic>
+          </wp:inline>
+        </w:drawing>
+      </w:r>
+      <w:r>
+        <w:t xml:space="preserve">  </w:t>
+      </w:r>
+      <w:r>
+        <w:drawing>
+          <wp:inline xmlns:a="http://schemas.openxmlformats.org/drawingml/2006/main" xmlns:pic="http://schemas.openxmlformats.org/drawingml/2006/picture">
+            <wp:extent cx="1152000" cy="1152000"/>
+            <wp:docPr id="83" name="Picture 83"/>
+            <wp:cNvGraphicFramePr>
+              <a:graphicFrameLocks noChangeAspect="1"/>
+            </wp:cNvGraphicFramePr>
+            <a:graphic>
+              <a:graphicData uri="http://schemas.openxmlformats.org/drawingml/2006/picture">
+                <pic:pic>
+                  <pic:nvPicPr>
+                    <pic:cNvPr id="0" name="bull-angry.png"/>
+                    <pic:cNvPicPr/>
+                  </pic:nvPicPr>
+                  <pic:blipFill>
+                    <a:blip r:embed="rId91"/>
+                    <a:stretch>
+                      <a:fillRect/>
+                    </a:stretch>
+                  </pic:blipFill>
+                  <pic:spPr>
+                    <a:xfrm>
+                      <a:off x="0" y="0"/>
+                      <a:ext cx="1152000" cy="1152000"/>
+                    </a:xfrm>
+                    <a:prstGeom prst="rect"/>
+                  </pic:spPr>
+                </pic:pic>
+              </a:graphicData>
+            </a:graphic>
+          </wp:inline>
+        </w:drawing>
+      </w:r>
+      <w:r>
+        <w:t xml:space="preserve">  </w:t>
+      </w:r>
+      <w:r>
+        <w:drawing>
+          <wp:inline xmlns:a="http://schemas.openxmlformats.org/drawingml/2006/main" xmlns:pic="http://schemas.openxmlformats.org/drawingml/2006/picture">
+            <wp:extent cx="1152000" cy="1152000"/>
+            <wp:docPr id="84" name="Picture 84"/>
+            <wp:cNvGraphicFramePr>
+              <a:graphicFrameLocks noChangeAspect="1"/>
+            </wp:cNvGraphicFramePr>
+            <a:graphic>
+              <a:graphicData uri="http://schemas.openxmlformats.org/drawingml/2006/picture">
+                <pic:pic>
+                  <pic:nvPicPr>
+                    <pic:cNvPr id="0" name="bull-smile.png"/>
+                    <pic:cNvPicPr/>
+                  </pic:nvPicPr>
+                  <pic:blipFill>
+                    <a:blip r:embed="rId92"/>
+                    <a:stretch>
+                      <a:fillRect/>
+                    </a:stretch>
+                  </pic:blipFill>
+                  <pic:spPr>
+                    <a:xfrm>
+                      <a:off x="0" y="0"/>
+                      <a:ext cx="1152000" cy="1152000"/>
+                    </a:xfrm>
+                    <a:prstGeom prst="rect"/>
+                  </pic:spPr>
+                </pic:pic>
+              </a:graphicData>
+            </a:graphic>
+          </wp:inline>
+        </w:drawing>
+      </w:r>
+      <w:r>
+        <w:t xml:space="preserve">  </w:t>
+      </w:r>
+    </w:p>
+    <w:p>
+      <w:r>
+        <w:rPr>
+          <w:sz w:val="16"/>
+        </w:rPr>
+        <w:t>calm - angry - smiling</w:t>
+      </w:r>
+    </w:p>
+    <w:tbl>
+      <w:tblPr>
+        <w:tblStyle w:val="LightGrid-Accent1"/>
+        <w:tblW w:type="auto" w:w="0"/>
+        <w:tblLook w:firstColumn="1" w:firstRow="1" w:lastColumn="0" w:lastRow="0" w:noHBand="0" w:noVBand="1" w:val="04A0"/>
+      </w:tblPr>
+      <w:tblGrid>
+        <w:gridCol w:w="4320"/>
+        <w:gridCol w:w="4320"/>
+      </w:tblGrid>
+      <w:tr>
+        <w:tc>
+          <w:tcPr>
+            <w:tcW w:type="dxa" w:w="1984"/>
+          </w:tcPr>
+          <w:p>
+            <w:r>
+              <w:t>Who</w:t>
+            </w:r>
+          </w:p>
+        </w:tc>
+        <w:tc>
+          <w:tcPr>
+            <w:tcW w:type="dxa" w:w="7370"/>
+          </w:tcPr>
+          <w:p>
+            <w:r>
+              <w:t>One of Bull Kessler's men - Dockside heavies, every one much like the next.</w:t>
+            </w:r>
+          </w:p>
+        </w:tc>
+      </w:tr>
+      <w:tr>
+        <w:tc>
+          <w:tcPr>
+            <w:tcW w:type="dxa" w:w="1984"/>
+          </w:tcPr>
+          <w:p>
+            <w:r>
+              <w:t>Looks</w:t>
+            </w:r>
+          </w:p>
+        </w:tc>
+        <w:tc>
+          <w:tcPr>
+            <w:tcW w:type="dxa" w:w="7370"/>
+          </w:tcPr>
+          <w:p>
+            <w:r>
+              <w:t>Thirties, a buzz cut, stubble, a white vest or an orange work shirt, gold chains, jeans.</w:t>
+            </w:r>
+          </w:p>
+        </w:tc>
+      </w:tr>
+      <w:tr>
+        <w:tc>
+          <w:tcPr>
+            <w:tcW w:type="dxa" w:w="1984"/>
+          </w:tcPr>
+          <w:p>
+            <w:r>
+              <w:t>Bubble colour</w:t>
+            </w:r>
+          </w:p>
+        </w:tc>
+        <w:tc>
+          <w:tcPr>
+            <w:tcW w:type="dxa" w:w="7370"/>
+          </w:tcPr>
+          <w:p>
+            <w:r>
+              <w:t>#d87a4a</w:t>
+            </w:r>
+          </w:p>
+        </w:tc>
+      </w:tr>
+      <w:tr>
+        <w:tc>
+          <w:tcPr>
+            <w:tcW w:type="dxa" w:w="1984"/>
+          </w:tcPr>
+          <w:p>
+            <w:r>
+              <w:t>In the city</w:t>
+            </w:r>
+          </w:p>
+        </w:tc>
+        <w:tc>
+          <w:tcPr>
+            <w:tcW w:type="dxa" w:w="7370"/>
+          </w:tcPr>
+          <w:p>
+            <w:r>
+              <w:t>shirt #f0f0ea, trousers #3a4a6a</w:t>
+            </w:r>
+          </w:p>
+        </w:tc>
+      </w:tr>
+      <w:tr>
+        <w:tc>
+          <w:tcPr>
+            <w:tcW w:type="dxa" w:w="1984"/>
+          </w:tcPr>
+          <w:p>
+            <w:r>
+              <w:t>Portrait recipe</w:t>
+            </w:r>
+          </w:p>
+        </w:tc>
+        <w:tc>
+          <w:tcPr>
+            <w:tcW w:type="dxa" w:w="7370"/>
+          </w:tcPr>
+          <w:p>
+            <w:r>
+              <w:t>skin #d9a27a; hair #3a2a20 (buzz); facial hair: stubble; eyes #3a2a1a; hat: none; glasses: none; top: tanktop (#f0f0ea / #d8d8d2); extras: chain; mid, broad build</w:t>
+            </w:r>
+          </w:p>
+        </w:tc>
+      </w:tr>
+      <w:tr>
+        <w:tc>
+          <w:tcPr>
+            <w:tcW w:type="dxa" w:w="1984"/>
+          </w:tcPr>
+          <w:p>
+            <w:r>
+              <w:t>Mumble</w:t>
+            </w:r>
+          </w:p>
+        </w:tc>
+        <w:tc>
+          <w:tcPr>
+            <w:tcW w:type="dxa" w:w="7370"/>
+          </w:tcPr>
+          <w:p>
+            <w:r>
+              <w:t>sawtooth wave, 100-150 Hz, 11 syllables a second, pauses 0.08 s</w:t>
             </w:r>
           </w:p>
         </w:tc>

</xml_diff>

<commit_message>
Portraits redrawn in the owner's reference style: 40 x 64, transparent, detailed shading
- tools/portraits.py draws every character anew: head and shoulders nearly face on, four- to five-tone skin, hair and cloth, eyes with
  whites and irises, hair in clumps with a sheen, a coloured outline; broad builds get a thick neck and heavy shoulders, women finer
  brows, lashes and chin. The contact sheet shows them on the game's ground.
- The game draws the dark ground and the bubble-colour glow behind the transparent pictures: a tall dialogue frame (80 x 128, 60 x 96 on
  a phone), the live-line portrait 40 x 64 (30 x 48 on a phone); Crane's billboards and posters keep the picture's shape.
- docs/Characters.docx and the quest pages rebuilt with the new pictures; answers 117-120 in docs/STORY-QA.md.

Co-Authored-By: Claude <noreply@anthropic.com>
Claude-Session: https://claude.ai/code/session_01RpWbq89r71C1p9HP7EcbZ5
</commit_message>
<xml_diff>
--- a/docs/Characters.docx
+++ b/docs/Characters.docx
@@ -12,7 +12,7 @@
     </w:p>
     <w:p>
       <w:r>
-        <w:t>How every character looks, written down so they stay the same in every mission. The portraits are pixel art, 48 x 48, head and shoulders in a 3/4 view turned toward the speech bubble, on a night-dark ground with a glow in the character's bubble colour. Each has three faces: calm, angry and smiling - the game picks one from the mood written on each line (angry: shouting, furious, screaming, barking, gritted, urgent, angry, hard, impatient, snarling, breathless, yelling; smiling: grinning, laughing, warm, amused, smiling, wry, relieved, silky, scoffing, moved, teasing, proud; anything else: calm).</w:t>
+        <w:t>How every character looks, written down so they stay the same in every mission. The portraits are pixel art, 40 x 64, head and shoulders nearly face on, in the style of the reference picture (transparent around the figure; the game shows them on a night-dark ground with a glow in the character's bubble colour, as here). Each has three faces: calm, angry and smiling - the game picks one from the mood written on each line (angry: shouting, furious, screaming, barking, gritted, urgent, angry, hard, impatient, snarling, breathless, yelling; smiling: grinning, laughing, warm, amused, smiling, wry, relieved, silky, scoffing, moved, teasing, proud; anything else: calm).</w:t>
       </w:r>
     </w:p>
     <w:p>
@@ -32,7 +32,7 @@
       <w:r>
         <w:drawing>
           <wp:inline xmlns:a="http://schemas.openxmlformats.org/drawingml/2006/main" xmlns:pic="http://schemas.openxmlformats.org/drawingml/2006/picture">
-            <wp:extent cx="1152000" cy="1152000"/>
+            <wp:extent cx="864000" cy="1382400"/>
             <wp:docPr id="1" name="Picture 1"/>
             <wp:cNvGraphicFramePr>
               <a:graphicFrameLocks noChangeAspect="1"/>
@@ -53,7 +53,7 @@
                   <pic:spPr>
                     <a:xfrm>
                       <a:off x="0" y="0"/>
-                      <a:ext cx="1152000" cy="1152000"/>
+                      <a:ext cx="864000" cy="1382400"/>
                     </a:xfrm>
                     <a:prstGeom prst="rect"/>
                   </pic:spPr>
@@ -69,7 +69,7 @@
       <w:r>
         <w:drawing>
           <wp:inline xmlns:a="http://schemas.openxmlformats.org/drawingml/2006/main" xmlns:pic="http://schemas.openxmlformats.org/drawingml/2006/picture">
-            <wp:extent cx="1152000" cy="1152000"/>
+            <wp:extent cx="864000" cy="1382400"/>
             <wp:docPr id="2" name="Picture 2"/>
             <wp:cNvGraphicFramePr>
               <a:graphicFrameLocks noChangeAspect="1"/>
@@ -90,7 +90,7 @@
                   <pic:spPr>
                     <a:xfrm>
                       <a:off x="0" y="0"/>
-                      <a:ext cx="1152000" cy="1152000"/>
+                      <a:ext cx="864000" cy="1382400"/>
                     </a:xfrm>
                     <a:prstGeom prst="rect"/>
                   </pic:spPr>
@@ -106,7 +106,7 @@
       <w:r>
         <w:drawing>
           <wp:inline xmlns:a="http://schemas.openxmlformats.org/drawingml/2006/main" xmlns:pic="http://schemas.openxmlformats.org/drawingml/2006/picture">
-            <wp:extent cx="1152000" cy="1152000"/>
+            <wp:extent cx="864000" cy="1382400"/>
             <wp:docPr id="3" name="Picture 3"/>
             <wp:cNvGraphicFramePr>
               <a:graphicFrameLocks noChangeAspect="1"/>
@@ -127,7 +127,7 @@
                   <pic:spPr>
                     <a:xfrm>
                       <a:off x="0" y="0"/>
-                      <a:ext cx="1152000" cy="1152000"/>
+                      <a:ext cx="864000" cy="1382400"/>
                     </a:xfrm>
                     <a:prstGeom prst="rect"/>
                   </pic:spPr>
@@ -304,7 +304,7 @@
       <w:r>
         <w:drawing>
           <wp:inline xmlns:a="http://schemas.openxmlformats.org/drawingml/2006/main" xmlns:pic="http://schemas.openxmlformats.org/drawingml/2006/picture">
-            <wp:extent cx="1152000" cy="1152000"/>
+            <wp:extent cx="864000" cy="1382400"/>
             <wp:docPr id="4" name="Picture 4"/>
             <wp:cNvGraphicFramePr>
               <a:graphicFrameLocks noChangeAspect="1"/>
@@ -325,7 +325,7 @@
                   <pic:spPr>
                     <a:xfrm>
                       <a:off x="0" y="0"/>
-                      <a:ext cx="1152000" cy="1152000"/>
+                      <a:ext cx="864000" cy="1382400"/>
                     </a:xfrm>
                     <a:prstGeom prst="rect"/>
                   </pic:spPr>
@@ -341,7 +341,7 @@
       <w:r>
         <w:drawing>
           <wp:inline xmlns:a="http://schemas.openxmlformats.org/drawingml/2006/main" xmlns:pic="http://schemas.openxmlformats.org/drawingml/2006/picture">
-            <wp:extent cx="1152000" cy="1152000"/>
+            <wp:extent cx="864000" cy="1382400"/>
             <wp:docPr id="5" name="Picture 5"/>
             <wp:cNvGraphicFramePr>
               <a:graphicFrameLocks noChangeAspect="1"/>
@@ -362,7 +362,7 @@
                   <pic:spPr>
                     <a:xfrm>
                       <a:off x="0" y="0"/>
-                      <a:ext cx="1152000" cy="1152000"/>
+                      <a:ext cx="864000" cy="1382400"/>
                     </a:xfrm>
                     <a:prstGeom prst="rect"/>
                   </pic:spPr>
@@ -378,7 +378,7 @@
       <w:r>
         <w:drawing>
           <wp:inline xmlns:a="http://schemas.openxmlformats.org/drawingml/2006/main" xmlns:pic="http://schemas.openxmlformats.org/drawingml/2006/picture">
-            <wp:extent cx="1152000" cy="1152000"/>
+            <wp:extent cx="864000" cy="1382400"/>
             <wp:docPr id="6" name="Picture 6"/>
             <wp:cNvGraphicFramePr>
               <a:graphicFrameLocks noChangeAspect="1"/>
@@ -399,7 +399,7 @@
                   <pic:spPr>
                     <a:xfrm>
                       <a:off x="0" y="0"/>
-                      <a:ext cx="1152000" cy="1152000"/>
+                      <a:ext cx="864000" cy="1382400"/>
                     </a:xfrm>
                     <a:prstGeom prst="rect"/>
                   </pic:spPr>
@@ -576,7 +576,7 @@
       <w:r>
         <w:drawing>
           <wp:inline xmlns:a="http://schemas.openxmlformats.org/drawingml/2006/main" xmlns:pic="http://schemas.openxmlformats.org/drawingml/2006/picture">
-            <wp:extent cx="1152000" cy="1152000"/>
+            <wp:extent cx="864000" cy="1382400"/>
             <wp:docPr id="7" name="Picture 7"/>
             <wp:cNvGraphicFramePr>
               <a:graphicFrameLocks noChangeAspect="1"/>
@@ -597,7 +597,7 @@
                   <pic:spPr>
                     <a:xfrm>
                       <a:off x="0" y="0"/>
-                      <a:ext cx="1152000" cy="1152000"/>
+                      <a:ext cx="864000" cy="1382400"/>
                     </a:xfrm>
                     <a:prstGeom prst="rect"/>
                   </pic:spPr>
@@ -613,7 +613,7 @@
       <w:r>
         <w:drawing>
           <wp:inline xmlns:a="http://schemas.openxmlformats.org/drawingml/2006/main" xmlns:pic="http://schemas.openxmlformats.org/drawingml/2006/picture">
-            <wp:extent cx="1152000" cy="1152000"/>
+            <wp:extent cx="864000" cy="1382400"/>
             <wp:docPr id="8" name="Picture 8"/>
             <wp:cNvGraphicFramePr>
               <a:graphicFrameLocks noChangeAspect="1"/>
@@ -634,7 +634,7 @@
                   <pic:spPr>
                     <a:xfrm>
                       <a:off x="0" y="0"/>
-                      <a:ext cx="1152000" cy="1152000"/>
+                      <a:ext cx="864000" cy="1382400"/>
                     </a:xfrm>
                     <a:prstGeom prst="rect"/>
                   </pic:spPr>
@@ -650,7 +650,7 @@
       <w:r>
         <w:drawing>
           <wp:inline xmlns:a="http://schemas.openxmlformats.org/drawingml/2006/main" xmlns:pic="http://schemas.openxmlformats.org/drawingml/2006/picture">
-            <wp:extent cx="1152000" cy="1152000"/>
+            <wp:extent cx="864000" cy="1382400"/>
             <wp:docPr id="9" name="Picture 9"/>
             <wp:cNvGraphicFramePr>
               <a:graphicFrameLocks noChangeAspect="1"/>
@@ -671,7 +671,7 @@
                   <pic:spPr>
                     <a:xfrm>
                       <a:off x="0" y="0"/>
-                      <a:ext cx="1152000" cy="1152000"/>
+                      <a:ext cx="864000" cy="1382400"/>
                     </a:xfrm>
                     <a:prstGeom prst="rect"/>
                   </pic:spPr>
@@ -848,7 +848,7 @@
       <w:r>
         <w:drawing>
           <wp:inline xmlns:a="http://schemas.openxmlformats.org/drawingml/2006/main" xmlns:pic="http://schemas.openxmlformats.org/drawingml/2006/picture">
-            <wp:extent cx="1152000" cy="1152000"/>
+            <wp:extent cx="864000" cy="1382400"/>
             <wp:docPr id="10" name="Picture 10"/>
             <wp:cNvGraphicFramePr>
               <a:graphicFrameLocks noChangeAspect="1"/>
@@ -869,7 +869,7 @@
                   <pic:spPr>
                     <a:xfrm>
                       <a:off x="0" y="0"/>
-                      <a:ext cx="1152000" cy="1152000"/>
+                      <a:ext cx="864000" cy="1382400"/>
                     </a:xfrm>
                     <a:prstGeom prst="rect"/>
                   </pic:spPr>
@@ -885,7 +885,7 @@
       <w:r>
         <w:drawing>
           <wp:inline xmlns:a="http://schemas.openxmlformats.org/drawingml/2006/main" xmlns:pic="http://schemas.openxmlformats.org/drawingml/2006/picture">
-            <wp:extent cx="1152000" cy="1152000"/>
+            <wp:extent cx="864000" cy="1382400"/>
             <wp:docPr id="11" name="Picture 11"/>
             <wp:cNvGraphicFramePr>
               <a:graphicFrameLocks noChangeAspect="1"/>
@@ -906,7 +906,7 @@
                   <pic:spPr>
                     <a:xfrm>
                       <a:off x="0" y="0"/>
-                      <a:ext cx="1152000" cy="1152000"/>
+                      <a:ext cx="864000" cy="1382400"/>
                     </a:xfrm>
                     <a:prstGeom prst="rect"/>
                   </pic:spPr>
@@ -922,7 +922,7 @@
       <w:r>
         <w:drawing>
           <wp:inline xmlns:a="http://schemas.openxmlformats.org/drawingml/2006/main" xmlns:pic="http://schemas.openxmlformats.org/drawingml/2006/picture">
-            <wp:extent cx="1152000" cy="1152000"/>
+            <wp:extent cx="864000" cy="1382400"/>
             <wp:docPr id="12" name="Picture 12"/>
             <wp:cNvGraphicFramePr>
               <a:graphicFrameLocks noChangeAspect="1"/>
@@ -943,7 +943,7 @@
                   <pic:spPr>
                     <a:xfrm>
                       <a:off x="0" y="0"/>
-                      <a:ext cx="1152000" cy="1152000"/>
+                      <a:ext cx="864000" cy="1382400"/>
                     </a:xfrm>
                     <a:prstGeom prst="rect"/>
                   </pic:spPr>
@@ -1120,7 +1120,7 @@
       <w:r>
         <w:drawing>
           <wp:inline xmlns:a="http://schemas.openxmlformats.org/drawingml/2006/main" xmlns:pic="http://schemas.openxmlformats.org/drawingml/2006/picture">
-            <wp:extent cx="1152000" cy="1152000"/>
+            <wp:extent cx="864000" cy="1382400"/>
             <wp:docPr id="13" name="Picture 13"/>
             <wp:cNvGraphicFramePr>
               <a:graphicFrameLocks noChangeAspect="1"/>
@@ -1141,7 +1141,7 @@
                   <pic:spPr>
                     <a:xfrm>
                       <a:off x="0" y="0"/>
-                      <a:ext cx="1152000" cy="1152000"/>
+                      <a:ext cx="864000" cy="1382400"/>
                     </a:xfrm>
                     <a:prstGeom prst="rect"/>
                   </pic:spPr>
@@ -1157,7 +1157,7 @@
       <w:r>
         <w:drawing>
           <wp:inline xmlns:a="http://schemas.openxmlformats.org/drawingml/2006/main" xmlns:pic="http://schemas.openxmlformats.org/drawingml/2006/picture">
-            <wp:extent cx="1152000" cy="1152000"/>
+            <wp:extent cx="864000" cy="1382400"/>
             <wp:docPr id="14" name="Picture 14"/>
             <wp:cNvGraphicFramePr>
               <a:graphicFrameLocks noChangeAspect="1"/>
@@ -1178,7 +1178,7 @@
                   <pic:spPr>
                     <a:xfrm>
                       <a:off x="0" y="0"/>
-                      <a:ext cx="1152000" cy="1152000"/>
+                      <a:ext cx="864000" cy="1382400"/>
                     </a:xfrm>
                     <a:prstGeom prst="rect"/>
                   </pic:spPr>
@@ -1194,7 +1194,7 @@
       <w:r>
         <w:drawing>
           <wp:inline xmlns:a="http://schemas.openxmlformats.org/drawingml/2006/main" xmlns:pic="http://schemas.openxmlformats.org/drawingml/2006/picture">
-            <wp:extent cx="1152000" cy="1152000"/>
+            <wp:extent cx="864000" cy="1382400"/>
             <wp:docPr id="15" name="Picture 15"/>
             <wp:cNvGraphicFramePr>
               <a:graphicFrameLocks noChangeAspect="1"/>
@@ -1215,7 +1215,7 @@
                   <pic:spPr>
                     <a:xfrm>
                       <a:off x="0" y="0"/>
-                      <a:ext cx="1152000" cy="1152000"/>
+                      <a:ext cx="864000" cy="1382400"/>
                     </a:xfrm>
                     <a:prstGeom prst="rect"/>
                   </pic:spPr>
@@ -1392,7 +1392,7 @@
       <w:r>
         <w:drawing>
           <wp:inline xmlns:a="http://schemas.openxmlformats.org/drawingml/2006/main" xmlns:pic="http://schemas.openxmlformats.org/drawingml/2006/picture">
-            <wp:extent cx="1152000" cy="1152000"/>
+            <wp:extent cx="864000" cy="1382400"/>
             <wp:docPr id="16" name="Picture 16"/>
             <wp:cNvGraphicFramePr>
               <a:graphicFrameLocks noChangeAspect="1"/>
@@ -1413,7 +1413,7 @@
                   <pic:spPr>
                     <a:xfrm>
                       <a:off x="0" y="0"/>
-                      <a:ext cx="1152000" cy="1152000"/>
+                      <a:ext cx="864000" cy="1382400"/>
                     </a:xfrm>
                     <a:prstGeom prst="rect"/>
                   </pic:spPr>
@@ -1429,7 +1429,7 @@
       <w:r>
         <w:drawing>
           <wp:inline xmlns:a="http://schemas.openxmlformats.org/drawingml/2006/main" xmlns:pic="http://schemas.openxmlformats.org/drawingml/2006/picture">
-            <wp:extent cx="1152000" cy="1152000"/>
+            <wp:extent cx="864000" cy="1382400"/>
             <wp:docPr id="17" name="Picture 17"/>
             <wp:cNvGraphicFramePr>
               <a:graphicFrameLocks noChangeAspect="1"/>
@@ -1450,7 +1450,7 @@
                   <pic:spPr>
                     <a:xfrm>
                       <a:off x="0" y="0"/>
-                      <a:ext cx="1152000" cy="1152000"/>
+                      <a:ext cx="864000" cy="1382400"/>
                     </a:xfrm>
                     <a:prstGeom prst="rect"/>
                   </pic:spPr>
@@ -1466,7 +1466,7 @@
       <w:r>
         <w:drawing>
           <wp:inline xmlns:a="http://schemas.openxmlformats.org/drawingml/2006/main" xmlns:pic="http://schemas.openxmlformats.org/drawingml/2006/picture">
-            <wp:extent cx="1152000" cy="1152000"/>
+            <wp:extent cx="864000" cy="1382400"/>
             <wp:docPr id="18" name="Picture 18"/>
             <wp:cNvGraphicFramePr>
               <a:graphicFrameLocks noChangeAspect="1"/>
@@ -1487,7 +1487,7 @@
                   <pic:spPr>
                     <a:xfrm>
                       <a:off x="0" y="0"/>
-                      <a:ext cx="1152000" cy="1152000"/>
+                      <a:ext cx="864000" cy="1382400"/>
                     </a:xfrm>
                     <a:prstGeom prst="rect"/>
                   </pic:spPr>
@@ -1664,7 +1664,7 @@
       <w:r>
         <w:drawing>
           <wp:inline xmlns:a="http://schemas.openxmlformats.org/drawingml/2006/main" xmlns:pic="http://schemas.openxmlformats.org/drawingml/2006/picture">
-            <wp:extent cx="1152000" cy="1152000"/>
+            <wp:extent cx="864000" cy="1382400"/>
             <wp:docPr id="19" name="Picture 19"/>
             <wp:cNvGraphicFramePr>
               <a:graphicFrameLocks noChangeAspect="1"/>
@@ -1685,7 +1685,7 @@
                   <pic:spPr>
                     <a:xfrm>
                       <a:off x="0" y="0"/>
-                      <a:ext cx="1152000" cy="1152000"/>
+                      <a:ext cx="864000" cy="1382400"/>
                     </a:xfrm>
                     <a:prstGeom prst="rect"/>
                   </pic:spPr>
@@ -1701,7 +1701,7 @@
       <w:r>
         <w:drawing>
           <wp:inline xmlns:a="http://schemas.openxmlformats.org/drawingml/2006/main" xmlns:pic="http://schemas.openxmlformats.org/drawingml/2006/picture">
-            <wp:extent cx="1152000" cy="1152000"/>
+            <wp:extent cx="864000" cy="1382400"/>
             <wp:docPr id="20" name="Picture 20"/>
             <wp:cNvGraphicFramePr>
               <a:graphicFrameLocks noChangeAspect="1"/>
@@ -1722,7 +1722,7 @@
                   <pic:spPr>
                     <a:xfrm>
                       <a:off x="0" y="0"/>
-                      <a:ext cx="1152000" cy="1152000"/>
+                      <a:ext cx="864000" cy="1382400"/>
                     </a:xfrm>
                     <a:prstGeom prst="rect"/>
                   </pic:spPr>
@@ -1738,7 +1738,7 @@
       <w:r>
         <w:drawing>
           <wp:inline xmlns:a="http://schemas.openxmlformats.org/drawingml/2006/main" xmlns:pic="http://schemas.openxmlformats.org/drawingml/2006/picture">
-            <wp:extent cx="1152000" cy="1152000"/>
+            <wp:extent cx="864000" cy="1382400"/>
             <wp:docPr id="21" name="Picture 21"/>
             <wp:cNvGraphicFramePr>
               <a:graphicFrameLocks noChangeAspect="1"/>
@@ -1759,7 +1759,7 @@
                   <pic:spPr>
                     <a:xfrm>
                       <a:off x="0" y="0"/>
-                      <a:ext cx="1152000" cy="1152000"/>
+                      <a:ext cx="864000" cy="1382400"/>
                     </a:xfrm>
                     <a:prstGeom prst="rect"/>
                   </pic:spPr>
@@ -1936,7 +1936,7 @@
       <w:r>
         <w:drawing>
           <wp:inline xmlns:a="http://schemas.openxmlformats.org/drawingml/2006/main" xmlns:pic="http://schemas.openxmlformats.org/drawingml/2006/picture">
-            <wp:extent cx="1152000" cy="1152000"/>
+            <wp:extent cx="864000" cy="1382400"/>
             <wp:docPr id="22" name="Picture 22"/>
             <wp:cNvGraphicFramePr>
               <a:graphicFrameLocks noChangeAspect="1"/>
@@ -1957,7 +1957,7 @@
                   <pic:spPr>
                     <a:xfrm>
                       <a:off x="0" y="0"/>
-                      <a:ext cx="1152000" cy="1152000"/>
+                      <a:ext cx="864000" cy="1382400"/>
                     </a:xfrm>
                     <a:prstGeom prst="rect"/>
                   </pic:spPr>
@@ -1973,7 +1973,7 @@
       <w:r>
         <w:drawing>
           <wp:inline xmlns:a="http://schemas.openxmlformats.org/drawingml/2006/main" xmlns:pic="http://schemas.openxmlformats.org/drawingml/2006/picture">
-            <wp:extent cx="1152000" cy="1152000"/>
+            <wp:extent cx="864000" cy="1382400"/>
             <wp:docPr id="23" name="Picture 23"/>
             <wp:cNvGraphicFramePr>
               <a:graphicFrameLocks noChangeAspect="1"/>
@@ -1994,7 +1994,7 @@
                   <pic:spPr>
                     <a:xfrm>
                       <a:off x="0" y="0"/>
-                      <a:ext cx="1152000" cy="1152000"/>
+                      <a:ext cx="864000" cy="1382400"/>
                     </a:xfrm>
                     <a:prstGeom prst="rect"/>
                   </pic:spPr>
@@ -2010,7 +2010,7 @@
       <w:r>
         <w:drawing>
           <wp:inline xmlns:a="http://schemas.openxmlformats.org/drawingml/2006/main" xmlns:pic="http://schemas.openxmlformats.org/drawingml/2006/picture">
-            <wp:extent cx="1152000" cy="1152000"/>
+            <wp:extent cx="864000" cy="1382400"/>
             <wp:docPr id="24" name="Picture 24"/>
             <wp:cNvGraphicFramePr>
               <a:graphicFrameLocks noChangeAspect="1"/>
@@ -2031,7 +2031,7 @@
                   <pic:spPr>
                     <a:xfrm>
                       <a:off x="0" y="0"/>
-                      <a:ext cx="1152000" cy="1152000"/>
+                      <a:ext cx="864000" cy="1382400"/>
                     </a:xfrm>
                     <a:prstGeom prst="rect"/>
                   </pic:spPr>
@@ -2208,7 +2208,7 @@
       <w:r>
         <w:drawing>
           <wp:inline xmlns:a="http://schemas.openxmlformats.org/drawingml/2006/main" xmlns:pic="http://schemas.openxmlformats.org/drawingml/2006/picture">
-            <wp:extent cx="1152000" cy="1152000"/>
+            <wp:extent cx="864000" cy="1382400"/>
             <wp:docPr id="25" name="Picture 25"/>
             <wp:cNvGraphicFramePr>
               <a:graphicFrameLocks noChangeAspect="1"/>
@@ -2229,7 +2229,7 @@
                   <pic:spPr>
                     <a:xfrm>
                       <a:off x="0" y="0"/>
-                      <a:ext cx="1152000" cy="1152000"/>
+                      <a:ext cx="864000" cy="1382400"/>
                     </a:xfrm>
                     <a:prstGeom prst="rect"/>
                   </pic:spPr>
@@ -2245,7 +2245,7 @@
       <w:r>
         <w:drawing>
           <wp:inline xmlns:a="http://schemas.openxmlformats.org/drawingml/2006/main" xmlns:pic="http://schemas.openxmlformats.org/drawingml/2006/picture">
-            <wp:extent cx="1152000" cy="1152000"/>
+            <wp:extent cx="864000" cy="1382400"/>
             <wp:docPr id="26" name="Picture 26"/>
             <wp:cNvGraphicFramePr>
               <a:graphicFrameLocks noChangeAspect="1"/>
@@ -2266,7 +2266,7 @@
                   <pic:spPr>
                     <a:xfrm>
                       <a:off x="0" y="0"/>
-                      <a:ext cx="1152000" cy="1152000"/>
+                      <a:ext cx="864000" cy="1382400"/>
                     </a:xfrm>
                     <a:prstGeom prst="rect"/>
                   </pic:spPr>
@@ -2282,7 +2282,7 @@
       <w:r>
         <w:drawing>
           <wp:inline xmlns:a="http://schemas.openxmlformats.org/drawingml/2006/main" xmlns:pic="http://schemas.openxmlformats.org/drawingml/2006/picture">
-            <wp:extent cx="1152000" cy="1152000"/>
+            <wp:extent cx="864000" cy="1382400"/>
             <wp:docPr id="27" name="Picture 27"/>
             <wp:cNvGraphicFramePr>
               <a:graphicFrameLocks noChangeAspect="1"/>
@@ -2303,7 +2303,7 @@
                   <pic:spPr>
                     <a:xfrm>
                       <a:off x="0" y="0"/>
-                      <a:ext cx="1152000" cy="1152000"/>
+                      <a:ext cx="864000" cy="1382400"/>
                     </a:xfrm>
                     <a:prstGeom prst="rect"/>
                   </pic:spPr>
@@ -2480,7 +2480,7 @@
       <w:r>
         <w:drawing>
           <wp:inline xmlns:a="http://schemas.openxmlformats.org/drawingml/2006/main" xmlns:pic="http://schemas.openxmlformats.org/drawingml/2006/picture">
-            <wp:extent cx="1152000" cy="1152000"/>
+            <wp:extent cx="864000" cy="1382400"/>
             <wp:docPr id="28" name="Picture 28"/>
             <wp:cNvGraphicFramePr>
               <a:graphicFrameLocks noChangeAspect="1"/>
@@ -2501,7 +2501,7 @@
                   <pic:spPr>
                     <a:xfrm>
                       <a:off x="0" y="0"/>
-                      <a:ext cx="1152000" cy="1152000"/>
+                      <a:ext cx="864000" cy="1382400"/>
                     </a:xfrm>
                     <a:prstGeom prst="rect"/>
                   </pic:spPr>
@@ -2517,7 +2517,7 @@
       <w:r>
         <w:drawing>
           <wp:inline xmlns:a="http://schemas.openxmlformats.org/drawingml/2006/main" xmlns:pic="http://schemas.openxmlformats.org/drawingml/2006/picture">
-            <wp:extent cx="1152000" cy="1152000"/>
+            <wp:extent cx="864000" cy="1382400"/>
             <wp:docPr id="29" name="Picture 29"/>
             <wp:cNvGraphicFramePr>
               <a:graphicFrameLocks noChangeAspect="1"/>
@@ -2538,7 +2538,7 @@
                   <pic:spPr>
                     <a:xfrm>
                       <a:off x="0" y="0"/>
-                      <a:ext cx="1152000" cy="1152000"/>
+                      <a:ext cx="864000" cy="1382400"/>
                     </a:xfrm>
                     <a:prstGeom prst="rect"/>
                   </pic:spPr>
@@ -2554,7 +2554,7 @@
       <w:r>
         <w:drawing>
           <wp:inline xmlns:a="http://schemas.openxmlformats.org/drawingml/2006/main" xmlns:pic="http://schemas.openxmlformats.org/drawingml/2006/picture">
-            <wp:extent cx="1152000" cy="1152000"/>
+            <wp:extent cx="864000" cy="1382400"/>
             <wp:docPr id="30" name="Picture 30"/>
             <wp:cNvGraphicFramePr>
               <a:graphicFrameLocks noChangeAspect="1"/>
@@ -2575,7 +2575,7 @@
                   <pic:spPr>
                     <a:xfrm>
                       <a:off x="0" y="0"/>
-                      <a:ext cx="1152000" cy="1152000"/>
+                      <a:ext cx="864000" cy="1382400"/>
                     </a:xfrm>
                     <a:prstGeom prst="rect"/>
                   </pic:spPr>
@@ -2752,7 +2752,7 @@
       <w:r>
         <w:drawing>
           <wp:inline xmlns:a="http://schemas.openxmlformats.org/drawingml/2006/main" xmlns:pic="http://schemas.openxmlformats.org/drawingml/2006/picture">
-            <wp:extent cx="1152000" cy="1152000"/>
+            <wp:extent cx="864000" cy="1382400"/>
             <wp:docPr id="31" name="Picture 31"/>
             <wp:cNvGraphicFramePr>
               <a:graphicFrameLocks noChangeAspect="1"/>
@@ -2773,7 +2773,7 @@
                   <pic:spPr>
                     <a:xfrm>
                       <a:off x="0" y="0"/>
-                      <a:ext cx="1152000" cy="1152000"/>
+                      <a:ext cx="864000" cy="1382400"/>
                     </a:xfrm>
                     <a:prstGeom prst="rect"/>
                   </pic:spPr>
@@ -2789,7 +2789,7 @@
       <w:r>
         <w:drawing>
           <wp:inline xmlns:a="http://schemas.openxmlformats.org/drawingml/2006/main" xmlns:pic="http://schemas.openxmlformats.org/drawingml/2006/picture">
-            <wp:extent cx="1152000" cy="1152000"/>
+            <wp:extent cx="864000" cy="1382400"/>
             <wp:docPr id="32" name="Picture 32"/>
             <wp:cNvGraphicFramePr>
               <a:graphicFrameLocks noChangeAspect="1"/>
@@ -2810,7 +2810,7 @@
                   <pic:spPr>
                     <a:xfrm>
                       <a:off x="0" y="0"/>
-                      <a:ext cx="1152000" cy="1152000"/>
+                      <a:ext cx="864000" cy="1382400"/>
                     </a:xfrm>
                     <a:prstGeom prst="rect"/>
                   </pic:spPr>
@@ -2826,7 +2826,7 @@
       <w:r>
         <w:drawing>
           <wp:inline xmlns:a="http://schemas.openxmlformats.org/drawingml/2006/main" xmlns:pic="http://schemas.openxmlformats.org/drawingml/2006/picture">
-            <wp:extent cx="1152000" cy="1152000"/>
+            <wp:extent cx="864000" cy="1382400"/>
             <wp:docPr id="33" name="Picture 33"/>
             <wp:cNvGraphicFramePr>
               <a:graphicFrameLocks noChangeAspect="1"/>
@@ -2847,7 +2847,7 @@
                   <pic:spPr>
                     <a:xfrm>
                       <a:off x="0" y="0"/>
-                      <a:ext cx="1152000" cy="1152000"/>
+                      <a:ext cx="864000" cy="1382400"/>
                     </a:xfrm>
                     <a:prstGeom prst="rect"/>
                   </pic:spPr>
@@ -3024,7 +3024,7 @@
       <w:r>
         <w:drawing>
           <wp:inline xmlns:a="http://schemas.openxmlformats.org/drawingml/2006/main" xmlns:pic="http://schemas.openxmlformats.org/drawingml/2006/picture">
-            <wp:extent cx="1152000" cy="1152000"/>
+            <wp:extent cx="864000" cy="1382400"/>
             <wp:docPr id="34" name="Picture 34"/>
             <wp:cNvGraphicFramePr>
               <a:graphicFrameLocks noChangeAspect="1"/>
@@ -3045,7 +3045,7 @@
                   <pic:spPr>
                     <a:xfrm>
                       <a:off x="0" y="0"/>
-                      <a:ext cx="1152000" cy="1152000"/>
+                      <a:ext cx="864000" cy="1382400"/>
                     </a:xfrm>
                     <a:prstGeom prst="rect"/>
                   </pic:spPr>
@@ -3061,7 +3061,7 @@
       <w:r>
         <w:drawing>
           <wp:inline xmlns:a="http://schemas.openxmlformats.org/drawingml/2006/main" xmlns:pic="http://schemas.openxmlformats.org/drawingml/2006/picture">
-            <wp:extent cx="1152000" cy="1152000"/>
+            <wp:extent cx="864000" cy="1382400"/>
             <wp:docPr id="35" name="Picture 35"/>
             <wp:cNvGraphicFramePr>
               <a:graphicFrameLocks noChangeAspect="1"/>
@@ -3082,7 +3082,7 @@
                   <pic:spPr>
                     <a:xfrm>
                       <a:off x="0" y="0"/>
-                      <a:ext cx="1152000" cy="1152000"/>
+                      <a:ext cx="864000" cy="1382400"/>
                     </a:xfrm>
                     <a:prstGeom prst="rect"/>
                   </pic:spPr>
@@ -3098,7 +3098,7 @@
       <w:r>
         <w:drawing>
           <wp:inline xmlns:a="http://schemas.openxmlformats.org/drawingml/2006/main" xmlns:pic="http://schemas.openxmlformats.org/drawingml/2006/picture">
-            <wp:extent cx="1152000" cy="1152000"/>
+            <wp:extent cx="864000" cy="1382400"/>
             <wp:docPr id="36" name="Picture 36"/>
             <wp:cNvGraphicFramePr>
               <a:graphicFrameLocks noChangeAspect="1"/>
@@ -3119,7 +3119,7 @@
                   <pic:spPr>
                     <a:xfrm>
                       <a:off x="0" y="0"/>
-                      <a:ext cx="1152000" cy="1152000"/>
+                      <a:ext cx="864000" cy="1382400"/>
                     </a:xfrm>
                     <a:prstGeom prst="rect"/>
                   </pic:spPr>
@@ -3296,7 +3296,7 @@
       <w:r>
         <w:drawing>
           <wp:inline xmlns:a="http://schemas.openxmlformats.org/drawingml/2006/main" xmlns:pic="http://schemas.openxmlformats.org/drawingml/2006/picture">
-            <wp:extent cx="1152000" cy="1152000"/>
+            <wp:extent cx="864000" cy="1382400"/>
             <wp:docPr id="37" name="Picture 37"/>
             <wp:cNvGraphicFramePr>
               <a:graphicFrameLocks noChangeAspect="1"/>
@@ -3317,7 +3317,7 @@
                   <pic:spPr>
                     <a:xfrm>
                       <a:off x="0" y="0"/>
-                      <a:ext cx="1152000" cy="1152000"/>
+                      <a:ext cx="864000" cy="1382400"/>
                     </a:xfrm>
                     <a:prstGeom prst="rect"/>
                   </pic:spPr>
@@ -3333,7 +3333,7 @@
       <w:r>
         <w:drawing>
           <wp:inline xmlns:a="http://schemas.openxmlformats.org/drawingml/2006/main" xmlns:pic="http://schemas.openxmlformats.org/drawingml/2006/picture">
-            <wp:extent cx="1152000" cy="1152000"/>
+            <wp:extent cx="864000" cy="1382400"/>
             <wp:docPr id="38" name="Picture 38"/>
             <wp:cNvGraphicFramePr>
               <a:graphicFrameLocks noChangeAspect="1"/>
@@ -3354,7 +3354,7 @@
                   <pic:spPr>
                     <a:xfrm>
                       <a:off x="0" y="0"/>
-                      <a:ext cx="1152000" cy="1152000"/>
+                      <a:ext cx="864000" cy="1382400"/>
                     </a:xfrm>
                     <a:prstGeom prst="rect"/>
                   </pic:spPr>
@@ -3370,7 +3370,7 @@
       <w:r>
         <w:drawing>
           <wp:inline xmlns:a="http://schemas.openxmlformats.org/drawingml/2006/main" xmlns:pic="http://schemas.openxmlformats.org/drawingml/2006/picture">
-            <wp:extent cx="1152000" cy="1152000"/>
+            <wp:extent cx="864000" cy="1382400"/>
             <wp:docPr id="39" name="Picture 39"/>
             <wp:cNvGraphicFramePr>
               <a:graphicFrameLocks noChangeAspect="1"/>
@@ -3391,7 +3391,7 @@
                   <pic:spPr>
                     <a:xfrm>
                       <a:off x="0" y="0"/>
-                      <a:ext cx="1152000" cy="1152000"/>
+                      <a:ext cx="864000" cy="1382400"/>
                     </a:xfrm>
                     <a:prstGeom prst="rect"/>
                   </pic:spPr>
@@ -3568,7 +3568,7 @@
       <w:r>
         <w:drawing>
           <wp:inline xmlns:a="http://schemas.openxmlformats.org/drawingml/2006/main" xmlns:pic="http://schemas.openxmlformats.org/drawingml/2006/picture">
-            <wp:extent cx="1152000" cy="1152000"/>
+            <wp:extent cx="864000" cy="1382400"/>
             <wp:docPr id="40" name="Picture 40"/>
             <wp:cNvGraphicFramePr>
               <a:graphicFrameLocks noChangeAspect="1"/>
@@ -3589,7 +3589,7 @@
                   <pic:spPr>
                     <a:xfrm>
                       <a:off x="0" y="0"/>
-                      <a:ext cx="1152000" cy="1152000"/>
+                      <a:ext cx="864000" cy="1382400"/>
                     </a:xfrm>
                     <a:prstGeom prst="rect"/>
                   </pic:spPr>
@@ -3605,7 +3605,7 @@
       <w:r>
         <w:drawing>
           <wp:inline xmlns:a="http://schemas.openxmlformats.org/drawingml/2006/main" xmlns:pic="http://schemas.openxmlformats.org/drawingml/2006/picture">
-            <wp:extent cx="1152000" cy="1152000"/>
+            <wp:extent cx="864000" cy="1382400"/>
             <wp:docPr id="41" name="Picture 41"/>
             <wp:cNvGraphicFramePr>
               <a:graphicFrameLocks noChangeAspect="1"/>
@@ -3626,7 +3626,7 @@
                   <pic:spPr>
                     <a:xfrm>
                       <a:off x="0" y="0"/>
-                      <a:ext cx="1152000" cy="1152000"/>
+                      <a:ext cx="864000" cy="1382400"/>
                     </a:xfrm>
                     <a:prstGeom prst="rect"/>
                   </pic:spPr>
@@ -3642,7 +3642,7 @@
       <w:r>
         <w:drawing>
           <wp:inline xmlns:a="http://schemas.openxmlformats.org/drawingml/2006/main" xmlns:pic="http://schemas.openxmlformats.org/drawingml/2006/picture">
-            <wp:extent cx="1152000" cy="1152000"/>
+            <wp:extent cx="864000" cy="1382400"/>
             <wp:docPr id="42" name="Picture 42"/>
             <wp:cNvGraphicFramePr>
               <a:graphicFrameLocks noChangeAspect="1"/>
@@ -3663,7 +3663,7 @@
                   <pic:spPr>
                     <a:xfrm>
                       <a:off x="0" y="0"/>
-                      <a:ext cx="1152000" cy="1152000"/>
+                      <a:ext cx="864000" cy="1382400"/>
                     </a:xfrm>
                     <a:prstGeom prst="rect"/>
                   </pic:spPr>
@@ -3840,7 +3840,7 @@
       <w:r>
         <w:drawing>
           <wp:inline xmlns:a="http://schemas.openxmlformats.org/drawingml/2006/main" xmlns:pic="http://schemas.openxmlformats.org/drawingml/2006/picture">
-            <wp:extent cx="1152000" cy="1152000"/>
+            <wp:extent cx="864000" cy="1382400"/>
             <wp:docPr id="43" name="Picture 43"/>
             <wp:cNvGraphicFramePr>
               <a:graphicFrameLocks noChangeAspect="1"/>
@@ -3861,7 +3861,7 @@
                   <pic:spPr>
                     <a:xfrm>
                       <a:off x="0" y="0"/>
-                      <a:ext cx="1152000" cy="1152000"/>
+                      <a:ext cx="864000" cy="1382400"/>
                     </a:xfrm>
                     <a:prstGeom prst="rect"/>
                   </pic:spPr>
@@ -3877,7 +3877,7 @@
       <w:r>
         <w:drawing>
           <wp:inline xmlns:a="http://schemas.openxmlformats.org/drawingml/2006/main" xmlns:pic="http://schemas.openxmlformats.org/drawingml/2006/picture">
-            <wp:extent cx="1152000" cy="1152000"/>
+            <wp:extent cx="864000" cy="1382400"/>
             <wp:docPr id="44" name="Picture 44"/>
             <wp:cNvGraphicFramePr>
               <a:graphicFrameLocks noChangeAspect="1"/>
@@ -3898,7 +3898,7 @@
                   <pic:spPr>
                     <a:xfrm>
                       <a:off x="0" y="0"/>
-                      <a:ext cx="1152000" cy="1152000"/>
+                      <a:ext cx="864000" cy="1382400"/>
                     </a:xfrm>
                     <a:prstGeom prst="rect"/>
                   </pic:spPr>
@@ -3914,7 +3914,7 @@
       <w:r>
         <w:drawing>
           <wp:inline xmlns:a="http://schemas.openxmlformats.org/drawingml/2006/main" xmlns:pic="http://schemas.openxmlformats.org/drawingml/2006/picture">
-            <wp:extent cx="1152000" cy="1152000"/>
+            <wp:extent cx="864000" cy="1382400"/>
             <wp:docPr id="45" name="Picture 45"/>
             <wp:cNvGraphicFramePr>
               <a:graphicFrameLocks noChangeAspect="1"/>
@@ -3935,7 +3935,7 @@
                   <pic:spPr>
                     <a:xfrm>
                       <a:off x="0" y="0"/>
-                      <a:ext cx="1152000" cy="1152000"/>
+                      <a:ext cx="864000" cy="1382400"/>
                     </a:xfrm>
                     <a:prstGeom prst="rect"/>
                   </pic:spPr>
@@ -4112,7 +4112,7 @@
       <w:r>
         <w:drawing>
           <wp:inline xmlns:a="http://schemas.openxmlformats.org/drawingml/2006/main" xmlns:pic="http://schemas.openxmlformats.org/drawingml/2006/picture">
-            <wp:extent cx="1152000" cy="1152000"/>
+            <wp:extent cx="864000" cy="1382400"/>
             <wp:docPr id="46" name="Picture 46"/>
             <wp:cNvGraphicFramePr>
               <a:graphicFrameLocks noChangeAspect="1"/>
@@ -4133,7 +4133,7 @@
                   <pic:spPr>
                     <a:xfrm>
                       <a:off x="0" y="0"/>
-                      <a:ext cx="1152000" cy="1152000"/>
+                      <a:ext cx="864000" cy="1382400"/>
                     </a:xfrm>
                     <a:prstGeom prst="rect"/>
                   </pic:spPr>
@@ -4149,7 +4149,7 @@
       <w:r>
         <w:drawing>
           <wp:inline xmlns:a="http://schemas.openxmlformats.org/drawingml/2006/main" xmlns:pic="http://schemas.openxmlformats.org/drawingml/2006/picture">
-            <wp:extent cx="1152000" cy="1152000"/>
+            <wp:extent cx="864000" cy="1382400"/>
             <wp:docPr id="47" name="Picture 47"/>
             <wp:cNvGraphicFramePr>
               <a:graphicFrameLocks noChangeAspect="1"/>
@@ -4170,7 +4170,7 @@
                   <pic:spPr>
                     <a:xfrm>
                       <a:off x="0" y="0"/>
-                      <a:ext cx="1152000" cy="1152000"/>
+                      <a:ext cx="864000" cy="1382400"/>
                     </a:xfrm>
                     <a:prstGeom prst="rect"/>
                   </pic:spPr>
@@ -4186,7 +4186,7 @@
       <w:r>
         <w:drawing>
           <wp:inline xmlns:a="http://schemas.openxmlformats.org/drawingml/2006/main" xmlns:pic="http://schemas.openxmlformats.org/drawingml/2006/picture">
-            <wp:extent cx="1152000" cy="1152000"/>
+            <wp:extent cx="864000" cy="1382400"/>
             <wp:docPr id="48" name="Picture 48"/>
             <wp:cNvGraphicFramePr>
               <a:graphicFrameLocks noChangeAspect="1"/>
@@ -4207,7 +4207,7 @@
                   <pic:spPr>
                     <a:xfrm>
                       <a:off x="0" y="0"/>
-                      <a:ext cx="1152000" cy="1152000"/>
+                      <a:ext cx="864000" cy="1382400"/>
                     </a:xfrm>
                     <a:prstGeom prst="rect"/>
                   </pic:spPr>
@@ -4384,7 +4384,7 @@
       <w:r>
         <w:drawing>
           <wp:inline xmlns:a="http://schemas.openxmlformats.org/drawingml/2006/main" xmlns:pic="http://schemas.openxmlformats.org/drawingml/2006/picture">
-            <wp:extent cx="1152000" cy="1152000"/>
+            <wp:extent cx="864000" cy="1382400"/>
             <wp:docPr id="49" name="Picture 49"/>
             <wp:cNvGraphicFramePr>
               <a:graphicFrameLocks noChangeAspect="1"/>
@@ -4405,7 +4405,7 @@
                   <pic:spPr>
                     <a:xfrm>
                       <a:off x="0" y="0"/>
-                      <a:ext cx="1152000" cy="1152000"/>
+                      <a:ext cx="864000" cy="1382400"/>
                     </a:xfrm>
                     <a:prstGeom prst="rect"/>
                   </pic:spPr>
@@ -4421,7 +4421,7 @@
       <w:r>
         <w:drawing>
           <wp:inline xmlns:a="http://schemas.openxmlformats.org/drawingml/2006/main" xmlns:pic="http://schemas.openxmlformats.org/drawingml/2006/picture">
-            <wp:extent cx="1152000" cy="1152000"/>
+            <wp:extent cx="864000" cy="1382400"/>
             <wp:docPr id="50" name="Picture 50"/>
             <wp:cNvGraphicFramePr>
               <a:graphicFrameLocks noChangeAspect="1"/>
@@ -4442,7 +4442,7 @@
                   <pic:spPr>
                     <a:xfrm>
                       <a:off x="0" y="0"/>
-                      <a:ext cx="1152000" cy="1152000"/>
+                      <a:ext cx="864000" cy="1382400"/>
                     </a:xfrm>
                     <a:prstGeom prst="rect"/>
                   </pic:spPr>
@@ -4458,7 +4458,7 @@
       <w:r>
         <w:drawing>
           <wp:inline xmlns:a="http://schemas.openxmlformats.org/drawingml/2006/main" xmlns:pic="http://schemas.openxmlformats.org/drawingml/2006/picture">
-            <wp:extent cx="1152000" cy="1152000"/>
+            <wp:extent cx="864000" cy="1382400"/>
             <wp:docPr id="51" name="Picture 51"/>
             <wp:cNvGraphicFramePr>
               <a:graphicFrameLocks noChangeAspect="1"/>
@@ -4479,7 +4479,7 @@
                   <pic:spPr>
                     <a:xfrm>
                       <a:off x="0" y="0"/>
-                      <a:ext cx="1152000" cy="1152000"/>
+                      <a:ext cx="864000" cy="1382400"/>
                     </a:xfrm>
                     <a:prstGeom prst="rect"/>
                   </pic:spPr>
@@ -4656,7 +4656,7 @@
       <w:r>
         <w:drawing>
           <wp:inline xmlns:a="http://schemas.openxmlformats.org/drawingml/2006/main" xmlns:pic="http://schemas.openxmlformats.org/drawingml/2006/picture">
-            <wp:extent cx="1152000" cy="1152000"/>
+            <wp:extent cx="864000" cy="1382400"/>
             <wp:docPr id="52" name="Picture 52"/>
             <wp:cNvGraphicFramePr>
               <a:graphicFrameLocks noChangeAspect="1"/>
@@ -4677,7 +4677,7 @@
                   <pic:spPr>
                     <a:xfrm>
                       <a:off x="0" y="0"/>
-                      <a:ext cx="1152000" cy="1152000"/>
+                      <a:ext cx="864000" cy="1382400"/>
                     </a:xfrm>
                     <a:prstGeom prst="rect"/>
                   </pic:spPr>
@@ -4693,7 +4693,7 @@
       <w:r>
         <w:drawing>
           <wp:inline xmlns:a="http://schemas.openxmlformats.org/drawingml/2006/main" xmlns:pic="http://schemas.openxmlformats.org/drawingml/2006/picture">
-            <wp:extent cx="1152000" cy="1152000"/>
+            <wp:extent cx="864000" cy="1382400"/>
             <wp:docPr id="53" name="Picture 53"/>
             <wp:cNvGraphicFramePr>
               <a:graphicFrameLocks noChangeAspect="1"/>
@@ -4714,7 +4714,7 @@
                   <pic:spPr>
                     <a:xfrm>
                       <a:off x="0" y="0"/>
-                      <a:ext cx="1152000" cy="1152000"/>
+                      <a:ext cx="864000" cy="1382400"/>
                     </a:xfrm>
                     <a:prstGeom prst="rect"/>
                   </pic:spPr>
@@ -4730,7 +4730,7 @@
       <w:r>
         <w:drawing>
           <wp:inline xmlns:a="http://schemas.openxmlformats.org/drawingml/2006/main" xmlns:pic="http://schemas.openxmlformats.org/drawingml/2006/picture">
-            <wp:extent cx="1152000" cy="1152000"/>
+            <wp:extent cx="864000" cy="1382400"/>
             <wp:docPr id="54" name="Picture 54"/>
             <wp:cNvGraphicFramePr>
               <a:graphicFrameLocks noChangeAspect="1"/>
@@ -4751,7 +4751,7 @@
                   <pic:spPr>
                     <a:xfrm>
                       <a:off x="0" y="0"/>
-                      <a:ext cx="1152000" cy="1152000"/>
+                      <a:ext cx="864000" cy="1382400"/>
                     </a:xfrm>
                     <a:prstGeom prst="rect"/>
                   </pic:spPr>
@@ -4928,7 +4928,7 @@
       <w:r>
         <w:drawing>
           <wp:inline xmlns:a="http://schemas.openxmlformats.org/drawingml/2006/main" xmlns:pic="http://schemas.openxmlformats.org/drawingml/2006/picture">
-            <wp:extent cx="1152000" cy="1152000"/>
+            <wp:extent cx="864000" cy="1382400"/>
             <wp:docPr id="55" name="Picture 55"/>
             <wp:cNvGraphicFramePr>
               <a:graphicFrameLocks noChangeAspect="1"/>
@@ -4949,7 +4949,7 @@
                   <pic:spPr>
                     <a:xfrm>
                       <a:off x="0" y="0"/>
-                      <a:ext cx="1152000" cy="1152000"/>
+                      <a:ext cx="864000" cy="1382400"/>
                     </a:xfrm>
                     <a:prstGeom prst="rect"/>
                   </pic:spPr>
@@ -4965,7 +4965,7 @@
       <w:r>
         <w:drawing>
           <wp:inline xmlns:a="http://schemas.openxmlformats.org/drawingml/2006/main" xmlns:pic="http://schemas.openxmlformats.org/drawingml/2006/picture">
-            <wp:extent cx="1152000" cy="1152000"/>
+            <wp:extent cx="864000" cy="1382400"/>
             <wp:docPr id="56" name="Picture 56"/>
             <wp:cNvGraphicFramePr>
               <a:graphicFrameLocks noChangeAspect="1"/>
@@ -4986,7 +4986,7 @@
                   <pic:spPr>
                     <a:xfrm>
                       <a:off x="0" y="0"/>
-                      <a:ext cx="1152000" cy="1152000"/>
+                      <a:ext cx="864000" cy="1382400"/>
                     </a:xfrm>
                     <a:prstGeom prst="rect"/>
                   </pic:spPr>
@@ -5002,7 +5002,7 @@
       <w:r>
         <w:drawing>
           <wp:inline xmlns:a="http://schemas.openxmlformats.org/drawingml/2006/main" xmlns:pic="http://schemas.openxmlformats.org/drawingml/2006/picture">
-            <wp:extent cx="1152000" cy="1152000"/>
+            <wp:extent cx="864000" cy="1382400"/>
             <wp:docPr id="57" name="Picture 57"/>
             <wp:cNvGraphicFramePr>
               <a:graphicFrameLocks noChangeAspect="1"/>
@@ -5023,7 +5023,7 @@
                   <pic:spPr>
                     <a:xfrm>
                       <a:off x="0" y="0"/>
-                      <a:ext cx="1152000" cy="1152000"/>
+                      <a:ext cx="864000" cy="1382400"/>
                     </a:xfrm>
                     <a:prstGeom prst="rect"/>
                   </pic:spPr>
@@ -5200,7 +5200,7 @@
       <w:r>
         <w:drawing>
           <wp:inline xmlns:a="http://schemas.openxmlformats.org/drawingml/2006/main" xmlns:pic="http://schemas.openxmlformats.org/drawingml/2006/picture">
-            <wp:extent cx="1152000" cy="1152000"/>
+            <wp:extent cx="864000" cy="1382400"/>
             <wp:docPr id="58" name="Picture 58"/>
             <wp:cNvGraphicFramePr>
               <a:graphicFrameLocks noChangeAspect="1"/>
@@ -5221,7 +5221,7 @@
                   <pic:spPr>
                     <a:xfrm>
                       <a:off x="0" y="0"/>
-                      <a:ext cx="1152000" cy="1152000"/>
+                      <a:ext cx="864000" cy="1382400"/>
                     </a:xfrm>
                     <a:prstGeom prst="rect"/>
                   </pic:spPr>
@@ -5237,7 +5237,7 @@
       <w:r>
         <w:drawing>
           <wp:inline xmlns:a="http://schemas.openxmlformats.org/drawingml/2006/main" xmlns:pic="http://schemas.openxmlformats.org/drawingml/2006/picture">
-            <wp:extent cx="1152000" cy="1152000"/>
+            <wp:extent cx="864000" cy="1382400"/>
             <wp:docPr id="59" name="Picture 59"/>
             <wp:cNvGraphicFramePr>
               <a:graphicFrameLocks noChangeAspect="1"/>
@@ -5258,7 +5258,7 @@
                   <pic:spPr>
                     <a:xfrm>
                       <a:off x="0" y="0"/>
-                      <a:ext cx="1152000" cy="1152000"/>
+                      <a:ext cx="864000" cy="1382400"/>
                     </a:xfrm>
                     <a:prstGeom prst="rect"/>
                   </pic:spPr>
@@ -5274,7 +5274,7 @@
       <w:r>
         <w:drawing>
           <wp:inline xmlns:a="http://schemas.openxmlformats.org/drawingml/2006/main" xmlns:pic="http://schemas.openxmlformats.org/drawingml/2006/picture">
-            <wp:extent cx="1152000" cy="1152000"/>
+            <wp:extent cx="864000" cy="1382400"/>
             <wp:docPr id="60" name="Picture 60"/>
             <wp:cNvGraphicFramePr>
               <a:graphicFrameLocks noChangeAspect="1"/>
@@ -5295,7 +5295,7 @@
                   <pic:spPr>
                     <a:xfrm>
                       <a:off x="0" y="0"/>
-                      <a:ext cx="1152000" cy="1152000"/>
+                      <a:ext cx="864000" cy="1382400"/>
                     </a:xfrm>
                     <a:prstGeom prst="rect"/>
                   </pic:spPr>
@@ -5472,7 +5472,7 @@
       <w:r>
         <w:drawing>
           <wp:inline xmlns:a="http://schemas.openxmlformats.org/drawingml/2006/main" xmlns:pic="http://schemas.openxmlformats.org/drawingml/2006/picture">
-            <wp:extent cx="1152000" cy="1152000"/>
+            <wp:extent cx="864000" cy="1382400"/>
             <wp:docPr id="61" name="Picture 61"/>
             <wp:cNvGraphicFramePr>
               <a:graphicFrameLocks noChangeAspect="1"/>
@@ -5493,7 +5493,7 @@
                   <pic:spPr>
                     <a:xfrm>
                       <a:off x="0" y="0"/>
-                      <a:ext cx="1152000" cy="1152000"/>
+                      <a:ext cx="864000" cy="1382400"/>
                     </a:xfrm>
                     <a:prstGeom prst="rect"/>
                   </pic:spPr>
@@ -5509,7 +5509,7 @@
       <w:r>
         <w:drawing>
           <wp:inline xmlns:a="http://schemas.openxmlformats.org/drawingml/2006/main" xmlns:pic="http://schemas.openxmlformats.org/drawingml/2006/picture">
-            <wp:extent cx="1152000" cy="1152000"/>
+            <wp:extent cx="864000" cy="1382400"/>
             <wp:docPr id="62" name="Picture 62"/>
             <wp:cNvGraphicFramePr>
               <a:graphicFrameLocks noChangeAspect="1"/>
@@ -5530,7 +5530,7 @@
                   <pic:spPr>
                     <a:xfrm>
                       <a:off x="0" y="0"/>
-                      <a:ext cx="1152000" cy="1152000"/>
+                      <a:ext cx="864000" cy="1382400"/>
                     </a:xfrm>
                     <a:prstGeom prst="rect"/>
                   </pic:spPr>
@@ -5546,7 +5546,7 @@
       <w:r>
         <w:drawing>
           <wp:inline xmlns:a="http://schemas.openxmlformats.org/drawingml/2006/main" xmlns:pic="http://schemas.openxmlformats.org/drawingml/2006/picture">
-            <wp:extent cx="1152000" cy="1152000"/>
+            <wp:extent cx="864000" cy="1382400"/>
             <wp:docPr id="63" name="Picture 63"/>
             <wp:cNvGraphicFramePr>
               <a:graphicFrameLocks noChangeAspect="1"/>
@@ -5567,7 +5567,7 @@
                   <pic:spPr>
                     <a:xfrm>
                       <a:off x="0" y="0"/>
-                      <a:ext cx="1152000" cy="1152000"/>
+                      <a:ext cx="864000" cy="1382400"/>
                     </a:xfrm>
                     <a:prstGeom prst="rect"/>
                   </pic:spPr>
@@ -5744,7 +5744,7 @@
       <w:r>
         <w:drawing>
           <wp:inline xmlns:a="http://schemas.openxmlformats.org/drawingml/2006/main" xmlns:pic="http://schemas.openxmlformats.org/drawingml/2006/picture">
-            <wp:extent cx="1152000" cy="1152000"/>
+            <wp:extent cx="864000" cy="1382400"/>
             <wp:docPr id="64" name="Picture 64"/>
             <wp:cNvGraphicFramePr>
               <a:graphicFrameLocks noChangeAspect="1"/>
@@ -5765,7 +5765,7 @@
                   <pic:spPr>
                     <a:xfrm>
                       <a:off x="0" y="0"/>
-                      <a:ext cx="1152000" cy="1152000"/>
+                      <a:ext cx="864000" cy="1382400"/>
                     </a:xfrm>
                     <a:prstGeom prst="rect"/>
                   </pic:spPr>
@@ -5781,7 +5781,7 @@
       <w:r>
         <w:drawing>
           <wp:inline xmlns:a="http://schemas.openxmlformats.org/drawingml/2006/main" xmlns:pic="http://schemas.openxmlformats.org/drawingml/2006/picture">
-            <wp:extent cx="1152000" cy="1152000"/>
+            <wp:extent cx="864000" cy="1382400"/>
             <wp:docPr id="65" name="Picture 65"/>
             <wp:cNvGraphicFramePr>
               <a:graphicFrameLocks noChangeAspect="1"/>
@@ -5802,7 +5802,7 @@
                   <pic:spPr>
                     <a:xfrm>
                       <a:off x="0" y="0"/>
-                      <a:ext cx="1152000" cy="1152000"/>
+                      <a:ext cx="864000" cy="1382400"/>
                     </a:xfrm>
                     <a:prstGeom prst="rect"/>
                   </pic:spPr>
@@ -5818,7 +5818,7 @@
       <w:r>
         <w:drawing>
           <wp:inline xmlns:a="http://schemas.openxmlformats.org/drawingml/2006/main" xmlns:pic="http://schemas.openxmlformats.org/drawingml/2006/picture">
-            <wp:extent cx="1152000" cy="1152000"/>
+            <wp:extent cx="864000" cy="1382400"/>
             <wp:docPr id="66" name="Picture 66"/>
             <wp:cNvGraphicFramePr>
               <a:graphicFrameLocks noChangeAspect="1"/>
@@ -5839,7 +5839,7 @@
                   <pic:spPr>
                     <a:xfrm>
                       <a:off x="0" y="0"/>
-                      <a:ext cx="1152000" cy="1152000"/>
+                      <a:ext cx="864000" cy="1382400"/>
                     </a:xfrm>
                     <a:prstGeom prst="rect"/>
                   </pic:spPr>
@@ -6016,7 +6016,7 @@
       <w:r>
         <w:drawing>
           <wp:inline xmlns:a="http://schemas.openxmlformats.org/drawingml/2006/main" xmlns:pic="http://schemas.openxmlformats.org/drawingml/2006/picture">
-            <wp:extent cx="1152000" cy="1152000"/>
+            <wp:extent cx="864000" cy="1382400"/>
             <wp:docPr id="67" name="Picture 67"/>
             <wp:cNvGraphicFramePr>
               <a:graphicFrameLocks noChangeAspect="1"/>
@@ -6037,7 +6037,7 @@
                   <pic:spPr>
                     <a:xfrm>
                       <a:off x="0" y="0"/>
-                      <a:ext cx="1152000" cy="1152000"/>
+                      <a:ext cx="864000" cy="1382400"/>
                     </a:xfrm>
                     <a:prstGeom prst="rect"/>
                   </pic:spPr>
@@ -6053,7 +6053,7 @@
       <w:r>
         <w:drawing>
           <wp:inline xmlns:a="http://schemas.openxmlformats.org/drawingml/2006/main" xmlns:pic="http://schemas.openxmlformats.org/drawingml/2006/picture">
-            <wp:extent cx="1152000" cy="1152000"/>
+            <wp:extent cx="864000" cy="1382400"/>
             <wp:docPr id="68" name="Picture 68"/>
             <wp:cNvGraphicFramePr>
               <a:graphicFrameLocks noChangeAspect="1"/>
@@ -6074,7 +6074,7 @@
                   <pic:spPr>
                     <a:xfrm>
                       <a:off x="0" y="0"/>
-                      <a:ext cx="1152000" cy="1152000"/>
+                      <a:ext cx="864000" cy="1382400"/>
                     </a:xfrm>
                     <a:prstGeom prst="rect"/>
                   </pic:spPr>
@@ -6090,7 +6090,7 @@
       <w:r>
         <w:drawing>
           <wp:inline xmlns:a="http://schemas.openxmlformats.org/drawingml/2006/main" xmlns:pic="http://schemas.openxmlformats.org/drawingml/2006/picture">
-            <wp:extent cx="1152000" cy="1152000"/>
+            <wp:extent cx="864000" cy="1382400"/>
             <wp:docPr id="69" name="Picture 69"/>
             <wp:cNvGraphicFramePr>
               <a:graphicFrameLocks noChangeAspect="1"/>
@@ -6111,7 +6111,7 @@
                   <pic:spPr>
                     <a:xfrm>
                       <a:off x="0" y="0"/>
-                      <a:ext cx="1152000" cy="1152000"/>
+                      <a:ext cx="864000" cy="1382400"/>
                     </a:xfrm>
                     <a:prstGeom prst="rect"/>
                   </pic:spPr>
@@ -6288,7 +6288,7 @@
       <w:r>
         <w:drawing>
           <wp:inline xmlns:a="http://schemas.openxmlformats.org/drawingml/2006/main" xmlns:pic="http://schemas.openxmlformats.org/drawingml/2006/picture">
-            <wp:extent cx="1152000" cy="1152000"/>
+            <wp:extent cx="864000" cy="1382400"/>
             <wp:docPr id="70" name="Picture 70"/>
             <wp:cNvGraphicFramePr>
               <a:graphicFrameLocks noChangeAspect="1"/>
@@ -6309,7 +6309,7 @@
                   <pic:spPr>
                     <a:xfrm>
                       <a:off x="0" y="0"/>
-                      <a:ext cx="1152000" cy="1152000"/>
+                      <a:ext cx="864000" cy="1382400"/>
                     </a:xfrm>
                     <a:prstGeom prst="rect"/>
                   </pic:spPr>
@@ -6325,7 +6325,7 @@
       <w:r>
         <w:drawing>
           <wp:inline xmlns:a="http://schemas.openxmlformats.org/drawingml/2006/main" xmlns:pic="http://schemas.openxmlformats.org/drawingml/2006/picture">
-            <wp:extent cx="1152000" cy="1152000"/>
+            <wp:extent cx="864000" cy="1382400"/>
             <wp:docPr id="71" name="Picture 71"/>
             <wp:cNvGraphicFramePr>
               <a:graphicFrameLocks noChangeAspect="1"/>
@@ -6346,7 +6346,7 @@
                   <pic:spPr>
                     <a:xfrm>
                       <a:off x="0" y="0"/>
-                      <a:ext cx="1152000" cy="1152000"/>
+                      <a:ext cx="864000" cy="1382400"/>
                     </a:xfrm>
                     <a:prstGeom prst="rect"/>
                   </pic:spPr>
@@ -6362,7 +6362,7 @@
       <w:r>
         <w:drawing>
           <wp:inline xmlns:a="http://schemas.openxmlformats.org/drawingml/2006/main" xmlns:pic="http://schemas.openxmlformats.org/drawingml/2006/picture">
-            <wp:extent cx="1152000" cy="1152000"/>
+            <wp:extent cx="864000" cy="1382400"/>
             <wp:docPr id="72" name="Picture 72"/>
             <wp:cNvGraphicFramePr>
               <a:graphicFrameLocks noChangeAspect="1"/>
@@ -6383,7 +6383,7 @@
                   <pic:spPr>
                     <a:xfrm>
                       <a:off x="0" y="0"/>
-                      <a:ext cx="1152000" cy="1152000"/>
+                      <a:ext cx="864000" cy="1382400"/>
                     </a:xfrm>
                     <a:prstGeom prst="rect"/>
                   </pic:spPr>
@@ -6560,7 +6560,7 @@
       <w:r>
         <w:drawing>
           <wp:inline xmlns:a="http://schemas.openxmlformats.org/drawingml/2006/main" xmlns:pic="http://schemas.openxmlformats.org/drawingml/2006/picture">
-            <wp:extent cx="1152000" cy="1152000"/>
+            <wp:extent cx="864000" cy="1382400"/>
             <wp:docPr id="73" name="Picture 73"/>
             <wp:cNvGraphicFramePr>
               <a:graphicFrameLocks noChangeAspect="1"/>
@@ -6581,7 +6581,7 @@
                   <pic:spPr>
                     <a:xfrm>
                       <a:off x="0" y="0"/>
-                      <a:ext cx="1152000" cy="1152000"/>
+                      <a:ext cx="864000" cy="1382400"/>
                     </a:xfrm>
                     <a:prstGeom prst="rect"/>
                   </pic:spPr>
@@ -6597,7 +6597,7 @@
       <w:r>
         <w:drawing>
           <wp:inline xmlns:a="http://schemas.openxmlformats.org/drawingml/2006/main" xmlns:pic="http://schemas.openxmlformats.org/drawingml/2006/picture">
-            <wp:extent cx="1152000" cy="1152000"/>
+            <wp:extent cx="864000" cy="1382400"/>
             <wp:docPr id="74" name="Picture 74"/>
             <wp:cNvGraphicFramePr>
               <a:graphicFrameLocks noChangeAspect="1"/>
@@ -6618,7 +6618,7 @@
                   <pic:spPr>
                     <a:xfrm>
                       <a:off x="0" y="0"/>
-                      <a:ext cx="1152000" cy="1152000"/>
+                      <a:ext cx="864000" cy="1382400"/>
                     </a:xfrm>
                     <a:prstGeom prst="rect"/>
                   </pic:spPr>
@@ -6634,7 +6634,7 @@
       <w:r>
         <w:drawing>
           <wp:inline xmlns:a="http://schemas.openxmlformats.org/drawingml/2006/main" xmlns:pic="http://schemas.openxmlformats.org/drawingml/2006/picture">
-            <wp:extent cx="1152000" cy="1152000"/>
+            <wp:extent cx="864000" cy="1382400"/>
             <wp:docPr id="75" name="Picture 75"/>
             <wp:cNvGraphicFramePr>
               <a:graphicFrameLocks noChangeAspect="1"/>
@@ -6655,7 +6655,7 @@
                   <pic:spPr>
                     <a:xfrm>
                       <a:off x="0" y="0"/>
-                      <a:ext cx="1152000" cy="1152000"/>
+                      <a:ext cx="864000" cy="1382400"/>
                     </a:xfrm>
                     <a:prstGeom prst="rect"/>
                   </pic:spPr>
@@ -6832,7 +6832,7 @@
       <w:r>
         <w:drawing>
           <wp:inline xmlns:a="http://schemas.openxmlformats.org/drawingml/2006/main" xmlns:pic="http://schemas.openxmlformats.org/drawingml/2006/picture">
-            <wp:extent cx="1152000" cy="1152000"/>
+            <wp:extent cx="864000" cy="1382400"/>
             <wp:docPr id="76" name="Picture 76"/>
             <wp:cNvGraphicFramePr>
               <a:graphicFrameLocks noChangeAspect="1"/>
@@ -6853,7 +6853,7 @@
                   <pic:spPr>
                     <a:xfrm>
                       <a:off x="0" y="0"/>
-                      <a:ext cx="1152000" cy="1152000"/>
+                      <a:ext cx="864000" cy="1382400"/>
                     </a:xfrm>
                     <a:prstGeom prst="rect"/>
                   </pic:spPr>
@@ -6869,7 +6869,7 @@
       <w:r>
         <w:drawing>
           <wp:inline xmlns:a="http://schemas.openxmlformats.org/drawingml/2006/main" xmlns:pic="http://schemas.openxmlformats.org/drawingml/2006/picture">
-            <wp:extent cx="1152000" cy="1152000"/>
+            <wp:extent cx="864000" cy="1382400"/>
             <wp:docPr id="77" name="Picture 77"/>
             <wp:cNvGraphicFramePr>
               <a:graphicFrameLocks noChangeAspect="1"/>
@@ -6890,7 +6890,7 @@
                   <pic:spPr>
                     <a:xfrm>
                       <a:off x="0" y="0"/>
-                      <a:ext cx="1152000" cy="1152000"/>
+                      <a:ext cx="864000" cy="1382400"/>
                     </a:xfrm>
                     <a:prstGeom prst="rect"/>
                   </pic:spPr>
@@ -6906,7 +6906,7 @@
       <w:r>
         <w:drawing>
           <wp:inline xmlns:a="http://schemas.openxmlformats.org/drawingml/2006/main" xmlns:pic="http://schemas.openxmlformats.org/drawingml/2006/picture">
-            <wp:extent cx="1152000" cy="1152000"/>
+            <wp:extent cx="864000" cy="1382400"/>
             <wp:docPr id="78" name="Picture 78"/>
             <wp:cNvGraphicFramePr>
               <a:graphicFrameLocks noChangeAspect="1"/>
@@ -6927,7 +6927,7 @@
                   <pic:spPr>
                     <a:xfrm>
                       <a:off x="0" y="0"/>
-                      <a:ext cx="1152000" cy="1152000"/>
+                      <a:ext cx="864000" cy="1382400"/>
                     </a:xfrm>
                     <a:prstGeom prst="rect"/>
                   </pic:spPr>
@@ -7104,7 +7104,7 @@
       <w:r>
         <w:drawing>
           <wp:inline xmlns:a="http://schemas.openxmlformats.org/drawingml/2006/main" xmlns:pic="http://schemas.openxmlformats.org/drawingml/2006/picture">
-            <wp:extent cx="1152000" cy="1152000"/>
+            <wp:extent cx="864000" cy="1382400"/>
             <wp:docPr id="79" name="Picture 79"/>
             <wp:cNvGraphicFramePr>
               <a:graphicFrameLocks noChangeAspect="1"/>
@@ -7125,7 +7125,7 @@
                   <pic:spPr>
                     <a:xfrm>
                       <a:off x="0" y="0"/>
-                      <a:ext cx="1152000" cy="1152000"/>
+                      <a:ext cx="864000" cy="1382400"/>
                     </a:xfrm>
                     <a:prstGeom prst="rect"/>
                   </pic:spPr>
@@ -7141,7 +7141,7 @@
       <w:r>
         <w:drawing>
           <wp:inline xmlns:a="http://schemas.openxmlformats.org/drawingml/2006/main" xmlns:pic="http://schemas.openxmlformats.org/drawingml/2006/picture">
-            <wp:extent cx="1152000" cy="1152000"/>
+            <wp:extent cx="864000" cy="1382400"/>
             <wp:docPr id="80" name="Picture 80"/>
             <wp:cNvGraphicFramePr>
               <a:graphicFrameLocks noChangeAspect="1"/>
@@ -7162,7 +7162,7 @@
                   <pic:spPr>
                     <a:xfrm>
                       <a:off x="0" y="0"/>
-                      <a:ext cx="1152000" cy="1152000"/>
+                      <a:ext cx="864000" cy="1382400"/>
                     </a:xfrm>
                     <a:prstGeom prst="rect"/>
                   </pic:spPr>
@@ -7178,7 +7178,7 @@
       <w:r>
         <w:drawing>
           <wp:inline xmlns:a="http://schemas.openxmlformats.org/drawingml/2006/main" xmlns:pic="http://schemas.openxmlformats.org/drawingml/2006/picture">
-            <wp:extent cx="1152000" cy="1152000"/>
+            <wp:extent cx="864000" cy="1382400"/>
             <wp:docPr id="81" name="Picture 81"/>
             <wp:cNvGraphicFramePr>
               <a:graphicFrameLocks noChangeAspect="1"/>
@@ -7199,7 +7199,7 @@
                   <pic:spPr>
                     <a:xfrm>
                       <a:off x="0" y="0"/>
-                      <a:ext cx="1152000" cy="1152000"/>
+                      <a:ext cx="864000" cy="1382400"/>
                     </a:xfrm>
                     <a:prstGeom prst="rect"/>
                   </pic:spPr>
@@ -7376,7 +7376,7 @@
       <w:r>
         <w:drawing>
           <wp:inline xmlns:a="http://schemas.openxmlformats.org/drawingml/2006/main" xmlns:pic="http://schemas.openxmlformats.org/drawingml/2006/picture">
-            <wp:extent cx="1152000" cy="1152000"/>
+            <wp:extent cx="864000" cy="1382400"/>
             <wp:docPr id="82" name="Picture 82"/>
             <wp:cNvGraphicFramePr>
               <a:graphicFrameLocks noChangeAspect="1"/>
@@ -7397,7 +7397,7 @@
                   <pic:spPr>
                     <a:xfrm>
                       <a:off x="0" y="0"/>
-                      <a:ext cx="1152000" cy="1152000"/>
+                      <a:ext cx="864000" cy="1382400"/>
                     </a:xfrm>
                     <a:prstGeom prst="rect"/>
                   </pic:spPr>
@@ -7413,7 +7413,7 @@
       <w:r>
         <w:drawing>
           <wp:inline xmlns:a="http://schemas.openxmlformats.org/drawingml/2006/main" xmlns:pic="http://schemas.openxmlformats.org/drawingml/2006/picture">
-            <wp:extent cx="1152000" cy="1152000"/>
+            <wp:extent cx="864000" cy="1382400"/>
             <wp:docPr id="83" name="Picture 83"/>
             <wp:cNvGraphicFramePr>
               <a:graphicFrameLocks noChangeAspect="1"/>
@@ -7434,7 +7434,7 @@
                   <pic:spPr>
                     <a:xfrm>
                       <a:off x="0" y="0"/>
-                      <a:ext cx="1152000" cy="1152000"/>
+                      <a:ext cx="864000" cy="1382400"/>
                     </a:xfrm>
                     <a:prstGeom prst="rect"/>
                   </pic:spPr>
@@ -7450,7 +7450,7 @@
       <w:r>
         <w:drawing>
           <wp:inline xmlns:a="http://schemas.openxmlformats.org/drawingml/2006/main" xmlns:pic="http://schemas.openxmlformats.org/drawingml/2006/picture">
-            <wp:extent cx="1152000" cy="1152000"/>
+            <wp:extent cx="864000" cy="1382400"/>
             <wp:docPr id="84" name="Picture 84"/>
             <wp:cNvGraphicFramePr>
               <a:graphicFrameLocks noChangeAspect="1"/>
@@ -7471,7 +7471,7 @@
                   <pic:spPr>
                     <a:xfrm>
                       <a:off x="0" y="0"/>
-                      <a:ext cx="1152000" cy="1152000"/>
+                      <a:ext cx="864000" cy="1382400"/>
                     </a:xfrm>
                     <a:prstGeom prst="rect"/>
                   </pic:spPr>

</xml_diff>

<commit_message>
Portraits rebuilt from the reference picture itself: 48 x 75
The owner found the first redraw too far from the reference. The
portraits are now built on the reference's own pixel grid (48 x 75):
its face, hair and shirt are hand-cleaned parts (tools/portrait_parts.py),
recoloured per character with skin, hair and cloth ramps taken from the
reference, then dressed (hair styles, hats, glasses, facial hair,
jackets, props) and given three faces. Game frames, billboards, posters,
the quest pages and Characters.docx follow the new size.

Co-Authored-By: Claude <noreply@anthropic.com>
Claude-Session: https://claude.ai/code/session_01RpWbq89r71C1p9HP7EcbZ5
</commit_message>
<xml_diff>
--- a/docs/Characters.docx
+++ b/docs/Characters.docx
@@ -12,7 +12,7 @@
     </w:p>
     <w:p>
       <w:r>
-        <w:t>How every character looks, written down so they stay the same in every mission. The portraits are pixel art, 40 x 64, head and shoulders nearly face on, in the style of the reference picture (transparent around the figure; the game shows them on a night-dark ground with a glow in the character's bubble colour, as here). Each has three faces: calm, angry and smiling - the game picks one from the mood written on each line (angry: shouting, furious, screaming, barking, gritted, urgent, angry, hard, impatient, snarling, breathless, yelling; smiling: grinning, laughing, warm, amused, smiling, wry, relieved, silky, scoffing, moved, teasing, proud; anything else: calm).</w:t>
+        <w:t>How every character looks, written down so they stay the same in every mission. The portraits are pixel art, 48 x 75, in the style of the reference picture: head and shoulders in a 3/4 view, the ear on the left, lit from the upper right, transparent around the figure (the game shows them on a night-dark ground with a glow in the character's bubble colour, as here). Each has three faces: calm, angry and smiling - the game picks one from the mood written on each line (angry: shouting, furious, screaming, barking, gritted, urgent, angry, hard, impatient, snarling, breathless, yelling; smiling: grinning, laughing, warm, amused, smiling, wry, relieved, silky, scoffing, moved, teasing, proud; anything else: calm).</w:t>
       </w:r>
     </w:p>
     <w:p>
@@ -32,7 +32,7 @@
       <w:r>
         <w:drawing>
           <wp:inline xmlns:a="http://schemas.openxmlformats.org/drawingml/2006/main" xmlns:pic="http://schemas.openxmlformats.org/drawingml/2006/picture">
-            <wp:extent cx="864000" cy="1382400"/>
+            <wp:extent cx="936000" cy="1462500"/>
             <wp:docPr id="1" name="Picture 1"/>
             <wp:cNvGraphicFramePr>
               <a:graphicFrameLocks noChangeAspect="1"/>
@@ -53,7 +53,7 @@
                   <pic:spPr>
                     <a:xfrm>
                       <a:off x="0" y="0"/>
-                      <a:ext cx="864000" cy="1382400"/>
+                      <a:ext cx="936000" cy="1462500"/>
                     </a:xfrm>
                     <a:prstGeom prst="rect"/>
                   </pic:spPr>
@@ -69,7 +69,7 @@
       <w:r>
         <w:drawing>
           <wp:inline xmlns:a="http://schemas.openxmlformats.org/drawingml/2006/main" xmlns:pic="http://schemas.openxmlformats.org/drawingml/2006/picture">
-            <wp:extent cx="864000" cy="1382400"/>
+            <wp:extent cx="936000" cy="1462500"/>
             <wp:docPr id="2" name="Picture 2"/>
             <wp:cNvGraphicFramePr>
               <a:graphicFrameLocks noChangeAspect="1"/>
@@ -90,7 +90,7 @@
                   <pic:spPr>
                     <a:xfrm>
                       <a:off x="0" y="0"/>
-                      <a:ext cx="864000" cy="1382400"/>
+                      <a:ext cx="936000" cy="1462500"/>
                     </a:xfrm>
                     <a:prstGeom prst="rect"/>
                   </pic:spPr>
@@ -106,7 +106,7 @@
       <w:r>
         <w:drawing>
           <wp:inline xmlns:a="http://schemas.openxmlformats.org/drawingml/2006/main" xmlns:pic="http://schemas.openxmlformats.org/drawingml/2006/picture">
-            <wp:extent cx="864000" cy="1382400"/>
+            <wp:extent cx="936000" cy="1462500"/>
             <wp:docPr id="3" name="Picture 3"/>
             <wp:cNvGraphicFramePr>
               <a:graphicFrameLocks noChangeAspect="1"/>
@@ -127,7 +127,7 @@
                   <pic:spPr>
                     <a:xfrm>
                       <a:off x="0" y="0"/>
-                      <a:ext cx="864000" cy="1382400"/>
+                      <a:ext cx="936000" cy="1462500"/>
                     </a:xfrm>
                     <a:prstGeom prst="rect"/>
                   </pic:spPr>
@@ -304,7 +304,7 @@
       <w:r>
         <w:drawing>
           <wp:inline xmlns:a="http://schemas.openxmlformats.org/drawingml/2006/main" xmlns:pic="http://schemas.openxmlformats.org/drawingml/2006/picture">
-            <wp:extent cx="864000" cy="1382400"/>
+            <wp:extent cx="936000" cy="1462500"/>
             <wp:docPr id="4" name="Picture 4"/>
             <wp:cNvGraphicFramePr>
               <a:graphicFrameLocks noChangeAspect="1"/>
@@ -325,7 +325,7 @@
                   <pic:spPr>
                     <a:xfrm>
                       <a:off x="0" y="0"/>
-                      <a:ext cx="864000" cy="1382400"/>
+                      <a:ext cx="936000" cy="1462500"/>
                     </a:xfrm>
                     <a:prstGeom prst="rect"/>
                   </pic:spPr>
@@ -341,7 +341,7 @@
       <w:r>
         <w:drawing>
           <wp:inline xmlns:a="http://schemas.openxmlformats.org/drawingml/2006/main" xmlns:pic="http://schemas.openxmlformats.org/drawingml/2006/picture">
-            <wp:extent cx="864000" cy="1382400"/>
+            <wp:extent cx="936000" cy="1462500"/>
             <wp:docPr id="5" name="Picture 5"/>
             <wp:cNvGraphicFramePr>
               <a:graphicFrameLocks noChangeAspect="1"/>
@@ -362,7 +362,7 @@
                   <pic:spPr>
                     <a:xfrm>
                       <a:off x="0" y="0"/>
-                      <a:ext cx="864000" cy="1382400"/>
+                      <a:ext cx="936000" cy="1462500"/>
                     </a:xfrm>
                     <a:prstGeom prst="rect"/>
                   </pic:spPr>
@@ -378,7 +378,7 @@
       <w:r>
         <w:drawing>
           <wp:inline xmlns:a="http://schemas.openxmlformats.org/drawingml/2006/main" xmlns:pic="http://schemas.openxmlformats.org/drawingml/2006/picture">
-            <wp:extent cx="864000" cy="1382400"/>
+            <wp:extent cx="936000" cy="1462500"/>
             <wp:docPr id="6" name="Picture 6"/>
             <wp:cNvGraphicFramePr>
               <a:graphicFrameLocks noChangeAspect="1"/>
@@ -399,7 +399,7 @@
                   <pic:spPr>
                     <a:xfrm>
                       <a:off x="0" y="0"/>
-                      <a:ext cx="864000" cy="1382400"/>
+                      <a:ext cx="936000" cy="1462500"/>
                     </a:xfrm>
                     <a:prstGeom prst="rect"/>
                   </pic:spPr>
@@ -576,7 +576,7 @@
       <w:r>
         <w:drawing>
           <wp:inline xmlns:a="http://schemas.openxmlformats.org/drawingml/2006/main" xmlns:pic="http://schemas.openxmlformats.org/drawingml/2006/picture">
-            <wp:extent cx="864000" cy="1382400"/>
+            <wp:extent cx="936000" cy="1462500"/>
             <wp:docPr id="7" name="Picture 7"/>
             <wp:cNvGraphicFramePr>
               <a:graphicFrameLocks noChangeAspect="1"/>
@@ -597,7 +597,7 @@
                   <pic:spPr>
                     <a:xfrm>
                       <a:off x="0" y="0"/>
-                      <a:ext cx="864000" cy="1382400"/>
+                      <a:ext cx="936000" cy="1462500"/>
                     </a:xfrm>
                     <a:prstGeom prst="rect"/>
                   </pic:spPr>
@@ -613,7 +613,7 @@
       <w:r>
         <w:drawing>
           <wp:inline xmlns:a="http://schemas.openxmlformats.org/drawingml/2006/main" xmlns:pic="http://schemas.openxmlformats.org/drawingml/2006/picture">
-            <wp:extent cx="864000" cy="1382400"/>
+            <wp:extent cx="936000" cy="1462500"/>
             <wp:docPr id="8" name="Picture 8"/>
             <wp:cNvGraphicFramePr>
               <a:graphicFrameLocks noChangeAspect="1"/>
@@ -634,7 +634,7 @@
                   <pic:spPr>
                     <a:xfrm>
                       <a:off x="0" y="0"/>
-                      <a:ext cx="864000" cy="1382400"/>
+                      <a:ext cx="936000" cy="1462500"/>
                     </a:xfrm>
                     <a:prstGeom prst="rect"/>
                   </pic:spPr>
@@ -650,7 +650,7 @@
       <w:r>
         <w:drawing>
           <wp:inline xmlns:a="http://schemas.openxmlformats.org/drawingml/2006/main" xmlns:pic="http://schemas.openxmlformats.org/drawingml/2006/picture">
-            <wp:extent cx="864000" cy="1382400"/>
+            <wp:extent cx="936000" cy="1462500"/>
             <wp:docPr id="9" name="Picture 9"/>
             <wp:cNvGraphicFramePr>
               <a:graphicFrameLocks noChangeAspect="1"/>
@@ -671,7 +671,7 @@
                   <pic:spPr>
                     <a:xfrm>
                       <a:off x="0" y="0"/>
-                      <a:ext cx="864000" cy="1382400"/>
+                      <a:ext cx="936000" cy="1462500"/>
                     </a:xfrm>
                     <a:prstGeom prst="rect"/>
                   </pic:spPr>
@@ -848,7 +848,7 @@
       <w:r>
         <w:drawing>
           <wp:inline xmlns:a="http://schemas.openxmlformats.org/drawingml/2006/main" xmlns:pic="http://schemas.openxmlformats.org/drawingml/2006/picture">
-            <wp:extent cx="864000" cy="1382400"/>
+            <wp:extent cx="936000" cy="1462500"/>
             <wp:docPr id="10" name="Picture 10"/>
             <wp:cNvGraphicFramePr>
               <a:graphicFrameLocks noChangeAspect="1"/>
@@ -869,7 +869,7 @@
                   <pic:spPr>
                     <a:xfrm>
                       <a:off x="0" y="0"/>
-                      <a:ext cx="864000" cy="1382400"/>
+                      <a:ext cx="936000" cy="1462500"/>
                     </a:xfrm>
                     <a:prstGeom prst="rect"/>
                   </pic:spPr>
@@ -885,7 +885,7 @@
       <w:r>
         <w:drawing>
           <wp:inline xmlns:a="http://schemas.openxmlformats.org/drawingml/2006/main" xmlns:pic="http://schemas.openxmlformats.org/drawingml/2006/picture">
-            <wp:extent cx="864000" cy="1382400"/>
+            <wp:extent cx="936000" cy="1462500"/>
             <wp:docPr id="11" name="Picture 11"/>
             <wp:cNvGraphicFramePr>
               <a:graphicFrameLocks noChangeAspect="1"/>
@@ -906,7 +906,7 @@
                   <pic:spPr>
                     <a:xfrm>
                       <a:off x="0" y="0"/>
-                      <a:ext cx="864000" cy="1382400"/>
+                      <a:ext cx="936000" cy="1462500"/>
                     </a:xfrm>
                     <a:prstGeom prst="rect"/>
                   </pic:spPr>
@@ -922,7 +922,7 @@
       <w:r>
         <w:drawing>
           <wp:inline xmlns:a="http://schemas.openxmlformats.org/drawingml/2006/main" xmlns:pic="http://schemas.openxmlformats.org/drawingml/2006/picture">
-            <wp:extent cx="864000" cy="1382400"/>
+            <wp:extent cx="936000" cy="1462500"/>
             <wp:docPr id="12" name="Picture 12"/>
             <wp:cNvGraphicFramePr>
               <a:graphicFrameLocks noChangeAspect="1"/>
@@ -943,7 +943,7 @@
                   <pic:spPr>
                     <a:xfrm>
                       <a:off x="0" y="0"/>
-                      <a:ext cx="864000" cy="1382400"/>
+                      <a:ext cx="936000" cy="1462500"/>
                     </a:xfrm>
                     <a:prstGeom prst="rect"/>
                   </pic:spPr>
@@ -1120,7 +1120,7 @@
       <w:r>
         <w:drawing>
           <wp:inline xmlns:a="http://schemas.openxmlformats.org/drawingml/2006/main" xmlns:pic="http://schemas.openxmlformats.org/drawingml/2006/picture">
-            <wp:extent cx="864000" cy="1382400"/>
+            <wp:extent cx="936000" cy="1462500"/>
             <wp:docPr id="13" name="Picture 13"/>
             <wp:cNvGraphicFramePr>
               <a:graphicFrameLocks noChangeAspect="1"/>
@@ -1141,7 +1141,7 @@
                   <pic:spPr>
                     <a:xfrm>
                       <a:off x="0" y="0"/>
-                      <a:ext cx="864000" cy="1382400"/>
+                      <a:ext cx="936000" cy="1462500"/>
                     </a:xfrm>
                     <a:prstGeom prst="rect"/>
                   </pic:spPr>
@@ -1157,7 +1157,7 @@
       <w:r>
         <w:drawing>
           <wp:inline xmlns:a="http://schemas.openxmlformats.org/drawingml/2006/main" xmlns:pic="http://schemas.openxmlformats.org/drawingml/2006/picture">
-            <wp:extent cx="864000" cy="1382400"/>
+            <wp:extent cx="936000" cy="1462500"/>
             <wp:docPr id="14" name="Picture 14"/>
             <wp:cNvGraphicFramePr>
               <a:graphicFrameLocks noChangeAspect="1"/>
@@ -1178,7 +1178,7 @@
                   <pic:spPr>
                     <a:xfrm>
                       <a:off x="0" y="0"/>
-                      <a:ext cx="864000" cy="1382400"/>
+                      <a:ext cx="936000" cy="1462500"/>
                     </a:xfrm>
                     <a:prstGeom prst="rect"/>
                   </pic:spPr>
@@ -1194,7 +1194,7 @@
       <w:r>
         <w:drawing>
           <wp:inline xmlns:a="http://schemas.openxmlformats.org/drawingml/2006/main" xmlns:pic="http://schemas.openxmlformats.org/drawingml/2006/picture">
-            <wp:extent cx="864000" cy="1382400"/>
+            <wp:extent cx="936000" cy="1462500"/>
             <wp:docPr id="15" name="Picture 15"/>
             <wp:cNvGraphicFramePr>
               <a:graphicFrameLocks noChangeAspect="1"/>
@@ -1215,7 +1215,7 @@
                   <pic:spPr>
                     <a:xfrm>
                       <a:off x="0" y="0"/>
-                      <a:ext cx="864000" cy="1382400"/>
+                      <a:ext cx="936000" cy="1462500"/>
                     </a:xfrm>
                     <a:prstGeom prst="rect"/>
                   </pic:spPr>
@@ -1392,7 +1392,7 @@
       <w:r>
         <w:drawing>
           <wp:inline xmlns:a="http://schemas.openxmlformats.org/drawingml/2006/main" xmlns:pic="http://schemas.openxmlformats.org/drawingml/2006/picture">
-            <wp:extent cx="864000" cy="1382400"/>
+            <wp:extent cx="936000" cy="1462500"/>
             <wp:docPr id="16" name="Picture 16"/>
             <wp:cNvGraphicFramePr>
               <a:graphicFrameLocks noChangeAspect="1"/>
@@ -1413,7 +1413,7 @@
                   <pic:spPr>
                     <a:xfrm>
                       <a:off x="0" y="0"/>
-                      <a:ext cx="864000" cy="1382400"/>
+                      <a:ext cx="936000" cy="1462500"/>
                     </a:xfrm>
                     <a:prstGeom prst="rect"/>
                   </pic:spPr>
@@ -1429,7 +1429,7 @@
       <w:r>
         <w:drawing>
           <wp:inline xmlns:a="http://schemas.openxmlformats.org/drawingml/2006/main" xmlns:pic="http://schemas.openxmlformats.org/drawingml/2006/picture">
-            <wp:extent cx="864000" cy="1382400"/>
+            <wp:extent cx="936000" cy="1462500"/>
             <wp:docPr id="17" name="Picture 17"/>
             <wp:cNvGraphicFramePr>
               <a:graphicFrameLocks noChangeAspect="1"/>
@@ -1450,7 +1450,7 @@
                   <pic:spPr>
                     <a:xfrm>
                       <a:off x="0" y="0"/>
-                      <a:ext cx="864000" cy="1382400"/>
+                      <a:ext cx="936000" cy="1462500"/>
                     </a:xfrm>
                     <a:prstGeom prst="rect"/>
                   </pic:spPr>
@@ -1466,7 +1466,7 @@
       <w:r>
         <w:drawing>
           <wp:inline xmlns:a="http://schemas.openxmlformats.org/drawingml/2006/main" xmlns:pic="http://schemas.openxmlformats.org/drawingml/2006/picture">
-            <wp:extent cx="864000" cy="1382400"/>
+            <wp:extent cx="936000" cy="1462500"/>
             <wp:docPr id="18" name="Picture 18"/>
             <wp:cNvGraphicFramePr>
               <a:graphicFrameLocks noChangeAspect="1"/>
@@ -1487,7 +1487,7 @@
                   <pic:spPr>
                     <a:xfrm>
                       <a:off x="0" y="0"/>
-                      <a:ext cx="864000" cy="1382400"/>
+                      <a:ext cx="936000" cy="1462500"/>
                     </a:xfrm>
                     <a:prstGeom prst="rect"/>
                   </pic:spPr>
@@ -1664,7 +1664,7 @@
       <w:r>
         <w:drawing>
           <wp:inline xmlns:a="http://schemas.openxmlformats.org/drawingml/2006/main" xmlns:pic="http://schemas.openxmlformats.org/drawingml/2006/picture">
-            <wp:extent cx="864000" cy="1382400"/>
+            <wp:extent cx="936000" cy="1462500"/>
             <wp:docPr id="19" name="Picture 19"/>
             <wp:cNvGraphicFramePr>
               <a:graphicFrameLocks noChangeAspect="1"/>
@@ -1685,7 +1685,7 @@
                   <pic:spPr>
                     <a:xfrm>
                       <a:off x="0" y="0"/>
-                      <a:ext cx="864000" cy="1382400"/>
+                      <a:ext cx="936000" cy="1462500"/>
                     </a:xfrm>
                     <a:prstGeom prst="rect"/>
                   </pic:spPr>
@@ -1701,7 +1701,7 @@
       <w:r>
         <w:drawing>
           <wp:inline xmlns:a="http://schemas.openxmlformats.org/drawingml/2006/main" xmlns:pic="http://schemas.openxmlformats.org/drawingml/2006/picture">
-            <wp:extent cx="864000" cy="1382400"/>
+            <wp:extent cx="936000" cy="1462500"/>
             <wp:docPr id="20" name="Picture 20"/>
             <wp:cNvGraphicFramePr>
               <a:graphicFrameLocks noChangeAspect="1"/>
@@ -1722,7 +1722,7 @@
                   <pic:spPr>
                     <a:xfrm>
                       <a:off x="0" y="0"/>
-                      <a:ext cx="864000" cy="1382400"/>
+                      <a:ext cx="936000" cy="1462500"/>
                     </a:xfrm>
                     <a:prstGeom prst="rect"/>
                   </pic:spPr>
@@ -1738,7 +1738,7 @@
       <w:r>
         <w:drawing>
           <wp:inline xmlns:a="http://schemas.openxmlformats.org/drawingml/2006/main" xmlns:pic="http://schemas.openxmlformats.org/drawingml/2006/picture">
-            <wp:extent cx="864000" cy="1382400"/>
+            <wp:extent cx="936000" cy="1462500"/>
             <wp:docPr id="21" name="Picture 21"/>
             <wp:cNvGraphicFramePr>
               <a:graphicFrameLocks noChangeAspect="1"/>
@@ -1759,7 +1759,7 @@
                   <pic:spPr>
                     <a:xfrm>
                       <a:off x="0" y="0"/>
-                      <a:ext cx="864000" cy="1382400"/>
+                      <a:ext cx="936000" cy="1462500"/>
                     </a:xfrm>
                     <a:prstGeom prst="rect"/>
                   </pic:spPr>
@@ -1936,7 +1936,7 @@
       <w:r>
         <w:drawing>
           <wp:inline xmlns:a="http://schemas.openxmlformats.org/drawingml/2006/main" xmlns:pic="http://schemas.openxmlformats.org/drawingml/2006/picture">
-            <wp:extent cx="864000" cy="1382400"/>
+            <wp:extent cx="936000" cy="1462500"/>
             <wp:docPr id="22" name="Picture 22"/>
             <wp:cNvGraphicFramePr>
               <a:graphicFrameLocks noChangeAspect="1"/>
@@ -1957,7 +1957,7 @@
                   <pic:spPr>
                     <a:xfrm>
                       <a:off x="0" y="0"/>
-                      <a:ext cx="864000" cy="1382400"/>
+                      <a:ext cx="936000" cy="1462500"/>
                     </a:xfrm>
                     <a:prstGeom prst="rect"/>
                   </pic:spPr>
@@ -1973,7 +1973,7 @@
       <w:r>
         <w:drawing>
           <wp:inline xmlns:a="http://schemas.openxmlformats.org/drawingml/2006/main" xmlns:pic="http://schemas.openxmlformats.org/drawingml/2006/picture">
-            <wp:extent cx="864000" cy="1382400"/>
+            <wp:extent cx="936000" cy="1462500"/>
             <wp:docPr id="23" name="Picture 23"/>
             <wp:cNvGraphicFramePr>
               <a:graphicFrameLocks noChangeAspect="1"/>
@@ -1994,7 +1994,7 @@
                   <pic:spPr>
                     <a:xfrm>
                       <a:off x="0" y="0"/>
-                      <a:ext cx="864000" cy="1382400"/>
+                      <a:ext cx="936000" cy="1462500"/>
                     </a:xfrm>
                     <a:prstGeom prst="rect"/>
                   </pic:spPr>
@@ -2010,7 +2010,7 @@
       <w:r>
         <w:drawing>
           <wp:inline xmlns:a="http://schemas.openxmlformats.org/drawingml/2006/main" xmlns:pic="http://schemas.openxmlformats.org/drawingml/2006/picture">
-            <wp:extent cx="864000" cy="1382400"/>
+            <wp:extent cx="936000" cy="1462500"/>
             <wp:docPr id="24" name="Picture 24"/>
             <wp:cNvGraphicFramePr>
               <a:graphicFrameLocks noChangeAspect="1"/>
@@ -2031,7 +2031,7 @@
                   <pic:spPr>
                     <a:xfrm>
                       <a:off x="0" y="0"/>
-                      <a:ext cx="864000" cy="1382400"/>
+                      <a:ext cx="936000" cy="1462500"/>
                     </a:xfrm>
                     <a:prstGeom prst="rect"/>
                   </pic:spPr>
@@ -2208,7 +2208,7 @@
       <w:r>
         <w:drawing>
           <wp:inline xmlns:a="http://schemas.openxmlformats.org/drawingml/2006/main" xmlns:pic="http://schemas.openxmlformats.org/drawingml/2006/picture">
-            <wp:extent cx="864000" cy="1382400"/>
+            <wp:extent cx="936000" cy="1462500"/>
             <wp:docPr id="25" name="Picture 25"/>
             <wp:cNvGraphicFramePr>
               <a:graphicFrameLocks noChangeAspect="1"/>
@@ -2229,7 +2229,7 @@
                   <pic:spPr>
                     <a:xfrm>
                       <a:off x="0" y="0"/>
-                      <a:ext cx="864000" cy="1382400"/>
+                      <a:ext cx="936000" cy="1462500"/>
                     </a:xfrm>
                     <a:prstGeom prst="rect"/>
                   </pic:spPr>
@@ -2245,7 +2245,7 @@
       <w:r>
         <w:drawing>
           <wp:inline xmlns:a="http://schemas.openxmlformats.org/drawingml/2006/main" xmlns:pic="http://schemas.openxmlformats.org/drawingml/2006/picture">
-            <wp:extent cx="864000" cy="1382400"/>
+            <wp:extent cx="936000" cy="1462500"/>
             <wp:docPr id="26" name="Picture 26"/>
             <wp:cNvGraphicFramePr>
               <a:graphicFrameLocks noChangeAspect="1"/>
@@ -2266,7 +2266,7 @@
                   <pic:spPr>
                     <a:xfrm>
                       <a:off x="0" y="0"/>
-                      <a:ext cx="864000" cy="1382400"/>
+                      <a:ext cx="936000" cy="1462500"/>
                     </a:xfrm>
                     <a:prstGeom prst="rect"/>
                   </pic:spPr>
@@ -2282,7 +2282,7 @@
       <w:r>
         <w:drawing>
           <wp:inline xmlns:a="http://schemas.openxmlformats.org/drawingml/2006/main" xmlns:pic="http://schemas.openxmlformats.org/drawingml/2006/picture">
-            <wp:extent cx="864000" cy="1382400"/>
+            <wp:extent cx="936000" cy="1462500"/>
             <wp:docPr id="27" name="Picture 27"/>
             <wp:cNvGraphicFramePr>
               <a:graphicFrameLocks noChangeAspect="1"/>
@@ -2303,7 +2303,7 @@
                   <pic:spPr>
                     <a:xfrm>
                       <a:off x="0" y="0"/>
-                      <a:ext cx="864000" cy="1382400"/>
+                      <a:ext cx="936000" cy="1462500"/>
                     </a:xfrm>
                     <a:prstGeom prst="rect"/>
                   </pic:spPr>
@@ -2480,7 +2480,7 @@
       <w:r>
         <w:drawing>
           <wp:inline xmlns:a="http://schemas.openxmlformats.org/drawingml/2006/main" xmlns:pic="http://schemas.openxmlformats.org/drawingml/2006/picture">
-            <wp:extent cx="864000" cy="1382400"/>
+            <wp:extent cx="936000" cy="1462500"/>
             <wp:docPr id="28" name="Picture 28"/>
             <wp:cNvGraphicFramePr>
               <a:graphicFrameLocks noChangeAspect="1"/>
@@ -2501,7 +2501,7 @@
                   <pic:spPr>
                     <a:xfrm>
                       <a:off x="0" y="0"/>
-                      <a:ext cx="864000" cy="1382400"/>
+                      <a:ext cx="936000" cy="1462500"/>
                     </a:xfrm>
                     <a:prstGeom prst="rect"/>
                   </pic:spPr>
@@ -2517,7 +2517,7 @@
       <w:r>
         <w:drawing>
           <wp:inline xmlns:a="http://schemas.openxmlformats.org/drawingml/2006/main" xmlns:pic="http://schemas.openxmlformats.org/drawingml/2006/picture">
-            <wp:extent cx="864000" cy="1382400"/>
+            <wp:extent cx="936000" cy="1462500"/>
             <wp:docPr id="29" name="Picture 29"/>
             <wp:cNvGraphicFramePr>
               <a:graphicFrameLocks noChangeAspect="1"/>
@@ -2538,7 +2538,7 @@
                   <pic:spPr>
                     <a:xfrm>
                       <a:off x="0" y="0"/>
-                      <a:ext cx="864000" cy="1382400"/>
+                      <a:ext cx="936000" cy="1462500"/>
                     </a:xfrm>
                     <a:prstGeom prst="rect"/>
                   </pic:spPr>
@@ -2554,7 +2554,7 @@
       <w:r>
         <w:drawing>
           <wp:inline xmlns:a="http://schemas.openxmlformats.org/drawingml/2006/main" xmlns:pic="http://schemas.openxmlformats.org/drawingml/2006/picture">
-            <wp:extent cx="864000" cy="1382400"/>
+            <wp:extent cx="936000" cy="1462500"/>
             <wp:docPr id="30" name="Picture 30"/>
             <wp:cNvGraphicFramePr>
               <a:graphicFrameLocks noChangeAspect="1"/>
@@ -2575,7 +2575,7 @@
                   <pic:spPr>
                     <a:xfrm>
                       <a:off x="0" y="0"/>
-                      <a:ext cx="864000" cy="1382400"/>
+                      <a:ext cx="936000" cy="1462500"/>
                     </a:xfrm>
                     <a:prstGeom prst="rect"/>
                   </pic:spPr>
@@ -2752,7 +2752,7 @@
       <w:r>
         <w:drawing>
           <wp:inline xmlns:a="http://schemas.openxmlformats.org/drawingml/2006/main" xmlns:pic="http://schemas.openxmlformats.org/drawingml/2006/picture">
-            <wp:extent cx="864000" cy="1382400"/>
+            <wp:extent cx="936000" cy="1462500"/>
             <wp:docPr id="31" name="Picture 31"/>
             <wp:cNvGraphicFramePr>
               <a:graphicFrameLocks noChangeAspect="1"/>
@@ -2773,7 +2773,7 @@
                   <pic:spPr>
                     <a:xfrm>
                       <a:off x="0" y="0"/>
-                      <a:ext cx="864000" cy="1382400"/>
+                      <a:ext cx="936000" cy="1462500"/>
                     </a:xfrm>
                     <a:prstGeom prst="rect"/>
                   </pic:spPr>
@@ -2789,7 +2789,7 @@
       <w:r>
         <w:drawing>
           <wp:inline xmlns:a="http://schemas.openxmlformats.org/drawingml/2006/main" xmlns:pic="http://schemas.openxmlformats.org/drawingml/2006/picture">
-            <wp:extent cx="864000" cy="1382400"/>
+            <wp:extent cx="936000" cy="1462500"/>
             <wp:docPr id="32" name="Picture 32"/>
             <wp:cNvGraphicFramePr>
               <a:graphicFrameLocks noChangeAspect="1"/>
@@ -2810,7 +2810,7 @@
                   <pic:spPr>
                     <a:xfrm>
                       <a:off x="0" y="0"/>
-                      <a:ext cx="864000" cy="1382400"/>
+                      <a:ext cx="936000" cy="1462500"/>
                     </a:xfrm>
                     <a:prstGeom prst="rect"/>
                   </pic:spPr>
@@ -2826,7 +2826,7 @@
       <w:r>
         <w:drawing>
           <wp:inline xmlns:a="http://schemas.openxmlformats.org/drawingml/2006/main" xmlns:pic="http://schemas.openxmlformats.org/drawingml/2006/picture">
-            <wp:extent cx="864000" cy="1382400"/>
+            <wp:extent cx="936000" cy="1462500"/>
             <wp:docPr id="33" name="Picture 33"/>
             <wp:cNvGraphicFramePr>
               <a:graphicFrameLocks noChangeAspect="1"/>
@@ -2847,7 +2847,7 @@
                   <pic:spPr>
                     <a:xfrm>
                       <a:off x="0" y="0"/>
-                      <a:ext cx="864000" cy="1382400"/>
+                      <a:ext cx="936000" cy="1462500"/>
                     </a:xfrm>
                     <a:prstGeom prst="rect"/>
                   </pic:spPr>
@@ -3024,7 +3024,7 @@
       <w:r>
         <w:drawing>
           <wp:inline xmlns:a="http://schemas.openxmlformats.org/drawingml/2006/main" xmlns:pic="http://schemas.openxmlformats.org/drawingml/2006/picture">
-            <wp:extent cx="864000" cy="1382400"/>
+            <wp:extent cx="936000" cy="1462500"/>
             <wp:docPr id="34" name="Picture 34"/>
             <wp:cNvGraphicFramePr>
               <a:graphicFrameLocks noChangeAspect="1"/>
@@ -3045,7 +3045,7 @@
                   <pic:spPr>
                     <a:xfrm>
                       <a:off x="0" y="0"/>
-                      <a:ext cx="864000" cy="1382400"/>
+                      <a:ext cx="936000" cy="1462500"/>
                     </a:xfrm>
                     <a:prstGeom prst="rect"/>
                   </pic:spPr>
@@ -3061,7 +3061,7 @@
       <w:r>
         <w:drawing>
           <wp:inline xmlns:a="http://schemas.openxmlformats.org/drawingml/2006/main" xmlns:pic="http://schemas.openxmlformats.org/drawingml/2006/picture">
-            <wp:extent cx="864000" cy="1382400"/>
+            <wp:extent cx="936000" cy="1462500"/>
             <wp:docPr id="35" name="Picture 35"/>
             <wp:cNvGraphicFramePr>
               <a:graphicFrameLocks noChangeAspect="1"/>
@@ -3082,7 +3082,7 @@
                   <pic:spPr>
                     <a:xfrm>
                       <a:off x="0" y="0"/>
-                      <a:ext cx="864000" cy="1382400"/>
+                      <a:ext cx="936000" cy="1462500"/>
                     </a:xfrm>
                     <a:prstGeom prst="rect"/>
                   </pic:spPr>
@@ -3098,7 +3098,7 @@
       <w:r>
         <w:drawing>
           <wp:inline xmlns:a="http://schemas.openxmlformats.org/drawingml/2006/main" xmlns:pic="http://schemas.openxmlformats.org/drawingml/2006/picture">
-            <wp:extent cx="864000" cy="1382400"/>
+            <wp:extent cx="936000" cy="1462500"/>
             <wp:docPr id="36" name="Picture 36"/>
             <wp:cNvGraphicFramePr>
               <a:graphicFrameLocks noChangeAspect="1"/>
@@ -3119,7 +3119,7 @@
                   <pic:spPr>
                     <a:xfrm>
                       <a:off x="0" y="0"/>
-                      <a:ext cx="864000" cy="1382400"/>
+                      <a:ext cx="936000" cy="1462500"/>
                     </a:xfrm>
                     <a:prstGeom prst="rect"/>
                   </pic:spPr>
@@ -3296,7 +3296,7 @@
       <w:r>
         <w:drawing>
           <wp:inline xmlns:a="http://schemas.openxmlformats.org/drawingml/2006/main" xmlns:pic="http://schemas.openxmlformats.org/drawingml/2006/picture">
-            <wp:extent cx="864000" cy="1382400"/>
+            <wp:extent cx="936000" cy="1462500"/>
             <wp:docPr id="37" name="Picture 37"/>
             <wp:cNvGraphicFramePr>
               <a:graphicFrameLocks noChangeAspect="1"/>
@@ -3317,7 +3317,7 @@
                   <pic:spPr>
                     <a:xfrm>
                       <a:off x="0" y="0"/>
-                      <a:ext cx="864000" cy="1382400"/>
+                      <a:ext cx="936000" cy="1462500"/>
                     </a:xfrm>
                     <a:prstGeom prst="rect"/>
                   </pic:spPr>
@@ -3333,7 +3333,7 @@
       <w:r>
         <w:drawing>
           <wp:inline xmlns:a="http://schemas.openxmlformats.org/drawingml/2006/main" xmlns:pic="http://schemas.openxmlformats.org/drawingml/2006/picture">
-            <wp:extent cx="864000" cy="1382400"/>
+            <wp:extent cx="936000" cy="1462500"/>
             <wp:docPr id="38" name="Picture 38"/>
             <wp:cNvGraphicFramePr>
               <a:graphicFrameLocks noChangeAspect="1"/>
@@ -3354,7 +3354,7 @@
                   <pic:spPr>
                     <a:xfrm>
                       <a:off x="0" y="0"/>
-                      <a:ext cx="864000" cy="1382400"/>
+                      <a:ext cx="936000" cy="1462500"/>
                     </a:xfrm>
                     <a:prstGeom prst="rect"/>
                   </pic:spPr>
@@ -3370,7 +3370,7 @@
       <w:r>
         <w:drawing>
           <wp:inline xmlns:a="http://schemas.openxmlformats.org/drawingml/2006/main" xmlns:pic="http://schemas.openxmlformats.org/drawingml/2006/picture">
-            <wp:extent cx="864000" cy="1382400"/>
+            <wp:extent cx="936000" cy="1462500"/>
             <wp:docPr id="39" name="Picture 39"/>
             <wp:cNvGraphicFramePr>
               <a:graphicFrameLocks noChangeAspect="1"/>
@@ -3391,7 +3391,7 @@
                   <pic:spPr>
                     <a:xfrm>
                       <a:off x="0" y="0"/>
-                      <a:ext cx="864000" cy="1382400"/>
+                      <a:ext cx="936000" cy="1462500"/>
                     </a:xfrm>
                     <a:prstGeom prst="rect"/>
                   </pic:spPr>
@@ -3568,7 +3568,7 @@
       <w:r>
         <w:drawing>
           <wp:inline xmlns:a="http://schemas.openxmlformats.org/drawingml/2006/main" xmlns:pic="http://schemas.openxmlformats.org/drawingml/2006/picture">
-            <wp:extent cx="864000" cy="1382400"/>
+            <wp:extent cx="936000" cy="1462500"/>
             <wp:docPr id="40" name="Picture 40"/>
             <wp:cNvGraphicFramePr>
               <a:graphicFrameLocks noChangeAspect="1"/>
@@ -3589,7 +3589,7 @@
                   <pic:spPr>
                     <a:xfrm>
                       <a:off x="0" y="0"/>
-                      <a:ext cx="864000" cy="1382400"/>
+                      <a:ext cx="936000" cy="1462500"/>
                     </a:xfrm>
                     <a:prstGeom prst="rect"/>
                   </pic:spPr>
@@ -3605,7 +3605,7 @@
       <w:r>
         <w:drawing>
           <wp:inline xmlns:a="http://schemas.openxmlformats.org/drawingml/2006/main" xmlns:pic="http://schemas.openxmlformats.org/drawingml/2006/picture">
-            <wp:extent cx="864000" cy="1382400"/>
+            <wp:extent cx="936000" cy="1462500"/>
             <wp:docPr id="41" name="Picture 41"/>
             <wp:cNvGraphicFramePr>
               <a:graphicFrameLocks noChangeAspect="1"/>
@@ -3626,7 +3626,7 @@
                   <pic:spPr>
                     <a:xfrm>
                       <a:off x="0" y="0"/>
-                      <a:ext cx="864000" cy="1382400"/>
+                      <a:ext cx="936000" cy="1462500"/>
                     </a:xfrm>
                     <a:prstGeom prst="rect"/>
                   </pic:spPr>
@@ -3642,7 +3642,7 @@
       <w:r>
         <w:drawing>
           <wp:inline xmlns:a="http://schemas.openxmlformats.org/drawingml/2006/main" xmlns:pic="http://schemas.openxmlformats.org/drawingml/2006/picture">
-            <wp:extent cx="864000" cy="1382400"/>
+            <wp:extent cx="936000" cy="1462500"/>
             <wp:docPr id="42" name="Picture 42"/>
             <wp:cNvGraphicFramePr>
               <a:graphicFrameLocks noChangeAspect="1"/>
@@ -3663,7 +3663,7 @@
                   <pic:spPr>
                     <a:xfrm>
                       <a:off x="0" y="0"/>
-                      <a:ext cx="864000" cy="1382400"/>
+                      <a:ext cx="936000" cy="1462500"/>
                     </a:xfrm>
                     <a:prstGeom prst="rect"/>
                   </pic:spPr>
@@ -3840,7 +3840,7 @@
       <w:r>
         <w:drawing>
           <wp:inline xmlns:a="http://schemas.openxmlformats.org/drawingml/2006/main" xmlns:pic="http://schemas.openxmlformats.org/drawingml/2006/picture">
-            <wp:extent cx="864000" cy="1382400"/>
+            <wp:extent cx="936000" cy="1462500"/>
             <wp:docPr id="43" name="Picture 43"/>
             <wp:cNvGraphicFramePr>
               <a:graphicFrameLocks noChangeAspect="1"/>
@@ -3861,7 +3861,7 @@
                   <pic:spPr>
                     <a:xfrm>
                       <a:off x="0" y="0"/>
-                      <a:ext cx="864000" cy="1382400"/>
+                      <a:ext cx="936000" cy="1462500"/>
                     </a:xfrm>
                     <a:prstGeom prst="rect"/>
                   </pic:spPr>
@@ -3877,7 +3877,7 @@
       <w:r>
         <w:drawing>
           <wp:inline xmlns:a="http://schemas.openxmlformats.org/drawingml/2006/main" xmlns:pic="http://schemas.openxmlformats.org/drawingml/2006/picture">
-            <wp:extent cx="864000" cy="1382400"/>
+            <wp:extent cx="936000" cy="1462500"/>
             <wp:docPr id="44" name="Picture 44"/>
             <wp:cNvGraphicFramePr>
               <a:graphicFrameLocks noChangeAspect="1"/>
@@ -3898,7 +3898,7 @@
                   <pic:spPr>
                     <a:xfrm>
                       <a:off x="0" y="0"/>
-                      <a:ext cx="864000" cy="1382400"/>
+                      <a:ext cx="936000" cy="1462500"/>
                     </a:xfrm>
                     <a:prstGeom prst="rect"/>
                   </pic:spPr>
@@ -3914,7 +3914,7 @@
       <w:r>
         <w:drawing>
           <wp:inline xmlns:a="http://schemas.openxmlformats.org/drawingml/2006/main" xmlns:pic="http://schemas.openxmlformats.org/drawingml/2006/picture">
-            <wp:extent cx="864000" cy="1382400"/>
+            <wp:extent cx="936000" cy="1462500"/>
             <wp:docPr id="45" name="Picture 45"/>
             <wp:cNvGraphicFramePr>
               <a:graphicFrameLocks noChangeAspect="1"/>
@@ -3935,7 +3935,7 @@
                   <pic:spPr>
                     <a:xfrm>
                       <a:off x="0" y="0"/>
-                      <a:ext cx="864000" cy="1382400"/>
+                      <a:ext cx="936000" cy="1462500"/>
                     </a:xfrm>
                     <a:prstGeom prst="rect"/>
                   </pic:spPr>
@@ -4112,7 +4112,7 @@
       <w:r>
         <w:drawing>
           <wp:inline xmlns:a="http://schemas.openxmlformats.org/drawingml/2006/main" xmlns:pic="http://schemas.openxmlformats.org/drawingml/2006/picture">
-            <wp:extent cx="864000" cy="1382400"/>
+            <wp:extent cx="936000" cy="1462500"/>
             <wp:docPr id="46" name="Picture 46"/>
             <wp:cNvGraphicFramePr>
               <a:graphicFrameLocks noChangeAspect="1"/>
@@ -4133,7 +4133,7 @@
                   <pic:spPr>
                     <a:xfrm>
                       <a:off x="0" y="0"/>
-                      <a:ext cx="864000" cy="1382400"/>
+                      <a:ext cx="936000" cy="1462500"/>
                     </a:xfrm>
                     <a:prstGeom prst="rect"/>
                   </pic:spPr>
@@ -4149,7 +4149,7 @@
       <w:r>
         <w:drawing>
           <wp:inline xmlns:a="http://schemas.openxmlformats.org/drawingml/2006/main" xmlns:pic="http://schemas.openxmlformats.org/drawingml/2006/picture">
-            <wp:extent cx="864000" cy="1382400"/>
+            <wp:extent cx="936000" cy="1462500"/>
             <wp:docPr id="47" name="Picture 47"/>
             <wp:cNvGraphicFramePr>
               <a:graphicFrameLocks noChangeAspect="1"/>
@@ -4170,7 +4170,7 @@
                   <pic:spPr>
                     <a:xfrm>
                       <a:off x="0" y="0"/>
-                      <a:ext cx="864000" cy="1382400"/>
+                      <a:ext cx="936000" cy="1462500"/>
                     </a:xfrm>
                     <a:prstGeom prst="rect"/>
                   </pic:spPr>
@@ -4186,7 +4186,7 @@
       <w:r>
         <w:drawing>
           <wp:inline xmlns:a="http://schemas.openxmlformats.org/drawingml/2006/main" xmlns:pic="http://schemas.openxmlformats.org/drawingml/2006/picture">
-            <wp:extent cx="864000" cy="1382400"/>
+            <wp:extent cx="936000" cy="1462500"/>
             <wp:docPr id="48" name="Picture 48"/>
             <wp:cNvGraphicFramePr>
               <a:graphicFrameLocks noChangeAspect="1"/>
@@ -4207,7 +4207,7 @@
                   <pic:spPr>
                     <a:xfrm>
                       <a:off x="0" y="0"/>
-                      <a:ext cx="864000" cy="1382400"/>
+                      <a:ext cx="936000" cy="1462500"/>
                     </a:xfrm>
                     <a:prstGeom prst="rect"/>
                   </pic:spPr>
@@ -4384,7 +4384,7 @@
       <w:r>
         <w:drawing>
           <wp:inline xmlns:a="http://schemas.openxmlformats.org/drawingml/2006/main" xmlns:pic="http://schemas.openxmlformats.org/drawingml/2006/picture">
-            <wp:extent cx="864000" cy="1382400"/>
+            <wp:extent cx="936000" cy="1462500"/>
             <wp:docPr id="49" name="Picture 49"/>
             <wp:cNvGraphicFramePr>
               <a:graphicFrameLocks noChangeAspect="1"/>
@@ -4405,7 +4405,7 @@
                   <pic:spPr>
                     <a:xfrm>
                       <a:off x="0" y="0"/>
-                      <a:ext cx="864000" cy="1382400"/>
+                      <a:ext cx="936000" cy="1462500"/>
                     </a:xfrm>
                     <a:prstGeom prst="rect"/>
                   </pic:spPr>
@@ -4421,7 +4421,7 @@
       <w:r>
         <w:drawing>
           <wp:inline xmlns:a="http://schemas.openxmlformats.org/drawingml/2006/main" xmlns:pic="http://schemas.openxmlformats.org/drawingml/2006/picture">
-            <wp:extent cx="864000" cy="1382400"/>
+            <wp:extent cx="936000" cy="1462500"/>
             <wp:docPr id="50" name="Picture 50"/>
             <wp:cNvGraphicFramePr>
               <a:graphicFrameLocks noChangeAspect="1"/>
@@ -4442,7 +4442,7 @@
                   <pic:spPr>
                     <a:xfrm>
                       <a:off x="0" y="0"/>
-                      <a:ext cx="864000" cy="1382400"/>
+                      <a:ext cx="936000" cy="1462500"/>
                     </a:xfrm>
                     <a:prstGeom prst="rect"/>
                   </pic:spPr>
@@ -4458,7 +4458,7 @@
       <w:r>
         <w:drawing>
           <wp:inline xmlns:a="http://schemas.openxmlformats.org/drawingml/2006/main" xmlns:pic="http://schemas.openxmlformats.org/drawingml/2006/picture">
-            <wp:extent cx="864000" cy="1382400"/>
+            <wp:extent cx="936000" cy="1462500"/>
             <wp:docPr id="51" name="Picture 51"/>
             <wp:cNvGraphicFramePr>
               <a:graphicFrameLocks noChangeAspect="1"/>
@@ -4479,7 +4479,7 @@
                   <pic:spPr>
                     <a:xfrm>
                       <a:off x="0" y="0"/>
-                      <a:ext cx="864000" cy="1382400"/>
+                      <a:ext cx="936000" cy="1462500"/>
                     </a:xfrm>
                     <a:prstGeom prst="rect"/>
                   </pic:spPr>
@@ -4656,7 +4656,7 @@
       <w:r>
         <w:drawing>
           <wp:inline xmlns:a="http://schemas.openxmlformats.org/drawingml/2006/main" xmlns:pic="http://schemas.openxmlformats.org/drawingml/2006/picture">
-            <wp:extent cx="864000" cy="1382400"/>
+            <wp:extent cx="936000" cy="1462500"/>
             <wp:docPr id="52" name="Picture 52"/>
             <wp:cNvGraphicFramePr>
               <a:graphicFrameLocks noChangeAspect="1"/>
@@ -4677,7 +4677,7 @@
                   <pic:spPr>
                     <a:xfrm>
                       <a:off x="0" y="0"/>
-                      <a:ext cx="864000" cy="1382400"/>
+                      <a:ext cx="936000" cy="1462500"/>
                     </a:xfrm>
                     <a:prstGeom prst="rect"/>
                   </pic:spPr>
@@ -4693,7 +4693,7 @@
       <w:r>
         <w:drawing>
           <wp:inline xmlns:a="http://schemas.openxmlformats.org/drawingml/2006/main" xmlns:pic="http://schemas.openxmlformats.org/drawingml/2006/picture">
-            <wp:extent cx="864000" cy="1382400"/>
+            <wp:extent cx="936000" cy="1462500"/>
             <wp:docPr id="53" name="Picture 53"/>
             <wp:cNvGraphicFramePr>
               <a:graphicFrameLocks noChangeAspect="1"/>
@@ -4714,7 +4714,7 @@
                   <pic:spPr>
                     <a:xfrm>
                       <a:off x="0" y="0"/>
-                      <a:ext cx="864000" cy="1382400"/>
+                      <a:ext cx="936000" cy="1462500"/>
                     </a:xfrm>
                     <a:prstGeom prst="rect"/>
                   </pic:spPr>
@@ -4730,7 +4730,7 @@
       <w:r>
         <w:drawing>
           <wp:inline xmlns:a="http://schemas.openxmlformats.org/drawingml/2006/main" xmlns:pic="http://schemas.openxmlformats.org/drawingml/2006/picture">
-            <wp:extent cx="864000" cy="1382400"/>
+            <wp:extent cx="936000" cy="1462500"/>
             <wp:docPr id="54" name="Picture 54"/>
             <wp:cNvGraphicFramePr>
               <a:graphicFrameLocks noChangeAspect="1"/>
@@ -4751,7 +4751,7 @@
                   <pic:spPr>
                     <a:xfrm>
                       <a:off x="0" y="0"/>
-                      <a:ext cx="864000" cy="1382400"/>
+                      <a:ext cx="936000" cy="1462500"/>
                     </a:xfrm>
                     <a:prstGeom prst="rect"/>
                   </pic:spPr>
@@ -4928,7 +4928,7 @@
       <w:r>
         <w:drawing>
           <wp:inline xmlns:a="http://schemas.openxmlformats.org/drawingml/2006/main" xmlns:pic="http://schemas.openxmlformats.org/drawingml/2006/picture">
-            <wp:extent cx="864000" cy="1382400"/>
+            <wp:extent cx="936000" cy="1462500"/>
             <wp:docPr id="55" name="Picture 55"/>
             <wp:cNvGraphicFramePr>
               <a:graphicFrameLocks noChangeAspect="1"/>
@@ -4949,7 +4949,7 @@
                   <pic:spPr>
                     <a:xfrm>
                       <a:off x="0" y="0"/>
-                      <a:ext cx="864000" cy="1382400"/>
+                      <a:ext cx="936000" cy="1462500"/>
                     </a:xfrm>
                     <a:prstGeom prst="rect"/>
                   </pic:spPr>
@@ -4965,7 +4965,7 @@
       <w:r>
         <w:drawing>
           <wp:inline xmlns:a="http://schemas.openxmlformats.org/drawingml/2006/main" xmlns:pic="http://schemas.openxmlformats.org/drawingml/2006/picture">
-            <wp:extent cx="864000" cy="1382400"/>
+            <wp:extent cx="936000" cy="1462500"/>
             <wp:docPr id="56" name="Picture 56"/>
             <wp:cNvGraphicFramePr>
               <a:graphicFrameLocks noChangeAspect="1"/>
@@ -4986,7 +4986,7 @@
                   <pic:spPr>
                     <a:xfrm>
                       <a:off x="0" y="0"/>
-                      <a:ext cx="864000" cy="1382400"/>
+                      <a:ext cx="936000" cy="1462500"/>
                     </a:xfrm>
                     <a:prstGeom prst="rect"/>
                   </pic:spPr>
@@ -5002,7 +5002,7 @@
       <w:r>
         <w:drawing>
           <wp:inline xmlns:a="http://schemas.openxmlformats.org/drawingml/2006/main" xmlns:pic="http://schemas.openxmlformats.org/drawingml/2006/picture">
-            <wp:extent cx="864000" cy="1382400"/>
+            <wp:extent cx="936000" cy="1462500"/>
             <wp:docPr id="57" name="Picture 57"/>
             <wp:cNvGraphicFramePr>
               <a:graphicFrameLocks noChangeAspect="1"/>
@@ -5023,7 +5023,7 @@
                   <pic:spPr>
                     <a:xfrm>
                       <a:off x="0" y="0"/>
-                      <a:ext cx="864000" cy="1382400"/>
+                      <a:ext cx="936000" cy="1462500"/>
                     </a:xfrm>
                     <a:prstGeom prst="rect"/>
                   </pic:spPr>
@@ -5200,7 +5200,7 @@
       <w:r>
         <w:drawing>
           <wp:inline xmlns:a="http://schemas.openxmlformats.org/drawingml/2006/main" xmlns:pic="http://schemas.openxmlformats.org/drawingml/2006/picture">
-            <wp:extent cx="864000" cy="1382400"/>
+            <wp:extent cx="936000" cy="1462500"/>
             <wp:docPr id="58" name="Picture 58"/>
             <wp:cNvGraphicFramePr>
               <a:graphicFrameLocks noChangeAspect="1"/>
@@ -5221,7 +5221,7 @@
                   <pic:spPr>
                     <a:xfrm>
                       <a:off x="0" y="0"/>
-                      <a:ext cx="864000" cy="1382400"/>
+                      <a:ext cx="936000" cy="1462500"/>
                     </a:xfrm>
                     <a:prstGeom prst="rect"/>
                   </pic:spPr>
@@ -5237,7 +5237,7 @@
       <w:r>
         <w:drawing>
           <wp:inline xmlns:a="http://schemas.openxmlformats.org/drawingml/2006/main" xmlns:pic="http://schemas.openxmlformats.org/drawingml/2006/picture">
-            <wp:extent cx="864000" cy="1382400"/>
+            <wp:extent cx="936000" cy="1462500"/>
             <wp:docPr id="59" name="Picture 59"/>
             <wp:cNvGraphicFramePr>
               <a:graphicFrameLocks noChangeAspect="1"/>
@@ -5258,7 +5258,7 @@
                   <pic:spPr>
                     <a:xfrm>
                       <a:off x="0" y="0"/>
-                      <a:ext cx="864000" cy="1382400"/>
+                      <a:ext cx="936000" cy="1462500"/>
                     </a:xfrm>
                     <a:prstGeom prst="rect"/>
                   </pic:spPr>
@@ -5274,7 +5274,7 @@
       <w:r>
         <w:drawing>
           <wp:inline xmlns:a="http://schemas.openxmlformats.org/drawingml/2006/main" xmlns:pic="http://schemas.openxmlformats.org/drawingml/2006/picture">
-            <wp:extent cx="864000" cy="1382400"/>
+            <wp:extent cx="936000" cy="1462500"/>
             <wp:docPr id="60" name="Picture 60"/>
             <wp:cNvGraphicFramePr>
               <a:graphicFrameLocks noChangeAspect="1"/>
@@ -5295,7 +5295,7 @@
                   <pic:spPr>
                     <a:xfrm>
                       <a:off x="0" y="0"/>
-                      <a:ext cx="864000" cy="1382400"/>
+                      <a:ext cx="936000" cy="1462500"/>
                     </a:xfrm>
                     <a:prstGeom prst="rect"/>
                   </pic:spPr>
@@ -5472,7 +5472,7 @@
       <w:r>
         <w:drawing>
           <wp:inline xmlns:a="http://schemas.openxmlformats.org/drawingml/2006/main" xmlns:pic="http://schemas.openxmlformats.org/drawingml/2006/picture">
-            <wp:extent cx="864000" cy="1382400"/>
+            <wp:extent cx="936000" cy="1462500"/>
             <wp:docPr id="61" name="Picture 61"/>
             <wp:cNvGraphicFramePr>
               <a:graphicFrameLocks noChangeAspect="1"/>
@@ -5493,7 +5493,7 @@
                   <pic:spPr>
                     <a:xfrm>
                       <a:off x="0" y="0"/>
-                      <a:ext cx="864000" cy="1382400"/>
+                      <a:ext cx="936000" cy="1462500"/>
                     </a:xfrm>
                     <a:prstGeom prst="rect"/>
                   </pic:spPr>
@@ -5509,7 +5509,7 @@
       <w:r>
         <w:drawing>
           <wp:inline xmlns:a="http://schemas.openxmlformats.org/drawingml/2006/main" xmlns:pic="http://schemas.openxmlformats.org/drawingml/2006/picture">
-            <wp:extent cx="864000" cy="1382400"/>
+            <wp:extent cx="936000" cy="1462500"/>
             <wp:docPr id="62" name="Picture 62"/>
             <wp:cNvGraphicFramePr>
               <a:graphicFrameLocks noChangeAspect="1"/>
@@ -5530,7 +5530,7 @@
                   <pic:spPr>
                     <a:xfrm>
                       <a:off x="0" y="0"/>
-                      <a:ext cx="864000" cy="1382400"/>
+                      <a:ext cx="936000" cy="1462500"/>
                     </a:xfrm>
                     <a:prstGeom prst="rect"/>
                   </pic:spPr>
@@ -5546,7 +5546,7 @@
       <w:r>
         <w:drawing>
           <wp:inline xmlns:a="http://schemas.openxmlformats.org/drawingml/2006/main" xmlns:pic="http://schemas.openxmlformats.org/drawingml/2006/picture">
-            <wp:extent cx="864000" cy="1382400"/>
+            <wp:extent cx="936000" cy="1462500"/>
             <wp:docPr id="63" name="Picture 63"/>
             <wp:cNvGraphicFramePr>
               <a:graphicFrameLocks noChangeAspect="1"/>
@@ -5567,7 +5567,7 @@
                   <pic:spPr>
                     <a:xfrm>
                       <a:off x="0" y="0"/>
-                      <a:ext cx="864000" cy="1382400"/>
+                      <a:ext cx="936000" cy="1462500"/>
                     </a:xfrm>
                     <a:prstGeom prst="rect"/>
                   </pic:spPr>
@@ -5744,7 +5744,7 @@
       <w:r>
         <w:drawing>
           <wp:inline xmlns:a="http://schemas.openxmlformats.org/drawingml/2006/main" xmlns:pic="http://schemas.openxmlformats.org/drawingml/2006/picture">
-            <wp:extent cx="864000" cy="1382400"/>
+            <wp:extent cx="936000" cy="1462500"/>
             <wp:docPr id="64" name="Picture 64"/>
             <wp:cNvGraphicFramePr>
               <a:graphicFrameLocks noChangeAspect="1"/>
@@ -5765,7 +5765,7 @@
                   <pic:spPr>
                     <a:xfrm>
                       <a:off x="0" y="0"/>
-                      <a:ext cx="864000" cy="1382400"/>
+                      <a:ext cx="936000" cy="1462500"/>
                     </a:xfrm>
                     <a:prstGeom prst="rect"/>
                   </pic:spPr>
@@ -5781,7 +5781,7 @@
       <w:r>
         <w:drawing>
           <wp:inline xmlns:a="http://schemas.openxmlformats.org/drawingml/2006/main" xmlns:pic="http://schemas.openxmlformats.org/drawingml/2006/picture">
-            <wp:extent cx="864000" cy="1382400"/>
+            <wp:extent cx="936000" cy="1462500"/>
             <wp:docPr id="65" name="Picture 65"/>
             <wp:cNvGraphicFramePr>
               <a:graphicFrameLocks noChangeAspect="1"/>
@@ -5802,7 +5802,7 @@
                   <pic:spPr>
                     <a:xfrm>
                       <a:off x="0" y="0"/>
-                      <a:ext cx="864000" cy="1382400"/>
+                      <a:ext cx="936000" cy="1462500"/>
                     </a:xfrm>
                     <a:prstGeom prst="rect"/>
                   </pic:spPr>
@@ -5818,7 +5818,7 @@
       <w:r>
         <w:drawing>
           <wp:inline xmlns:a="http://schemas.openxmlformats.org/drawingml/2006/main" xmlns:pic="http://schemas.openxmlformats.org/drawingml/2006/picture">
-            <wp:extent cx="864000" cy="1382400"/>
+            <wp:extent cx="936000" cy="1462500"/>
             <wp:docPr id="66" name="Picture 66"/>
             <wp:cNvGraphicFramePr>
               <a:graphicFrameLocks noChangeAspect="1"/>
@@ -5839,7 +5839,7 @@
                   <pic:spPr>
                     <a:xfrm>
                       <a:off x="0" y="0"/>
-                      <a:ext cx="864000" cy="1382400"/>
+                      <a:ext cx="936000" cy="1462500"/>
                     </a:xfrm>
                     <a:prstGeom prst="rect"/>
                   </pic:spPr>
@@ -6016,7 +6016,7 @@
       <w:r>
         <w:drawing>
           <wp:inline xmlns:a="http://schemas.openxmlformats.org/drawingml/2006/main" xmlns:pic="http://schemas.openxmlformats.org/drawingml/2006/picture">
-            <wp:extent cx="864000" cy="1382400"/>
+            <wp:extent cx="936000" cy="1462500"/>
             <wp:docPr id="67" name="Picture 67"/>
             <wp:cNvGraphicFramePr>
               <a:graphicFrameLocks noChangeAspect="1"/>
@@ -6037,7 +6037,7 @@
                   <pic:spPr>
                     <a:xfrm>
                       <a:off x="0" y="0"/>
-                      <a:ext cx="864000" cy="1382400"/>
+                      <a:ext cx="936000" cy="1462500"/>
                     </a:xfrm>
                     <a:prstGeom prst="rect"/>
                   </pic:spPr>
@@ -6053,7 +6053,7 @@
       <w:r>
         <w:drawing>
           <wp:inline xmlns:a="http://schemas.openxmlformats.org/drawingml/2006/main" xmlns:pic="http://schemas.openxmlformats.org/drawingml/2006/picture">
-            <wp:extent cx="864000" cy="1382400"/>
+            <wp:extent cx="936000" cy="1462500"/>
             <wp:docPr id="68" name="Picture 68"/>
             <wp:cNvGraphicFramePr>
               <a:graphicFrameLocks noChangeAspect="1"/>
@@ -6074,7 +6074,7 @@
                   <pic:spPr>
                     <a:xfrm>
                       <a:off x="0" y="0"/>
-                      <a:ext cx="864000" cy="1382400"/>
+                      <a:ext cx="936000" cy="1462500"/>
                     </a:xfrm>
                     <a:prstGeom prst="rect"/>
                   </pic:spPr>
@@ -6090,7 +6090,7 @@
       <w:r>
         <w:drawing>
           <wp:inline xmlns:a="http://schemas.openxmlformats.org/drawingml/2006/main" xmlns:pic="http://schemas.openxmlformats.org/drawingml/2006/picture">
-            <wp:extent cx="864000" cy="1382400"/>
+            <wp:extent cx="936000" cy="1462500"/>
             <wp:docPr id="69" name="Picture 69"/>
             <wp:cNvGraphicFramePr>
               <a:graphicFrameLocks noChangeAspect="1"/>
@@ -6111,7 +6111,7 @@
                   <pic:spPr>
                     <a:xfrm>
                       <a:off x="0" y="0"/>
-                      <a:ext cx="864000" cy="1382400"/>
+                      <a:ext cx="936000" cy="1462500"/>
                     </a:xfrm>
                     <a:prstGeom prst="rect"/>
                   </pic:spPr>
@@ -6288,7 +6288,7 @@
       <w:r>
         <w:drawing>
           <wp:inline xmlns:a="http://schemas.openxmlformats.org/drawingml/2006/main" xmlns:pic="http://schemas.openxmlformats.org/drawingml/2006/picture">
-            <wp:extent cx="864000" cy="1382400"/>
+            <wp:extent cx="936000" cy="1462500"/>
             <wp:docPr id="70" name="Picture 70"/>
             <wp:cNvGraphicFramePr>
               <a:graphicFrameLocks noChangeAspect="1"/>
@@ -6309,7 +6309,7 @@
                   <pic:spPr>
                     <a:xfrm>
                       <a:off x="0" y="0"/>
-                      <a:ext cx="864000" cy="1382400"/>
+                      <a:ext cx="936000" cy="1462500"/>
                     </a:xfrm>
                     <a:prstGeom prst="rect"/>
                   </pic:spPr>
@@ -6325,7 +6325,7 @@
       <w:r>
         <w:drawing>
           <wp:inline xmlns:a="http://schemas.openxmlformats.org/drawingml/2006/main" xmlns:pic="http://schemas.openxmlformats.org/drawingml/2006/picture">
-            <wp:extent cx="864000" cy="1382400"/>
+            <wp:extent cx="936000" cy="1462500"/>
             <wp:docPr id="71" name="Picture 71"/>
             <wp:cNvGraphicFramePr>
               <a:graphicFrameLocks noChangeAspect="1"/>
@@ -6346,7 +6346,7 @@
                   <pic:spPr>
                     <a:xfrm>
                       <a:off x="0" y="0"/>
-                      <a:ext cx="864000" cy="1382400"/>
+                      <a:ext cx="936000" cy="1462500"/>
                     </a:xfrm>
                     <a:prstGeom prst="rect"/>
                   </pic:spPr>
@@ -6362,7 +6362,7 @@
       <w:r>
         <w:drawing>
           <wp:inline xmlns:a="http://schemas.openxmlformats.org/drawingml/2006/main" xmlns:pic="http://schemas.openxmlformats.org/drawingml/2006/picture">
-            <wp:extent cx="864000" cy="1382400"/>
+            <wp:extent cx="936000" cy="1462500"/>
             <wp:docPr id="72" name="Picture 72"/>
             <wp:cNvGraphicFramePr>
               <a:graphicFrameLocks noChangeAspect="1"/>
@@ -6383,7 +6383,7 @@
                   <pic:spPr>
                     <a:xfrm>
                       <a:off x="0" y="0"/>
-                      <a:ext cx="864000" cy="1382400"/>
+                      <a:ext cx="936000" cy="1462500"/>
                     </a:xfrm>
                     <a:prstGeom prst="rect"/>
                   </pic:spPr>
@@ -6560,7 +6560,7 @@
       <w:r>
         <w:drawing>
           <wp:inline xmlns:a="http://schemas.openxmlformats.org/drawingml/2006/main" xmlns:pic="http://schemas.openxmlformats.org/drawingml/2006/picture">
-            <wp:extent cx="864000" cy="1382400"/>
+            <wp:extent cx="936000" cy="1462500"/>
             <wp:docPr id="73" name="Picture 73"/>
             <wp:cNvGraphicFramePr>
               <a:graphicFrameLocks noChangeAspect="1"/>
@@ -6581,7 +6581,7 @@
                   <pic:spPr>
                     <a:xfrm>
                       <a:off x="0" y="0"/>
-                      <a:ext cx="864000" cy="1382400"/>
+                      <a:ext cx="936000" cy="1462500"/>
                     </a:xfrm>
                     <a:prstGeom prst="rect"/>
                   </pic:spPr>
@@ -6597,7 +6597,7 @@
       <w:r>
         <w:drawing>
           <wp:inline xmlns:a="http://schemas.openxmlformats.org/drawingml/2006/main" xmlns:pic="http://schemas.openxmlformats.org/drawingml/2006/picture">
-            <wp:extent cx="864000" cy="1382400"/>
+            <wp:extent cx="936000" cy="1462500"/>
             <wp:docPr id="74" name="Picture 74"/>
             <wp:cNvGraphicFramePr>
               <a:graphicFrameLocks noChangeAspect="1"/>
@@ -6618,7 +6618,7 @@
                   <pic:spPr>
                     <a:xfrm>
                       <a:off x="0" y="0"/>
-                      <a:ext cx="864000" cy="1382400"/>
+                      <a:ext cx="936000" cy="1462500"/>
                     </a:xfrm>
                     <a:prstGeom prst="rect"/>
                   </pic:spPr>
@@ -6634,7 +6634,7 @@
       <w:r>
         <w:drawing>
           <wp:inline xmlns:a="http://schemas.openxmlformats.org/drawingml/2006/main" xmlns:pic="http://schemas.openxmlformats.org/drawingml/2006/picture">
-            <wp:extent cx="864000" cy="1382400"/>
+            <wp:extent cx="936000" cy="1462500"/>
             <wp:docPr id="75" name="Picture 75"/>
             <wp:cNvGraphicFramePr>
               <a:graphicFrameLocks noChangeAspect="1"/>
@@ -6655,7 +6655,7 @@
                   <pic:spPr>
                     <a:xfrm>
                       <a:off x="0" y="0"/>
-                      <a:ext cx="864000" cy="1382400"/>
+                      <a:ext cx="936000" cy="1462500"/>
                     </a:xfrm>
                     <a:prstGeom prst="rect"/>
                   </pic:spPr>
@@ -6832,7 +6832,7 @@
       <w:r>
         <w:drawing>
           <wp:inline xmlns:a="http://schemas.openxmlformats.org/drawingml/2006/main" xmlns:pic="http://schemas.openxmlformats.org/drawingml/2006/picture">
-            <wp:extent cx="864000" cy="1382400"/>
+            <wp:extent cx="936000" cy="1462500"/>
             <wp:docPr id="76" name="Picture 76"/>
             <wp:cNvGraphicFramePr>
               <a:graphicFrameLocks noChangeAspect="1"/>
@@ -6853,7 +6853,7 @@
                   <pic:spPr>
                     <a:xfrm>
                       <a:off x="0" y="0"/>
-                      <a:ext cx="864000" cy="1382400"/>
+                      <a:ext cx="936000" cy="1462500"/>
                     </a:xfrm>
                     <a:prstGeom prst="rect"/>
                   </pic:spPr>
@@ -6869,7 +6869,7 @@
       <w:r>
         <w:drawing>
           <wp:inline xmlns:a="http://schemas.openxmlformats.org/drawingml/2006/main" xmlns:pic="http://schemas.openxmlformats.org/drawingml/2006/picture">
-            <wp:extent cx="864000" cy="1382400"/>
+            <wp:extent cx="936000" cy="1462500"/>
             <wp:docPr id="77" name="Picture 77"/>
             <wp:cNvGraphicFramePr>
               <a:graphicFrameLocks noChangeAspect="1"/>
@@ -6890,7 +6890,7 @@
                   <pic:spPr>
                     <a:xfrm>
                       <a:off x="0" y="0"/>
-                      <a:ext cx="864000" cy="1382400"/>
+                      <a:ext cx="936000" cy="1462500"/>
                     </a:xfrm>
                     <a:prstGeom prst="rect"/>
                   </pic:spPr>
@@ -6906,7 +6906,7 @@
       <w:r>
         <w:drawing>
           <wp:inline xmlns:a="http://schemas.openxmlformats.org/drawingml/2006/main" xmlns:pic="http://schemas.openxmlformats.org/drawingml/2006/picture">
-            <wp:extent cx="864000" cy="1382400"/>
+            <wp:extent cx="936000" cy="1462500"/>
             <wp:docPr id="78" name="Picture 78"/>
             <wp:cNvGraphicFramePr>
               <a:graphicFrameLocks noChangeAspect="1"/>
@@ -6927,7 +6927,7 @@
                   <pic:spPr>
                     <a:xfrm>
                       <a:off x="0" y="0"/>
-                      <a:ext cx="864000" cy="1382400"/>
+                      <a:ext cx="936000" cy="1462500"/>
                     </a:xfrm>
                     <a:prstGeom prst="rect"/>
                   </pic:spPr>
@@ -7104,7 +7104,7 @@
       <w:r>
         <w:drawing>
           <wp:inline xmlns:a="http://schemas.openxmlformats.org/drawingml/2006/main" xmlns:pic="http://schemas.openxmlformats.org/drawingml/2006/picture">
-            <wp:extent cx="864000" cy="1382400"/>
+            <wp:extent cx="936000" cy="1462500"/>
             <wp:docPr id="79" name="Picture 79"/>
             <wp:cNvGraphicFramePr>
               <a:graphicFrameLocks noChangeAspect="1"/>
@@ -7125,7 +7125,7 @@
                   <pic:spPr>
                     <a:xfrm>
                       <a:off x="0" y="0"/>
-                      <a:ext cx="864000" cy="1382400"/>
+                      <a:ext cx="936000" cy="1462500"/>
                     </a:xfrm>
                     <a:prstGeom prst="rect"/>
                   </pic:spPr>
@@ -7141,7 +7141,7 @@
       <w:r>
         <w:drawing>
           <wp:inline xmlns:a="http://schemas.openxmlformats.org/drawingml/2006/main" xmlns:pic="http://schemas.openxmlformats.org/drawingml/2006/picture">
-            <wp:extent cx="864000" cy="1382400"/>
+            <wp:extent cx="936000" cy="1462500"/>
             <wp:docPr id="80" name="Picture 80"/>
             <wp:cNvGraphicFramePr>
               <a:graphicFrameLocks noChangeAspect="1"/>
@@ -7162,7 +7162,7 @@
                   <pic:spPr>
                     <a:xfrm>
                       <a:off x="0" y="0"/>
-                      <a:ext cx="864000" cy="1382400"/>
+                      <a:ext cx="936000" cy="1462500"/>
                     </a:xfrm>
                     <a:prstGeom prst="rect"/>
                   </pic:spPr>
@@ -7178,7 +7178,7 @@
       <w:r>
         <w:drawing>
           <wp:inline xmlns:a="http://schemas.openxmlformats.org/drawingml/2006/main" xmlns:pic="http://schemas.openxmlformats.org/drawingml/2006/picture">
-            <wp:extent cx="864000" cy="1382400"/>
+            <wp:extent cx="936000" cy="1462500"/>
             <wp:docPr id="81" name="Picture 81"/>
             <wp:cNvGraphicFramePr>
               <a:graphicFrameLocks noChangeAspect="1"/>
@@ -7199,7 +7199,7 @@
                   <pic:spPr>
                     <a:xfrm>
                       <a:off x="0" y="0"/>
-                      <a:ext cx="864000" cy="1382400"/>
+                      <a:ext cx="936000" cy="1462500"/>
                     </a:xfrm>
                     <a:prstGeom prst="rect"/>
                   </pic:spPr>
@@ -7376,7 +7376,7 @@
       <w:r>
         <w:drawing>
           <wp:inline xmlns:a="http://schemas.openxmlformats.org/drawingml/2006/main" xmlns:pic="http://schemas.openxmlformats.org/drawingml/2006/picture">
-            <wp:extent cx="864000" cy="1382400"/>
+            <wp:extent cx="936000" cy="1462500"/>
             <wp:docPr id="82" name="Picture 82"/>
             <wp:cNvGraphicFramePr>
               <a:graphicFrameLocks noChangeAspect="1"/>
@@ -7397,7 +7397,7 @@
                   <pic:spPr>
                     <a:xfrm>
                       <a:off x="0" y="0"/>
-                      <a:ext cx="864000" cy="1382400"/>
+                      <a:ext cx="936000" cy="1462500"/>
                     </a:xfrm>
                     <a:prstGeom prst="rect"/>
                   </pic:spPr>
@@ -7413,7 +7413,7 @@
       <w:r>
         <w:drawing>
           <wp:inline xmlns:a="http://schemas.openxmlformats.org/drawingml/2006/main" xmlns:pic="http://schemas.openxmlformats.org/drawingml/2006/picture">
-            <wp:extent cx="864000" cy="1382400"/>
+            <wp:extent cx="936000" cy="1462500"/>
             <wp:docPr id="83" name="Picture 83"/>
             <wp:cNvGraphicFramePr>
               <a:graphicFrameLocks noChangeAspect="1"/>
@@ -7434,7 +7434,7 @@
                   <pic:spPr>
                     <a:xfrm>
                       <a:off x="0" y="0"/>
-                      <a:ext cx="864000" cy="1382400"/>
+                      <a:ext cx="936000" cy="1462500"/>
                     </a:xfrm>
                     <a:prstGeom prst="rect"/>
                   </pic:spPr>
@@ -7450,7 +7450,7 @@
       <w:r>
         <w:drawing>
           <wp:inline xmlns:a="http://schemas.openxmlformats.org/drawingml/2006/main" xmlns:pic="http://schemas.openxmlformats.org/drawingml/2006/picture">
-            <wp:extent cx="864000" cy="1382400"/>
+            <wp:extent cx="936000" cy="1462500"/>
             <wp:docPr id="84" name="Picture 84"/>
             <wp:cNvGraphicFramePr>
               <a:graphicFrameLocks noChangeAspect="1"/>
@@ -7471,7 +7471,7 @@
                   <pic:spPr>
                     <a:xfrm>
                       <a:off x="0" y="0"/>
-                      <a:ext cx="864000" cy="1382400"/>
+                      <a:ext cx="936000" cy="1462500"/>
                     </a:xfrm>
                     <a:prstGeom prst="rect"/>
                   </pic:spPr>

</xml_diff>

<commit_message>
Chapter 2 shared pieces: the brick phone, ROSA'S MARKET, two characters
- The brick phone (mode phone, STORY and MISSIONS TEST): a quest step
  msPhone rings it on the right with the caller's name; ANSWER (or E),
  even in a car, and the call plays while the game waits.
- Mercado's FARMERS MARKET reads ROSA'S MARKET in STORY and MISSIONS
  TEST (mode rosaMarket); built again under the right name on a new game.
- Characters: Gus Delgado (the hardware man who will not pay Kessler)
  and Rosa's man (her market men), with portraits; Characters.docx.

Co-Authored-By: Claude <noreply@anthropic.com>
Claude-Session: https://claude.ai/code/session_01RpWbq89r71C1p9HP7EcbZ5
</commit_message>
<xml_diff>
--- a/docs/Characters.docx
+++ b/docs/Characters.docx
@@ -7631,6 +7631,550 @@
           <w:p>
             <w:r>
               <w:t>sawtooth wave, 100-150 Hz, 11 syllables a second, pauses 0.08 s</w:t>
+            </w:r>
+          </w:p>
+        </w:tc>
+      </w:tr>
+    </w:tbl>
+    <w:p>
+      <w:pPr>
+        <w:pStyle w:val="Heading1"/>
+      </w:pPr>
+      <w:r>
+        <w:t>GUS DELGADO  (W)</w:t>
+      </w:r>
+    </w:p>
+    <w:p>
+      <w:r>
+        <w:drawing>
+          <wp:inline xmlns:a="http://schemas.openxmlformats.org/drawingml/2006/main" xmlns:pic="http://schemas.openxmlformats.org/drawingml/2006/picture">
+            <wp:extent cx="936000" cy="1462500"/>
+            <wp:docPr id="85" name="Picture 85"/>
+            <wp:cNvGraphicFramePr>
+              <a:graphicFrameLocks noChangeAspect="1"/>
+            </wp:cNvGraphicFramePr>
+            <a:graphic>
+              <a:graphicData uri="http://schemas.openxmlformats.org/drawingml/2006/picture">
+                <pic:pic>
+                  <pic:nvPicPr>
+                    <pic:cNvPr id="0" name="gus-calm.png"/>
+                    <pic:cNvPicPr/>
+                  </pic:nvPicPr>
+                  <pic:blipFill>
+                    <a:blip r:embed="rId93"/>
+                    <a:stretch>
+                      <a:fillRect/>
+                    </a:stretch>
+                  </pic:blipFill>
+                  <pic:spPr>
+                    <a:xfrm>
+                      <a:off x="0" y="0"/>
+                      <a:ext cx="936000" cy="1462500"/>
+                    </a:xfrm>
+                    <a:prstGeom prst="rect"/>
+                  </pic:spPr>
+                </pic:pic>
+              </a:graphicData>
+            </a:graphic>
+          </wp:inline>
+        </w:drawing>
+      </w:r>
+      <w:r>
+        <w:t xml:space="preserve">  </w:t>
+      </w:r>
+      <w:r>
+        <w:drawing>
+          <wp:inline xmlns:a="http://schemas.openxmlformats.org/drawingml/2006/main" xmlns:pic="http://schemas.openxmlformats.org/drawingml/2006/picture">
+            <wp:extent cx="936000" cy="1462500"/>
+            <wp:docPr id="86" name="Picture 86"/>
+            <wp:cNvGraphicFramePr>
+              <a:graphicFrameLocks noChangeAspect="1"/>
+            </wp:cNvGraphicFramePr>
+            <a:graphic>
+              <a:graphicData uri="http://schemas.openxmlformats.org/drawingml/2006/picture">
+                <pic:pic>
+                  <pic:nvPicPr>
+                    <pic:cNvPr id="0" name="gus-angry.png"/>
+                    <pic:cNvPicPr/>
+                  </pic:nvPicPr>
+                  <pic:blipFill>
+                    <a:blip r:embed="rId94"/>
+                    <a:stretch>
+                      <a:fillRect/>
+                    </a:stretch>
+                  </pic:blipFill>
+                  <pic:spPr>
+                    <a:xfrm>
+                      <a:off x="0" y="0"/>
+                      <a:ext cx="936000" cy="1462500"/>
+                    </a:xfrm>
+                    <a:prstGeom prst="rect"/>
+                  </pic:spPr>
+                </pic:pic>
+              </a:graphicData>
+            </a:graphic>
+          </wp:inline>
+        </w:drawing>
+      </w:r>
+      <w:r>
+        <w:t xml:space="preserve">  </w:t>
+      </w:r>
+      <w:r>
+        <w:drawing>
+          <wp:inline xmlns:a="http://schemas.openxmlformats.org/drawingml/2006/main" xmlns:pic="http://schemas.openxmlformats.org/drawingml/2006/picture">
+            <wp:extent cx="936000" cy="1462500"/>
+            <wp:docPr id="87" name="Picture 87"/>
+            <wp:cNvGraphicFramePr>
+              <a:graphicFrameLocks noChangeAspect="1"/>
+            </wp:cNvGraphicFramePr>
+            <a:graphic>
+              <a:graphicData uri="http://schemas.openxmlformats.org/drawingml/2006/picture">
+                <pic:pic>
+                  <pic:nvPicPr>
+                    <pic:cNvPr id="0" name="gus-smile.png"/>
+                    <pic:cNvPicPr/>
+                  </pic:nvPicPr>
+                  <pic:blipFill>
+                    <a:blip r:embed="rId95"/>
+                    <a:stretch>
+                      <a:fillRect/>
+                    </a:stretch>
+                  </pic:blipFill>
+                  <pic:spPr>
+                    <a:xfrm>
+                      <a:off x="0" y="0"/>
+                      <a:ext cx="936000" cy="1462500"/>
+                    </a:xfrm>
+                    <a:prstGeom prst="rect"/>
+                  </pic:spPr>
+                </pic:pic>
+              </a:graphicData>
+            </a:graphic>
+          </wp:inline>
+        </w:drawing>
+      </w:r>
+      <w:r>
+        <w:t xml:space="preserve">  </w:t>
+      </w:r>
+    </w:p>
+    <w:p>
+      <w:r>
+        <w:rPr>
+          <w:sz w:val="16"/>
+        </w:rPr>
+        <w:t>calm - angry - smiling</w:t>
+      </w:r>
+    </w:p>
+    <w:tbl>
+      <w:tblPr>
+        <w:tblStyle w:val="LightGrid-Accent1"/>
+        <w:tblW w:type="auto" w:w="0"/>
+        <w:tblLook w:firstColumn="1" w:firstRow="1" w:lastColumn="0" w:lastRow="0" w:noHBand="0" w:noVBand="1" w:val="04A0"/>
+      </w:tblPr>
+      <w:tblGrid>
+        <w:gridCol w:w="4320"/>
+        <w:gridCol w:w="4320"/>
+      </w:tblGrid>
+      <w:tr>
+        <w:tc>
+          <w:tcPr>
+            <w:tcW w:type="dxa" w:w="1984"/>
+          </w:tcPr>
+          <w:p>
+            <w:r>
+              <w:t>Who</w:t>
+            </w:r>
+          </w:p>
+        </w:tc>
+        <w:tc>
+          <w:tcPr>
+            <w:tcW w:type="dxa" w:w="7370"/>
+          </w:tcPr>
+          <w:p>
+            <w:r>
+              <w:t>Runs DELGADO HARDWARE in Dockside; the one shopkeeper on the street who will not pay Kessler his rent.</w:t>
+            </w:r>
+          </w:p>
+        </w:tc>
+      </w:tr>
+      <w:tr>
+        <w:tc>
+          <w:tcPr>
+            <w:tcW w:type="dxa" w:w="1984"/>
+          </w:tcPr>
+          <w:p>
+            <w:r>
+              <w:t>Looks</w:t>
+            </w:r>
+          </w:p>
+        </w:tc>
+        <w:tc>
+          <w:tcPr>
+            <w:tcW w:type="dxa" w:w="7370"/>
+          </w:tcPr>
+          <w:p>
+            <w:r>
+              <w:t>Sixties, bald with a grey fringe, round glasses, a grey moustache, a brown shopkeeper's apron over a white shirt; stubborn.</w:t>
+            </w:r>
+          </w:p>
+        </w:tc>
+      </w:tr>
+      <w:tr>
+        <w:tc>
+          <w:tcPr>
+            <w:tcW w:type="dxa" w:w="1984"/>
+          </w:tcPr>
+          <w:p>
+            <w:r>
+              <w:t>Bubble colour</w:t>
+            </w:r>
+          </w:p>
+        </w:tc>
+        <w:tc>
+          <w:tcPr>
+            <w:tcW w:type="dxa" w:w="7370"/>
+          </w:tcPr>
+          <w:p>
+            <w:r>
+              <w:t>#b8a07a</w:t>
+            </w:r>
+          </w:p>
+        </w:tc>
+      </w:tr>
+      <w:tr>
+        <w:tc>
+          <w:tcPr>
+            <w:tcW w:type="dxa" w:w="1984"/>
+          </w:tcPr>
+          <w:p>
+            <w:r>
+              <w:t>In the city</w:t>
+            </w:r>
+          </w:p>
+        </w:tc>
+        <w:tc>
+          <w:tcPr>
+            <w:tcW w:type="dxa" w:w="7370"/>
+          </w:tcPr>
+          <w:p>
+            <w:r>
+              <w:t>shirt #f0ece0, trousers #5a4a3a</w:t>
+            </w:r>
+          </w:p>
+        </w:tc>
+      </w:tr>
+      <w:tr>
+        <w:tc>
+          <w:tcPr>
+            <w:tcW w:type="dxa" w:w="1984"/>
+          </w:tcPr>
+          <w:p>
+            <w:r>
+              <w:t>Portrait recipe</w:t>
+            </w:r>
+          </w:p>
+        </w:tc>
+        <w:tc>
+          <w:tcPr>
+            <w:tcW w:type="dxa" w:w="7370"/>
+          </w:tcPr>
+          <w:p>
+            <w:r>
+              <w:t>skin #c99a76; hair #b0b0b4 (sides); facial hair: moustache; eyes #3a2a1a; hat: none; glasses: reading; top: waistcoat (#7a5a3a / #f0ece0); extras: wrinkles; old, normal build</w:t>
+            </w:r>
+          </w:p>
+        </w:tc>
+      </w:tr>
+      <w:tr>
+        <w:tc>
+          <w:tcPr>
+            <w:tcW w:type="dxa" w:w="1984"/>
+          </w:tcPr>
+          <w:p>
+            <w:r>
+              <w:t>Mumble</w:t>
+            </w:r>
+          </w:p>
+        </w:tc>
+        <w:tc>
+          <w:tcPr>
+            <w:tcW w:type="dxa" w:w="7370"/>
+          </w:tcPr>
+          <w:p>
+            <w:r>
+              <w:t>triangle wave, 120-190 Hz, 10 syllables a second, pauses 0.12 s</w:t>
+            </w:r>
+          </w:p>
+        </w:tc>
+      </w:tr>
+    </w:tbl>
+    <w:p>
+      <w:pPr>
+        <w:pStyle w:val="Heading1"/>
+      </w:pPr>
+      <w:r>
+        <w:t>ROSA'S MAN  (R)</w:t>
+      </w:r>
+    </w:p>
+    <w:p>
+      <w:r>
+        <w:drawing>
+          <wp:inline xmlns:a="http://schemas.openxmlformats.org/drawingml/2006/main" xmlns:pic="http://schemas.openxmlformats.org/drawingml/2006/picture">
+            <wp:extent cx="936000" cy="1462500"/>
+            <wp:docPr id="88" name="Picture 88"/>
+            <wp:cNvGraphicFramePr>
+              <a:graphicFrameLocks noChangeAspect="1"/>
+            </wp:cNvGraphicFramePr>
+            <a:graphic>
+              <a:graphicData uri="http://schemas.openxmlformats.org/drawingml/2006/picture">
+                <pic:pic>
+                  <pic:nvPicPr>
+                    <pic:cNvPr id="0" name="rosaman-calm.png"/>
+                    <pic:cNvPicPr/>
+                  </pic:nvPicPr>
+                  <pic:blipFill>
+                    <a:blip r:embed="rId96"/>
+                    <a:stretch>
+                      <a:fillRect/>
+                    </a:stretch>
+                  </pic:blipFill>
+                  <pic:spPr>
+                    <a:xfrm>
+                      <a:off x="0" y="0"/>
+                      <a:ext cx="936000" cy="1462500"/>
+                    </a:xfrm>
+                    <a:prstGeom prst="rect"/>
+                  </pic:spPr>
+                </pic:pic>
+              </a:graphicData>
+            </a:graphic>
+          </wp:inline>
+        </w:drawing>
+      </w:r>
+      <w:r>
+        <w:t xml:space="preserve">  </w:t>
+      </w:r>
+      <w:r>
+        <w:drawing>
+          <wp:inline xmlns:a="http://schemas.openxmlformats.org/drawingml/2006/main" xmlns:pic="http://schemas.openxmlformats.org/drawingml/2006/picture">
+            <wp:extent cx="936000" cy="1462500"/>
+            <wp:docPr id="89" name="Picture 89"/>
+            <wp:cNvGraphicFramePr>
+              <a:graphicFrameLocks noChangeAspect="1"/>
+            </wp:cNvGraphicFramePr>
+            <a:graphic>
+              <a:graphicData uri="http://schemas.openxmlformats.org/drawingml/2006/picture">
+                <pic:pic>
+                  <pic:nvPicPr>
+                    <pic:cNvPr id="0" name="rosaman-angry.png"/>
+                    <pic:cNvPicPr/>
+                  </pic:nvPicPr>
+                  <pic:blipFill>
+                    <a:blip r:embed="rId97"/>
+                    <a:stretch>
+                      <a:fillRect/>
+                    </a:stretch>
+                  </pic:blipFill>
+                  <pic:spPr>
+                    <a:xfrm>
+                      <a:off x="0" y="0"/>
+                      <a:ext cx="936000" cy="1462500"/>
+                    </a:xfrm>
+                    <a:prstGeom prst="rect"/>
+                  </pic:spPr>
+                </pic:pic>
+              </a:graphicData>
+            </a:graphic>
+          </wp:inline>
+        </w:drawing>
+      </w:r>
+      <w:r>
+        <w:t xml:space="preserve">  </w:t>
+      </w:r>
+      <w:r>
+        <w:drawing>
+          <wp:inline xmlns:a="http://schemas.openxmlformats.org/drawingml/2006/main" xmlns:pic="http://schemas.openxmlformats.org/drawingml/2006/picture">
+            <wp:extent cx="936000" cy="1462500"/>
+            <wp:docPr id="90" name="Picture 90"/>
+            <wp:cNvGraphicFramePr>
+              <a:graphicFrameLocks noChangeAspect="1"/>
+            </wp:cNvGraphicFramePr>
+            <a:graphic>
+              <a:graphicData uri="http://schemas.openxmlformats.org/drawingml/2006/picture">
+                <pic:pic>
+                  <pic:nvPicPr>
+                    <pic:cNvPr id="0" name="rosaman-smile.png"/>
+                    <pic:cNvPicPr/>
+                  </pic:nvPicPr>
+                  <pic:blipFill>
+                    <a:blip r:embed="rId98"/>
+                    <a:stretch>
+                      <a:fillRect/>
+                    </a:stretch>
+                  </pic:blipFill>
+                  <pic:spPr>
+                    <a:xfrm>
+                      <a:off x="0" y="0"/>
+                      <a:ext cx="936000" cy="1462500"/>
+                    </a:xfrm>
+                    <a:prstGeom prst="rect"/>
+                  </pic:spPr>
+                </pic:pic>
+              </a:graphicData>
+            </a:graphic>
+          </wp:inline>
+        </w:drawing>
+      </w:r>
+      <w:r>
+        <w:t xml:space="preserve">  </w:t>
+      </w:r>
+    </w:p>
+    <w:p>
+      <w:r>
+        <w:rPr>
+          <w:sz w:val="16"/>
+        </w:rPr>
+        <w:t>calm - angry - smiling</w:t>
+      </w:r>
+    </w:p>
+    <w:tbl>
+      <w:tblPr>
+        <w:tblStyle w:val="LightGrid-Accent1"/>
+        <w:tblW w:type="auto" w:w="0"/>
+        <w:tblLook w:firstColumn="1" w:firstRow="1" w:lastColumn="0" w:lastRow="0" w:noHBand="0" w:noVBand="1" w:val="04A0"/>
+      </w:tblPr>
+      <w:tblGrid>
+        <w:gridCol w:w="4320"/>
+        <w:gridCol w:w="4320"/>
+      </w:tblGrid>
+      <w:tr>
+        <w:tc>
+          <w:tcPr>
+            <w:tcW w:type="dxa" w:w="1984"/>
+          </w:tcPr>
+          <w:p>
+            <w:r>
+              <w:t>Who</w:t>
+            </w:r>
+          </w:p>
+        </w:tc>
+        <w:tc>
+          <w:tcPr>
+            <w:tcW w:type="dxa" w:w="7370"/>
+          </w:tcPr>
+          <w:p>
+            <w:r>
+              <w:t>One of Rosa Ortega's market men - porters and stall-keepers who stand by her (one bubble for all of them).</w:t>
+            </w:r>
+          </w:p>
+        </w:tc>
+      </w:tr>
+      <w:tr>
+        <w:tc>
+          <w:tcPr>
+            <w:tcW w:type="dxa" w:w="1984"/>
+          </w:tcPr>
+          <w:p>
+            <w:r>
+              <w:t>Looks</w:t>
+            </w:r>
+          </w:p>
+        </w:tc>
+        <w:tc>
+          <w:tcPr>
+            <w:tcW w:type="dxa" w:w="7370"/>
+          </w:tcPr>
+          <w:p>
+            <w:r>
+              <w:t>Thirties, short black hair, stubble, a red bandana over the shoulder, a white vest, strong arms.</w:t>
+            </w:r>
+          </w:p>
+        </w:tc>
+      </w:tr>
+      <w:tr>
+        <w:tc>
+          <w:tcPr>
+            <w:tcW w:type="dxa" w:w="1984"/>
+          </w:tcPr>
+          <w:p>
+            <w:r>
+              <w:t>Bubble colour</w:t>
+            </w:r>
+          </w:p>
+        </w:tc>
+        <w:tc>
+          <w:tcPr>
+            <w:tcW w:type="dxa" w:w="7370"/>
+          </w:tcPr>
+          <w:p>
+            <w:r>
+              <w:t>#e04a5a</w:t>
+            </w:r>
+          </w:p>
+        </w:tc>
+      </w:tr>
+      <w:tr>
+        <w:tc>
+          <w:tcPr>
+            <w:tcW w:type="dxa" w:w="1984"/>
+          </w:tcPr>
+          <w:p>
+            <w:r>
+              <w:t>In the city</w:t>
+            </w:r>
+          </w:p>
+        </w:tc>
+        <w:tc>
+          <w:tcPr>
+            <w:tcW w:type="dxa" w:w="7370"/>
+          </w:tcPr>
+          <w:p>
+            <w:r>
+              <w:t>shirt #f2f2f2, trousers #2a3a5a</w:t>
+            </w:r>
+          </w:p>
+        </w:tc>
+      </w:tr>
+      <w:tr>
+        <w:tc>
+          <w:tcPr>
+            <w:tcW w:type="dxa" w:w="1984"/>
+          </w:tcPr>
+          <w:p>
+            <w:r>
+              <w:t>Portrait recipe</w:t>
+            </w:r>
+          </w:p>
+        </w:tc>
+        <w:tc>
+          <w:tcPr>
+            <w:tcW w:type="dxa" w:w="7370"/>
+          </w:tcPr>
+          <w:p>
+            <w:r>
+              <w:t>skin #b8805a; hair #1a1416 (short); facial hair: stubble; eyes #2a1a12; hat: none; glasses: none; top: tanktop (#f2f2f2 / #e0e0e0); extras: rag; mid, broad build</w:t>
+            </w:r>
+          </w:p>
+        </w:tc>
+      </w:tr>
+      <w:tr>
+        <w:tc>
+          <w:tcPr>
+            <w:tcW w:type="dxa" w:w="1984"/>
+          </w:tcPr>
+          <w:p>
+            <w:r>
+              <w:t>Mumble</w:t>
+            </w:r>
+          </w:p>
+        </w:tc>
+        <w:tc>
+          <w:tcPr>
+            <w:tcW w:type="dxa" w:w="7370"/>
+          </w:tcPr>
+          <w:p>
+            <w:r>
+              <w:t>triangle wave, 110-170 Hz, 11 syllables a second, pauses 0.07 s</w:t>
             </w:r>
           </w:p>
         </w:tc>

</xml_diff>

<commit_message>
Casino line characters: Lenny Gold, Fay "Fingers" (a nose ring for portraits), the casino guard
Co-Authored-By: Claude <noreply@anthropic.com>
Claude-Session: https://claude.ai/code/session_01RpWbq89r71C1p9HP7EcbZ5
</commit_message>
<xml_diff>
--- a/docs/Characters.docx
+++ b/docs/Characters.docx
@@ -8175,6 +8175,822 @@
           <w:p>
             <w:r>
               <w:t>triangle wave, 110-170 Hz, 11 syllables a second, pauses 0.07 s</w:t>
+            </w:r>
+          </w:p>
+        </w:tc>
+      </w:tr>
+    </w:tbl>
+    <w:p>
+      <w:pPr>
+        <w:pStyle w:val="Heading1"/>
+      </w:pPr>
+      <w:r>
+        <w:t>LENNY GOLD  (G)</w:t>
+      </w:r>
+    </w:p>
+    <w:p>
+      <w:r>
+        <w:drawing>
+          <wp:inline xmlns:a="http://schemas.openxmlformats.org/drawingml/2006/main" xmlns:pic="http://schemas.openxmlformats.org/drawingml/2006/picture">
+            <wp:extent cx="936000" cy="1462500"/>
+            <wp:docPr id="91" name="Picture 91"/>
+            <wp:cNvGraphicFramePr>
+              <a:graphicFrameLocks noChangeAspect="1"/>
+            </wp:cNvGraphicFramePr>
+            <a:graphic>
+              <a:graphicData uri="http://schemas.openxmlformats.org/drawingml/2006/picture">
+                <pic:pic>
+                  <pic:nvPicPr>
+                    <pic:cNvPr id="0" name="lenny-calm.png"/>
+                    <pic:cNvPicPr/>
+                  </pic:nvPicPr>
+                  <pic:blipFill>
+                    <a:blip r:embed="rId99"/>
+                    <a:stretch>
+                      <a:fillRect/>
+                    </a:stretch>
+                  </pic:blipFill>
+                  <pic:spPr>
+                    <a:xfrm>
+                      <a:off x="0" y="0"/>
+                      <a:ext cx="936000" cy="1462500"/>
+                    </a:xfrm>
+                    <a:prstGeom prst="rect"/>
+                  </pic:spPr>
+                </pic:pic>
+              </a:graphicData>
+            </a:graphic>
+          </wp:inline>
+        </w:drawing>
+      </w:r>
+      <w:r>
+        <w:t xml:space="preserve">  </w:t>
+      </w:r>
+      <w:r>
+        <w:drawing>
+          <wp:inline xmlns:a="http://schemas.openxmlformats.org/drawingml/2006/main" xmlns:pic="http://schemas.openxmlformats.org/drawingml/2006/picture">
+            <wp:extent cx="936000" cy="1462500"/>
+            <wp:docPr id="92" name="Picture 92"/>
+            <wp:cNvGraphicFramePr>
+              <a:graphicFrameLocks noChangeAspect="1"/>
+            </wp:cNvGraphicFramePr>
+            <a:graphic>
+              <a:graphicData uri="http://schemas.openxmlformats.org/drawingml/2006/picture">
+                <pic:pic>
+                  <pic:nvPicPr>
+                    <pic:cNvPr id="0" name="lenny-angry.png"/>
+                    <pic:cNvPicPr/>
+                  </pic:nvPicPr>
+                  <pic:blipFill>
+                    <a:blip r:embed="rId100"/>
+                    <a:stretch>
+                      <a:fillRect/>
+                    </a:stretch>
+                  </pic:blipFill>
+                  <pic:spPr>
+                    <a:xfrm>
+                      <a:off x="0" y="0"/>
+                      <a:ext cx="936000" cy="1462500"/>
+                    </a:xfrm>
+                    <a:prstGeom prst="rect"/>
+                  </pic:spPr>
+                </pic:pic>
+              </a:graphicData>
+            </a:graphic>
+          </wp:inline>
+        </w:drawing>
+      </w:r>
+      <w:r>
+        <w:t xml:space="preserve">  </w:t>
+      </w:r>
+      <w:r>
+        <w:drawing>
+          <wp:inline xmlns:a="http://schemas.openxmlformats.org/drawingml/2006/main" xmlns:pic="http://schemas.openxmlformats.org/drawingml/2006/picture">
+            <wp:extent cx="936000" cy="1462500"/>
+            <wp:docPr id="93" name="Picture 93"/>
+            <wp:cNvGraphicFramePr>
+              <a:graphicFrameLocks noChangeAspect="1"/>
+            </wp:cNvGraphicFramePr>
+            <a:graphic>
+              <a:graphicData uri="http://schemas.openxmlformats.org/drawingml/2006/picture">
+                <pic:pic>
+                  <pic:nvPicPr>
+                    <pic:cNvPr id="0" name="lenny-smile.png"/>
+                    <pic:cNvPicPr/>
+                  </pic:nvPicPr>
+                  <pic:blipFill>
+                    <a:blip r:embed="rId101"/>
+                    <a:stretch>
+                      <a:fillRect/>
+                    </a:stretch>
+                  </pic:blipFill>
+                  <pic:spPr>
+                    <a:xfrm>
+                      <a:off x="0" y="0"/>
+                      <a:ext cx="936000" cy="1462500"/>
+                    </a:xfrm>
+                    <a:prstGeom prst="rect"/>
+                  </pic:spPr>
+                </pic:pic>
+              </a:graphicData>
+            </a:graphic>
+          </wp:inline>
+        </w:drawing>
+      </w:r>
+      <w:r>
+        <w:t xml:space="preserve">  </w:t>
+      </w:r>
+    </w:p>
+    <w:p>
+      <w:r>
+        <w:rPr>
+          <w:sz w:val="16"/>
+        </w:rPr>
+        <w:t>calm - angry - smiling</w:t>
+      </w:r>
+    </w:p>
+    <w:tbl>
+      <w:tblPr>
+        <w:tblStyle w:val="LightGrid-Accent1"/>
+        <w:tblW w:type="auto" w:w="0"/>
+        <w:tblLook w:firstColumn="1" w:firstRow="1" w:lastColumn="0" w:lastRow="0" w:noHBand="0" w:noVBand="1" w:val="04A0"/>
+      </w:tblPr>
+      <w:tblGrid>
+        <w:gridCol w:w="4320"/>
+        <w:gridCol w:w="4320"/>
+      </w:tblGrid>
+      <w:tr>
+        <w:tc>
+          <w:tcPr>
+            <w:tcW w:type="dxa" w:w="1984"/>
+          </w:tcPr>
+          <w:p>
+            <w:r>
+              <w:t>Who</w:t>
+            </w:r>
+          </w:p>
+        </w:tc>
+        <w:tc>
+          <w:tcPr>
+            <w:tcW w:type="dxa" w:w="7370"/>
+          </w:tcPr>
+          <w:p>
+            <w:r>
+              <w:t>The Royal Flamingo's pit boss - Crane's man on the casino floor; his men hunt Del and Fay. Shouts at everyone.</w:t>
+            </w:r>
+          </w:p>
+        </w:tc>
+      </w:tr>
+      <w:tr>
+        <w:tc>
+          <w:tcPr>
+            <w:tcW w:type="dxa" w:w="1984"/>
+          </w:tcPr>
+          <w:p>
+            <w:r>
+              <w:t>Looks</w:t>
+            </w:r>
+          </w:p>
+        </w:tc>
+        <w:tc>
+          <w:tcPr>
+            <w:tcW w:type="dxa" w:w="7370"/>
+          </w:tcPr>
+          <w:p>
+            <w:r>
+              <w:t>Forties, heavy, a bad toupee, a burgundy suit, gold chains; shouts at everyone.</w:t>
+            </w:r>
+          </w:p>
+        </w:tc>
+      </w:tr>
+      <w:tr>
+        <w:tc>
+          <w:tcPr>
+            <w:tcW w:type="dxa" w:w="1984"/>
+          </w:tcPr>
+          <w:p>
+            <w:r>
+              <w:t>Bubble colour</w:t>
+            </w:r>
+          </w:p>
+        </w:tc>
+        <w:tc>
+          <w:tcPr>
+            <w:tcW w:type="dxa" w:w="7370"/>
+          </w:tcPr>
+          <w:p>
+            <w:r>
+              <w:t>#d4a017</w:t>
+            </w:r>
+          </w:p>
+        </w:tc>
+      </w:tr>
+      <w:tr>
+        <w:tc>
+          <w:tcPr>
+            <w:tcW w:type="dxa" w:w="1984"/>
+          </w:tcPr>
+          <w:p>
+            <w:r>
+              <w:t>In the city</w:t>
+            </w:r>
+          </w:p>
+        </w:tc>
+        <w:tc>
+          <w:tcPr>
+            <w:tcW w:type="dxa" w:w="7370"/>
+          </w:tcPr>
+          <w:p>
+            <w:r>
+              <w:t>shirt #6a1a2a, trousers #2a1a1e</w:t>
+            </w:r>
+          </w:p>
+        </w:tc>
+      </w:tr>
+      <w:tr>
+        <w:tc>
+          <w:tcPr>
+            <w:tcW w:type="dxa" w:w="1984"/>
+          </w:tcPr>
+          <w:p>
+            <w:r>
+              <w:t>Portrait recipe</w:t>
+            </w:r>
+          </w:p>
+        </w:tc>
+        <w:tc>
+          <w:tcPr>
+            <w:tcW w:type="dxa" w:w="7370"/>
+          </w:tcPr>
+          <w:p>
+            <w:r>
+              <w:t>skin #e8b894; hair #a8642a (combed); facial hair: none; eyes #3a2a1a; hat: none; glasses: none; top: suit (#6a1a2a / #f0e6e0); extras: chain, jowls, sweat; mid, broad build</w:t>
+            </w:r>
+          </w:p>
+        </w:tc>
+      </w:tr>
+      <w:tr>
+        <w:tc>
+          <w:tcPr>
+            <w:tcW w:type="dxa" w:w="1984"/>
+          </w:tcPr>
+          <w:p>
+            <w:r>
+              <w:t>Mumble</w:t>
+            </w:r>
+          </w:p>
+        </w:tc>
+        <w:tc>
+          <w:tcPr>
+            <w:tcW w:type="dxa" w:w="7370"/>
+          </w:tcPr>
+          <w:p>
+            <w:r>
+              <w:t>sawtooth wave, 90-150 Hz, 12 syllables a second, pauses 0.04 s</w:t>
+            </w:r>
+          </w:p>
+        </w:tc>
+      </w:tr>
+    </w:tbl>
+    <w:p>
+      <w:pPr>
+        <w:pStyle w:val="Heading1"/>
+      </w:pPr>
+      <w:r>
+        <w:t>FAY "FINGERS"  (F)</w:t>
+      </w:r>
+    </w:p>
+    <w:p>
+      <w:r>
+        <w:drawing>
+          <wp:inline xmlns:a="http://schemas.openxmlformats.org/drawingml/2006/main" xmlns:pic="http://schemas.openxmlformats.org/drawingml/2006/picture">
+            <wp:extent cx="936000" cy="1462500"/>
+            <wp:docPr id="94" name="Picture 94"/>
+            <wp:cNvGraphicFramePr>
+              <a:graphicFrameLocks noChangeAspect="1"/>
+            </wp:cNvGraphicFramePr>
+            <a:graphic>
+              <a:graphicData uri="http://schemas.openxmlformats.org/drawingml/2006/picture">
+                <pic:pic>
+                  <pic:nvPicPr>
+                    <pic:cNvPr id="0" name="fay-calm.png"/>
+                    <pic:cNvPicPr/>
+                  </pic:nvPicPr>
+                  <pic:blipFill>
+                    <a:blip r:embed="rId102"/>
+                    <a:stretch>
+                      <a:fillRect/>
+                    </a:stretch>
+                  </pic:blipFill>
+                  <pic:spPr>
+                    <a:xfrm>
+                      <a:off x="0" y="0"/>
+                      <a:ext cx="936000" cy="1462500"/>
+                    </a:xfrm>
+                    <a:prstGeom prst="rect"/>
+                  </pic:spPr>
+                </pic:pic>
+              </a:graphicData>
+            </a:graphic>
+          </wp:inline>
+        </w:drawing>
+      </w:r>
+      <w:r>
+        <w:t xml:space="preserve">  </w:t>
+      </w:r>
+      <w:r>
+        <w:drawing>
+          <wp:inline xmlns:a="http://schemas.openxmlformats.org/drawingml/2006/main" xmlns:pic="http://schemas.openxmlformats.org/drawingml/2006/picture">
+            <wp:extent cx="936000" cy="1462500"/>
+            <wp:docPr id="95" name="Picture 95"/>
+            <wp:cNvGraphicFramePr>
+              <a:graphicFrameLocks noChangeAspect="1"/>
+            </wp:cNvGraphicFramePr>
+            <a:graphic>
+              <a:graphicData uri="http://schemas.openxmlformats.org/drawingml/2006/picture">
+                <pic:pic>
+                  <pic:nvPicPr>
+                    <pic:cNvPr id="0" name="fay-angry.png"/>
+                    <pic:cNvPicPr/>
+                  </pic:nvPicPr>
+                  <pic:blipFill>
+                    <a:blip r:embed="rId103"/>
+                    <a:stretch>
+                      <a:fillRect/>
+                    </a:stretch>
+                  </pic:blipFill>
+                  <pic:spPr>
+                    <a:xfrm>
+                      <a:off x="0" y="0"/>
+                      <a:ext cx="936000" cy="1462500"/>
+                    </a:xfrm>
+                    <a:prstGeom prst="rect"/>
+                  </pic:spPr>
+                </pic:pic>
+              </a:graphicData>
+            </a:graphic>
+          </wp:inline>
+        </w:drawing>
+      </w:r>
+      <w:r>
+        <w:t xml:space="preserve">  </w:t>
+      </w:r>
+      <w:r>
+        <w:drawing>
+          <wp:inline xmlns:a="http://schemas.openxmlformats.org/drawingml/2006/main" xmlns:pic="http://schemas.openxmlformats.org/drawingml/2006/picture">
+            <wp:extent cx="936000" cy="1462500"/>
+            <wp:docPr id="96" name="Picture 96"/>
+            <wp:cNvGraphicFramePr>
+              <a:graphicFrameLocks noChangeAspect="1"/>
+            </wp:cNvGraphicFramePr>
+            <a:graphic>
+              <a:graphicData uri="http://schemas.openxmlformats.org/drawingml/2006/picture">
+                <pic:pic>
+                  <pic:nvPicPr>
+                    <pic:cNvPr id="0" name="fay-smile.png"/>
+                    <pic:cNvPicPr/>
+                  </pic:nvPicPr>
+                  <pic:blipFill>
+                    <a:blip r:embed="rId104"/>
+                    <a:stretch>
+                      <a:fillRect/>
+                    </a:stretch>
+                  </pic:blipFill>
+                  <pic:spPr>
+                    <a:xfrm>
+                      <a:off x="0" y="0"/>
+                      <a:ext cx="936000" cy="1462500"/>
+                    </a:xfrm>
+                    <a:prstGeom prst="rect"/>
+                  </pic:spPr>
+                </pic:pic>
+              </a:graphicData>
+            </a:graphic>
+          </wp:inline>
+        </w:drawing>
+      </w:r>
+      <w:r>
+        <w:t xml:space="preserve">  </w:t>
+      </w:r>
+    </w:p>
+    <w:p>
+      <w:r>
+        <w:rPr>
+          <w:sz w:val="16"/>
+        </w:rPr>
+        <w:t>calm - angry - smiling</w:t>
+      </w:r>
+    </w:p>
+    <w:tbl>
+      <w:tblPr>
+        <w:tblStyle w:val="LightGrid-Accent1"/>
+        <w:tblW w:type="auto" w:w="0"/>
+        <w:tblLook w:firstColumn="1" w:firstRow="1" w:lastColumn="0" w:lastRow="0" w:noHBand="0" w:noVBand="1" w:val="04A0"/>
+      </w:tblPr>
+      <w:tblGrid>
+        <w:gridCol w:w="4320"/>
+        <w:gridCol w:w="4320"/>
+      </w:tblGrid>
+      <w:tr>
+        <w:tc>
+          <w:tcPr>
+            <w:tcW w:type="dxa" w:w="1984"/>
+          </w:tcPr>
+          <w:p>
+            <w:r>
+              <w:t>Who</w:t>
+            </w:r>
+          </w:p>
+        </w:tc>
+        <w:tc>
+          <w:tcPr>
+            <w:tcW w:type="dxa" w:w="7370"/>
+          </w:tcPr>
+          <w:p>
+            <w:r>
+              <w:t>A safecracker with the steadiest hands in Florida; Gold's men hold her in the lunapark's funhouse. The vault's lock is hers.</w:t>
+            </w:r>
+          </w:p>
+        </w:tc>
+      </w:tr>
+      <w:tr>
+        <w:tc>
+          <w:tcPr>
+            <w:tcW w:type="dxa" w:w="1984"/>
+          </w:tcPr>
+          <w:p>
+            <w:r>
+              <w:t>Looks</w:t>
+            </w:r>
+          </w:p>
+        </w:tc>
+        <w:tc>
+          <w:tcPr>
+            <w:tcW w:type="dxa" w:w="7370"/>
+          </w:tcPr>
+          <w:p>
+            <w:r>
+              <w:t>Twenties, a dyed red undercut, a black leather jacket, a nose ring; talks fast.</w:t>
+            </w:r>
+          </w:p>
+        </w:tc>
+      </w:tr>
+      <w:tr>
+        <w:tc>
+          <w:tcPr>
+            <w:tcW w:type="dxa" w:w="1984"/>
+          </w:tcPr>
+          <w:p>
+            <w:r>
+              <w:t>Bubble colour</w:t>
+            </w:r>
+          </w:p>
+        </w:tc>
+        <w:tc>
+          <w:tcPr>
+            <w:tcW w:type="dxa" w:w="7370"/>
+          </w:tcPr>
+          <w:p>
+            <w:r>
+              <w:t>#ff3b6b</w:t>
+            </w:r>
+          </w:p>
+        </w:tc>
+      </w:tr>
+      <w:tr>
+        <w:tc>
+          <w:tcPr>
+            <w:tcW w:type="dxa" w:w="1984"/>
+          </w:tcPr>
+          <w:p>
+            <w:r>
+              <w:t>In the city</w:t>
+            </w:r>
+          </w:p>
+        </w:tc>
+        <w:tc>
+          <w:tcPr>
+            <w:tcW w:type="dxa" w:w="7370"/>
+          </w:tcPr>
+          <w:p>
+            <w:r>
+              <w:t>shirt #1a1a20, trousers #2a2a3a</w:t>
+            </w:r>
+          </w:p>
+        </w:tc>
+      </w:tr>
+      <w:tr>
+        <w:tc>
+          <w:tcPr>
+            <w:tcW w:type="dxa" w:w="1984"/>
+          </w:tcPr>
+          <w:p>
+            <w:r>
+              <w:t>Portrait recipe</w:t>
+            </w:r>
+          </w:p>
+        </w:tc>
+        <w:tc>
+          <w:tcPr>
+            <w:tcW w:type="dxa" w:w="7370"/>
+          </w:tcPr>
+          <w:p>
+            <w:r>
+              <w:t>skin #f0c8a8; hair #d0202a (pixie); facial hair: none; eyes #2a6a3a; hat: none; glasses: none; top: leather (#1a1a20 / #c8202c); extras: nosering, earring; young, slim build</w:t>
+            </w:r>
+          </w:p>
+        </w:tc>
+      </w:tr>
+      <w:tr>
+        <w:tc>
+          <w:tcPr>
+            <w:tcW w:type="dxa" w:w="1984"/>
+          </w:tcPr>
+          <w:p>
+            <w:r>
+              <w:t>Mumble</w:t>
+            </w:r>
+          </w:p>
+        </w:tc>
+        <w:tc>
+          <w:tcPr>
+            <w:tcW w:type="dxa" w:w="7370"/>
+          </w:tcPr>
+          <w:p>
+            <w:r>
+              <w:t>square wave, 280-440 Hz, 17 syllables a second, pauses 0.02 s</w:t>
+            </w:r>
+          </w:p>
+        </w:tc>
+      </w:tr>
+    </w:tbl>
+    <w:p>
+      <w:pPr>
+        <w:pStyle w:val="Heading1"/>
+      </w:pPr>
+      <w:r>
+        <w:t>CASINO GUARD  (Q)</w:t>
+      </w:r>
+    </w:p>
+    <w:p>
+      <w:r>
+        <w:drawing>
+          <wp:inline xmlns:a="http://schemas.openxmlformats.org/drawingml/2006/main" xmlns:pic="http://schemas.openxmlformats.org/drawingml/2006/picture">
+            <wp:extent cx="936000" cy="1462500"/>
+            <wp:docPr id="97" name="Picture 97"/>
+            <wp:cNvGraphicFramePr>
+              <a:graphicFrameLocks noChangeAspect="1"/>
+            </wp:cNvGraphicFramePr>
+            <a:graphic>
+              <a:graphicData uri="http://schemas.openxmlformats.org/drawingml/2006/picture">
+                <pic:pic>
+                  <pic:nvPicPr>
+                    <pic:cNvPr id="0" name="cguard-calm.png"/>
+                    <pic:cNvPicPr/>
+                  </pic:nvPicPr>
+                  <pic:blipFill>
+                    <a:blip r:embed="rId105"/>
+                    <a:stretch>
+                      <a:fillRect/>
+                    </a:stretch>
+                  </pic:blipFill>
+                  <pic:spPr>
+                    <a:xfrm>
+                      <a:off x="0" y="0"/>
+                      <a:ext cx="936000" cy="1462500"/>
+                    </a:xfrm>
+                    <a:prstGeom prst="rect"/>
+                  </pic:spPr>
+                </pic:pic>
+              </a:graphicData>
+            </a:graphic>
+          </wp:inline>
+        </w:drawing>
+      </w:r>
+      <w:r>
+        <w:t xml:space="preserve">  </w:t>
+      </w:r>
+      <w:r>
+        <w:drawing>
+          <wp:inline xmlns:a="http://schemas.openxmlformats.org/drawingml/2006/main" xmlns:pic="http://schemas.openxmlformats.org/drawingml/2006/picture">
+            <wp:extent cx="936000" cy="1462500"/>
+            <wp:docPr id="98" name="Picture 98"/>
+            <wp:cNvGraphicFramePr>
+              <a:graphicFrameLocks noChangeAspect="1"/>
+            </wp:cNvGraphicFramePr>
+            <a:graphic>
+              <a:graphicData uri="http://schemas.openxmlformats.org/drawingml/2006/picture">
+                <pic:pic>
+                  <pic:nvPicPr>
+                    <pic:cNvPr id="0" name="cguard-angry.png"/>
+                    <pic:cNvPicPr/>
+                  </pic:nvPicPr>
+                  <pic:blipFill>
+                    <a:blip r:embed="rId106"/>
+                    <a:stretch>
+                      <a:fillRect/>
+                    </a:stretch>
+                  </pic:blipFill>
+                  <pic:spPr>
+                    <a:xfrm>
+                      <a:off x="0" y="0"/>
+                      <a:ext cx="936000" cy="1462500"/>
+                    </a:xfrm>
+                    <a:prstGeom prst="rect"/>
+                  </pic:spPr>
+                </pic:pic>
+              </a:graphicData>
+            </a:graphic>
+          </wp:inline>
+        </w:drawing>
+      </w:r>
+      <w:r>
+        <w:t xml:space="preserve">  </w:t>
+      </w:r>
+      <w:r>
+        <w:drawing>
+          <wp:inline xmlns:a="http://schemas.openxmlformats.org/drawingml/2006/main" xmlns:pic="http://schemas.openxmlformats.org/drawingml/2006/picture">
+            <wp:extent cx="936000" cy="1462500"/>
+            <wp:docPr id="99" name="Picture 99"/>
+            <wp:cNvGraphicFramePr>
+              <a:graphicFrameLocks noChangeAspect="1"/>
+            </wp:cNvGraphicFramePr>
+            <a:graphic>
+              <a:graphicData uri="http://schemas.openxmlformats.org/drawingml/2006/picture">
+                <pic:pic>
+                  <pic:nvPicPr>
+                    <pic:cNvPr id="0" name="cguard-smile.png"/>
+                    <pic:cNvPicPr/>
+                  </pic:nvPicPr>
+                  <pic:blipFill>
+                    <a:blip r:embed="rId107"/>
+                    <a:stretch>
+                      <a:fillRect/>
+                    </a:stretch>
+                  </pic:blipFill>
+                  <pic:spPr>
+                    <a:xfrm>
+                      <a:off x="0" y="0"/>
+                      <a:ext cx="936000" cy="1462500"/>
+                    </a:xfrm>
+                    <a:prstGeom prst="rect"/>
+                  </pic:spPr>
+                </pic:pic>
+              </a:graphicData>
+            </a:graphic>
+          </wp:inline>
+        </w:drawing>
+      </w:r>
+      <w:r>
+        <w:t xml:space="preserve">  </w:t>
+      </w:r>
+    </w:p>
+    <w:p>
+      <w:r>
+        <w:rPr>
+          <w:sz w:val="16"/>
+        </w:rPr>
+        <w:t>calm - angry - smiling</w:t>
+      </w:r>
+    </w:p>
+    <w:tbl>
+      <w:tblPr>
+        <w:tblStyle w:val="LightGrid-Accent1"/>
+        <w:tblW w:type="auto" w:w="0"/>
+        <w:tblLook w:firstColumn="1" w:firstRow="1" w:lastColumn="0" w:lastRow="0" w:noHBand="0" w:noVBand="1" w:val="04A0"/>
+      </w:tblPr>
+      <w:tblGrid>
+        <w:gridCol w:w="4320"/>
+        <w:gridCol w:w="4320"/>
+      </w:tblGrid>
+      <w:tr>
+        <w:tc>
+          <w:tcPr>
+            <w:tcW w:type="dxa" w:w="1984"/>
+          </w:tcPr>
+          <w:p>
+            <w:r>
+              <w:t>Who</w:t>
+            </w:r>
+          </w:p>
+        </w:tc>
+        <w:tc>
+          <w:tcPr>
+            <w:tcW w:type="dxa" w:w="7370"/>
+          </w:tcPr>
+          <w:p>
+            <w:r>
+              <w:t>The Royal Flamingo's guards (one bubble for all of them).</w:t>
+            </w:r>
+          </w:p>
+        </w:tc>
+      </w:tr>
+      <w:tr>
+        <w:tc>
+          <w:tcPr>
+            <w:tcW w:type="dxa" w:w="1984"/>
+          </w:tcPr>
+          <w:p>
+            <w:r>
+              <w:t>Looks</w:t>
+            </w:r>
+          </w:p>
+        </w:tc>
+        <w:tc>
+          <w:tcPr>
+            <w:tcW w:type="dxa" w:w="7370"/>
+          </w:tcPr>
+          <w:p>
+            <w:r>
+              <w:t>Thirties, a crew cut, a black suit with a gold flamingo pin, an earpiece.</w:t>
+            </w:r>
+          </w:p>
+        </w:tc>
+      </w:tr>
+      <w:tr>
+        <w:tc>
+          <w:tcPr>
+            <w:tcW w:type="dxa" w:w="1984"/>
+          </w:tcPr>
+          <w:p>
+            <w:r>
+              <w:t>Bubble colour</w:t>
+            </w:r>
+          </w:p>
+        </w:tc>
+        <w:tc>
+          <w:tcPr>
+            <w:tcW w:type="dxa" w:w="7370"/>
+          </w:tcPr>
+          <w:p>
+            <w:r>
+              <w:t>#8a8fa8</w:t>
+            </w:r>
+          </w:p>
+        </w:tc>
+      </w:tr>
+      <w:tr>
+        <w:tc>
+          <w:tcPr>
+            <w:tcW w:type="dxa" w:w="1984"/>
+          </w:tcPr>
+          <w:p>
+            <w:r>
+              <w:t>In the city</w:t>
+            </w:r>
+          </w:p>
+        </w:tc>
+        <w:tc>
+          <w:tcPr>
+            <w:tcW w:type="dxa" w:w="7370"/>
+          </w:tcPr>
+          <w:p>
+            <w:r>
+              <w:t>shirt #16161c, trousers #16161c</w:t>
+            </w:r>
+          </w:p>
+        </w:tc>
+      </w:tr>
+      <w:tr>
+        <w:tc>
+          <w:tcPr>
+            <w:tcW w:type="dxa" w:w="1984"/>
+          </w:tcPr>
+          <w:p>
+            <w:r>
+              <w:t>Portrait recipe</w:t>
+            </w:r>
+          </w:p>
+        </w:tc>
+        <w:tc>
+          <w:tcPr>
+            <w:tcW w:type="dxa" w:w="7370"/>
+          </w:tcPr>
+          <w:p>
+            <w:r>
+              <w:t>skin #c89a76; hair #2a1a14 (buzz); facial hair: none; eyes #3a2a1a; hat: none; glasses: none; top: suit (#16161c / #f0f0f0); extras: earring; mid, broad build</w:t>
+            </w:r>
+          </w:p>
+        </w:tc>
+      </w:tr>
+      <w:tr>
+        <w:tc>
+          <w:tcPr>
+            <w:tcW w:type="dxa" w:w="1984"/>
+          </w:tcPr>
+          <w:p>
+            <w:r>
+              <w:t>Mumble</w:t>
+            </w:r>
+          </w:p>
+        </w:tc>
+        <w:tc>
+          <w:tcPr>
+            <w:tcW w:type="dxa" w:w="7370"/>
+          </w:tcPr>
+          <w:p>
+            <w:r>
+              <w:t>square wave, 120-170 Hz, 10 syllables a second, pauses 0.06 s</w:t>
             </w:r>
           </w:p>
         </w:tc>

</xml_diff>

<commit_message>
Colony line H1-H8: Word pages, README, Help, STORY.md approval rows and connectors; the characters' Word sheet
Co-Authored-By: Claude <noreply@anthropic.com>
Claude-Session: https://claude.ai/code/session_01RpWbq89r71C1p9HP7EcbZ5
</commit_message>
<xml_diff>
--- a/docs/Characters.docx
+++ b/docs/Characters.docx
@@ -4105,7 +4105,7 @@
         <w:pStyle w:val="Heading1"/>
       </w:pPr>
       <w:r>
-        <w:t>BULL KESSLER  (B)</w:t>
+        <w:t>UNKNOWN CALLER  (?)</w:t>
       </w:r>
     </w:p>
     <w:p>
@@ -4121,7 +4121,7 @@
               <a:graphicData uri="http://schemas.openxmlformats.org/drawingml/2006/picture">
                 <pic:pic>
                   <pic:nvPicPr>
-                    <pic:cNvPr id="0" name="kessler-calm.png"/>
+                    <pic:cNvPr id="0" name="anon-calm.png"/>
                     <pic:cNvPicPr/>
                   </pic:nvPicPr>
                   <pic:blipFill>
@@ -4158,7 +4158,7 @@
               <a:graphicData uri="http://schemas.openxmlformats.org/drawingml/2006/picture">
                 <pic:pic>
                   <pic:nvPicPr>
-                    <pic:cNvPr id="0" name="kessler-angry.png"/>
+                    <pic:cNvPr id="0" name="anon-angry.png"/>
                     <pic:cNvPicPr/>
                   </pic:nvPicPr>
                   <pic:blipFill>
@@ -4195,7 +4195,7 @@
               <a:graphicData uri="http://schemas.openxmlformats.org/drawingml/2006/picture">
                 <pic:pic>
                   <pic:nvPicPr>
-                    <pic:cNvPr id="0" name="kessler-smile.png"/>
+                    <pic:cNvPr id="0" name="anon-smile.png"/>
                     <pic:cNvPicPr/>
                   </pic:nvPicPr>
                   <pic:blipFill>
@@ -4256,7 +4256,7 @@
           </w:tcPr>
           <w:p>
             <w:r>
-              <w:t>Bruno "Bull" Kessler, Crane's muscle and the Dockside gang boss; loud, likes tough men, fears only Crane.</w:t>
+              <w:t>The voice on the phone who knows too much - the unseen helper's tip (M22). No portrait on purpose: a shadow with a question mark.</w:t>
             </w:r>
           </w:p>
         </w:tc>
@@ -4278,7 +4278,7 @@
           </w:tcPr>
           <w:p>
             <w:r>
-              <w:t>Forties, huge, a big neck, a shaved head, a blond goatee, a white tank top, gold chains, a tattoo on the shoulder.</w:t>
+              <w:t>Never seen: a low, careful voice from a pay phone.</w:t>
             </w:r>
           </w:p>
         </w:tc>
@@ -4300,7 +4300,7 @@
           </w:tcPr>
           <w:p>
             <w:r>
-              <w:t>#ff5a1f</w:t>
+              <w:t>#9aa0b4</w:t>
             </w:r>
           </w:p>
         </w:tc>
@@ -4322,7 +4322,7 @@
           </w:tcPr>
           <w:p>
             <w:r>
-              <w:t>shirt #f2f2ee, trousers #3a4a6a</w:t>
+              <w:t>shirt #1c1e28, trousers #1c1e28</w:t>
             </w:r>
           </w:p>
         </w:tc>
@@ -4344,7 +4344,7 @@
           </w:tcPr>
           <w:p>
             <w:r>
-              <w:t>skin #d9a27a; hair #e0c070 (bald); facial hair: goatee; eyes #5a7a9a; hat: none; glasses: none; top: tanktop (#f2f2ee / #d8d8d2); extras: chain, tattoo; mid, broad build</w:t>
+              <w:t>skin #c48a60; hair #1e1a1c (slick); facial hair: none; eyes #3a2618; hat: chauffeur; glasses: none; top: suit (#1c1e28 / #f0ece4); extras: none; mid, normal build</w:t>
             </w:r>
           </w:p>
         </w:tc>
@@ -4366,7 +4366,7 @@
           </w:tcPr>
           <w:p>
             <w:r>
-              <w:t>sawtooth wave, 70-110 Hz, 11 syllables a second, pauses 0.06 s</w:t>
+              <w:t>sine wave, 80-110 Hz, 8 syllables a second, pauses 0.16 s</w:t>
             </w:r>
           </w:p>
         </w:tc>
@@ -4377,7 +4377,7 @@
         <w:pStyle w:val="Heading1"/>
       </w:pPr>
       <w:r>
-        <w:t>ROSA ORTEGA  (R)</w:t>
+        <w:t>WALTER FINCH  (W)</w:t>
       </w:r>
     </w:p>
     <w:p>
@@ -4393,7 +4393,7 @@
               <a:graphicData uri="http://schemas.openxmlformats.org/drawingml/2006/picture">
                 <pic:pic>
                   <pic:nvPicPr>
-                    <pic:cNvPr id="0" name="rosa-calm.png"/>
+                    <pic:cNvPr id="0" name="finch-calm.png"/>
                     <pic:cNvPicPr/>
                   </pic:nvPicPr>
                   <pic:blipFill>
@@ -4430,7 +4430,7 @@
               <a:graphicData uri="http://schemas.openxmlformats.org/drawingml/2006/picture">
                 <pic:pic>
                   <pic:nvPicPr>
-                    <pic:cNvPr id="0" name="rosa-angry.png"/>
+                    <pic:cNvPr id="0" name="finch-angry.png"/>
                     <pic:cNvPicPr/>
                   </pic:nvPicPr>
                   <pic:blipFill>
@@ -4467,7 +4467,7 @@
               <a:graphicData uri="http://schemas.openxmlformats.org/drawingml/2006/picture">
                 <pic:pic>
                   <pic:nvPicPr>
-                    <pic:cNvPr id="0" name="rosa-smile.png"/>
+                    <pic:cNvPr id="0" name="finch-smile.png"/>
                     <pic:cNvPicPr/>
                   </pic:nvPicPr>
                   <pic:blipFill>
@@ -4528,7 +4528,7 @@
           </w:tcPr>
           <w:p>
             <w:r>
-              <w:t>Mercado's market boss: tough and warm; takes Danny in against Kessler and becomes part of his crew.</w:t>
+              <w:t>Crane's notary, who forged the Colony's deed; nervous and talkative - he confesses at the courthouse (H8) if he lives to get there.</w:t>
             </w:r>
           </w:p>
         </w:tc>
@@ -4550,7 +4550,7 @@
           </w:tcPr>
           <w:p>
             <w:r>
-              <w:t>Forties, black hair pulled back tight, big gold hoop earrings, red lipstick, a red blouse with rolled sleeves, a gold chain.</w:t>
+              <w:t>Sixties, thin, a grey three-piece suit, round glasses, thinning grey hair, a briefcase he never lets go of.</w:t>
             </w:r>
           </w:p>
         </w:tc>
@@ -4572,7 +4572,7 @@
           </w:tcPr>
           <w:p>
             <w:r>
-              <w:t>#d41e3c</w:t>
+              <w:t>#b8c4d0</w:t>
             </w:r>
           </w:p>
         </w:tc>
@@ -4594,7 +4594,7 @@
           </w:tcPr>
           <w:p>
             <w:r>
-              <w:t>shirt #c8243a, trousers #1a1a20</w:t>
+              <w:t>shirt #6a6e78, trousers #6a6e78</w:t>
             </w:r>
           </w:p>
         </w:tc>
@@ -4616,7 +4616,7 @@
           </w:tcPr>
           <w:p>
             <w:r>
-              <w:t>skin #c08458; hair #141018 (pulled); facial hair: none; eyes #2a1a12; hat: none; glasses: none; top: blouse (#c8243a / #9a1a2c); extras: hoops, lipstick, chain; mid, normal build</w:t>
+              <w:t>skin #ecc8a8; hair #a8a8a8 (combed); facial hair: none; eyes #5a6a7a; hat: none; glasses: reading; top: suit (#6a6e78 / #f0ece4); extras: sweat, wrinkles; old, slim build</w:t>
             </w:r>
           </w:p>
         </w:tc>
@@ -4638,7 +4638,7 @@
           </w:tcPr>
           <w:p>
             <w:r>
-              <w:t>triangle wave, 190-300 Hz, 12 syllables a second, pauses 0.08 s</w:t>
+              <w:t>triangle wave, 150-240 Hz, 13 syllables a second, pauses 0.08 s</w:t>
             </w:r>
           </w:p>
         </w:tc>
@@ -4649,7 +4649,7 @@
         <w:pStyle w:val="Heading1"/>
       </w:pPr>
       <w:r>
-        <w:t>NINA PARK  (N)</w:t>
+        <w:t>BULL KESSLER  (B)</w:t>
       </w:r>
     </w:p>
     <w:p>
@@ -4665,7 +4665,7 @@
               <a:graphicData uri="http://schemas.openxmlformats.org/drawingml/2006/picture">
                 <pic:pic>
                   <pic:nvPicPr>
-                    <pic:cNvPr id="0" name="nina-calm.png"/>
+                    <pic:cNvPr id="0" name="kessler-calm.png"/>
                     <pic:cNvPicPr/>
                   </pic:nvPicPr>
                   <pic:blipFill>
@@ -4702,7 +4702,7 @@
               <a:graphicData uri="http://schemas.openxmlformats.org/drawingml/2006/picture">
                 <pic:pic>
                   <pic:nvPicPr>
-                    <pic:cNvPr id="0" name="nina-angry.png"/>
+                    <pic:cNvPr id="0" name="kessler-angry.png"/>
                     <pic:cNvPicPr/>
                   </pic:nvPicPr>
                   <pic:blipFill>
@@ -4739,7 +4739,7 @@
               <a:graphicData uri="http://schemas.openxmlformats.org/drawingml/2006/picture">
                 <pic:pic>
                   <pic:nvPicPr>
-                    <pic:cNvPr id="0" name="nina-smile.png"/>
+                    <pic:cNvPr id="0" name="kessler-smile.png"/>
                     <pic:cNvPicPr/>
                   </pic:nvPicPr>
                   <pic:blipFill>
@@ -4800,7 +4800,7 @@
           </w:tcPr>
           <w:p>
             <w:r>
-              <w:t>A Bay TV reporter who has dug into Crane for years; quick and fearless; trades what she knows for Danny's help.</w:t>
+              <w:t>Bruno "Bull" Kessler, Crane's muscle and the Dockside gang boss; loud, likes tough men, fears only Crane.</w:t>
             </w:r>
           </w:p>
         </w:tc>
@@ -4822,7 +4822,7 @@
           </w:tcPr>
           <w:p>
             <w:r>
-              <w:t>Thirties, a sharp black bob, a mustard blazer with big 90s shoulders over a black top, small gold earrings.</w:t>
+              <w:t>Forties, huge, a big neck, a shaved head, a blond goatee, a white tank top, gold chains, a tattoo on the shoulder.</w:t>
             </w:r>
           </w:p>
         </w:tc>
@@ -4844,7 +4844,7 @@
           </w:tcPr>
           <w:p>
             <w:r>
-              <w:t>#ffb000</w:t>
+              <w:t>#ff5a1f</w:t>
             </w:r>
           </w:p>
         </w:tc>
@@ -4866,7 +4866,7 @@
           </w:tcPr>
           <w:p>
             <w:r>
-              <w:t>shirt #d4a020, trousers #1a1a20</w:t>
+              <w:t>shirt #f2f2ee, trousers #3a4a6a</w:t>
             </w:r>
           </w:p>
         </w:tc>
@@ -4888,7 +4888,7 @@
           </w:tcPr>
           <w:p>
             <w:r>
-              <w:t>skin #e6c49e; hair #121014 (bob); facial hair: none; eyes #2a1a14; hat: none; glasses: none; top: blazer (#d4a020 / #1a1a20); extras: earring, lipstick; mid, slim build</w:t>
+              <w:t>skin #d9a27a; hair #e0c070 (bald); facial hair: goatee; eyes #5a7a9a; hat: none; glasses: none; top: tanktop (#f2f2ee / #d8d8d2); extras: chain, tattoo; mid, broad build</w:t>
             </w:r>
           </w:p>
         </w:tc>
@@ -4910,7 +4910,7 @@
           </w:tcPr>
           <w:p>
             <w:r>
-              <w:t>square wave, 240-380 Hz, 15 syllables a second, pauses 0.03 s</w:t>
+              <w:t>sawtooth wave, 70-110 Hz, 11 syllables a second, pauses 0.06 s</w:t>
             </w:r>
           </w:p>
         </w:tc>
@@ -4921,7 +4921,7 @@
         <w:pStyle w:val="Heading1"/>
       </w:pPr>
       <w:r>
-        <w:t>LEONARD SACHS  (A)</w:t>
+        <w:t>ROSA ORTEGA  (R)</w:t>
       </w:r>
     </w:p>
     <w:p>
@@ -4937,7 +4937,7 @@
               <a:graphicData uri="http://schemas.openxmlformats.org/drawingml/2006/picture">
                 <pic:pic>
                   <pic:nvPicPr>
-                    <pic:cNvPr id="0" name="sachs-calm.png"/>
+                    <pic:cNvPr id="0" name="rosa-calm.png"/>
                     <pic:cNvPicPr/>
                   </pic:nvPicPr>
                   <pic:blipFill>
@@ -4974,7 +4974,7 @@
               <a:graphicData uri="http://schemas.openxmlformats.org/drawingml/2006/picture">
                 <pic:pic>
                   <pic:nvPicPr>
-                    <pic:cNvPr id="0" name="sachs-angry.png"/>
+                    <pic:cNvPr id="0" name="rosa-angry.png"/>
                     <pic:cNvPicPr/>
                   </pic:nvPicPr>
                   <pic:blipFill>
@@ -5011,7 +5011,7 @@
               <a:graphicData uri="http://schemas.openxmlformats.org/drawingml/2006/picture">
                 <pic:pic>
                   <pic:nvPicPr>
-                    <pic:cNvPr id="0" name="sachs-smile.png"/>
+                    <pic:cNvPr id="0" name="rosa-smile.png"/>
                     <pic:cNvPicPr/>
                   </pic:nvPicPr>
                   <pic:blipFill>
@@ -5072,7 +5072,7 @@
           </w:tcPr>
           <w:p>
             <w:r>
-              <w:t>Crane's lawyer, who moves the money; cheerful, friendly - and dangerous under the smile.</w:t>
+              <w:t>Mercado's market boss: tough and warm; takes Danny in against Kessler and becomes part of his crew.</w:t>
             </w:r>
           </w:p>
         </w:tc>
@@ -5094,7 +5094,7 @@
           </w:tcPr>
           <w:p>
             <w:r>
-              <w:t>Fifties, round and cheerful, thinning hair, a brown suit, a red bow tie, a pocket watch.</w:t>
+              <w:t>Forties, black hair pulled back tight, big gold hoop earrings, red lipstick, a red blouse with rolled sleeves, a gold chain.</w:t>
             </w:r>
           </w:p>
         </w:tc>
@@ -5116,7 +5116,7 @@
           </w:tcPr>
           <w:p>
             <w:r>
-              <w:t>#9ad08a</w:t>
+              <w:t>#d41e3c</w:t>
             </w:r>
           </w:p>
         </w:tc>
@@ -5138,7 +5138,7 @@
           </w:tcPr>
           <w:p>
             <w:r>
-              <w:t>shirt #5a4a3a, trousers #5a4a3a</w:t>
+              <w:t>shirt #c8243a, trousers #1a1a20</w:t>
             </w:r>
           </w:p>
         </w:tc>
@@ -5160,7 +5160,7 @@
           </w:tcPr>
           <w:p>
             <w:r>
-              <w:t>skin #f0c8a8; hair #8a7a6a (sides); facial hair: none; eyes #4a5a3a; hat: none; glasses: none; top: suit (#5a4a3a / #f0ece0); extras: bowtie, jowls; mid, broad build</w:t>
+              <w:t>skin #c08458; hair #141018 (pulled); facial hair: none; eyes #2a1a12; hat: none; glasses: none; top: blouse (#c8243a / #9a1a2c); extras: hoops, lipstick, chain; mid, normal build</w:t>
             </w:r>
           </w:p>
         </w:tc>
@@ -5182,7 +5182,7 @@
           </w:tcPr>
           <w:p>
             <w:r>
-              <w:t>sine wave, 130-200 Hz, 10 syllables a second, pauses 0.12 s</w:t>
+              <w:t>triangle wave, 190-300 Hz, 12 syllables a second, pauses 0.08 s</w:t>
             </w:r>
           </w:p>
         </w:tc>
@@ -5193,7 +5193,7 @@
         <w:pStyle w:val="Heading1"/>
       </w:pPr>
       <w:r>
-        <w:t>CHIEF HOLLOWAY  (H)</w:t>
+        <w:t>NINA PARK  (N)</w:t>
       </w:r>
     </w:p>
     <w:p>
@@ -5209,7 +5209,7 @@
               <a:graphicData uri="http://schemas.openxmlformats.org/drawingml/2006/picture">
                 <pic:pic>
                   <pic:nvPicPr>
-                    <pic:cNvPr id="0" name="holloway-calm.png"/>
+                    <pic:cNvPr id="0" name="nina-calm.png"/>
                     <pic:cNvPicPr/>
                   </pic:nvPicPr>
                   <pic:blipFill>
@@ -5246,7 +5246,7 @@
               <a:graphicData uri="http://schemas.openxmlformats.org/drawingml/2006/picture">
                 <pic:pic>
                   <pic:nvPicPr>
-                    <pic:cNvPr id="0" name="holloway-angry.png"/>
+                    <pic:cNvPr id="0" name="nina-angry.png"/>
                     <pic:cNvPicPr/>
                   </pic:nvPicPr>
                   <pic:blipFill>
@@ -5283,7 +5283,7 @@
               <a:graphicData uri="http://schemas.openxmlformats.org/drawingml/2006/picture">
                 <pic:pic>
                   <pic:nvPicPr>
-                    <pic:cNvPr id="0" name="holloway-smile.png"/>
+                    <pic:cNvPr id="0" name="nina-smile.png"/>
                     <pic:cNvPicPr/>
                   </pic:nvPicPr>
                   <pic:blipFill>
@@ -5344,7 +5344,7 @@
           </w:tcPr>
           <w:p>
             <w:r>
-              <w:t>Chief Ray Holloway, Miravista's police chief, who keeps the police off Crane.</w:t>
+              <w:t>A Bay TV reporter who has dug into Crane for years; quick and fearless; trades what she knows for Danny's help.</w:t>
             </w:r>
           </w:p>
         </w:tc>
@@ -5366,7 +5366,7 @@
           </w:tcPr>
           <w:p>
             <w:r>
-              <w:t>Fifties, a red face, a grey flat-top, a thick moustache, the chief's navy uniform with gold braid, mirror shades.</w:t>
+              <w:t>Thirties, a sharp black bob, a mustard blazer with big 90s shoulders over a black top, small gold earrings.</w:t>
             </w:r>
           </w:p>
         </w:tc>
@@ -5388,7 +5388,7 @@
           </w:tcPr>
           <w:p>
             <w:r>
-              <w:t>#8a9ab0</w:t>
+              <w:t>#ffb000</w:t>
             </w:r>
           </w:p>
         </w:tc>
@@ -5410,7 +5410,7 @@
           </w:tcPr>
           <w:p>
             <w:r>
-              <w:t>shirt #1e2a4a, trousers #1e2a4a</w:t>
+              <w:t>shirt #d4a020, trousers #1a1a20</w:t>
             </w:r>
           </w:p>
         </w:tc>
@@ -5432,7 +5432,7 @@
           </w:tcPr>
           <w:p>
             <w:r>
-              <w:t>skin #e09070; hair #a8a8a8 (flattop); facial hair: moustache; eyes #4a5a6a; hat: none; glasses: shades; top: uniform (#1e2a4a / #141a2a); extras: braid; old, broad build</w:t>
+              <w:t>skin #e6c49e; hair #121014 (bob); facial hair: none; eyes #2a1a14; hat: none; glasses: none; top: blazer (#d4a020 / #1a1a20); extras: earring, lipstick; mid, slim build</w:t>
             </w:r>
           </w:p>
         </w:tc>
@@ -5454,7 +5454,7 @@
           </w:tcPr>
           <w:p>
             <w:r>
-              <w:t>square wave, 90-130 Hz, 8 syllables a second, pauses 0.14 s</w:t>
+              <w:t>square wave, 240-380 Hz, 15 syllables a second, pauses 0.03 s</w:t>
             </w:r>
           </w:p>
         </w:tc>
@@ -5465,7 +5465,7 @@
         <w:pStyle w:val="Heading1"/>
       </w:pPr>
       <w:r>
-        <w:t>DEAN PRATT  (P)</w:t>
+        <w:t>LEONARD SACHS  (A)</w:t>
       </w:r>
     </w:p>
     <w:p>
@@ -5481,7 +5481,7 @@
               <a:graphicData uri="http://schemas.openxmlformats.org/drawingml/2006/picture">
                 <pic:pic>
                   <pic:nvPicPr>
-                    <pic:cNvPr id="0" name="pratt-calm.png"/>
+                    <pic:cNvPr id="0" name="sachs-calm.png"/>
                     <pic:cNvPicPr/>
                   </pic:nvPicPr>
                   <pic:blipFill>
@@ -5518,7 +5518,7 @@
               <a:graphicData uri="http://schemas.openxmlformats.org/drawingml/2006/picture">
                 <pic:pic>
                   <pic:nvPicPr>
-                    <pic:cNvPr id="0" name="pratt-angry.png"/>
+                    <pic:cNvPr id="0" name="sachs-angry.png"/>
                     <pic:cNvPicPr/>
                   </pic:nvPicPr>
                   <pic:blipFill>
@@ -5555,7 +5555,7 @@
               <a:graphicData uri="http://schemas.openxmlformats.org/drawingml/2006/picture">
                 <pic:pic>
                   <pic:nvPicPr>
-                    <pic:cNvPr id="0" name="pratt-smile.png"/>
+                    <pic:cNvPr id="0" name="sachs-smile.png"/>
                     <pic:cNvPicPr/>
                   </pic:nvPicPr>
                   <pic:blipFill>
@@ -5616,7 +5616,7 @@
           </w:tcPr>
           <w:p>
             <w:r>
-              <w:t>Councilman Dean Pratt, who sells Crane the city's land; old-school charm.</w:t>
+              <w:t>Crane's lawyer, who moves the money; cheerful, friendly - and dangerous under the smile.</w:t>
             </w:r>
           </w:p>
         </w:tc>
@@ -5638,7 +5638,7 @@
           </w:tcPr>
           <w:p>
             <w:r>
-              <w:t>Sixties, white hair, a seersucker suit and a bow tie.</w:t>
+              <w:t>Fifties, round and cheerful, thinning hair, a brown suit, a red bow tie, a pocket watch.</w:t>
             </w:r>
           </w:p>
         </w:tc>
@@ -5660,7 +5660,7 @@
           </w:tcPr>
           <w:p>
             <w:r>
-              <w:t>#c8e0ff</w:t>
+              <w:t>#9ad08a</w:t>
             </w:r>
           </w:p>
         </w:tc>
@@ -5682,7 +5682,7 @@
           </w:tcPr>
           <w:p>
             <w:r>
-              <w:t>shirt #c8d8ec, trousers #c8d8ec</w:t>
+              <w:t>shirt #5a4a3a, trousers #5a4a3a</w:t>
             </w:r>
           </w:p>
         </w:tc>
@@ -5704,7 +5704,7 @@
           </w:tcPr>
           <w:p>
             <w:r>
-              <w:t>skin #eac6a8; hair #f0eeea (combed); facial hair: none; eyes #5a7aa0; hat: none; glasses: none; top: seersucker (#9ab8dc / #f4f2ea); extras: bowtie, wrinkles; old, normal build</w:t>
+              <w:t>skin #f0c8a8; hair #8a7a6a (sides); facial hair: none; eyes #4a5a3a; hat: none; glasses: none; top: suit (#5a4a3a / #f0ece0); extras: bowtie, jowls; mid, broad build</w:t>
             </w:r>
           </w:p>
         </w:tc>
@@ -5726,7 +5726,7 @@
           </w:tcPr>
           <w:p>
             <w:r>
-              <w:t>triangle wave, 140-220 Hz, 11 syllables a second, pauses 0.1 s</w:t>
+              <w:t>sine wave, 130-200 Hz, 10 syllables a second, pauses 0.12 s</w:t>
             </w:r>
           </w:p>
         </w:tc>
@@ -5737,7 +5737,7 @@
         <w:pStyle w:val="Heading1"/>
       </w:pPr>
       <w:r>
-        <w:t>SAL MORETTI  (S)</w:t>
+        <w:t>CHIEF HOLLOWAY  (H)</w:t>
       </w:r>
     </w:p>
     <w:p>
@@ -5753,7 +5753,7 @@
               <a:graphicData uri="http://schemas.openxmlformats.org/drawingml/2006/picture">
                 <pic:pic>
                   <pic:nvPicPr>
-                    <pic:cNvPr id="0" name="sal-calm.png"/>
+                    <pic:cNvPr id="0" name="holloway-calm.png"/>
                     <pic:cNvPicPr/>
                   </pic:nvPicPr>
                   <pic:blipFill>
@@ -5790,7 +5790,7 @@
               <a:graphicData uri="http://schemas.openxmlformats.org/drawingml/2006/picture">
                 <pic:pic>
                   <pic:nvPicPr>
-                    <pic:cNvPr id="0" name="sal-angry.png"/>
+                    <pic:cNvPr id="0" name="holloway-angry.png"/>
                     <pic:cNvPicPr/>
                   </pic:nvPicPr>
                   <pic:blipFill>
@@ -5827,7 +5827,7 @@
               <a:graphicData uri="http://schemas.openxmlformats.org/drawingml/2006/picture">
                 <pic:pic>
                   <pic:nvPicPr>
-                    <pic:cNvPr id="0" name="sal-smile.png"/>
+                    <pic:cNvPr id="0" name="holloway-smile.png"/>
                     <pic:cNvPicPr/>
                   </pic:nvPicPr>
                   <pic:blipFill>
@@ -5888,7 +5888,7 @@
           </w:tcPr>
           <w:p>
             <w:r>
-              <w:t>A lifer on Iron Key: Crane's first partner in the 70s, framed by Crane for a murder Crane did; twenty years inside, calm, patient, plays chess.</w:t>
+              <w:t>Chief Ray Holloway, Miravista's police chief, who keeps the police off Crane.</w:t>
             </w:r>
           </w:p>
         </w:tc>
@@ -5910,7 +5910,7 @@
           </w:tcPr>
           <w:p>
             <w:r>
-              <w:t>Sixties, short grey hair combed back, a grey moustache, reading glasses, prison blues buttoned to the top; calm eyes.</w:t>
+              <w:t>Fifties, a red face, a grey flat-top, a thick moustache, the chief's navy uniform with gold braid, mirror shades.</w:t>
             </w:r>
           </w:p>
         </w:tc>
@@ -5932,7 +5932,7 @@
           </w:tcPr>
           <w:p>
             <w:r>
-              <w:t>#a8b8a0</w:t>
+              <w:t>#8a9ab0</w:t>
             </w:r>
           </w:p>
         </w:tc>
@@ -5954,7 +5954,7 @@
           </w:tcPr>
           <w:p>
             <w:r>
-              <w:t>shirt #4a6a9a, trousers #3a5480</w:t>
+              <w:t>shirt #1e2a4a, trousers #1e2a4a</w:t>
             </w:r>
           </w:p>
         </w:tc>
@@ -5976,7 +5976,7 @@
           </w:tcPr>
           <w:p>
             <w:r>
-              <w:t>skin #d4a882; hair #a8a8ac (combed); facial hair: moustache; eyes #4a4030; hat: none; glasses: reading; top: buttoned (#4a6a9a / #3a5480); extras: wrinkles; old, slim build</w:t>
+              <w:t>skin #e09070; hair #a8a8a8 (flattop); facial hair: moustache; eyes #4a5a6a; hat: none; glasses: shades; top: uniform (#1e2a4a / #141a2a); extras: braid; old, broad build</w:t>
             </w:r>
           </w:p>
         </w:tc>
@@ -5998,7 +5998,7 @@
           </w:tcPr>
           <w:p>
             <w:r>
-              <w:t>sine wave, 90-130 Hz, 6 syllables a second, pauses 0.24 s</w:t>
+              <w:t>square wave, 90-130 Hz, 8 syllables a second, pauses 0.14 s</w:t>
             </w:r>
           </w:p>
         </w:tc>
@@ -6009,7 +6009,7 @@
         <w:pStyle w:val="Heading1"/>
       </w:pPr>
       <w:r>
-        <w:t>DR. IRIS KAHN  (K)</w:t>
+        <w:t>DEAN PRATT  (P)</w:t>
       </w:r>
     </w:p>
     <w:p>
@@ -6025,7 +6025,7 @@
               <a:graphicData uri="http://schemas.openxmlformats.org/drawingml/2006/picture">
                 <pic:pic>
                   <pic:nvPicPr>
-                    <pic:cNvPr id="0" name="iris-calm.png"/>
+                    <pic:cNvPr id="0" name="pratt-calm.png"/>
                     <pic:cNvPicPr/>
                   </pic:nvPicPr>
                   <pic:blipFill>
@@ -6062,7 +6062,7 @@
               <a:graphicData uri="http://schemas.openxmlformats.org/drawingml/2006/picture">
                 <pic:pic>
                   <pic:nvPicPr>
-                    <pic:cNvPr id="0" name="iris-angry.png"/>
+                    <pic:cNvPr id="0" name="pratt-angry.png"/>
                     <pic:cNvPicPr/>
                   </pic:nvPicPr>
                   <pic:blipFill>
@@ -6099,7 +6099,7 @@
               <a:graphicData uri="http://schemas.openxmlformats.org/drawingml/2006/picture">
                 <pic:pic>
                   <pic:nvPicPr>
-                    <pic:cNvPr id="0" name="iris-smile.png"/>
+                    <pic:cNvPr id="0" name="pratt-smile.png"/>
                     <pic:cNvPicPr/>
                   </pic:nvPicPr>
                   <pic:blipFill>
@@ -6160,7 +6160,7 @@
           </w:tcPr>
           <w:p>
             <w:r>
-              <w:t>A rocket engineer at the space center, brilliant and stubborn; her last launch is all that keeps the center open.</w:t>
+              <w:t>Councilman Dean Pratt, who sells Crane the city's land; old-school charm.</w:t>
             </w:r>
           </w:p>
         </w:tc>
@@ -6182,7 +6182,7 @@
           </w:tcPr>
           <w:p>
             <w:r>
-              <w:t>Forties, dark curly hair in a messy bun, big square glasses, a white lab coat over a mission T-shirt, a pencil behind her ear.</w:t>
+              <w:t>Sixties, white hair, a seersucker suit and a bow tie.</w:t>
             </w:r>
           </w:p>
         </w:tc>
@@ -6204,7 +6204,7 @@
           </w:tcPr>
           <w:p>
             <w:r>
-              <w:t>#6affc0</w:t>
+              <w:t>#c8e0ff</w:t>
             </w:r>
           </w:p>
         </w:tc>
@@ -6226,7 +6226,7 @@
           </w:tcPr>
           <w:p>
             <w:r>
-              <w:t>shirt #f0f0f0, trousers #2a2a40</w:t>
+              <w:t>shirt #c8d8ec, trousers #c8d8ec</w:t>
             </w:r>
           </w:p>
         </w:tc>
@@ -6248,7 +6248,7 @@
           </w:tcPr>
           <w:p>
             <w:r>
-              <w:t>skin #d8a888; hair #2a1c18 (bun); facial hair: none; eyes #3a2a1a; hat: none; glasses: square; top: labcoat (#f0f0f0 / #2a3a6a); extras: pencil; mid, slim build</w:t>
+              <w:t>skin #eac6a8; hair #f0eeea (combed); facial hair: none; eyes #5a7aa0; hat: none; glasses: none; top: seersucker (#9ab8dc / #f4f2ea); extras: bowtie, wrinkles; old, normal build</w:t>
             </w:r>
           </w:p>
         </w:tc>
@@ -6270,7 +6270,7 @@
           </w:tcPr>
           <w:p>
             <w:r>
-              <w:t>triangle wave, 230-360 Hz, 14 syllables a second, pauses 0.04 s</w:t>
+              <w:t>triangle wave, 140-220 Hz, 11 syllables a second, pauses 0.1 s</w:t>
             </w:r>
           </w:p>
         </w:tc>
@@ -6281,7 +6281,7 @@
         <w:pStyle w:val="Heading1"/>
       </w:pPr>
       <w:r>
-        <w:t>MANNY  (G)</w:t>
+        <w:t>SAL MORETTI  (S)</w:t>
       </w:r>
     </w:p>
     <w:p>
@@ -6297,7 +6297,7 @@
               <a:graphicData uri="http://schemas.openxmlformats.org/drawingml/2006/picture">
                 <pic:pic>
                   <pic:nvPicPr>
-                    <pic:cNvPr id="0" name="manny-calm.png"/>
+                    <pic:cNvPr id="0" name="sal-calm.png"/>
                     <pic:cNvPicPr/>
                   </pic:nvPicPr>
                   <pic:blipFill>
@@ -6334,7 +6334,7 @@
               <a:graphicData uri="http://schemas.openxmlformats.org/drawingml/2006/picture">
                 <pic:pic>
                   <pic:nvPicPr>
-                    <pic:cNvPr id="0" name="manny-angry.png"/>
+                    <pic:cNvPr id="0" name="sal-angry.png"/>
                     <pic:cNvPicPr/>
                   </pic:nvPicPr>
                   <pic:blipFill>
@@ -6371,7 +6371,7 @@
               <a:graphicData uri="http://schemas.openxmlformats.org/drawingml/2006/picture">
                 <pic:pic>
                   <pic:nvPicPr>
-                    <pic:cNvPr id="0" name="manny-smile.png"/>
+                    <pic:cNvPr id="0" name="sal-smile.png"/>
                     <pic:cNvPicPr/>
                   </pic:nvPicPr>
                   <pic:blipFill>
@@ -6432,7 +6432,7 @@
           </w:tcPr>
           <w:p>
             <w:r>
-              <w:t>Owner of Manny's Auto in Dockside, where Mateo worked as a mechanic; grumpy, fond of Mateo.</w:t>
+              <w:t>A lifer on Iron Key: Crane's first partner in the 70s, framed by Crane for a murder Crane did; twenty years inside, calm, patient, plays chess.</w:t>
             </w:r>
           </w:p>
         </w:tc>
@@ -6454,7 +6454,7 @@
           </w:tcPr>
           <w:p>
             <w:r>
-              <w:t>Sixties, a grey beard, short grey hair, a greasy blue jumpsuit with MANNY on it, a red rag over the shoulder.</w:t>
+              <w:t>Sixties, short grey hair combed back, a grey moustache, reading glasses, prison blues buttoned to the top; calm eyes.</w:t>
             </w:r>
           </w:p>
         </w:tc>
@@ -6476,7 +6476,7 @@
           </w:tcPr>
           <w:p>
             <w:r>
-              <w:t>#d08a4a</w:t>
+              <w:t>#a8b8a0</w:t>
             </w:r>
           </w:p>
         </w:tc>
@@ -6498,7 +6498,7 @@
           </w:tcPr>
           <w:p>
             <w:r>
-              <w:t>shirt #2a4a8a, trousers #2a4a8a</w:t>
+              <w:t>shirt #4a6a9a, trousers #3a5480</w:t>
             </w:r>
           </w:p>
         </w:tc>
@@ -6520,7 +6520,7 @@
           </w:tcPr>
           <w:p>
             <w:r>
-              <w:t>skin #c8946a; hair #b8b8bc (short); facial hair: beard; eyes #4a3a2a; hat: none; glasses: none; top: jumpsuit (#2a4a8a / #1e3a6e); extras: wrinkles, rag; old, broad build</w:t>
+              <w:t>skin #d4a882; hair #a8a8ac (combed); facial hair: moustache; eyes #4a4030; hat: none; glasses: reading; top: buttoned (#4a6a9a / #3a5480); extras: wrinkles; old, slim build</w:t>
             </w:r>
           </w:p>
         </w:tc>
@@ -6542,7 +6542,7 @@
           </w:tcPr>
           <w:p>
             <w:r>
-              <w:t>sawtooth wave, 85-125 Hz, 8 syllables a second, pauses 0.16 s</w:t>
+              <w:t>sine wave, 90-130 Hz, 6 syllables a second, pauses 0.24 s</w:t>
             </w:r>
           </w:p>
         </w:tc>
@@ -6553,7 +6553,7 @@
         <w:pStyle w:val="Heading1"/>
       </w:pPr>
       <w:r>
-        <w:t>UNCLE SAUL  (U)</w:t>
+        <w:t>DR. IRIS KAHN  (K)</w:t>
       </w:r>
     </w:p>
     <w:p>
@@ -6569,7 +6569,7 @@
               <a:graphicData uri="http://schemas.openxmlformats.org/drawingml/2006/picture">
                 <pic:pic>
                   <pic:nvPicPr>
-                    <pic:cNvPr id="0" name="saul-calm.png"/>
+                    <pic:cNvPr id="0" name="iris-calm.png"/>
                     <pic:cNvPicPr/>
                   </pic:nvPicPr>
                   <pic:blipFill>
@@ -6606,7 +6606,7 @@
               <a:graphicData uri="http://schemas.openxmlformats.org/drawingml/2006/picture">
                 <pic:pic>
                   <pic:nvPicPr>
-                    <pic:cNvPr id="0" name="saul-angry.png"/>
+                    <pic:cNvPr id="0" name="iris-angry.png"/>
                     <pic:cNvPicPr/>
                   </pic:nvPicPr>
                   <pic:blipFill>
@@ -6643,7 +6643,7 @@
               <a:graphicData uri="http://schemas.openxmlformats.org/drawingml/2006/picture">
                 <pic:pic>
                   <pic:nvPicPr>
-                    <pic:cNvPr id="0" name="saul-smile.png"/>
+                    <pic:cNvPr id="0" name="iris-smile.png"/>
                     <pic:cNvPicPr/>
                   </pic:nvPicPr>
                   <pic:blipFill>
@@ -6704,7 +6704,7 @@
           </w:tcPr>
           <w:p>
             <w:r>
-              <w:t>Papa Joe's old friend, the pawnbroker in Mercado; takes Joe's parcels, asks no questions.</w:t>
+              <w:t>A rocket engineer at the space center, brilliant and stubborn; her last launch is all that keeps the center open.</w:t>
             </w:r>
           </w:p>
         </w:tc>
@@ -6726,7 +6726,7 @@
           </w:tcPr>
           <w:p>
             <w:r>
-              <w:t>Seventies, bald with white tufts, a jeweller's loupe pushed up on his glasses, a grey cardigan over a cream shirt.</w:t>
+              <w:t>Forties, dark curly hair in a messy bun, big square glasses, a white lab coat over a mission T-shirt, a pencil behind her ear.</w:t>
             </w:r>
           </w:p>
         </w:tc>
@@ -6748,7 +6748,7 @@
           </w:tcPr>
           <w:p>
             <w:r>
-              <w:t>#d8c890</w:t>
+              <w:t>#6affc0</w:t>
             </w:r>
           </w:p>
         </w:tc>
@@ -6770,7 +6770,7 @@
           </w:tcPr>
           <w:p>
             <w:r>
-              <w:t>shirt #7a7a80, trousers #3a3a40</w:t>
+              <w:t>shirt #f0f0f0, trousers #2a2a40</w:t>
             </w:r>
           </w:p>
         </w:tc>
@@ -6792,7 +6792,7 @@
           </w:tcPr>
           <w:p>
             <w:r>
-              <w:t>skin #e2bc9a; hair #eeeeea (sides); facial hair: none; eyes #4a4a3a; hat: none; glasses: reading; top: cardigan (#7a7a80 / #e8e4d8); extras: wrinkles, loupe; old, slim build</w:t>
+              <w:t>skin #d8a888; hair #2a1c18 (bun); facial hair: none; eyes #3a2a1a; hat: none; glasses: square; top: labcoat (#f0f0f0 / #2a3a6a); extras: pencil; mid, slim build</w:t>
             </w:r>
           </w:p>
         </w:tc>
@@ -6814,7 +6814,7 @@
           </w:tcPr>
           <w:p>
             <w:r>
-              <w:t>sine wave, 150-230 Hz, 9 syllables a second, pauses 0.14 s</w:t>
+              <w:t>triangle wave, 230-360 Hz, 14 syllables a second, pauses 0.04 s</w:t>
             </w:r>
           </w:p>
         </w:tc>
@@ -6825,7 +6825,7 @@
         <w:pStyle w:val="Heading1"/>
       </w:pPr>
       <w:r>
-        <w:t>LUCKY LOU  (F)</w:t>
+        <w:t>MANNY  (G)</w:t>
       </w:r>
     </w:p>
     <w:p>
@@ -6841,7 +6841,7 @@
               <a:graphicData uri="http://schemas.openxmlformats.org/drawingml/2006/picture">
                 <pic:pic>
                   <pic:nvPicPr>
-                    <pic:cNvPr id="0" name="lou-calm.png"/>
+                    <pic:cNvPr id="0" name="manny-calm.png"/>
                     <pic:cNvPicPr/>
                   </pic:nvPicPr>
                   <pic:blipFill>
@@ -6878,7 +6878,7 @@
               <a:graphicData uri="http://schemas.openxmlformats.org/drawingml/2006/picture">
                 <pic:pic>
                   <pic:nvPicPr>
-                    <pic:cNvPr id="0" name="lou-angry.png"/>
+                    <pic:cNvPr id="0" name="manny-angry.png"/>
                     <pic:cNvPicPr/>
                   </pic:nvPicPr>
                   <pic:blipFill>
@@ -6915,7 +6915,7 @@
               <a:graphicData uri="http://schemas.openxmlformats.org/drawingml/2006/picture">
                 <pic:pic>
                   <pic:nvPicPr>
-                    <pic:cNvPr id="0" name="lou-smile.png"/>
+                    <pic:cNvPr id="0" name="manny-smile.png"/>
                     <pic:cNvPicPr/>
                   </pic:nvPicPr>
                   <pic:blipFill>
@@ -6976,7 +6976,7 @@
           </w:tcPr>
           <w:p>
             <w:r>
-              <w:t>"Lucky" Lou Fontaine, a bookie who owes Papa Joe two grand from cards; loud and flashy.</w:t>
+              <w:t>Owner of Manny's Auto in Dockside, where Mateo worked as a mechanic; grumpy, fond of Mateo.</w:t>
             </w:r>
           </w:p>
         </w:tc>
@@ -6998,7 +6998,7 @@
           </w:tcPr>
           <w:p>
             <w:r>
-              <w:t>Forties, a pencil moustache, slicked hair, a green visor, a loud check jacket, a cigar.</w:t>
+              <w:t>Sixties, a grey beard, short grey hair, a greasy blue jumpsuit with MANNY on it, a red rag over the shoulder.</w:t>
             </w:r>
           </w:p>
         </w:tc>
@@ -7020,7 +7020,7 @@
           </w:tcPr>
           <w:p>
             <w:r>
-              <w:t>#2ad480</w:t>
+              <w:t>#d08a4a</w:t>
             </w:r>
           </w:p>
         </w:tc>
@@ -7042,7 +7042,7 @@
           </w:tcPr>
           <w:p>
             <w:r>
-              <w:t>shirt #c8a040, trousers #3a3a3a</w:t>
+              <w:t>shirt #2a4a8a, trousers #2a4a8a</w:t>
             </w:r>
           </w:p>
         </w:tc>
@@ -7064,7 +7064,7 @@
           </w:tcPr>
           <w:p>
             <w:r>
-              <w:t>skin #e0b088; hair #2a1a14 (slick); facial hair: pencil; eyes #3a2a1a; hat: visor; glasses: none; top: checkjacket (#c8a040 / #7a3a20); extras: cigar; mid, broad build</w:t>
+              <w:t>skin #c8946a; hair #b8b8bc (short); facial hair: beard; eyes #4a3a2a; hat: none; glasses: none; top: jumpsuit (#2a4a8a / #1e3a6e); extras: wrinkles, rag; old, broad build</w:t>
             </w:r>
           </w:p>
         </w:tc>
@@ -7086,7 +7086,7 @@
           </w:tcPr>
           <w:p>
             <w:r>
-              <w:t>square wave, 160-260 Hz, 13 syllables a second, pauses 0.05 s</w:t>
+              <w:t>sawtooth wave, 85-125 Hz, 8 syllables a second, pauses 0.16 s</w:t>
             </w:r>
           </w:p>
         </w:tc>
@@ -7097,7 +7097,7 @@
         <w:pStyle w:val="Heading1"/>
       </w:pPr>
       <w:r>
-        <w:t>THE FARE  (X)</w:t>
+        <w:t>UNCLE SAUL  (U)</w:t>
       </w:r>
     </w:p>
     <w:p>
@@ -7113,7 +7113,7 @@
               <a:graphicData uri="http://schemas.openxmlformats.org/drawingml/2006/picture">
                 <pic:pic>
                   <pic:nvPicPr>
-                    <pic:cNvPr id="0" name="kid-calm.png"/>
+                    <pic:cNvPr id="0" name="saul-calm.png"/>
                     <pic:cNvPicPr/>
                   </pic:nvPicPr>
                   <pic:blipFill>
@@ -7150,7 +7150,7 @@
               <a:graphicData uri="http://schemas.openxmlformats.org/drawingml/2006/picture">
                 <pic:pic>
                   <pic:nvPicPr>
-                    <pic:cNvPr id="0" name="kid-angry.png"/>
+                    <pic:cNvPr id="0" name="saul-angry.png"/>
                     <pic:cNvPicPr/>
                   </pic:nvPicPr>
                   <pic:blipFill>
@@ -7187,7 +7187,7 @@
               <a:graphicData uri="http://schemas.openxmlformats.org/drawingml/2006/picture">
                 <pic:pic>
                   <pic:nvPicPr>
-                    <pic:cNvPr id="0" name="kid-smile.png"/>
+                    <pic:cNvPr id="0" name="saul-smile.png"/>
                     <pic:cNvPicPr/>
                   </pic:nvPicPr>
                   <pic:blipFill>
@@ -7248,7 +7248,7 @@
           </w:tcPr>
           <w:p>
             <w:r>
-              <w:t>A punk kid who rides Joe's cab from the airport and runs without paying.</w:t>
+              <w:t>Papa Joe's old friend, the pawnbroker in Mercado; takes Joe's parcels, asks no questions.</w:t>
             </w:r>
           </w:p>
         </w:tc>
@@ -7270,7 +7270,7 @@
           </w:tcPr>
           <w:p>
             <w:r>
-              <w:t>Late teens, skinny, spiky pink hair, an earring, a purple and neon-green windbreaker.</w:t>
+              <w:t>Seventies, bald with white tufts, a jeweller's loupe pushed up on his glasses, a grey cardigan over a cream shirt.</w:t>
             </w:r>
           </w:p>
         </w:tc>
@@ -7292,7 +7292,7 @@
           </w:tcPr>
           <w:p>
             <w:r>
-              <w:t>#3affd0</w:t>
+              <w:t>#d8c890</w:t>
             </w:r>
           </w:p>
         </w:tc>
@@ -7314,7 +7314,7 @@
           </w:tcPr>
           <w:p>
             <w:r>
-              <w:t>shirt #7a3aff, trousers #1a1a24</w:t>
+              <w:t>shirt #7a7a80, trousers #3a3a40</w:t>
             </w:r>
           </w:p>
         </w:tc>
@@ -7336,7 +7336,7 @@
           </w:tcPr>
           <w:p>
             <w:r>
-              <w:t>skin #e8c0a0; hair #ff3aa0 (spiky); facial hair: none; eyes #3a5a7a; hat: none; glasses: none; top: windbreaker (#7a3aff / #3affd0); extras: earring; young, slim build</w:t>
+              <w:t>skin #e2bc9a; hair #eeeeea (sides); facial hair: none; eyes #4a4a3a; hat: none; glasses: reading; top: cardigan (#7a7a80 / #e8e4d8); extras: wrinkles, loupe; old, slim build</w:t>
             </w:r>
           </w:p>
         </w:tc>
@@ -7358,7 +7358,7 @@
           </w:tcPr>
           <w:p>
             <w:r>
-              <w:t>square wave, 300-460 Hz, 16 syllables a second, pauses 0.02 s</w:t>
+              <w:t>sine wave, 150-230 Hz, 9 syllables a second, pauses 0.14 s</w:t>
             </w:r>
           </w:p>
         </w:tc>
@@ -7369,7 +7369,7 @@
         <w:pStyle w:val="Heading1"/>
       </w:pPr>
       <w:r>
-        <w:t>KESSLER MAN  (Q)</w:t>
+        <w:t>LUCKY LOU  (F)</w:t>
       </w:r>
     </w:p>
     <w:p>
@@ -7385,7 +7385,7 @@
               <a:graphicData uri="http://schemas.openxmlformats.org/drawingml/2006/picture">
                 <pic:pic>
                   <pic:nvPicPr>
-                    <pic:cNvPr id="0" name="bull-calm.png"/>
+                    <pic:cNvPr id="0" name="lou-calm.png"/>
                     <pic:cNvPicPr/>
                   </pic:nvPicPr>
                   <pic:blipFill>
@@ -7422,7 +7422,7 @@
               <a:graphicData uri="http://schemas.openxmlformats.org/drawingml/2006/picture">
                 <pic:pic>
                   <pic:nvPicPr>
-                    <pic:cNvPr id="0" name="bull-angry.png"/>
+                    <pic:cNvPr id="0" name="lou-angry.png"/>
                     <pic:cNvPicPr/>
                   </pic:nvPicPr>
                   <pic:blipFill>
@@ -7459,7 +7459,7 @@
               <a:graphicData uri="http://schemas.openxmlformats.org/drawingml/2006/picture">
                 <pic:pic>
                   <pic:nvPicPr>
-                    <pic:cNvPr id="0" name="bull-smile.png"/>
+                    <pic:cNvPr id="0" name="lou-smile.png"/>
                     <pic:cNvPicPr/>
                   </pic:nvPicPr>
                   <pic:blipFill>
@@ -7520,7 +7520,7 @@
           </w:tcPr>
           <w:p>
             <w:r>
-              <w:t>One of Bull Kessler's men - Dockside heavies, every one much like the next.</w:t>
+              <w:t>"Lucky" Lou Fontaine, a bookie who owes Papa Joe two grand from cards; loud and flashy.</w:t>
             </w:r>
           </w:p>
         </w:tc>
@@ -7542,7 +7542,7 @@
           </w:tcPr>
           <w:p>
             <w:r>
-              <w:t>Thirties, a buzz cut, stubble, a white vest or an orange work shirt, gold chains, jeans.</w:t>
+              <w:t>Forties, a pencil moustache, slicked hair, a green visor, a loud check jacket, a cigar.</w:t>
             </w:r>
           </w:p>
         </w:tc>
@@ -7564,7 +7564,7 @@
           </w:tcPr>
           <w:p>
             <w:r>
-              <w:t>#d87a4a</w:t>
+              <w:t>#2ad480</w:t>
             </w:r>
           </w:p>
         </w:tc>
@@ -7586,7 +7586,7 @@
           </w:tcPr>
           <w:p>
             <w:r>
-              <w:t>shirt #f0f0ea, trousers #3a4a6a</w:t>
+              <w:t>shirt #c8a040, trousers #3a3a3a</w:t>
             </w:r>
           </w:p>
         </w:tc>
@@ -7608,7 +7608,7 @@
           </w:tcPr>
           <w:p>
             <w:r>
-              <w:t>skin #d9a27a; hair #3a2a20 (buzz); facial hair: stubble; eyes #3a2a1a; hat: none; glasses: none; top: tanktop (#f0f0ea / #d8d8d2); extras: chain; mid, broad build</w:t>
+              <w:t>skin #e0b088; hair #2a1a14 (slick); facial hair: pencil; eyes #3a2a1a; hat: visor; glasses: none; top: checkjacket (#c8a040 / #7a3a20); extras: cigar; mid, broad build</w:t>
             </w:r>
           </w:p>
         </w:tc>
@@ -7630,7 +7630,7 @@
           </w:tcPr>
           <w:p>
             <w:r>
-              <w:t>sawtooth wave, 100-150 Hz, 11 syllables a second, pauses 0.08 s</w:t>
+              <w:t>square wave, 160-260 Hz, 13 syllables a second, pauses 0.05 s</w:t>
             </w:r>
           </w:p>
         </w:tc>
@@ -7641,7 +7641,7 @@
         <w:pStyle w:val="Heading1"/>
       </w:pPr>
       <w:r>
-        <w:t>GUS DELGADO  (W)</w:t>
+        <w:t>THE FARE  (X)</w:t>
       </w:r>
     </w:p>
     <w:p>
@@ -7657,7 +7657,7 @@
               <a:graphicData uri="http://schemas.openxmlformats.org/drawingml/2006/picture">
                 <pic:pic>
                   <pic:nvPicPr>
-                    <pic:cNvPr id="0" name="gus-calm.png"/>
+                    <pic:cNvPr id="0" name="kid-calm.png"/>
                     <pic:cNvPicPr/>
                   </pic:nvPicPr>
                   <pic:blipFill>
@@ -7694,7 +7694,7 @@
               <a:graphicData uri="http://schemas.openxmlformats.org/drawingml/2006/picture">
                 <pic:pic>
                   <pic:nvPicPr>
-                    <pic:cNvPr id="0" name="gus-angry.png"/>
+                    <pic:cNvPr id="0" name="kid-angry.png"/>
                     <pic:cNvPicPr/>
                   </pic:nvPicPr>
                   <pic:blipFill>
@@ -7731,7 +7731,7 @@
               <a:graphicData uri="http://schemas.openxmlformats.org/drawingml/2006/picture">
                 <pic:pic>
                   <pic:nvPicPr>
-                    <pic:cNvPr id="0" name="gus-smile.png"/>
+                    <pic:cNvPr id="0" name="kid-smile.png"/>
                     <pic:cNvPicPr/>
                   </pic:nvPicPr>
                   <pic:blipFill>
@@ -7792,7 +7792,7 @@
           </w:tcPr>
           <w:p>
             <w:r>
-              <w:t>Runs DELGADO HARDWARE in Dockside; the one shopkeeper on the street who will not pay Kessler his rent.</w:t>
+              <w:t>A punk kid who rides Joe's cab from the airport and runs without paying.</w:t>
             </w:r>
           </w:p>
         </w:tc>
@@ -7814,7 +7814,7 @@
           </w:tcPr>
           <w:p>
             <w:r>
-              <w:t>Sixties, bald with a grey fringe, round glasses, a grey moustache, a brown shopkeeper's apron over a white shirt; stubborn.</w:t>
+              <w:t>Late teens, skinny, spiky pink hair, an earring, a purple and neon-green windbreaker.</w:t>
             </w:r>
           </w:p>
         </w:tc>
@@ -7836,7 +7836,7 @@
           </w:tcPr>
           <w:p>
             <w:r>
-              <w:t>#b8a07a</w:t>
+              <w:t>#3affd0</w:t>
             </w:r>
           </w:p>
         </w:tc>
@@ -7858,7 +7858,7 @@
           </w:tcPr>
           <w:p>
             <w:r>
-              <w:t>shirt #f0ece0, trousers #5a4a3a</w:t>
+              <w:t>shirt #7a3aff, trousers #1a1a24</w:t>
             </w:r>
           </w:p>
         </w:tc>
@@ -7880,7 +7880,7 @@
           </w:tcPr>
           <w:p>
             <w:r>
-              <w:t>skin #c99a76; hair #b0b0b4 (sides); facial hair: moustache; eyes #3a2a1a; hat: none; glasses: reading; top: waistcoat (#7a5a3a / #f0ece0); extras: wrinkles; old, normal build</w:t>
+              <w:t>skin #e8c0a0; hair #ff3aa0 (spiky); facial hair: none; eyes #3a5a7a; hat: none; glasses: none; top: windbreaker (#7a3aff / #3affd0); extras: earring; young, slim build</w:t>
             </w:r>
           </w:p>
         </w:tc>
@@ -7902,7 +7902,7 @@
           </w:tcPr>
           <w:p>
             <w:r>
-              <w:t>triangle wave, 120-190 Hz, 10 syllables a second, pauses 0.12 s</w:t>
+              <w:t>square wave, 300-460 Hz, 16 syllables a second, pauses 0.02 s</w:t>
             </w:r>
           </w:p>
         </w:tc>
@@ -7913,7 +7913,7 @@
         <w:pStyle w:val="Heading1"/>
       </w:pPr>
       <w:r>
-        <w:t>ROSA'S MAN  (R)</w:t>
+        <w:t>KESSLER MAN  (Q)</w:t>
       </w:r>
     </w:p>
     <w:p>
@@ -7929,7 +7929,7 @@
               <a:graphicData uri="http://schemas.openxmlformats.org/drawingml/2006/picture">
                 <pic:pic>
                   <pic:nvPicPr>
-                    <pic:cNvPr id="0" name="rosaman-calm.png"/>
+                    <pic:cNvPr id="0" name="bull-calm.png"/>
                     <pic:cNvPicPr/>
                   </pic:nvPicPr>
                   <pic:blipFill>
@@ -7966,7 +7966,7 @@
               <a:graphicData uri="http://schemas.openxmlformats.org/drawingml/2006/picture">
                 <pic:pic>
                   <pic:nvPicPr>
-                    <pic:cNvPr id="0" name="rosaman-angry.png"/>
+                    <pic:cNvPr id="0" name="bull-angry.png"/>
                     <pic:cNvPicPr/>
                   </pic:nvPicPr>
                   <pic:blipFill>
@@ -8003,7 +8003,7 @@
               <a:graphicData uri="http://schemas.openxmlformats.org/drawingml/2006/picture">
                 <pic:pic>
                   <pic:nvPicPr>
-                    <pic:cNvPr id="0" name="rosaman-smile.png"/>
+                    <pic:cNvPr id="0" name="bull-smile.png"/>
                     <pic:cNvPicPr/>
                   </pic:nvPicPr>
                   <pic:blipFill>
@@ -8064,7 +8064,7 @@
           </w:tcPr>
           <w:p>
             <w:r>
-              <w:t>One of Rosa Ortega's market men - porters and stall-keepers who stand by her (one bubble for all of them).</w:t>
+              <w:t>One of Bull Kessler's men - Dockside heavies, every one much like the next.</w:t>
             </w:r>
           </w:p>
         </w:tc>
@@ -8086,7 +8086,7 @@
           </w:tcPr>
           <w:p>
             <w:r>
-              <w:t>Thirties, short black hair, stubble, a red bandana over the shoulder, a white vest, strong arms.</w:t>
+              <w:t>Thirties, a buzz cut, stubble, a white vest or an orange work shirt, gold chains, jeans.</w:t>
             </w:r>
           </w:p>
         </w:tc>
@@ -8108,7 +8108,7 @@
           </w:tcPr>
           <w:p>
             <w:r>
-              <w:t>#e04a5a</w:t>
+              <w:t>#d87a4a</w:t>
             </w:r>
           </w:p>
         </w:tc>
@@ -8130,7 +8130,7 @@
           </w:tcPr>
           <w:p>
             <w:r>
-              <w:t>shirt #f2f2f2, trousers #2a3a5a</w:t>
+              <w:t>shirt #f0f0ea, trousers #3a4a6a</w:t>
             </w:r>
           </w:p>
         </w:tc>
@@ -8152,7 +8152,7 @@
           </w:tcPr>
           <w:p>
             <w:r>
-              <w:t>skin #b8805a; hair #1a1416 (short); facial hair: stubble; eyes #2a1a12; hat: none; glasses: none; top: tanktop (#f2f2f2 / #e0e0e0); extras: rag; mid, broad build</w:t>
+              <w:t>skin #d9a27a; hair #3a2a20 (buzz); facial hair: stubble; eyes #3a2a1a; hat: none; glasses: none; top: tanktop (#f0f0ea / #d8d8d2); extras: chain; mid, broad build</w:t>
             </w:r>
           </w:p>
         </w:tc>
@@ -8174,7 +8174,7 @@
           </w:tcPr>
           <w:p>
             <w:r>
-              <w:t>triangle wave, 110-170 Hz, 11 syllables a second, pauses 0.07 s</w:t>
+              <w:t>sawtooth wave, 100-150 Hz, 11 syllables a second, pauses 0.08 s</w:t>
             </w:r>
           </w:p>
         </w:tc>
@@ -8185,7 +8185,7 @@
         <w:pStyle w:val="Heading1"/>
       </w:pPr>
       <w:r>
-        <w:t>LENNY GOLD  (G)</w:t>
+        <w:t>GUS DELGADO  (W)</w:t>
       </w:r>
     </w:p>
     <w:p>
@@ -8201,7 +8201,7 @@
               <a:graphicData uri="http://schemas.openxmlformats.org/drawingml/2006/picture">
                 <pic:pic>
                   <pic:nvPicPr>
-                    <pic:cNvPr id="0" name="lenny-calm.png"/>
+                    <pic:cNvPr id="0" name="gus-calm.png"/>
                     <pic:cNvPicPr/>
                   </pic:nvPicPr>
                   <pic:blipFill>
@@ -8238,7 +8238,7 @@
               <a:graphicData uri="http://schemas.openxmlformats.org/drawingml/2006/picture">
                 <pic:pic>
                   <pic:nvPicPr>
-                    <pic:cNvPr id="0" name="lenny-angry.png"/>
+                    <pic:cNvPr id="0" name="gus-angry.png"/>
                     <pic:cNvPicPr/>
                   </pic:nvPicPr>
                   <pic:blipFill>
@@ -8275,7 +8275,7 @@
               <a:graphicData uri="http://schemas.openxmlformats.org/drawingml/2006/picture">
                 <pic:pic>
                   <pic:nvPicPr>
-                    <pic:cNvPr id="0" name="lenny-smile.png"/>
+                    <pic:cNvPr id="0" name="gus-smile.png"/>
                     <pic:cNvPicPr/>
                   </pic:nvPicPr>
                   <pic:blipFill>
@@ -8336,7 +8336,7 @@
           </w:tcPr>
           <w:p>
             <w:r>
-              <w:t>The Royal Flamingo's pit boss - Crane's man on the casino floor; his men hunt Del and Fay. Shouts at everyone.</w:t>
+              <w:t>Runs DELGADO HARDWARE in Dockside; the one shopkeeper on the street who will not pay Kessler his rent.</w:t>
             </w:r>
           </w:p>
         </w:tc>
@@ -8358,7 +8358,7 @@
           </w:tcPr>
           <w:p>
             <w:r>
-              <w:t>Forties, heavy, a bad toupee, a burgundy suit, gold chains; shouts at everyone.</w:t>
+              <w:t>Sixties, bald with a grey fringe, round glasses, a grey moustache, a brown shopkeeper's apron over a white shirt; stubborn.</w:t>
             </w:r>
           </w:p>
         </w:tc>
@@ -8380,7 +8380,7 @@
           </w:tcPr>
           <w:p>
             <w:r>
-              <w:t>#d4a017</w:t>
+              <w:t>#b8a07a</w:t>
             </w:r>
           </w:p>
         </w:tc>
@@ -8402,7 +8402,7 @@
           </w:tcPr>
           <w:p>
             <w:r>
-              <w:t>shirt #6a1a2a, trousers #2a1a1e</w:t>
+              <w:t>shirt #f0ece0, trousers #5a4a3a</w:t>
             </w:r>
           </w:p>
         </w:tc>
@@ -8424,7 +8424,7 @@
           </w:tcPr>
           <w:p>
             <w:r>
-              <w:t>skin #e8b894; hair #a8642a (combed); facial hair: none; eyes #3a2a1a; hat: none; glasses: none; top: suit (#6a1a2a / #f0e6e0); extras: chain, jowls, sweat; mid, broad build</w:t>
+              <w:t>skin #c99a76; hair #b0b0b4 (sides); facial hair: moustache; eyes #3a2a1a; hat: none; glasses: reading; top: waistcoat (#7a5a3a / #f0ece0); extras: wrinkles; old, normal build</w:t>
             </w:r>
           </w:p>
         </w:tc>
@@ -8446,7 +8446,7 @@
           </w:tcPr>
           <w:p>
             <w:r>
-              <w:t>sawtooth wave, 90-150 Hz, 12 syllables a second, pauses 0.04 s</w:t>
+              <w:t>triangle wave, 120-190 Hz, 10 syllables a second, pauses 0.12 s</w:t>
             </w:r>
           </w:p>
         </w:tc>
@@ -8457,7 +8457,7 @@
         <w:pStyle w:val="Heading1"/>
       </w:pPr>
       <w:r>
-        <w:t>FAY "FINGERS"  (F)</w:t>
+        <w:t>ROSA'S MAN  (R)</w:t>
       </w:r>
     </w:p>
     <w:p>
@@ -8473,7 +8473,7 @@
               <a:graphicData uri="http://schemas.openxmlformats.org/drawingml/2006/picture">
                 <pic:pic>
                   <pic:nvPicPr>
-                    <pic:cNvPr id="0" name="fay-calm.png"/>
+                    <pic:cNvPr id="0" name="rosaman-calm.png"/>
                     <pic:cNvPicPr/>
                   </pic:nvPicPr>
                   <pic:blipFill>
@@ -8510,7 +8510,7 @@
               <a:graphicData uri="http://schemas.openxmlformats.org/drawingml/2006/picture">
                 <pic:pic>
                   <pic:nvPicPr>
-                    <pic:cNvPr id="0" name="fay-angry.png"/>
+                    <pic:cNvPr id="0" name="rosaman-angry.png"/>
                     <pic:cNvPicPr/>
                   </pic:nvPicPr>
                   <pic:blipFill>
@@ -8547,7 +8547,7 @@
               <a:graphicData uri="http://schemas.openxmlformats.org/drawingml/2006/picture">
                 <pic:pic>
                   <pic:nvPicPr>
-                    <pic:cNvPr id="0" name="fay-smile.png"/>
+                    <pic:cNvPr id="0" name="rosaman-smile.png"/>
                     <pic:cNvPicPr/>
                   </pic:nvPicPr>
                   <pic:blipFill>
@@ -8608,7 +8608,7 @@
           </w:tcPr>
           <w:p>
             <w:r>
-              <w:t>A safecracker with the steadiest hands in Florida; Gold's men hold her in the lunapark's funhouse. The vault's lock is hers.</w:t>
+              <w:t>One of Rosa Ortega's market men - porters and stall-keepers who stand by her (one bubble for all of them).</w:t>
             </w:r>
           </w:p>
         </w:tc>
@@ -8630,7 +8630,7 @@
           </w:tcPr>
           <w:p>
             <w:r>
-              <w:t>Twenties, a dyed red undercut, a black leather jacket, a nose ring; talks fast.</w:t>
+              <w:t>Thirties, short black hair, stubble, a red bandana over the shoulder, a white vest, strong arms.</w:t>
             </w:r>
           </w:p>
         </w:tc>
@@ -8652,7 +8652,7 @@
           </w:tcPr>
           <w:p>
             <w:r>
-              <w:t>#ff3b6b</w:t>
+              <w:t>#e04a5a</w:t>
             </w:r>
           </w:p>
         </w:tc>
@@ -8674,7 +8674,7 @@
           </w:tcPr>
           <w:p>
             <w:r>
-              <w:t>shirt #1a1a20, trousers #2a2a3a</w:t>
+              <w:t>shirt #f2f2f2, trousers #2a3a5a</w:t>
             </w:r>
           </w:p>
         </w:tc>
@@ -8696,7 +8696,7 @@
           </w:tcPr>
           <w:p>
             <w:r>
-              <w:t>skin #f0c8a8; hair #d0202a (pixie); facial hair: none; eyes #2a6a3a; hat: none; glasses: none; top: leather (#1a1a20 / #c8202c); extras: nosering, earring; young, slim build</w:t>
+              <w:t>skin #b8805a; hair #1a1416 (short); facial hair: stubble; eyes #2a1a12; hat: none; glasses: none; top: tanktop (#f2f2f2 / #e0e0e0); extras: rag; mid, broad build</w:t>
             </w:r>
           </w:p>
         </w:tc>
@@ -8718,7 +8718,7 @@
           </w:tcPr>
           <w:p>
             <w:r>
-              <w:t>square wave, 280-440 Hz, 17 syllables a second, pauses 0.02 s</w:t>
+              <w:t>triangle wave, 110-170 Hz, 11 syllables a second, pauses 0.07 s</w:t>
             </w:r>
           </w:p>
         </w:tc>
@@ -8729,7 +8729,7 @@
         <w:pStyle w:val="Heading1"/>
       </w:pPr>
       <w:r>
-        <w:t>CASINO GUARD  (Q)</w:t>
+        <w:t>LENNY GOLD  (G)</w:t>
       </w:r>
     </w:p>
     <w:p>
@@ -8745,7 +8745,7 @@
               <a:graphicData uri="http://schemas.openxmlformats.org/drawingml/2006/picture">
                 <pic:pic>
                   <pic:nvPicPr>
-                    <pic:cNvPr id="0" name="cguard-calm.png"/>
+                    <pic:cNvPr id="0" name="lenny-calm.png"/>
                     <pic:cNvPicPr/>
                   </pic:nvPicPr>
                   <pic:blipFill>
@@ -8782,7 +8782,7 @@
               <a:graphicData uri="http://schemas.openxmlformats.org/drawingml/2006/picture">
                 <pic:pic>
                   <pic:nvPicPr>
-                    <pic:cNvPr id="0" name="cguard-angry.png"/>
+                    <pic:cNvPr id="0" name="lenny-angry.png"/>
                     <pic:cNvPicPr/>
                   </pic:nvPicPr>
                   <pic:blipFill>
@@ -8819,7 +8819,7 @@
               <a:graphicData uri="http://schemas.openxmlformats.org/drawingml/2006/picture">
                 <pic:pic>
                   <pic:nvPicPr>
-                    <pic:cNvPr id="0" name="cguard-smile.png"/>
+                    <pic:cNvPr id="0" name="lenny-smile.png"/>
                     <pic:cNvPicPr/>
                   </pic:nvPicPr>
                   <pic:blipFill>
@@ -8880,7 +8880,7 @@
           </w:tcPr>
           <w:p>
             <w:r>
-              <w:t>The Royal Flamingo's guards (one bubble for all of them).</w:t>
+              <w:t>The Royal Flamingo's pit boss - Crane's man on the casino floor; his men hunt Del and Fay. Shouts at everyone.</w:t>
             </w:r>
           </w:p>
         </w:tc>
@@ -8902,7 +8902,7 @@
           </w:tcPr>
           <w:p>
             <w:r>
-              <w:t>Thirties, a crew cut, a black suit with a gold flamingo pin, an earpiece.</w:t>
+              <w:t>Forties, heavy, a bad toupee, a burgundy suit, gold chains; shouts at everyone.</w:t>
             </w:r>
           </w:p>
         </w:tc>
@@ -8924,7 +8924,7 @@
           </w:tcPr>
           <w:p>
             <w:r>
-              <w:t>#8a8fa8</w:t>
+              <w:t>#d4a017</w:t>
             </w:r>
           </w:p>
         </w:tc>
@@ -8946,7 +8946,7 @@
           </w:tcPr>
           <w:p>
             <w:r>
-              <w:t>shirt #16161c, trousers #16161c</w:t>
+              <w:t>shirt #6a1a2a, trousers #2a1a1e</w:t>
             </w:r>
           </w:p>
         </w:tc>
@@ -8968,7 +8968,7 @@
           </w:tcPr>
           <w:p>
             <w:r>
-              <w:t>skin #c89a76; hair #2a1a14 (buzz); facial hair: none; eyes #3a2a1a; hat: none; glasses: none; top: suit (#16161c / #f0f0f0); extras: earring; mid, broad build</w:t>
+              <w:t>skin #e8b894; hair #a8642a (combed); facial hair: none; eyes #3a2a1a; hat: none; glasses: none; top: suit (#6a1a2a / #f0e6e0); extras: chain, jowls, sweat; mid, broad build</w:t>
             </w:r>
           </w:p>
         </w:tc>
@@ -8990,7 +8990,2455 @@
           </w:tcPr>
           <w:p>
             <w:r>
+              <w:t>sawtooth wave, 90-150 Hz, 12 syllables a second, pauses 0.04 s</w:t>
+            </w:r>
+          </w:p>
+        </w:tc>
+      </w:tr>
+    </w:tbl>
+    <w:p>
+      <w:pPr>
+        <w:pStyle w:val="Heading1"/>
+      </w:pPr>
+      <w:r>
+        <w:t>FAY "FINGERS"  (F)</w:t>
+      </w:r>
+    </w:p>
+    <w:p>
+      <w:r>
+        <w:drawing>
+          <wp:inline xmlns:a="http://schemas.openxmlformats.org/drawingml/2006/main" xmlns:pic="http://schemas.openxmlformats.org/drawingml/2006/picture">
+            <wp:extent cx="936000" cy="1462500"/>
+            <wp:docPr id="100" name="Picture 100"/>
+            <wp:cNvGraphicFramePr>
+              <a:graphicFrameLocks noChangeAspect="1"/>
+            </wp:cNvGraphicFramePr>
+            <a:graphic>
+              <a:graphicData uri="http://schemas.openxmlformats.org/drawingml/2006/picture">
+                <pic:pic>
+                  <pic:nvPicPr>
+                    <pic:cNvPr id="0" name="fay-calm.png"/>
+                    <pic:cNvPicPr/>
+                  </pic:nvPicPr>
+                  <pic:blipFill>
+                    <a:blip r:embed="rId108"/>
+                    <a:stretch>
+                      <a:fillRect/>
+                    </a:stretch>
+                  </pic:blipFill>
+                  <pic:spPr>
+                    <a:xfrm>
+                      <a:off x="0" y="0"/>
+                      <a:ext cx="936000" cy="1462500"/>
+                    </a:xfrm>
+                    <a:prstGeom prst="rect"/>
+                  </pic:spPr>
+                </pic:pic>
+              </a:graphicData>
+            </a:graphic>
+          </wp:inline>
+        </w:drawing>
+      </w:r>
+      <w:r>
+        <w:t xml:space="preserve">  </w:t>
+      </w:r>
+      <w:r>
+        <w:drawing>
+          <wp:inline xmlns:a="http://schemas.openxmlformats.org/drawingml/2006/main" xmlns:pic="http://schemas.openxmlformats.org/drawingml/2006/picture">
+            <wp:extent cx="936000" cy="1462500"/>
+            <wp:docPr id="101" name="Picture 101"/>
+            <wp:cNvGraphicFramePr>
+              <a:graphicFrameLocks noChangeAspect="1"/>
+            </wp:cNvGraphicFramePr>
+            <a:graphic>
+              <a:graphicData uri="http://schemas.openxmlformats.org/drawingml/2006/picture">
+                <pic:pic>
+                  <pic:nvPicPr>
+                    <pic:cNvPr id="0" name="fay-angry.png"/>
+                    <pic:cNvPicPr/>
+                  </pic:nvPicPr>
+                  <pic:blipFill>
+                    <a:blip r:embed="rId109"/>
+                    <a:stretch>
+                      <a:fillRect/>
+                    </a:stretch>
+                  </pic:blipFill>
+                  <pic:spPr>
+                    <a:xfrm>
+                      <a:off x="0" y="0"/>
+                      <a:ext cx="936000" cy="1462500"/>
+                    </a:xfrm>
+                    <a:prstGeom prst="rect"/>
+                  </pic:spPr>
+                </pic:pic>
+              </a:graphicData>
+            </a:graphic>
+          </wp:inline>
+        </w:drawing>
+      </w:r>
+      <w:r>
+        <w:t xml:space="preserve">  </w:t>
+      </w:r>
+      <w:r>
+        <w:drawing>
+          <wp:inline xmlns:a="http://schemas.openxmlformats.org/drawingml/2006/main" xmlns:pic="http://schemas.openxmlformats.org/drawingml/2006/picture">
+            <wp:extent cx="936000" cy="1462500"/>
+            <wp:docPr id="102" name="Picture 102"/>
+            <wp:cNvGraphicFramePr>
+              <a:graphicFrameLocks noChangeAspect="1"/>
+            </wp:cNvGraphicFramePr>
+            <a:graphic>
+              <a:graphicData uri="http://schemas.openxmlformats.org/drawingml/2006/picture">
+                <pic:pic>
+                  <pic:nvPicPr>
+                    <pic:cNvPr id="0" name="fay-smile.png"/>
+                    <pic:cNvPicPr/>
+                  </pic:nvPicPr>
+                  <pic:blipFill>
+                    <a:blip r:embed="rId110"/>
+                    <a:stretch>
+                      <a:fillRect/>
+                    </a:stretch>
+                  </pic:blipFill>
+                  <pic:spPr>
+                    <a:xfrm>
+                      <a:off x="0" y="0"/>
+                      <a:ext cx="936000" cy="1462500"/>
+                    </a:xfrm>
+                    <a:prstGeom prst="rect"/>
+                  </pic:spPr>
+                </pic:pic>
+              </a:graphicData>
+            </a:graphic>
+          </wp:inline>
+        </w:drawing>
+      </w:r>
+      <w:r>
+        <w:t xml:space="preserve">  </w:t>
+      </w:r>
+    </w:p>
+    <w:p>
+      <w:r>
+        <w:rPr>
+          <w:sz w:val="16"/>
+        </w:rPr>
+        <w:t>calm - angry - smiling</w:t>
+      </w:r>
+    </w:p>
+    <w:tbl>
+      <w:tblPr>
+        <w:tblStyle w:val="LightGrid-Accent1"/>
+        <w:tblW w:type="auto" w:w="0"/>
+        <w:tblLook w:firstColumn="1" w:firstRow="1" w:lastColumn="0" w:lastRow="0" w:noHBand="0" w:noVBand="1" w:val="04A0"/>
+      </w:tblPr>
+      <w:tblGrid>
+        <w:gridCol w:w="4320"/>
+        <w:gridCol w:w="4320"/>
+      </w:tblGrid>
+      <w:tr>
+        <w:tc>
+          <w:tcPr>
+            <w:tcW w:type="dxa" w:w="1984"/>
+          </w:tcPr>
+          <w:p>
+            <w:r>
+              <w:t>Who</w:t>
+            </w:r>
+          </w:p>
+        </w:tc>
+        <w:tc>
+          <w:tcPr>
+            <w:tcW w:type="dxa" w:w="7370"/>
+          </w:tcPr>
+          <w:p>
+            <w:r>
+              <w:t>A safecracker with the steadiest hands in Florida; Gold's men hold her in the lunapark's funhouse. The vault's lock is hers.</w:t>
+            </w:r>
+          </w:p>
+        </w:tc>
+      </w:tr>
+      <w:tr>
+        <w:tc>
+          <w:tcPr>
+            <w:tcW w:type="dxa" w:w="1984"/>
+          </w:tcPr>
+          <w:p>
+            <w:r>
+              <w:t>Looks</w:t>
+            </w:r>
+          </w:p>
+        </w:tc>
+        <w:tc>
+          <w:tcPr>
+            <w:tcW w:type="dxa" w:w="7370"/>
+          </w:tcPr>
+          <w:p>
+            <w:r>
+              <w:t>Twenties, a dyed red undercut, a black leather jacket, a nose ring; talks fast.</w:t>
+            </w:r>
+          </w:p>
+        </w:tc>
+      </w:tr>
+      <w:tr>
+        <w:tc>
+          <w:tcPr>
+            <w:tcW w:type="dxa" w:w="1984"/>
+          </w:tcPr>
+          <w:p>
+            <w:r>
+              <w:t>Bubble colour</w:t>
+            </w:r>
+          </w:p>
+        </w:tc>
+        <w:tc>
+          <w:tcPr>
+            <w:tcW w:type="dxa" w:w="7370"/>
+          </w:tcPr>
+          <w:p>
+            <w:r>
+              <w:t>#ff3b6b</w:t>
+            </w:r>
+          </w:p>
+        </w:tc>
+      </w:tr>
+      <w:tr>
+        <w:tc>
+          <w:tcPr>
+            <w:tcW w:type="dxa" w:w="1984"/>
+          </w:tcPr>
+          <w:p>
+            <w:r>
+              <w:t>In the city</w:t>
+            </w:r>
+          </w:p>
+        </w:tc>
+        <w:tc>
+          <w:tcPr>
+            <w:tcW w:type="dxa" w:w="7370"/>
+          </w:tcPr>
+          <w:p>
+            <w:r>
+              <w:t>shirt #1a1a20, trousers #2a2a3a</w:t>
+            </w:r>
+          </w:p>
+        </w:tc>
+      </w:tr>
+      <w:tr>
+        <w:tc>
+          <w:tcPr>
+            <w:tcW w:type="dxa" w:w="1984"/>
+          </w:tcPr>
+          <w:p>
+            <w:r>
+              <w:t>Portrait recipe</w:t>
+            </w:r>
+          </w:p>
+        </w:tc>
+        <w:tc>
+          <w:tcPr>
+            <w:tcW w:type="dxa" w:w="7370"/>
+          </w:tcPr>
+          <w:p>
+            <w:r>
+              <w:t>skin #f0c8a8; hair #d0202a (pixie); facial hair: none; eyes #2a6a3a; hat: none; glasses: none; top: leather (#1a1a20 / #c8202c); extras: nosering, earring; young, slim build</w:t>
+            </w:r>
+          </w:p>
+        </w:tc>
+      </w:tr>
+      <w:tr>
+        <w:tc>
+          <w:tcPr>
+            <w:tcW w:type="dxa" w:w="1984"/>
+          </w:tcPr>
+          <w:p>
+            <w:r>
+              <w:t>Mumble</w:t>
+            </w:r>
+          </w:p>
+        </w:tc>
+        <w:tc>
+          <w:tcPr>
+            <w:tcW w:type="dxa" w:w="7370"/>
+          </w:tcPr>
+          <w:p>
+            <w:r>
+              <w:t>square wave, 280-440 Hz, 17 syllables a second, pauses 0.02 s</w:t>
+            </w:r>
+          </w:p>
+        </w:tc>
+      </w:tr>
+    </w:tbl>
+    <w:p>
+      <w:pPr>
+        <w:pStyle w:val="Heading1"/>
+      </w:pPr>
+      <w:r>
+        <w:t>CASINO GUARD  (Q)</w:t>
+      </w:r>
+    </w:p>
+    <w:p>
+      <w:r>
+        <w:drawing>
+          <wp:inline xmlns:a="http://schemas.openxmlformats.org/drawingml/2006/main" xmlns:pic="http://schemas.openxmlformats.org/drawingml/2006/picture">
+            <wp:extent cx="936000" cy="1462500"/>
+            <wp:docPr id="103" name="Picture 103"/>
+            <wp:cNvGraphicFramePr>
+              <a:graphicFrameLocks noChangeAspect="1"/>
+            </wp:cNvGraphicFramePr>
+            <a:graphic>
+              <a:graphicData uri="http://schemas.openxmlformats.org/drawingml/2006/picture">
+                <pic:pic>
+                  <pic:nvPicPr>
+                    <pic:cNvPr id="0" name="cguard-calm.png"/>
+                    <pic:cNvPicPr/>
+                  </pic:nvPicPr>
+                  <pic:blipFill>
+                    <a:blip r:embed="rId111"/>
+                    <a:stretch>
+                      <a:fillRect/>
+                    </a:stretch>
+                  </pic:blipFill>
+                  <pic:spPr>
+                    <a:xfrm>
+                      <a:off x="0" y="0"/>
+                      <a:ext cx="936000" cy="1462500"/>
+                    </a:xfrm>
+                    <a:prstGeom prst="rect"/>
+                  </pic:spPr>
+                </pic:pic>
+              </a:graphicData>
+            </a:graphic>
+          </wp:inline>
+        </w:drawing>
+      </w:r>
+      <w:r>
+        <w:t xml:space="preserve">  </w:t>
+      </w:r>
+      <w:r>
+        <w:drawing>
+          <wp:inline xmlns:a="http://schemas.openxmlformats.org/drawingml/2006/main" xmlns:pic="http://schemas.openxmlformats.org/drawingml/2006/picture">
+            <wp:extent cx="936000" cy="1462500"/>
+            <wp:docPr id="104" name="Picture 104"/>
+            <wp:cNvGraphicFramePr>
+              <a:graphicFrameLocks noChangeAspect="1"/>
+            </wp:cNvGraphicFramePr>
+            <a:graphic>
+              <a:graphicData uri="http://schemas.openxmlformats.org/drawingml/2006/picture">
+                <pic:pic>
+                  <pic:nvPicPr>
+                    <pic:cNvPr id="0" name="cguard-angry.png"/>
+                    <pic:cNvPicPr/>
+                  </pic:nvPicPr>
+                  <pic:blipFill>
+                    <a:blip r:embed="rId112"/>
+                    <a:stretch>
+                      <a:fillRect/>
+                    </a:stretch>
+                  </pic:blipFill>
+                  <pic:spPr>
+                    <a:xfrm>
+                      <a:off x="0" y="0"/>
+                      <a:ext cx="936000" cy="1462500"/>
+                    </a:xfrm>
+                    <a:prstGeom prst="rect"/>
+                  </pic:spPr>
+                </pic:pic>
+              </a:graphicData>
+            </a:graphic>
+          </wp:inline>
+        </w:drawing>
+      </w:r>
+      <w:r>
+        <w:t xml:space="preserve">  </w:t>
+      </w:r>
+      <w:r>
+        <w:drawing>
+          <wp:inline xmlns:a="http://schemas.openxmlformats.org/drawingml/2006/main" xmlns:pic="http://schemas.openxmlformats.org/drawingml/2006/picture">
+            <wp:extent cx="936000" cy="1462500"/>
+            <wp:docPr id="105" name="Picture 105"/>
+            <wp:cNvGraphicFramePr>
+              <a:graphicFrameLocks noChangeAspect="1"/>
+            </wp:cNvGraphicFramePr>
+            <a:graphic>
+              <a:graphicData uri="http://schemas.openxmlformats.org/drawingml/2006/picture">
+                <pic:pic>
+                  <pic:nvPicPr>
+                    <pic:cNvPr id="0" name="cguard-smile.png"/>
+                    <pic:cNvPicPr/>
+                  </pic:nvPicPr>
+                  <pic:blipFill>
+                    <a:blip r:embed="rId113"/>
+                    <a:stretch>
+                      <a:fillRect/>
+                    </a:stretch>
+                  </pic:blipFill>
+                  <pic:spPr>
+                    <a:xfrm>
+                      <a:off x="0" y="0"/>
+                      <a:ext cx="936000" cy="1462500"/>
+                    </a:xfrm>
+                    <a:prstGeom prst="rect"/>
+                  </pic:spPr>
+                </pic:pic>
+              </a:graphicData>
+            </a:graphic>
+          </wp:inline>
+        </w:drawing>
+      </w:r>
+      <w:r>
+        <w:t xml:space="preserve">  </w:t>
+      </w:r>
+    </w:p>
+    <w:p>
+      <w:r>
+        <w:rPr>
+          <w:sz w:val="16"/>
+        </w:rPr>
+        <w:t>calm - angry - smiling</w:t>
+      </w:r>
+    </w:p>
+    <w:tbl>
+      <w:tblPr>
+        <w:tblStyle w:val="LightGrid-Accent1"/>
+        <w:tblW w:type="auto" w:w="0"/>
+        <w:tblLook w:firstColumn="1" w:firstRow="1" w:lastColumn="0" w:lastRow="0" w:noHBand="0" w:noVBand="1" w:val="04A0"/>
+      </w:tblPr>
+      <w:tblGrid>
+        <w:gridCol w:w="4320"/>
+        <w:gridCol w:w="4320"/>
+      </w:tblGrid>
+      <w:tr>
+        <w:tc>
+          <w:tcPr>
+            <w:tcW w:type="dxa" w:w="1984"/>
+          </w:tcPr>
+          <w:p>
+            <w:r>
+              <w:t>Who</w:t>
+            </w:r>
+          </w:p>
+        </w:tc>
+        <w:tc>
+          <w:tcPr>
+            <w:tcW w:type="dxa" w:w="7370"/>
+          </w:tcPr>
+          <w:p>
+            <w:r>
+              <w:t>The Royal Flamingo's guards (one bubble for all of them).</w:t>
+            </w:r>
+          </w:p>
+        </w:tc>
+      </w:tr>
+      <w:tr>
+        <w:tc>
+          <w:tcPr>
+            <w:tcW w:type="dxa" w:w="1984"/>
+          </w:tcPr>
+          <w:p>
+            <w:r>
+              <w:t>Looks</w:t>
+            </w:r>
+          </w:p>
+        </w:tc>
+        <w:tc>
+          <w:tcPr>
+            <w:tcW w:type="dxa" w:w="7370"/>
+          </w:tcPr>
+          <w:p>
+            <w:r>
+              <w:t>Thirties, a crew cut, a black suit with a gold flamingo pin, an earpiece.</w:t>
+            </w:r>
+          </w:p>
+        </w:tc>
+      </w:tr>
+      <w:tr>
+        <w:tc>
+          <w:tcPr>
+            <w:tcW w:type="dxa" w:w="1984"/>
+          </w:tcPr>
+          <w:p>
+            <w:r>
+              <w:t>Bubble colour</w:t>
+            </w:r>
+          </w:p>
+        </w:tc>
+        <w:tc>
+          <w:tcPr>
+            <w:tcW w:type="dxa" w:w="7370"/>
+          </w:tcPr>
+          <w:p>
+            <w:r>
+              <w:t>#8a8fa8</w:t>
+            </w:r>
+          </w:p>
+        </w:tc>
+      </w:tr>
+      <w:tr>
+        <w:tc>
+          <w:tcPr>
+            <w:tcW w:type="dxa" w:w="1984"/>
+          </w:tcPr>
+          <w:p>
+            <w:r>
+              <w:t>In the city</w:t>
+            </w:r>
+          </w:p>
+        </w:tc>
+        <w:tc>
+          <w:tcPr>
+            <w:tcW w:type="dxa" w:w="7370"/>
+          </w:tcPr>
+          <w:p>
+            <w:r>
+              <w:t>shirt #16161c, trousers #16161c</w:t>
+            </w:r>
+          </w:p>
+        </w:tc>
+      </w:tr>
+      <w:tr>
+        <w:tc>
+          <w:tcPr>
+            <w:tcW w:type="dxa" w:w="1984"/>
+          </w:tcPr>
+          <w:p>
+            <w:r>
+              <w:t>Portrait recipe</w:t>
+            </w:r>
+          </w:p>
+        </w:tc>
+        <w:tc>
+          <w:tcPr>
+            <w:tcW w:type="dxa" w:w="7370"/>
+          </w:tcPr>
+          <w:p>
+            <w:r>
+              <w:t>skin #c89a76; hair #2a1a14 (buzz); facial hair: none; eyes #3a2a1a; hat: none; glasses: none; top: suit (#16161c / #f0f0f0); extras: earring; mid, broad build</w:t>
+            </w:r>
+          </w:p>
+        </w:tc>
+      </w:tr>
+      <w:tr>
+        <w:tc>
+          <w:tcPr>
+            <w:tcW w:type="dxa" w:w="1984"/>
+          </w:tcPr>
+          <w:p>
+            <w:r>
+              <w:t>Mumble</w:t>
+            </w:r>
+          </w:p>
+        </w:tc>
+        <w:tc>
+          <w:tcPr>
+            <w:tcW w:type="dxa" w:w="7370"/>
+          </w:tcPr>
+          <w:p>
+            <w:r>
               <w:t>square wave, 120-170 Hz, 10 syllables a second, pauses 0.06 s</w:t>
+            </w:r>
+          </w:p>
+        </w:tc>
+      </w:tr>
+    </w:tbl>
+    <w:p>
+      <w:pPr>
+        <w:pStyle w:val="Heading1"/>
+      </w:pPr>
+      <w:r>
+        <w:t>CRANE MAN  (Q)</w:t>
+      </w:r>
+    </w:p>
+    <w:p>
+      <w:r>
+        <w:drawing>
+          <wp:inline xmlns:a="http://schemas.openxmlformats.org/drawingml/2006/main" xmlns:pic="http://schemas.openxmlformats.org/drawingml/2006/picture">
+            <wp:extent cx="936000" cy="1462500"/>
+            <wp:docPr id="106" name="Picture 106"/>
+            <wp:cNvGraphicFramePr>
+              <a:graphicFrameLocks noChangeAspect="1"/>
+            </wp:cNvGraphicFramePr>
+            <a:graphic>
+              <a:graphicData uri="http://schemas.openxmlformats.org/drawingml/2006/picture">
+                <pic:pic>
+                  <pic:nvPicPr>
+                    <pic:cNvPr id="0" name="craneman-calm.png"/>
+                    <pic:cNvPicPr/>
+                  </pic:nvPicPr>
+                  <pic:blipFill>
+                    <a:blip r:embed="rId114"/>
+                    <a:stretch>
+                      <a:fillRect/>
+                    </a:stretch>
+                  </pic:blipFill>
+                  <pic:spPr>
+                    <a:xfrm>
+                      <a:off x="0" y="0"/>
+                      <a:ext cx="936000" cy="1462500"/>
+                    </a:xfrm>
+                    <a:prstGeom prst="rect"/>
+                  </pic:spPr>
+                </pic:pic>
+              </a:graphicData>
+            </a:graphic>
+          </wp:inline>
+        </w:drawing>
+      </w:r>
+      <w:r>
+        <w:t xml:space="preserve">  </w:t>
+      </w:r>
+      <w:r>
+        <w:drawing>
+          <wp:inline xmlns:a="http://schemas.openxmlformats.org/drawingml/2006/main" xmlns:pic="http://schemas.openxmlformats.org/drawingml/2006/picture">
+            <wp:extent cx="936000" cy="1462500"/>
+            <wp:docPr id="107" name="Picture 107"/>
+            <wp:cNvGraphicFramePr>
+              <a:graphicFrameLocks noChangeAspect="1"/>
+            </wp:cNvGraphicFramePr>
+            <a:graphic>
+              <a:graphicData uri="http://schemas.openxmlformats.org/drawingml/2006/picture">
+                <pic:pic>
+                  <pic:nvPicPr>
+                    <pic:cNvPr id="0" name="craneman-angry.png"/>
+                    <pic:cNvPicPr/>
+                  </pic:nvPicPr>
+                  <pic:blipFill>
+                    <a:blip r:embed="rId115"/>
+                    <a:stretch>
+                      <a:fillRect/>
+                    </a:stretch>
+                  </pic:blipFill>
+                  <pic:spPr>
+                    <a:xfrm>
+                      <a:off x="0" y="0"/>
+                      <a:ext cx="936000" cy="1462500"/>
+                    </a:xfrm>
+                    <a:prstGeom prst="rect"/>
+                  </pic:spPr>
+                </pic:pic>
+              </a:graphicData>
+            </a:graphic>
+          </wp:inline>
+        </w:drawing>
+      </w:r>
+      <w:r>
+        <w:t xml:space="preserve">  </w:t>
+      </w:r>
+      <w:r>
+        <w:drawing>
+          <wp:inline xmlns:a="http://schemas.openxmlformats.org/drawingml/2006/main" xmlns:pic="http://schemas.openxmlformats.org/drawingml/2006/picture">
+            <wp:extent cx="936000" cy="1462500"/>
+            <wp:docPr id="108" name="Picture 108"/>
+            <wp:cNvGraphicFramePr>
+              <a:graphicFrameLocks noChangeAspect="1"/>
+            </wp:cNvGraphicFramePr>
+            <a:graphic>
+              <a:graphicData uri="http://schemas.openxmlformats.org/drawingml/2006/picture">
+                <pic:pic>
+                  <pic:nvPicPr>
+                    <pic:cNvPr id="0" name="craneman-smile.png"/>
+                    <pic:cNvPicPr/>
+                  </pic:nvPicPr>
+                  <pic:blipFill>
+                    <a:blip r:embed="rId116"/>
+                    <a:stretch>
+                      <a:fillRect/>
+                    </a:stretch>
+                  </pic:blipFill>
+                  <pic:spPr>
+                    <a:xfrm>
+                      <a:off x="0" y="0"/>
+                      <a:ext cx="936000" cy="1462500"/>
+                    </a:xfrm>
+                    <a:prstGeom prst="rect"/>
+                  </pic:spPr>
+                </pic:pic>
+              </a:graphicData>
+            </a:graphic>
+          </wp:inline>
+        </w:drawing>
+      </w:r>
+      <w:r>
+        <w:t xml:space="preserve">  </w:t>
+      </w:r>
+    </w:p>
+    <w:p>
+      <w:r>
+        <w:rPr>
+          <w:sz w:val="16"/>
+        </w:rPr>
+        <w:t>calm - angry - smiling</w:t>
+      </w:r>
+    </w:p>
+    <w:tbl>
+      <w:tblPr>
+        <w:tblStyle w:val="LightGrid-Accent1"/>
+        <w:tblW w:type="auto" w:w="0"/>
+        <w:tblLook w:firstColumn="1" w:firstRow="1" w:lastColumn="0" w:lastRow="0" w:noHBand="0" w:noVBand="1" w:val="04A0"/>
+      </w:tblPr>
+      <w:tblGrid>
+        <w:gridCol w:w="4320"/>
+        <w:gridCol w:w="4320"/>
+      </w:tblGrid>
+      <w:tr>
+        <w:tc>
+          <w:tcPr>
+            <w:tcW w:type="dxa" w:w="1984"/>
+          </w:tcPr>
+          <w:p>
+            <w:r>
+              <w:t>Who</w:t>
+            </w:r>
+          </w:p>
+        </w:tc>
+        <w:tc>
+          <w:tcPr>
+            <w:tcW w:type="dxa" w:w="7370"/>
+          </w:tcPr>
+          <w:p>
+            <w:r>
+              <w:t>Victor Crane's men - his drivers, bodyguards and fixers (one bubble for all of them).</w:t>
+            </w:r>
+          </w:p>
+        </w:tc>
+      </w:tr>
+      <w:tr>
+        <w:tc>
+          <w:tcPr>
+            <w:tcW w:type="dxa" w:w="1984"/>
+          </w:tcPr>
+          <w:p>
+            <w:r>
+              <w:t>Looks</w:t>
+            </w:r>
+          </w:p>
+        </w:tc>
+        <w:tc>
+          <w:tcPr>
+            <w:tcW w:type="dxa" w:w="7370"/>
+          </w:tcPr>
+          <w:p>
+            <w:r>
+              <w:t>Thirties to forties, slicked-back hair, dark sunglasses, a charcoal suit, a white shirt, no tie.</w:t>
+            </w:r>
+          </w:p>
+        </w:tc>
+      </w:tr>
+      <w:tr>
+        <w:tc>
+          <w:tcPr>
+            <w:tcW w:type="dxa" w:w="1984"/>
+          </w:tcPr>
+          <w:p>
+            <w:r>
+              <w:t>Bubble colour</w:t>
+            </w:r>
+          </w:p>
+        </w:tc>
+        <w:tc>
+          <w:tcPr>
+            <w:tcW w:type="dxa" w:w="7370"/>
+          </w:tcPr>
+          <w:p>
+            <w:r>
+              <w:t>#c8ccd4</w:t>
+            </w:r>
+          </w:p>
+        </w:tc>
+      </w:tr>
+      <w:tr>
+        <w:tc>
+          <w:tcPr>
+            <w:tcW w:type="dxa" w:w="1984"/>
+          </w:tcPr>
+          <w:p>
+            <w:r>
+              <w:t>In the city</w:t>
+            </w:r>
+          </w:p>
+        </w:tc>
+        <w:tc>
+          <w:tcPr>
+            <w:tcW w:type="dxa" w:w="7370"/>
+          </w:tcPr>
+          <w:p>
+            <w:r>
+              <w:t>shirt #3a3f4c, trousers #2a2d36</w:t>
+            </w:r>
+          </w:p>
+        </w:tc>
+      </w:tr>
+      <w:tr>
+        <w:tc>
+          <w:tcPr>
+            <w:tcW w:type="dxa" w:w="1984"/>
+          </w:tcPr>
+          <w:p>
+            <w:r>
+              <w:t>Portrait recipe</w:t>
+            </w:r>
+          </w:p>
+        </w:tc>
+        <w:tc>
+          <w:tcPr>
+            <w:tcW w:type="dxa" w:w="7370"/>
+          </w:tcPr>
+          <w:p>
+            <w:r>
+              <w:t>skin #d9b08c; hair #1a1410 (slick); facial hair: none; eyes #2a2a2a; hat: none; glasses: shades; top: suit (#3a3f4c / #f4f4f4); extras: none; mid, broad build</w:t>
+            </w:r>
+          </w:p>
+        </w:tc>
+      </w:tr>
+      <w:tr>
+        <w:tc>
+          <w:tcPr>
+            <w:tcW w:type="dxa" w:w="1984"/>
+          </w:tcPr>
+          <w:p>
+            <w:r>
+              <w:t>Mumble</w:t>
+            </w:r>
+          </w:p>
+        </w:tc>
+        <w:tc>
+          <w:tcPr>
+            <w:tcW w:type="dxa" w:w="7370"/>
+          </w:tcPr>
+          <w:p>
+            <w:r>
+              <w:t>triangle wave, 110-160 Hz, 10 syllables a second, pauses 0.07 s</w:t>
+            </w:r>
+          </w:p>
+        </w:tc>
+      </w:tr>
+    </w:tbl>
+    <w:p>
+      <w:pPr>
+        <w:pStyle w:val="Heading1"/>
+      </w:pPr>
+      <w:r>
+        <w:t>"SHARKEY" VINCE LOMAX  (L)</w:t>
+      </w:r>
+    </w:p>
+    <w:p>
+      <w:r>
+        <w:drawing>
+          <wp:inline xmlns:a="http://schemas.openxmlformats.org/drawingml/2006/main" xmlns:pic="http://schemas.openxmlformats.org/drawingml/2006/picture">
+            <wp:extent cx="936000" cy="1462500"/>
+            <wp:docPr id="109" name="Picture 109"/>
+            <wp:cNvGraphicFramePr>
+              <a:graphicFrameLocks noChangeAspect="1"/>
+            </wp:cNvGraphicFramePr>
+            <a:graphic>
+              <a:graphicData uri="http://schemas.openxmlformats.org/drawingml/2006/picture">
+                <pic:pic>
+                  <pic:nvPicPr>
+                    <pic:cNvPr id="0" name="sharkey-calm.png"/>
+                    <pic:cNvPicPr/>
+                  </pic:nvPicPr>
+                  <pic:blipFill>
+                    <a:blip r:embed="rId117"/>
+                    <a:stretch>
+                      <a:fillRect/>
+                    </a:stretch>
+                  </pic:blipFill>
+                  <pic:spPr>
+                    <a:xfrm>
+                      <a:off x="0" y="0"/>
+                      <a:ext cx="936000" cy="1462500"/>
+                    </a:xfrm>
+                    <a:prstGeom prst="rect"/>
+                  </pic:spPr>
+                </pic:pic>
+              </a:graphicData>
+            </a:graphic>
+          </wp:inline>
+        </w:drawing>
+      </w:r>
+      <w:r>
+        <w:t xml:space="preserve">  </w:t>
+      </w:r>
+      <w:r>
+        <w:drawing>
+          <wp:inline xmlns:a="http://schemas.openxmlformats.org/drawingml/2006/main" xmlns:pic="http://schemas.openxmlformats.org/drawingml/2006/picture">
+            <wp:extent cx="936000" cy="1462500"/>
+            <wp:docPr id="110" name="Picture 110"/>
+            <wp:cNvGraphicFramePr>
+              <a:graphicFrameLocks noChangeAspect="1"/>
+            </wp:cNvGraphicFramePr>
+            <a:graphic>
+              <a:graphicData uri="http://schemas.openxmlformats.org/drawingml/2006/picture">
+                <pic:pic>
+                  <pic:nvPicPr>
+                    <pic:cNvPr id="0" name="sharkey-angry.png"/>
+                    <pic:cNvPicPr/>
+                  </pic:nvPicPr>
+                  <pic:blipFill>
+                    <a:blip r:embed="rId118"/>
+                    <a:stretch>
+                      <a:fillRect/>
+                    </a:stretch>
+                  </pic:blipFill>
+                  <pic:spPr>
+                    <a:xfrm>
+                      <a:off x="0" y="0"/>
+                      <a:ext cx="936000" cy="1462500"/>
+                    </a:xfrm>
+                    <a:prstGeom prst="rect"/>
+                  </pic:spPr>
+                </pic:pic>
+              </a:graphicData>
+            </a:graphic>
+          </wp:inline>
+        </w:drawing>
+      </w:r>
+      <w:r>
+        <w:t xml:space="preserve">  </w:t>
+      </w:r>
+      <w:r>
+        <w:drawing>
+          <wp:inline xmlns:a="http://schemas.openxmlformats.org/drawingml/2006/main" xmlns:pic="http://schemas.openxmlformats.org/drawingml/2006/picture">
+            <wp:extent cx="936000" cy="1462500"/>
+            <wp:docPr id="111" name="Picture 111"/>
+            <wp:cNvGraphicFramePr>
+              <a:graphicFrameLocks noChangeAspect="1"/>
+            </wp:cNvGraphicFramePr>
+            <a:graphic>
+              <a:graphicData uri="http://schemas.openxmlformats.org/drawingml/2006/picture">
+                <pic:pic>
+                  <pic:nvPicPr>
+                    <pic:cNvPr id="0" name="sharkey-smile.png"/>
+                    <pic:cNvPicPr/>
+                  </pic:nvPicPr>
+                  <pic:blipFill>
+                    <a:blip r:embed="rId119"/>
+                    <a:stretch>
+                      <a:fillRect/>
+                    </a:stretch>
+                  </pic:blipFill>
+                  <pic:spPr>
+                    <a:xfrm>
+                      <a:off x="0" y="0"/>
+                      <a:ext cx="936000" cy="1462500"/>
+                    </a:xfrm>
+                    <a:prstGeom prst="rect"/>
+                  </pic:spPr>
+                </pic:pic>
+              </a:graphicData>
+            </a:graphic>
+          </wp:inline>
+        </w:drawing>
+      </w:r>
+      <w:r>
+        <w:t xml:space="preserve">  </w:t>
+      </w:r>
+    </w:p>
+    <w:p>
+      <w:r>
+        <w:rPr>
+          <w:sz w:val="16"/>
+        </w:rPr>
+        <w:t>calm - angry - smiling</w:t>
+      </w:r>
+    </w:p>
+    <w:tbl>
+      <w:tblPr>
+        <w:tblStyle w:val="LightGrid-Accent1"/>
+        <w:tblW w:type="auto" w:w="0"/>
+        <w:tblLook w:firstColumn="1" w:firstRow="1" w:lastColumn="0" w:lastRow="0" w:noHBand="0" w:noVBand="1" w:val="04A0"/>
+      </w:tblPr>
+      <w:tblGrid>
+        <w:gridCol w:w="4320"/>
+        <w:gridCol w:w="4320"/>
+      </w:tblGrid>
+      <w:tr>
+        <w:tc>
+          <w:tcPr>
+            <w:tcW w:type="dxa" w:w="1984"/>
+          </w:tcPr>
+          <w:p>
+            <w:r>
+              <w:t>Who</w:t>
+            </w:r>
+          </w:p>
+        </w:tc>
+        <w:tc>
+          <w:tcPr>
+            <w:tcW w:type="dxa" w:w="7370"/>
+          </w:tcPr>
+          <w:p>
+            <w:r>
+              <w:t>The loan shark: a pawn-and-loan in Mercado, two heavies at the door; Officer Dunn owes him (P2).</w:t>
+            </w:r>
+          </w:p>
+        </w:tc>
+      </w:tr>
+      <w:tr>
+        <w:tc>
+          <w:tcPr>
+            <w:tcW w:type="dxa" w:w="1984"/>
+          </w:tcPr>
+          <w:p>
+            <w:r>
+              <w:t>Looks</w:t>
+            </w:r>
+          </w:p>
+        </w:tc>
+        <w:tc>
+          <w:tcPr>
+            <w:tcW w:type="dxa" w:w="7370"/>
+          </w:tcPr>
+          <w:p>
+            <w:r>
+              <w:t>Fifties, slicked-back hair, a pinstripe suit, a cigar, a gold tooth.</w:t>
+            </w:r>
+          </w:p>
+        </w:tc>
+      </w:tr>
+      <w:tr>
+        <w:tc>
+          <w:tcPr>
+            <w:tcW w:type="dxa" w:w="1984"/>
+          </w:tcPr>
+          <w:p>
+            <w:r>
+              <w:t>Bubble colour</w:t>
+            </w:r>
+          </w:p>
+        </w:tc>
+        <w:tc>
+          <w:tcPr>
+            <w:tcW w:type="dxa" w:w="7370"/>
+          </w:tcPr>
+          <w:p>
+            <w:r>
+              <w:t>#4ab8c8</w:t>
+            </w:r>
+          </w:p>
+        </w:tc>
+      </w:tr>
+      <w:tr>
+        <w:tc>
+          <w:tcPr>
+            <w:tcW w:type="dxa" w:w="1984"/>
+          </w:tcPr>
+          <w:p>
+            <w:r>
+              <w:t>In the city</w:t>
+            </w:r>
+          </w:p>
+        </w:tc>
+        <w:tc>
+          <w:tcPr>
+            <w:tcW w:type="dxa" w:w="7370"/>
+          </w:tcPr>
+          <w:p>
+            <w:r>
+              <w:t>shirt #2a2d3a, trousers #2a2d3a</w:t>
+            </w:r>
+          </w:p>
+        </w:tc>
+      </w:tr>
+      <w:tr>
+        <w:tc>
+          <w:tcPr>
+            <w:tcW w:type="dxa" w:w="1984"/>
+          </w:tcPr>
+          <w:p>
+            <w:r>
+              <w:t>Portrait recipe</w:t>
+            </w:r>
+          </w:p>
+        </w:tc>
+        <w:tc>
+          <w:tcPr>
+            <w:tcW w:type="dxa" w:w="7370"/>
+          </w:tcPr>
+          <w:p>
+            <w:r>
+              <w:t>skin #d9a87c; hair #2a2420 (slick); facial hair: none; eyes #2a2018; hat: none; glasses: none; top: suit (#2a2d3a / #e8e0d0); extras: cigar, goldtooth, temples; old, broad build</w:t>
+            </w:r>
+          </w:p>
+        </w:tc>
+      </w:tr>
+      <w:tr>
+        <w:tc>
+          <w:tcPr>
+            <w:tcW w:type="dxa" w:w="1984"/>
+          </w:tcPr>
+          <w:p>
+            <w:r>
+              <w:t>Mumble</w:t>
+            </w:r>
+          </w:p>
+        </w:tc>
+        <w:tc>
+          <w:tcPr>
+            <w:tcW w:type="dxa" w:w="7370"/>
+          </w:tcPr>
+          <w:p>
+            <w:r>
+              <w:t>sawtooth wave, 100-150 Hz, 11 syllables a second, pauses 0.06 s</w:t>
+            </w:r>
+          </w:p>
+        </w:tc>
+      </w:tr>
+    </w:tbl>
+    <w:p>
+      <w:pPr>
+        <w:pStyle w:val="Heading1"/>
+      </w:pPr>
+      <w:r>
+        <w:t>OTTO  (T)</w:t>
+      </w:r>
+    </w:p>
+    <w:p>
+      <w:r>
+        <w:drawing>
+          <wp:inline xmlns:a="http://schemas.openxmlformats.org/drawingml/2006/main" xmlns:pic="http://schemas.openxmlformats.org/drawingml/2006/picture">
+            <wp:extent cx="936000" cy="1462500"/>
+            <wp:docPr id="112" name="Picture 112"/>
+            <wp:cNvGraphicFramePr>
+              <a:graphicFrameLocks noChangeAspect="1"/>
+            </wp:cNvGraphicFramePr>
+            <a:graphic>
+              <a:graphicData uri="http://schemas.openxmlformats.org/drawingml/2006/picture">
+                <pic:pic>
+                  <pic:nvPicPr>
+                    <pic:cNvPr id="0" name="otto-calm.png"/>
+                    <pic:cNvPicPr/>
+                  </pic:nvPicPr>
+                  <pic:blipFill>
+                    <a:blip r:embed="rId120"/>
+                    <a:stretch>
+                      <a:fillRect/>
+                    </a:stretch>
+                  </pic:blipFill>
+                  <pic:spPr>
+                    <a:xfrm>
+                      <a:off x="0" y="0"/>
+                      <a:ext cx="936000" cy="1462500"/>
+                    </a:xfrm>
+                    <a:prstGeom prst="rect"/>
+                  </pic:spPr>
+                </pic:pic>
+              </a:graphicData>
+            </a:graphic>
+          </wp:inline>
+        </w:drawing>
+      </w:r>
+      <w:r>
+        <w:t xml:space="preserve">  </w:t>
+      </w:r>
+      <w:r>
+        <w:drawing>
+          <wp:inline xmlns:a="http://schemas.openxmlformats.org/drawingml/2006/main" xmlns:pic="http://schemas.openxmlformats.org/drawingml/2006/picture">
+            <wp:extent cx="936000" cy="1462500"/>
+            <wp:docPr id="113" name="Picture 113"/>
+            <wp:cNvGraphicFramePr>
+              <a:graphicFrameLocks noChangeAspect="1"/>
+            </wp:cNvGraphicFramePr>
+            <a:graphic>
+              <a:graphicData uri="http://schemas.openxmlformats.org/drawingml/2006/picture">
+                <pic:pic>
+                  <pic:nvPicPr>
+                    <pic:cNvPr id="0" name="otto-angry.png"/>
+                    <pic:cNvPicPr/>
+                  </pic:nvPicPr>
+                  <pic:blipFill>
+                    <a:blip r:embed="rId121"/>
+                    <a:stretch>
+                      <a:fillRect/>
+                    </a:stretch>
+                  </pic:blipFill>
+                  <pic:spPr>
+                    <a:xfrm>
+                      <a:off x="0" y="0"/>
+                      <a:ext cx="936000" cy="1462500"/>
+                    </a:xfrm>
+                    <a:prstGeom prst="rect"/>
+                  </pic:spPr>
+                </pic:pic>
+              </a:graphicData>
+            </a:graphic>
+          </wp:inline>
+        </w:drawing>
+      </w:r>
+      <w:r>
+        <w:t xml:space="preserve">  </w:t>
+      </w:r>
+      <w:r>
+        <w:drawing>
+          <wp:inline xmlns:a="http://schemas.openxmlformats.org/drawingml/2006/main" xmlns:pic="http://schemas.openxmlformats.org/drawingml/2006/picture">
+            <wp:extent cx="936000" cy="1462500"/>
+            <wp:docPr id="114" name="Picture 114"/>
+            <wp:cNvGraphicFramePr>
+              <a:graphicFrameLocks noChangeAspect="1"/>
+            </wp:cNvGraphicFramePr>
+            <a:graphic>
+              <a:graphicData uri="http://schemas.openxmlformats.org/drawingml/2006/picture">
+                <pic:pic>
+                  <pic:nvPicPr>
+                    <pic:cNvPr id="0" name="otto-smile.png"/>
+                    <pic:cNvPicPr/>
+                  </pic:nvPicPr>
+                  <pic:blipFill>
+                    <a:blip r:embed="rId122"/>
+                    <a:stretch>
+                      <a:fillRect/>
+                    </a:stretch>
+                  </pic:blipFill>
+                  <pic:spPr>
+                    <a:xfrm>
+                      <a:off x="0" y="0"/>
+                      <a:ext cx="936000" cy="1462500"/>
+                    </a:xfrm>
+                    <a:prstGeom prst="rect"/>
+                  </pic:spPr>
+                </pic:pic>
+              </a:graphicData>
+            </a:graphic>
+          </wp:inline>
+        </w:drawing>
+      </w:r>
+      <w:r>
+        <w:t xml:space="preserve">  </w:t>
+      </w:r>
+    </w:p>
+    <w:p>
+      <w:r>
+        <w:rPr>
+          <w:sz w:val="16"/>
+        </w:rPr>
+        <w:t>calm - angry - smiling</w:t>
+      </w:r>
+    </w:p>
+    <w:tbl>
+      <w:tblPr>
+        <w:tblStyle w:val="LightGrid-Accent1"/>
+        <w:tblW w:type="auto" w:w="0"/>
+        <w:tblLook w:firstColumn="1" w:firstRow="1" w:lastColumn="0" w:lastRow="0" w:noHBand="0" w:noVBand="1" w:val="04A0"/>
+      </w:tblPr>
+      <w:tblGrid>
+        <w:gridCol w:w="4320"/>
+        <w:gridCol w:w="4320"/>
+      </w:tblGrid>
+      <w:tr>
+        <w:tc>
+          <w:tcPr>
+            <w:tcW w:type="dxa" w:w="1984"/>
+          </w:tcPr>
+          <w:p>
+            <w:r>
+              <w:t>Who</w:t>
+            </w:r>
+          </w:p>
+        </w:tc>
+        <w:tc>
+          <w:tcPr>
+            <w:tcW w:type="dxa" w:w="7370"/>
+          </w:tcPr>
+          <w:p>
+            <w:r>
+              <w:t>The old printer of OTTO'S PRINTING in Mercado - and a forger, for friends (P3).</w:t>
+            </w:r>
+          </w:p>
+        </w:tc>
+      </w:tr>
+      <w:tr>
+        <w:tc>
+          <w:tcPr>
+            <w:tcW w:type="dxa" w:w="1984"/>
+          </w:tcPr>
+          <w:p>
+            <w:r>
+              <w:t>Looks</w:t>
+            </w:r>
+          </w:p>
+        </w:tc>
+        <w:tc>
+          <w:tcPr>
+            <w:tcW w:type="dxa" w:w="7370"/>
+          </w:tcPr>
+          <w:p>
+            <w:r>
+              <w:t>Seventies, thick glasses, an ink-stained apron over a cardigan.</w:t>
+            </w:r>
+          </w:p>
+        </w:tc>
+      </w:tr>
+      <w:tr>
+        <w:tc>
+          <w:tcPr>
+            <w:tcW w:type="dxa" w:w="1984"/>
+          </w:tcPr>
+          <w:p>
+            <w:r>
+              <w:t>Bubble colour</w:t>
+            </w:r>
+          </w:p>
+        </w:tc>
+        <w:tc>
+          <w:tcPr>
+            <w:tcW w:type="dxa" w:w="7370"/>
+          </w:tcPr>
+          <w:p>
+            <w:r>
+              <w:t>#b89a6a</w:t>
+            </w:r>
+          </w:p>
+        </w:tc>
+      </w:tr>
+      <w:tr>
+        <w:tc>
+          <w:tcPr>
+            <w:tcW w:type="dxa" w:w="1984"/>
+          </w:tcPr>
+          <w:p>
+            <w:r>
+              <w:t>In the city</w:t>
+            </w:r>
+          </w:p>
+        </w:tc>
+        <w:tc>
+          <w:tcPr>
+            <w:tcW w:type="dxa" w:w="7370"/>
+          </w:tcPr>
+          <w:p>
+            <w:r>
+              <w:t>shirt #7a6a50, trousers #3a3430</w:t>
+            </w:r>
+          </w:p>
+        </w:tc>
+      </w:tr>
+      <w:tr>
+        <w:tc>
+          <w:tcPr>
+            <w:tcW w:type="dxa" w:w="1984"/>
+          </w:tcPr>
+          <w:p>
+            <w:r>
+              <w:t>Portrait recipe</w:t>
+            </w:r>
+          </w:p>
+        </w:tc>
+        <w:tc>
+          <w:tcPr>
+            <w:tcW w:type="dxa" w:w="7370"/>
+          </w:tcPr>
+          <w:p>
+            <w:r>
+              <w:t>skin #ecc8a8; hair #d8d8d8 (sides); facial hair: none; eyes #4a4a5a; hat: none; glasses: square; top: cardigan (#7a6a50 / #3a3a4a); extras: wrinkles, pencil; old, slim build</w:t>
+            </w:r>
+          </w:p>
+        </w:tc>
+      </w:tr>
+      <w:tr>
+        <w:tc>
+          <w:tcPr>
+            <w:tcW w:type="dxa" w:w="1984"/>
+          </w:tcPr>
+          <w:p>
+            <w:r>
+              <w:t>Mumble</w:t>
+            </w:r>
+          </w:p>
+        </w:tc>
+        <w:tc>
+          <w:tcPr>
+            <w:tcW w:type="dxa" w:w="7370"/>
+          </w:tcPr>
+          <w:p>
+            <w:r>
+              <w:t>triangle wave, 120-170 Hz, 8 syllables a second, pauses 0.14 s</w:t>
+            </w:r>
+          </w:p>
+        </w:tc>
+      </w:tr>
+    </w:tbl>
+    <w:p>
+      <w:pPr>
+        <w:pStyle w:val="Heading1"/>
+      </w:pPr>
+      <w:r>
+        <w:t>SAMMY STICKS  (S)</w:t>
+      </w:r>
+    </w:p>
+    <w:p>
+      <w:r>
+        <w:drawing>
+          <wp:inline xmlns:a="http://schemas.openxmlformats.org/drawingml/2006/main" xmlns:pic="http://schemas.openxmlformats.org/drawingml/2006/picture">
+            <wp:extent cx="936000" cy="1462500"/>
+            <wp:docPr id="115" name="Picture 115"/>
+            <wp:cNvGraphicFramePr>
+              <a:graphicFrameLocks noChangeAspect="1"/>
+            </wp:cNvGraphicFramePr>
+            <a:graphic>
+              <a:graphicData uri="http://schemas.openxmlformats.org/drawingml/2006/picture">
+                <pic:pic>
+                  <pic:nvPicPr>
+                    <pic:cNvPr id="0" name="sticks-calm.png"/>
+                    <pic:cNvPicPr/>
+                  </pic:nvPicPr>
+                  <pic:blipFill>
+                    <a:blip r:embed="rId123"/>
+                    <a:stretch>
+                      <a:fillRect/>
+                    </a:stretch>
+                  </pic:blipFill>
+                  <pic:spPr>
+                    <a:xfrm>
+                      <a:off x="0" y="0"/>
+                      <a:ext cx="936000" cy="1462500"/>
+                    </a:xfrm>
+                    <a:prstGeom prst="rect"/>
+                  </pic:spPr>
+                </pic:pic>
+              </a:graphicData>
+            </a:graphic>
+          </wp:inline>
+        </w:drawing>
+      </w:r>
+      <w:r>
+        <w:t xml:space="preserve">  </w:t>
+      </w:r>
+      <w:r>
+        <w:drawing>
+          <wp:inline xmlns:a="http://schemas.openxmlformats.org/drawingml/2006/main" xmlns:pic="http://schemas.openxmlformats.org/drawingml/2006/picture">
+            <wp:extent cx="936000" cy="1462500"/>
+            <wp:docPr id="116" name="Picture 116"/>
+            <wp:cNvGraphicFramePr>
+              <a:graphicFrameLocks noChangeAspect="1"/>
+            </wp:cNvGraphicFramePr>
+            <a:graphic>
+              <a:graphicData uri="http://schemas.openxmlformats.org/drawingml/2006/picture">
+                <pic:pic>
+                  <pic:nvPicPr>
+                    <pic:cNvPr id="0" name="sticks-angry.png"/>
+                    <pic:cNvPicPr/>
+                  </pic:nvPicPr>
+                  <pic:blipFill>
+                    <a:blip r:embed="rId124"/>
+                    <a:stretch>
+                      <a:fillRect/>
+                    </a:stretch>
+                  </pic:blipFill>
+                  <pic:spPr>
+                    <a:xfrm>
+                      <a:off x="0" y="0"/>
+                      <a:ext cx="936000" cy="1462500"/>
+                    </a:xfrm>
+                    <a:prstGeom prst="rect"/>
+                  </pic:spPr>
+                </pic:pic>
+              </a:graphicData>
+            </a:graphic>
+          </wp:inline>
+        </w:drawing>
+      </w:r>
+      <w:r>
+        <w:t xml:space="preserve">  </w:t>
+      </w:r>
+      <w:r>
+        <w:drawing>
+          <wp:inline xmlns:a="http://schemas.openxmlformats.org/drawingml/2006/main" xmlns:pic="http://schemas.openxmlformats.org/drawingml/2006/picture">
+            <wp:extent cx="936000" cy="1462500"/>
+            <wp:docPr id="117" name="Picture 117"/>
+            <wp:cNvGraphicFramePr>
+              <a:graphicFrameLocks noChangeAspect="1"/>
+            </wp:cNvGraphicFramePr>
+            <a:graphic>
+              <a:graphicData uri="http://schemas.openxmlformats.org/drawingml/2006/picture">
+                <pic:pic>
+                  <pic:nvPicPr>
+                    <pic:cNvPr id="0" name="sticks-smile.png"/>
+                    <pic:cNvPicPr/>
+                  </pic:nvPicPr>
+                  <pic:blipFill>
+                    <a:blip r:embed="rId125"/>
+                    <a:stretch>
+                      <a:fillRect/>
+                    </a:stretch>
+                  </pic:blipFill>
+                  <pic:spPr>
+                    <a:xfrm>
+                      <a:off x="0" y="0"/>
+                      <a:ext cx="936000" cy="1462500"/>
+                    </a:xfrm>
+                    <a:prstGeom prst="rect"/>
+                  </pic:spPr>
+                </pic:pic>
+              </a:graphicData>
+            </a:graphic>
+          </wp:inline>
+        </w:drawing>
+      </w:r>
+      <w:r>
+        <w:t xml:space="preserve">  </w:t>
+      </w:r>
+    </w:p>
+    <w:p>
+      <w:r>
+        <w:rPr>
+          <w:sz w:val="16"/>
+        </w:rPr>
+        <w:t>calm - angry - smiling</w:t>
+      </w:r>
+    </w:p>
+    <w:tbl>
+      <w:tblPr>
+        <w:tblStyle w:val="LightGrid-Accent1"/>
+        <w:tblW w:type="auto" w:w="0"/>
+        <w:tblLook w:firstColumn="1" w:firstRow="1" w:lastColumn="0" w:lastRow="0" w:noHBand="0" w:noVBand="1" w:val="04A0"/>
+      </w:tblPr>
+      <w:tblGrid>
+        <w:gridCol w:w="4320"/>
+        <w:gridCol w:w="4320"/>
+      </w:tblGrid>
+      <w:tr>
+        <w:tc>
+          <w:tcPr>
+            <w:tcW w:type="dxa" w:w="1984"/>
+          </w:tcPr>
+          <w:p>
+            <w:r>
+              <w:t>Who</w:t>
+            </w:r>
+          </w:p>
+        </w:tc>
+        <w:tc>
+          <w:tcPr>
+            <w:tcW w:type="dxa" w:w="7370"/>
+          </w:tcPr>
+          <w:p>
+            <w:r>
+              <w:t>The Colony band's drummer: fast hands, faster mouth, always owes somebody; lost a race bet to Vinnie Rapp (H4).</w:t>
+            </w:r>
+          </w:p>
+        </w:tc>
+      </w:tr>
+      <w:tr>
+        <w:tc>
+          <w:tcPr>
+            <w:tcW w:type="dxa" w:w="1984"/>
+          </w:tcPr>
+          <w:p>
+            <w:r>
+              <w:t>Looks</w:t>
+            </w:r>
+          </w:p>
+        </w:tc>
+        <w:tc>
+          <w:tcPr>
+            <w:tcW w:type="dxa" w:w="7370"/>
+          </w:tcPr>
+          <w:p>
+            <w:r>
+              <w:t>Twenties, a blond mullet, a sleeveless white tee, a sweatband on each wrist, a drumstick behind the ear.</w:t>
+            </w:r>
+          </w:p>
+        </w:tc>
+      </w:tr>
+      <w:tr>
+        <w:tc>
+          <w:tcPr>
+            <w:tcW w:type="dxa" w:w="1984"/>
+          </w:tcPr>
+          <w:p>
+            <w:r>
+              <w:t>Bubble colour</w:t>
+            </w:r>
+          </w:p>
+        </w:tc>
+        <w:tc>
+          <w:tcPr>
+            <w:tcW w:type="dxa" w:w="7370"/>
+          </w:tcPr>
+          <w:p>
+            <w:r>
+              <w:t>#ff6ad5</w:t>
+            </w:r>
+          </w:p>
+        </w:tc>
+      </w:tr>
+      <w:tr>
+        <w:tc>
+          <w:tcPr>
+            <w:tcW w:type="dxa" w:w="1984"/>
+          </w:tcPr>
+          <w:p>
+            <w:r>
+              <w:t>In the city</w:t>
+            </w:r>
+          </w:p>
+        </w:tc>
+        <w:tc>
+          <w:tcPr>
+            <w:tcW w:type="dxa" w:w="7370"/>
+          </w:tcPr>
+          <w:p>
+            <w:r>
+              <w:t>shirt #f2f2ee, trousers #2a3a6a</w:t>
+            </w:r>
+          </w:p>
+        </w:tc>
+      </w:tr>
+      <w:tr>
+        <w:tc>
+          <w:tcPr>
+            <w:tcW w:type="dxa" w:w="1984"/>
+          </w:tcPr>
+          <w:p>
+            <w:r>
+              <w:t>Portrait recipe</w:t>
+            </w:r>
+          </w:p>
+        </w:tc>
+        <w:tc>
+          <w:tcPr>
+            <w:tcW w:type="dxa" w:w="7370"/>
+          </w:tcPr>
+          <w:p>
+            <w:r>
+              <w:t>skin #f0c8a0; hair #e8c860 (spiky); facial hair: stubble; eyes #4a7aa8; hat: none; glasses: none; top: tanktop (#f2f2ee / #2a3a6a); extras: earring, pencil; young, slim build</w:t>
+            </w:r>
+          </w:p>
+        </w:tc>
+      </w:tr>
+      <w:tr>
+        <w:tc>
+          <w:tcPr>
+            <w:tcW w:type="dxa" w:w="1984"/>
+          </w:tcPr>
+          <w:p>
+            <w:r>
+              <w:t>Mumble</w:t>
+            </w:r>
+          </w:p>
+        </w:tc>
+        <w:tc>
+          <w:tcPr>
+            <w:tcW w:type="dxa" w:w="7370"/>
+          </w:tcPr>
+          <w:p>
+            <w:r>
+              <w:t>square wave, 180-300 Hz, 16 syllables a second, pauses 0.03 s</w:t>
+            </w:r>
+          </w:p>
+        </w:tc>
+      </w:tr>
+    </w:tbl>
+    <w:p>
+      <w:pPr>
+        <w:pStyle w:val="Heading1"/>
+      </w:pPr>
+      <w:r>
+        <w:t>LOLA DIAMOND  (L)</w:t>
+      </w:r>
+    </w:p>
+    <w:p>
+      <w:r>
+        <w:drawing>
+          <wp:inline xmlns:a="http://schemas.openxmlformats.org/drawingml/2006/main" xmlns:pic="http://schemas.openxmlformats.org/drawingml/2006/picture">
+            <wp:extent cx="936000" cy="1462500"/>
+            <wp:docPr id="118" name="Picture 118"/>
+            <wp:cNvGraphicFramePr>
+              <a:graphicFrameLocks noChangeAspect="1"/>
+            </wp:cNvGraphicFramePr>
+            <a:graphic>
+              <a:graphicData uri="http://schemas.openxmlformats.org/drawingml/2006/picture">
+                <pic:pic>
+                  <pic:nvPicPr>
+                    <pic:cNvPr id="0" name="lola-calm.png"/>
+                    <pic:cNvPicPr/>
+                  </pic:nvPicPr>
+                  <pic:blipFill>
+                    <a:blip r:embed="rId126"/>
+                    <a:stretch>
+                      <a:fillRect/>
+                    </a:stretch>
+                  </pic:blipFill>
+                  <pic:spPr>
+                    <a:xfrm>
+                      <a:off x="0" y="0"/>
+                      <a:ext cx="936000" cy="1462500"/>
+                    </a:xfrm>
+                    <a:prstGeom prst="rect"/>
+                  </pic:spPr>
+                </pic:pic>
+              </a:graphicData>
+            </a:graphic>
+          </wp:inline>
+        </w:drawing>
+      </w:r>
+      <w:r>
+        <w:t xml:space="preserve">  </w:t>
+      </w:r>
+      <w:r>
+        <w:drawing>
+          <wp:inline xmlns:a="http://schemas.openxmlformats.org/drawingml/2006/main" xmlns:pic="http://schemas.openxmlformats.org/drawingml/2006/picture">
+            <wp:extent cx="936000" cy="1462500"/>
+            <wp:docPr id="119" name="Picture 119"/>
+            <wp:cNvGraphicFramePr>
+              <a:graphicFrameLocks noChangeAspect="1"/>
+            </wp:cNvGraphicFramePr>
+            <a:graphic>
+              <a:graphicData uri="http://schemas.openxmlformats.org/drawingml/2006/picture">
+                <pic:pic>
+                  <pic:nvPicPr>
+                    <pic:cNvPr id="0" name="lola-angry.png"/>
+                    <pic:cNvPicPr/>
+                  </pic:nvPicPr>
+                  <pic:blipFill>
+                    <a:blip r:embed="rId127"/>
+                    <a:stretch>
+                      <a:fillRect/>
+                    </a:stretch>
+                  </pic:blipFill>
+                  <pic:spPr>
+                    <a:xfrm>
+                      <a:off x="0" y="0"/>
+                      <a:ext cx="936000" cy="1462500"/>
+                    </a:xfrm>
+                    <a:prstGeom prst="rect"/>
+                  </pic:spPr>
+                </pic:pic>
+              </a:graphicData>
+            </a:graphic>
+          </wp:inline>
+        </w:drawing>
+      </w:r>
+      <w:r>
+        <w:t xml:space="preserve">  </w:t>
+      </w:r>
+      <w:r>
+        <w:drawing>
+          <wp:inline xmlns:a="http://schemas.openxmlformats.org/drawingml/2006/main" xmlns:pic="http://schemas.openxmlformats.org/drawingml/2006/picture">
+            <wp:extent cx="936000" cy="1462500"/>
+            <wp:docPr id="120" name="Picture 120"/>
+            <wp:cNvGraphicFramePr>
+              <a:graphicFrameLocks noChangeAspect="1"/>
+            </wp:cNvGraphicFramePr>
+            <a:graphic>
+              <a:graphicData uri="http://schemas.openxmlformats.org/drawingml/2006/picture">
+                <pic:pic>
+                  <pic:nvPicPr>
+                    <pic:cNvPr id="0" name="lola-smile.png"/>
+                    <pic:cNvPicPr/>
+                  </pic:nvPicPr>
+                  <pic:blipFill>
+                    <a:blip r:embed="rId128"/>
+                    <a:stretch>
+                      <a:fillRect/>
+                    </a:stretch>
+                  </pic:blipFill>
+                  <pic:spPr>
+                    <a:xfrm>
+                      <a:off x="0" y="0"/>
+                      <a:ext cx="936000" cy="1462500"/>
+                    </a:xfrm>
+                    <a:prstGeom prst="rect"/>
+                  </pic:spPr>
+                </pic:pic>
+              </a:graphicData>
+            </a:graphic>
+          </wp:inline>
+        </w:drawing>
+      </w:r>
+      <w:r>
+        <w:t xml:space="preserve">  </w:t>
+      </w:r>
+    </w:p>
+    <w:p>
+      <w:r>
+        <w:rPr>
+          <w:sz w:val="16"/>
+        </w:rPr>
+        <w:t>calm - angry - smiling</w:t>
+      </w:r>
+    </w:p>
+    <w:tbl>
+      <w:tblPr>
+        <w:tblStyle w:val="LightGrid-Accent1"/>
+        <w:tblW w:type="auto" w:w="0"/>
+        <w:tblLook w:firstColumn="1" w:firstRow="1" w:lastColumn="0" w:lastRow="0" w:noHBand="0" w:noVBand="1" w:val="04A0"/>
+      </w:tblPr>
+      <w:tblGrid>
+        <w:gridCol w:w="4320"/>
+        <w:gridCol w:w="4320"/>
+      </w:tblGrid>
+      <w:tr>
+        <w:tc>
+          <w:tcPr>
+            <w:tcW w:type="dxa" w:w="1984"/>
+          </w:tcPr>
+          <w:p>
+            <w:r>
+              <w:t>Who</w:t>
+            </w:r>
+          </w:p>
+        </w:tc>
+        <w:tc>
+          <w:tcPr>
+            <w:tcW w:type="dxa" w:w="7370"/>
+          </w:tcPr>
+          <w:p>
+            <w:r>
+              <w:t>The Colony band's singer, a big voice from the 70s lounges; Crane's money had THE PULSE's door keep her from the hotel (H4).</w:t>
+            </w:r>
+          </w:p>
+        </w:tc>
+      </w:tr>
+      <w:tr>
+        <w:tc>
+          <w:tcPr>
+            <w:tcW w:type="dxa" w:w="1984"/>
+          </w:tcPr>
+          <w:p>
+            <w:r>
+              <w:t>Looks</w:t>
+            </w:r>
+          </w:p>
+        </w:tc>
+        <w:tc>
+          <w:tcPr>
+            <w:tcW w:type="dxa" w:w="7370"/>
+          </w:tcPr>
+          <w:p>
+            <w:r>
+              <w:t>Forties, big copper curls, a red sequin dress, gold hoop earrings, red lipstick.</w:t>
+            </w:r>
+          </w:p>
+        </w:tc>
+      </w:tr>
+      <w:tr>
+        <w:tc>
+          <w:tcPr>
+            <w:tcW w:type="dxa" w:w="1984"/>
+          </w:tcPr>
+          <w:p>
+            <w:r>
+              <w:t>Bubble colour</w:t>
+            </w:r>
+          </w:p>
+        </w:tc>
+        <w:tc>
+          <w:tcPr>
+            <w:tcW w:type="dxa" w:w="7370"/>
+          </w:tcPr>
+          <w:p>
+            <w:r>
+              <w:t>#ff4a8a</w:t>
+            </w:r>
+          </w:p>
+        </w:tc>
+      </w:tr>
+      <w:tr>
+        <w:tc>
+          <w:tcPr>
+            <w:tcW w:type="dxa" w:w="1984"/>
+          </w:tcPr>
+          <w:p>
+            <w:r>
+              <w:t>In the city</w:t>
+            </w:r>
+          </w:p>
+        </w:tc>
+        <w:tc>
+          <w:tcPr>
+            <w:tcW w:type="dxa" w:w="7370"/>
+          </w:tcPr>
+          <w:p>
+            <w:r>
+              <w:t>shirt #c81e5a, trousers #c81e5a</w:t>
+            </w:r>
+          </w:p>
+        </w:tc>
+      </w:tr>
+      <w:tr>
+        <w:tc>
+          <w:tcPr>
+            <w:tcW w:type="dxa" w:w="1984"/>
+          </w:tcPr>
+          <w:p>
+            <w:r>
+              <w:t>Portrait recipe</w:t>
+            </w:r>
+          </w:p>
+        </w:tc>
+        <w:tc>
+          <w:tcPr>
+            <w:tcW w:type="dxa" w:w="7370"/>
+          </w:tcPr>
+          <w:p>
+            <w:r>
+              <w:t>skin #c8946a; hair #b0502a (wave); facial hair: none; eyes #3a2a1a; hat: none; glasses: none; top: dress (#c81e5a / #ffd23f); extras: hoops, lipstick; mid, normal build</w:t>
+            </w:r>
+          </w:p>
+        </w:tc>
+      </w:tr>
+      <w:tr>
+        <w:tc>
+          <w:tcPr>
+            <w:tcW w:type="dxa" w:w="1984"/>
+          </w:tcPr>
+          <w:p>
+            <w:r>
+              <w:t>Mumble</w:t>
+            </w:r>
+          </w:p>
+        </w:tc>
+        <w:tc>
+          <w:tcPr>
+            <w:tcW w:type="dxa" w:w="7370"/>
+          </w:tcPr>
+          <w:p>
+            <w:r>
+              <w:t>sine wave, 260-420 Hz, 13 syllables a second, pauses 0.05 s</w:t>
+            </w:r>
+          </w:p>
+        </w:tc>
+      </w:tr>
+    </w:tbl>
+    <w:p>
+      <w:pPr>
+        <w:pStyle w:val="Heading1"/>
+      </w:pPr>
+      <w:r>
+        <w:t>TEDDY BELL  (T)</w:t>
+      </w:r>
+    </w:p>
+    <w:p>
+      <w:r>
+        <w:drawing>
+          <wp:inline xmlns:a="http://schemas.openxmlformats.org/drawingml/2006/main" xmlns:pic="http://schemas.openxmlformats.org/drawingml/2006/picture">
+            <wp:extent cx="936000" cy="1462500"/>
+            <wp:docPr id="121" name="Picture 121"/>
+            <wp:cNvGraphicFramePr>
+              <a:graphicFrameLocks noChangeAspect="1"/>
+            </wp:cNvGraphicFramePr>
+            <a:graphic>
+              <a:graphicData uri="http://schemas.openxmlformats.org/drawingml/2006/picture">
+                <pic:pic>
+                  <pic:nvPicPr>
+                    <pic:cNvPr id="0" name="teddy-calm.png"/>
+                    <pic:cNvPicPr/>
+                  </pic:nvPicPr>
+                  <pic:blipFill>
+                    <a:blip r:embed="rId129"/>
+                    <a:stretch>
+                      <a:fillRect/>
+                    </a:stretch>
+                  </pic:blipFill>
+                  <pic:spPr>
+                    <a:xfrm>
+                      <a:off x="0" y="0"/>
+                      <a:ext cx="936000" cy="1462500"/>
+                    </a:xfrm>
+                    <a:prstGeom prst="rect"/>
+                  </pic:spPr>
+                </pic:pic>
+              </a:graphicData>
+            </a:graphic>
+          </wp:inline>
+        </w:drawing>
+      </w:r>
+      <w:r>
+        <w:t xml:space="preserve">  </w:t>
+      </w:r>
+      <w:r>
+        <w:drawing>
+          <wp:inline xmlns:a="http://schemas.openxmlformats.org/drawingml/2006/main" xmlns:pic="http://schemas.openxmlformats.org/drawingml/2006/picture">
+            <wp:extent cx="936000" cy="1462500"/>
+            <wp:docPr id="122" name="Picture 122"/>
+            <wp:cNvGraphicFramePr>
+              <a:graphicFrameLocks noChangeAspect="1"/>
+            </wp:cNvGraphicFramePr>
+            <a:graphic>
+              <a:graphicData uri="http://schemas.openxmlformats.org/drawingml/2006/picture">
+                <pic:pic>
+                  <pic:nvPicPr>
+                    <pic:cNvPr id="0" name="teddy-angry.png"/>
+                    <pic:cNvPicPr/>
+                  </pic:nvPicPr>
+                  <pic:blipFill>
+                    <a:blip r:embed="rId130"/>
+                    <a:stretch>
+                      <a:fillRect/>
+                    </a:stretch>
+                  </pic:blipFill>
+                  <pic:spPr>
+                    <a:xfrm>
+                      <a:off x="0" y="0"/>
+                      <a:ext cx="936000" cy="1462500"/>
+                    </a:xfrm>
+                    <a:prstGeom prst="rect"/>
+                  </pic:spPr>
+                </pic:pic>
+              </a:graphicData>
+            </a:graphic>
+          </wp:inline>
+        </w:drawing>
+      </w:r>
+      <w:r>
+        <w:t xml:space="preserve">  </w:t>
+      </w:r>
+      <w:r>
+        <w:drawing>
+          <wp:inline xmlns:a="http://schemas.openxmlformats.org/drawingml/2006/main" xmlns:pic="http://schemas.openxmlformats.org/drawingml/2006/picture">
+            <wp:extent cx="936000" cy="1462500"/>
+            <wp:docPr id="123" name="Picture 123"/>
+            <wp:cNvGraphicFramePr>
+              <a:graphicFrameLocks noChangeAspect="1"/>
+            </wp:cNvGraphicFramePr>
+            <a:graphic>
+              <a:graphicData uri="http://schemas.openxmlformats.org/drawingml/2006/picture">
+                <pic:pic>
+                  <pic:nvPicPr>
+                    <pic:cNvPr id="0" name="teddy-smile.png"/>
+                    <pic:cNvPicPr/>
+                  </pic:nvPicPr>
+                  <pic:blipFill>
+                    <a:blip r:embed="rId131"/>
+                    <a:stretch>
+                      <a:fillRect/>
+                    </a:stretch>
+                  </pic:blipFill>
+                  <pic:spPr>
+                    <a:xfrm>
+                      <a:off x="0" y="0"/>
+                      <a:ext cx="936000" cy="1462500"/>
+                    </a:xfrm>
+                    <a:prstGeom prst="rect"/>
+                  </pic:spPr>
+                </pic:pic>
+              </a:graphicData>
+            </a:graphic>
+          </wp:inline>
+        </w:drawing>
+      </w:r>
+      <w:r>
+        <w:t xml:space="preserve">  </w:t>
+      </w:r>
+    </w:p>
+    <w:p>
+      <w:r>
+        <w:rPr>
+          <w:sz w:val="16"/>
+        </w:rPr>
+        <w:t>calm - angry - smiling</w:t>
+      </w:r>
+    </w:p>
+    <w:tbl>
+      <w:tblPr>
+        <w:tblStyle w:val="LightGrid-Accent1"/>
+        <w:tblW w:type="auto" w:w="0"/>
+        <w:tblLook w:firstColumn="1" w:firstRow="1" w:lastColumn="0" w:lastRow="0" w:noHBand="0" w:noVBand="1" w:val="04A0"/>
+      </w:tblPr>
+      <w:tblGrid>
+        <w:gridCol w:w="4320"/>
+        <w:gridCol w:w="4320"/>
+      </w:tblGrid>
+      <w:tr>
+        <w:tc>
+          <w:tcPr>
+            <w:tcW w:type="dxa" w:w="1984"/>
+          </w:tcPr>
+          <w:p>
+            <w:r>
+              <w:t>Who</w:t>
+            </w:r>
+          </w:p>
+        </w:tc>
+        <w:tc>
+          <w:tcPr>
+            <w:tcW w:type="dxa" w:w="7370"/>
+          </w:tcPr>
+          <w:p>
+            <w:r>
+              <w:t>The Colony band's trumpet player, sixty and in love with the sea; ran off on a jet ski rather than play for an empty hall (H4).</w:t>
+            </w:r>
+          </w:p>
+        </w:tc>
+      </w:tr>
+      <w:tr>
+        <w:tc>
+          <w:tcPr>
+            <w:tcW w:type="dxa" w:w="1984"/>
+          </w:tcPr>
+          <w:p>
+            <w:r>
+              <w:t>Looks</w:t>
+            </w:r>
+          </w:p>
+        </w:tc>
+        <w:tc>
+          <w:tcPr>
+            <w:tcW w:type="dxa" w:w="7370"/>
+          </w:tcPr>
+          <w:p>
+            <w:r>
+              <w:t>Sixties, a pencil moustache, a teal flower shirt, a captain's cap pushed back, a gold tooth.</w:t>
+            </w:r>
+          </w:p>
+        </w:tc>
+      </w:tr>
+      <w:tr>
+        <w:tc>
+          <w:tcPr>
+            <w:tcW w:type="dxa" w:w="1984"/>
+          </w:tcPr>
+          <w:p>
+            <w:r>
+              <w:t>Bubble colour</w:t>
+            </w:r>
+          </w:p>
+        </w:tc>
+        <w:tc>
+          <w:tcPr>
+            <w:tcW w:type="dxa" w:w="7370"/>
+          </w:tcPr>
+          <w:p>
+            <w:r>
+              <w:t>#ffc83a</w:t>
+            </w:r>
+          </w:p>
+        </w:tc>
+      </w:tr>
+      <w:tr>
+        <w:tc>
+          <w:tcPr>
+            <w:tcW w:type="dxa" w:w="1984"/>
+          </w:tcPr>
+          <w:p>
+            <w:r>
+              <w:t>In the city</w:t>
+            </w:r>
+          </w:p>
+        </w:tc>
+        <w:tc>
+          <w:tcPr>
+            <w:tcW w:type="dxa" w:w="7370"/>
+          </w:tcPr>
+          <w:p>
+            <w:r>
+              <w:t>shirt #2ab0a0, trousers #e8e0c8</w:t>
+            </w:r>
+          </w:p>
+        </w:tc>
+      </w:tr>
+      <w:tr>
+        <w:tc>
+          <w:tcPr>
+            <w:tcW w:type="dxa" w:w="1984"/>
+          </w:tcPr>
+          <w:p>
+            <w:r>
+              <w:t>Portrait recipe</w:t>
+            </w:r>
+          </w:p>
+        </w:tc>
+        <w:tc>
+          <w:tcPr>
+            <w:tcW w:type="dxa" w:w="7370"/>
+          </w:tcPr>
+          <w:p>
+            <w:r>
+              <w:t>skin #8a5a3a; hair #d0d0d0 (short); facial hair: pencil; eyes #2a1a10; hat: captain; glasses: none; top: flowershirt (#2ab0a0 / #ffd23f); extras: goldtooth, wrinkles; old, normal build</w:t>
+            </w:r>
+          </w:p>
+        </w:tc>
+      </w:tr>
+      <w:tr>
+        <w:tc>
+          <w:tcPr>
+            <w:tcW w:type="dxa" w:w="1984"/>
+          </w:tcPr>
+          <w:p>
+            <w:r>
+              <w:t>Mumble</w:t>
+            </w:r>
+          </w:p>
+        </w:tc>
+        <w:tc>
+          <w:tcPr>
+            <w:tcW w:type="dxa" w:w="7370"/>
+          </w:tcPr>
+          <w:p>
+            <w:r>
+              <w:t>triangle wave, 120-200 Hz, 11 syllables a second, pauses 0.08 s</w:t>
+            </w:r>
+          </w:p>
+        </w:tc>
+      </w:tr>
+    </w:tbl>
+    <w:p>
+      <w:pPr>
+        <w:pStyle w:val="Heading1"/>
+      </w:pPr>
+      <w:r>
+        <w:t>VINNIE RAPP  (V)</w:t>
+      </w:r>
+    </w:p>
+    <w:p>
+      <w:r>
+        <w:drawing>
+          <wp:inline xmlns:a="http://schemas.openxmlformats.org/drawingml/2006/main" xmlns:pic="http://schemas.openxmlformats.org/drawingml/2006/picture">
+            <wp:extent cx="936000" cy="1462500"/>
+            <wp:docPr id="124" name="Picture 124"/>
+            <wp:cNvGraphicFramePr>
+              <a:graphicFrameLocks noChangeAspect="1"/>
+            </wp:cNvGraphicFramePr>
+            <a:graphic>
+              <a:graphicData uri="http://schemas.openxmlformats.org/drawingml/2006/picture">
+                <pic:pic>
+                  <pic:nvPicPr>
+                    <pic:cNvPr id="0" name="vinnie-calm.png"/>
+                    <pic:cNvPicPr/>
+                  </pic:nvPicPr>
+                  <pic:blipFill>
+                    <a:blip r:embed="rId132"/>
+                    <a:stretch>
+                      <a:fillRect/>
+                    </a:stretch>
+                  </pic:blipFill>
+                  <pic:spPr>
+                    <a:xfrm>
+                      <a:off x="0" y="0"/>
+                      <a:ext cx="936000" cy="1462500"/>
+                    </a:xfrm>
+                    <a:prstGeom prst="rect"/>
+                  </pic:spPr>
+                </pic:pic>
+              </a:graphicData>
+            </a:graphic>
+          </wp:inline>
+        </w:drawing>
+      </w:r>
+      <w:r>
+        <w:t xml:space="preserve">  </w:t>
+      </w:r>
+      <w:r>
+        <w:drawing>
+          <wp:inline xmlns:a="http://schemas.openxmlformats.org/drawingml/2006/main" xmlns:pic="http://schemas.openxmlformats.org/drawingml/2006/picture">
+            <wp:extent cx="936000" cy="1462500"/>
+            <wp:docPr id="125" name="Picture 125"/>
+            <wp:cNvGraphicFramePr>
+              <a:graphicFrameLocks noChangeAspect="1"/>
+            </wp:cNvGraphicFramePr>
+            <a:graphic>
+              <a:graphicData uri="http://schemas.openxmlformats.org/drawingml/2006/picture">
+                <pic:pic>
+                  <pic:nvPicPr>
+                    <pic:cNvPr id="0" name="vinnie-angry.png"/>
+                    <pic:cNvPicPr/>
+                  </pic:nvPicPr>
+                  <pic:blipFill>
+                    <a:blip r:embed="rId133"/>
+                    <a:stretch>
+                      <a:fillRect/>
+                    </a:stretch>
+                  </pic:blipFill>
+                  <pic:spPr>
+                    <a:xfrm>
+                      <a:off x="0" y="0"/>
+                      <a:ext cx="936000" cy="1462500"/>
+                    </a:xfrm>
+                    <a:prstGeom prst="rect"/>
+                  </pic:spPr>
+                </pic:pic>
+              </a:graphicData>
+            </a:graphic>
+          </wp:inline>
+        </w:drawing>
+      </w:r>
+      <w:r>
+        <w:t xml:space="preserve">  </w:t>
+      </w:r>
+      <w:r>
+        <w:drawing>
+          <wp:inline xmlns:a="http://schemas.openxmlformats.org/drawingml/2006/main" xmlns:pic="http://schemas.openxmlformats.org/drawingml/2006/picture">
+            <wp:extent cx="936000" cy="1462500"/>
+            <wp:docPr id="126" name="Picture 126"/>
+            <wp:cNvGraphicFramePr>
+              <a:graphicFrameLocks noChangeAspect="1"/>
+            </wp:cNvGraphicFramePr>
+            <a:graphic>
+              <a:graphicData uri="http://schemas.openxmlformats.org/drawingml/2006/picture">
+                <pic:pic>
+                  <pic:nvPicPr>
+                    <pic:cNvPr id="0" name="vinnie-smile.png"/>
+                    <pic:cNvPicPr/>
+                  </pic:nvPicPr>
+                  <pic:blipFill>
+                    <a:blip r:embed="rId134"/>
+                    <a:stretch>
+                      <a:fillRect/>
+                    </a:stretch>
+                  </pic:blipFill>
+                  <pic:spPr>
+                    <a:xfrm>
+                      <a:off x="0" y="0"/>
+                      <a:ext cx="936000" cy="1462500"/>
+                    </a:xfrm>
+                    <a:prstGeom prst="rect"/>
+                  </pic:spPr>
+                </pic:pic>
+              </a:graphicData>
+            </a:graphic>
+          </wp:inline>
+        </w:drawing>
+      </w:r>
+      <w:r>
+        <w:t xml:space="preserve">  </w:t>
+      </w:r>
+    </w:p>
+    <w:p>
+      <w:r>
+        <w:rPr>
+          <w:sz w:val="16"/>
+        </w:rPr>
+        <w:t>calm - angry - smiling</w:t>
+      </w:r>
+    </w:p>
+    <w:tbl>
+      <w:tblPr>
+        <w:tblStyle w:val="LightGrid-Accent1"/>
+        <w:tblW w:type="auto" w:w="0"/>
+        <w:tblLook w:firstColumn="1" w:firstRow="1" w:lastColumn="0" w:lastRow="0" w:noHBand="0" w:noVBand="1" w:val="04A0"/>
+      </w:tblPr>
+      <w:tblGrid>
+        <w:gridCol w:w="4320"/>
+        <w:gridCol w:w="4320"/>
+      </w:tblGrid>
+      <w:tr>
+        <w:tc>
+          <w:tcPr>
+            <w:tcW w:type="dxa" w:w="1984"/>
+          </w:tcPr>
+          <w:p>
+            <w:r>
+              <w:t>Who</w:t>
+            </w:r>
+          </w:p>
+        </w:tc>
+        <w:tc>
+          <w:tcPr>
+            <w:tcW w:type="dxa" w:w="7370"/>
+          </w:tcPr>
+          <w:p>
+            <w:r>
+              <w:t>A loan shark who races at the speedway and takes bets on himself; holds Sammy Sticks until his debt is paid - or raced off (H4).</w:t>
+            </w:r>
+          </w:p>
+        </w:tc>
+      </w:tr>
+      <w:tr>
+        <w:tc>
+          <w:tcPr>
+            <w:tcW w:type="dxa" w:w="1984"/>
+          </w:tcPr>
+          <w:p>
+            <w:r>
+              <w:t>Looks</w:t>
+            </w:r>
+          </w:p>
+        </w:tc>
+        <w:tc>
+          <w:tcPr>
+            <w:tcW w:type="dxa" w:w="7370"/>
+          </w:tcPr>
+          <w:p>
+            <w:r>
+              <w:t>Forties, slicked-back black hair, a black leather racing jacket with an orange stripe, aviator shades, a gold chain.</w:t>
+            </w:r>
+          </w:p>
+        </w:tc>
+      </w:tr>
+      <w:tr>
+        <w:tc>
+          <w:tcPr>
+            <w:tcW w:type="dxa" w:w="1984"/>
+          </w:tcPr>
+          <w:p>
+            <w:r>
+              <w:t>Bubble colour</w:t>
+            </w:r>
+          </w:p>
+        </w:tc>
+        <w:tc>
+          <w:tcPr>
+            <w:tcW w:type="dxa" w:w="7370"/>
+          </w:tcPr>
+          <w:p>
+            <w:r>
+              <w:t>#ff8a2a</w:t>
+            </w:r>
+          </w:p>
+        </w:tc>
+      </w:tr>
+      <w:tr>
+        <w:tc>
+          <w:tcPr>
+            <w:tcW w:type="dxa" w:w="1984"/>
+          </w:tcPr>
+          <w:p>
+            <w:r>
+              <w:t>In the city</w:t>
+            </w:r>
+          </w:p>
+        </w:tc>
+        <w:tc>
+          <w:tcPr>
+            <w:tcW w:type="dxa" w:w="7370"/>
+          </w:tcPr>
+          <w:p>
+            <w:r>
+              <w:t>shirt #1a1a1a, trousers #1a1a1a</w:t>
+            </w:r>
+          </w:p>
+        </w:tc>
+      </w:tr>
+      <w:tr>
+        <w:tc>
+          <w:tcPr>
+            <w:tcW w:type="dxa" w:w="1984"/>
+          </w:tcPr>
+          <w:p>
+            <w:r>
+              <w:t>Portrait recipe</w:t>
+            </w:r>
+          </w:p>
+        </w:tc>
+        <w:tc>
+          <w:tcPr>
+            <w:tcW w:type="dxa" w:w="7370"/>
+          </w:tcPr>
+          <w:p>
+            <w:r>
+              <w:t>skin #d8a880; hair #141014 (slick); facial hair: stubble; eyes #2a1a14; hat: none; glasses: shades; top: leather (#1a1a1a / #ff8a2a); extras: chain, toothpick; mid, normal build</w:t>
+            </w:r>
+          </w:p>
+        </w:tc>
+      </w:tr>
+      <w:tr>
+        <w:tc>
+          <w:tcPr>
+            <w:tcW w:type="dxa" w:w="1984"/>
+          </w:tcPr>
+          <w:p>
+            <w:r>
+              <w:t>Mumble</w:t>
+            </w:r>
+          </w:p>
+        </w:tc>
+        <w:tc>
+          <w:tcPr>
+            <w:tcW w:type="dxa" w:w="7370"/>
+          </w:tcPr>
+          <w:p>
+            <w:r>
+              <w:t>sawtooth wave, 110-170 Hz, 12 syllables a second, pauses 0.05 s</w:t>
             </w:r>
           </w:p>
         </w:tc>

</xml_diff>

<commit_message>
Space line S1-S8: Word pages, README, Help, STORY.md approval rows and connectors; the characters' Word sheet
Co-Authored-By: Claude <noreply@anthropic.com>
Claude-Session: https://claude.ai/code/session_01RpWbq89r71C1p9HP7EcbZ5
</commit_message>
<xml_diff>
--- a/docs/Characters.docx
+++ b/docs/Characters.docx
@@ -11439,6 +11439,822 @@
           <w:p>
             <w:r>
               <w:t>sawtooth wave, 110-170 Hz, 12 syllables a second, pauses 0.05 s</w:t>
+            </w:r>
+          </w:p>
+        </w:tc>
+      </w:tr>
+    </w:tbl>
+    <w:p>
+      <w:pPr>
+        <w:pStyle w:val="Heading1"/>
+      </w:pPr>
+      <w:r>
+        <w:t>RICK TOLAN  (R)</w:t>
+      </w:r>
+    </w:p>
+    <w:p>
+      <w:r>
+        <w:drawing>
+          <wp:inline xmlns:a="http://schemas.openxmlformats.org/drawingml/2006/main" xmlns:pic="http://schemas.openxmlformats.org/drawingml/2006/picture">
+            <wp:extent cx="936000" cy="1462500"/>
+            <wp:docPr id="127" name="Picture 127"/>
+            <wp:cNvGraphicFramePr>
+              <a:graphicFrameLocks noChangeAspect="1"/>
+            </wp:cNvGraphicFramePr>
+            <a:graphic>
+              <a:graphicData uri="http://schemas.openxmlformats.org/drawingml/2006/picture">
+                <pic:pic>
+                  <pic:nvPicPr>
+                    <pic:cNvPr id="0" name="tolan-calm.png"/>
+                    <pic:cNvPicPr/>
+                  </pic:nvPicPr>
+                  <pic:blipFill>
+                    <a:blip r:embed="rId135"/>
+                    <a:stretch>
+                      <a:fillRect/>
+                    </a:stretch>
+                  </pic:blipFill>
+                  <pic:spPr>
+                    <a:xfrm>
+                      <a:off x="0" y="0"/>
+                      <a:ext cx="936000" cy="1462500"/>
+                    </a:xfrm>
+                    <a:prstGeom prst="rect"/>
+                  </pic:spPr>
+                </pic:pic>
+              </a:graphicData>
+            </a:graphic>
+          </wp:inline>
+        </w:drawing>
+      </w:r>
+      <w:r>
+        <w:t xml:space="preserve">  </w:t>
+      </w:r>
+      <w:r>
+        <w:drawing>
+          <wp:inline xmlns:a="http://schemas.openxmlformats.org/drawingml/2006/main" xmlns:pic="http://schemas.openxmlformats.org/drawingml/2006/picture">
+            <wp:extent cx="936000" cy="1462500"/>
+            <wp:docPr id="128" name="Picture 128"/>
+            <wp:cNvGraphicFramePr>
+              <a:graphicFrameLocks noChangeAspect="1"/>
+            </wp:cNvGraphicFramePr>
+            <a:graphic>
+              <a:graphicData uri="http://schemas.openxmlformats.org/drawingml/2006/picture">
+                <pic:pic>
+                  <pic:nvPicPr>
+                    <pic:cNvPr id="0" name="tolan-angry.png"/>
+                    <pic:cNvPicPr/>
+                  </pic:nvPicPr>
+                  <pic:blipFill>
+                    <a:blip r:embed="rId136"/>
+                    <a:stretch>
+                      <a:fillRect/>
+                    </a:stretch>
+                  </pic:blipFill>
+                  <pic:spPr>
+                    <a:xfrm>
+                      <a:off x="0" y="0"/>
+                      <a:ext cx="936000" cy="1462500"/>
+                    </a:xfrm>
+                    <a:prstGeom prst="rect"/>
+                  </pic:spPr>
+                </pic:pic>
+              </a:graphicData>
+            </a:graphic>
+          </wp:inline>
+        </w:drawing>
+      </w:r>
+      <w:r>
+        <w:t xml:space="preserve">  </w:t>
+      </w:r>
+      <w:r>
+        <w:drawing>
+          <wp:inline xmlns:a="http://schemas.openxmlformats.org/drawingml/2006/main" xmlns:pic="http://schemas.openxmlformats.org/drawingml/2006/picture">
+            <wp:extent cx="936000" cy="1462500"/>
+            <wp:docPr id="129" name="Picture 129"/>
+            <wp:cNvGraphicFramePr>
+              <a:graphicFrameLocks noChangeAspect="1"/>
+            </wp:cNvGraphicFramePr>
+            <a:graphic>
+              <a:graphicData uri="http://schemas.openxmlformats.org/drawingml/2006/picture">
+                <pic:pic>
+                  <pic:nvPicPr>
+                    <pic:cNvPr id="0" name="tolan-smile.png"/>
+                    <pic:cNvPicPr/>
+                  </pic:nvPicPr>
+                  <pic:blipFill>
+                    <a:blip r:embed="rId137"/>
+                    <a:stretch>
+                      <a:fillRect/>
+                    </a:stretch>
+                  </pic:blipFill>
+                  <pic:spPr>
+                    <a:xfrm>
+                      <a:off x="0" y="0"/>
+                      <a:ext cx="936000" cy="1462500"/>
+                    </a:xfrm>
+                    <a:prstGeom prst="rect"/>
+                  </pic:spPr>
+                </pic:pic>
+              </a:graphicData>
+            </a:graphic>
+          </wp:inline>
+        </w:drawing>
+      </w:r>
+      <w:r>
+        <w:t xml:space="preserve">  </w:t>
+      </w:r>
+    </w:p>
+    <w:p>
+      <w:r>
+        <w:rPr>
+          <w:sz w:val="16"/>
+        </w:rPr>
+        <w:t>calm - angry - smiling</w:t>
+      </w:r>
+    </w:p>
+    <w:tbl>
+      <w:tblPr>
+        <w:tblStyle w:val="LightGrid-Accent1"/>
+        <w:tblW w:type="auto" w:w="0"/>
+        <w:tblLook w:firstColumn="1" w:firstRow="1" w:lastColumn="0" w:lastRow="0" w:noHBand="0" w:noVBand="1" w:val="04A0"/>
+      </w:tblPr>
+      <w:tblGrid>
+        <w:gridCol w:w="4320"/>
+        <w:gridCol w:w="4320"/>
+      </w:tblGrid>
+      <w:tr>
+        <w:tc>
+          <w:tcPr>
+            <w:tcW w:type="dxa" w:w="1984"/>
+          </w:tcPr>
+          <w:p>
+            <w:r>
+              <w:t>Who</w:t>
+            </w:r>
+          </w:p>
+        </w:tc>
+        <w:tc>
+          <w:tcPr>
+            <w:tcW w:type="dxa" w:w="7370"/>
+          </w:tcPr>
+          <w:p>
+            <w:r>
+              <w:t>The space center's night supervisor, deep in debt; Crane pays him to wreck the rocket's guidance (S2's saboteur).</w:t>
+            </w:r>
+          </w:p>
+        </w:tc>
+      </w:tr>
+      <w:tr>
+        <w:tc>
+          <w:tcPr>
+            <w:tcW w:type="dxa" w:w="1984"/>
+          </w:tcPr>
+          <w:p>
+            <w:r>
+              <w:t>Looks</w:t>
+            </w:r>
+          </w:p>
+        </w:tc>
+        <w:tc>
+          <w:tcPr>
+            <w:tcW w:type="dxa" w:w="7370"/>
+          </w:tcPr>
+          <w:p>
+            <w:r>
+              <w:t>Fifties, a grey crew cut, a heavy moustache, a short-sleeved white shirt with a pocket protector, an ID badge.</w:t>
+            </w:r>
+          </w:p>
+        </w:tc>
+      </w:tr>
+      <w:tr>
+        <w:tc>
+          <w:tcPr>
+            <w:tcW w:type="dxa" w:w="1984"/>
+          </w:tcPr>
+          <w:p>
+            <w:r>
+              <w:t>Bubble colour</w:t>
+            </w:r>
+          </w:p>
+        </w:tc>
+        <w:tc>
+          <w:tcPr>
+            <w:tcW w:type="dxa" w:w="7370"/>
+          </w:tcPr>
+          <w:p>
+            <w:r>
+              <w:t>#c86a3a</w:t>
+            </w:r>
+          </w:p>
+        </w:tc>
+      </w:tr>
+      <w:tr>
+        <w:tc>
+          <w:tcPr>
+            <w:tcW w:type="dxa" w:w="1984"/>
+          </w:tcPr>
+          <w:p>
+            <w:r>
+              <w:t>In the city</w:t>
+            </w:r>
+          </w:p>
+        </w:tc>
+        <w:tc>
+          <w:tcPr>
+            <w:tcW w:type="dxa" w:w="7370"/>
+          </w:tcPr>
+          <w:p>
+            <w:r>
+              <w:t>shirt #eef2f6, trousers #2a2d3a</w:t>
+            </w:r>
+          </w:p>
+        </w:tc>
+      </w:tr>
+      <w:tr>
+        <w:tc>
+          <w:tcPr>
+            <w:tcW w:type="dxa" w:w="1984"/>
+          </w:tcPr>
+          <w:p>
+            <w:r>
+              <w:t>Portrait recipe</w:t>
+            </w:r>
+          </w:p>
+        </w:tc>
+        <w:tc>
+          <w:tcPr>
+            <w:tcW w:type="dxa" w:w="7370"/>
+          </w:tcPr>
+          <w:p>
+            <w:r>
+              <w:t>skin #e0b090; hair #8a8a8a (buzz); facial hair: moustache; eyes #4a5a6a; hat: none; glasses: none; top: buttoned (#eef2f6 / #2a4aa8); extras: sweat, pencil; old, broad build</w:t>
+            </w:r>
+          </w:p>
+        </w:tc>
+      </w:tr>
+      <w:tr>
+        <w:tc>
+          <w:tcPr>
+            <w:tcW w:type="dxa" w:w="1984"/>
+          </w:tcPr>
+          <w:p>
+            <w:r>
+              <w:t>Mumble</w:t>
+            </w:r>
+          </w:p>
+        </w:tc>
+        <w:tc>
+          <w:tcPr>
+            <w:tcW w:type="dxa" w:w="7370"/>
+          </w:tcPr>
+          <w:p>
+            <w:r>
+              <w:t>sawtooth wave, 110-170 Hz, 11 syllables a second, pauses 0.07 s</w:t>
+            </w:r>
+          </w:p>
+        </w:tc>
+      </w:tr>
+    </w:tbl>
+    <w:p>
+      <w:pPr>
+        <w:pStyle w:val="Heading1"/>
+      </w:pPr>
+      <w:r>
+        <w:t>HAL MERCER  (H)</w:t>
+      </w:r>
+    </w:p>
+    <w:p>
+      <w:r>
+        <w:drawing>
+          <wp:inline xmlns:a="http://schemas.openxmlformats.org/drawingml/2006/main" xmlns:pic="http://schemas.openxmlformats.org/drawingml/2006/picture">
+            <wp:extent cx="936000" cy="1462500"/>
+            <wp:docPr id="130" name="Picture 130"/>
+            <wp:cNvGraphicFramePr>
+              <a:graphicFrameLocks noChangeAspect="1"/>
+            </wp:cNvGraphicFramePr>
+            <a:graphic>
+              <a:graphicData uri="http://schemas.openxmlformats.org/drawingml/2006/picture">
+                <pic:pic>
+                  <pic:nvPicPr>
+                    <pic:cNvPr id="0" name="mercer-calm.png"/>
+                    <pic:cNvPicPr/>
+                  </pic:nvPicPr>
+                  <pic:blipFill>
+                    <a:blip r:embed="rId138"/>
+                    <a:stretch>
+                      <a:fillRect/>
+                    </a:stretch>
+                  </pic:blipFill>
+                  <pic:spPr>
+                    <a:xfrm>
+                      <a:off x="0" y="0"/>
+                      <a:ext cx="936000" cy="1462500"/>
+                    </a:xfrm>
+                    <a:prstGeom prst="rect"/>
+                  </pic:spPr>
+                </pic:pic>
+              </a:graphicData>
+            </a:graphic>
+          </wp:inline>
+        </w:drawing>
+      </w:r>
+      <w:r>
+        <w:t xml:space="preserve">  </w:t>
+      </w:r>
+      <w:r>
+        <w:drawing>
+          <wp:inline xmlns:a="http://schemas.openxmlformats.org/drawingml/2006/main" xmlns:pic="http://schemas.openxmlformats.org/drawingml/2006/picture">
+            <wp:extent cx="936000" cy="1462500"/>
+            <wp:docPr id="131" name="Picture 131"/>
+            <wp:cNvGraphicFramePr>
+              <a:graphicFrameLocks noChangeAspect="1"/>
+            </wp:cNvGraphicFramePr>
+            <a:graphic>
+              <a:graphicData uri="http://schemas.openxmlformats.org/drawingml/2006/picture">
+                <pic:pic>
+                  <pic:nvPicPr>
+                    <pic:cNvPr id="0" name="mercer-angry.png"/>
+                    <pic:cNvPicPr/>
+                  </pic:nvPicPr>
+                  <pic:blipFill>
+                    <a:blip r:embed="rId139"/>
+                    <a:stretch>
+                      <a:fillRect/>
+                    </a:stretch>
+                  </pic:blipFill>
+                  <pic:spPr>
+                    <a:xfrm>
+                      <a:off x="0" y="0"/>
+                      <a:ext cx="936000" cy="1462500"/>
+                    </a:xfrm>
+                    <a:prstGeom prst="rect"/>
+                  </pic:spPr>
+                </pic:pic>
+              </a:graphicData>
+            </a:graphic>
+          </wp:inline>
+        </w:drawing>
+      </w:r>
+      <w:r>
+        <w:t xml:space="preserve">  </w:t>
+      </w:r>
+      <w:r>
+        <w:drawing>
+          <wp:inline xmlns:a="http://schemas.openxmlformats.org/drawingml/2006/main" xmlns:pic="http://schemas.openxmlformats.org/drawingml/2006/picture">
+            <wp:extent cx="936000" cy="1462500"/>
+            <wp:docPr id="132" name="Picture 132"/>
+            <wp:cNvGraphicFramePr>
+              <a:graphicFrameLocks noChangeAspect="1"/>
+            </wp:cNvGraphicFramePr>
+            <a:graphic>
+              <a:graphicData uri="http://schemas.openxmlformats.org/drawingml/2006/picture">
+                <pic:pic>
+                  <pic:nvPicPr>
+                    <pic:cNvPr id="0" name="mercer-smile.png"/>
+                    <pic:cNvPicPr/>
+                  </pic:nvPicPr>
+                  <pic:blipFill>
+                    <a:blip r:embed="rId140"/>
+                    <a:stretch>
+                      <a:fillRect/>
+                    </a:stretch>
+                  </pic:blipFill>
+                  <pic:spPr>
+                    <a:xfrm>
+                      <a:off x="0" y="0"/>
+                      <a:ext cx="936000" cy="1462500"/>
+                    </a:xfrm>
+                    <a:prstGeom prst="rect"/>
+                  </pic:spPr>
+                </pic:pic>
+              </a:graphicData>
+            </a:graphic>
+          </wp:inline>
+        </w:drawing>
+      </w:r>
+      <w:r>
+        <w:t xml:space="preserve">  </w:t>
+      </w:r>
+    </w:p>
+    <w:p>
+      <w:r>
+        <w:rPr>
+          <w:sz w:val="16"/>
+        </w:rPr>
+        <w:t>calm - angry - smiling</w:t>
+      </w:r>
+    </w:p>
+    <w:tbl>
+      <w:tblPr>
+        <w:tblStyle w:val="LightGrid-Accent1"/>
+        <w:tblW w:type="auto" w:w="0"/>
+        <w:tblLook w:firstColumn="1" w:firstRow="1" w:lastColumn="0" w:lastRow="0" w:noHBand="0" w:noVBand="1" w:val="04A0"/>
+      </w:tblPr>
+      <w:tblGrid>
+        <w:gridCol w:w="4320"/>
+        <w:gridCol w:w="4320"/>
+      </w:tblGrid>
+      <w:tr>
+        <w:tc>
+          <w:tcPr>
+            <w:tcW w:type="dxa" w:w="1984"/>
+          </w:tcPr>
+          <w:p>
+            <w:r>
+              <w:t>Who</w:t>
+            </w:r>
+          </w:p>
+        </w:tc>
+        <w:tc>
+          <w:tcPr>
+            <w:tcW w:type="dxa" w:w="7370"/>
+          </w:tcPr>
+          <w:p>
+            <w:r>
+              <w:t>A fuel technician at the space center: loud, grumpy, honest - one of S2's three suspects.</w:t>
+            </w:r>
+          </w:p>
+        </w:tc>
+      </w:tr>
+      <w:tr>
+        <w:tc>
+          <w:tcPr>
+            <w:tcW w:type="dxa" w:w="1984"/>
+          </w:tcPr>
+          <w:p>
+            <w:r>
+              <w:t>Looks</w:t>
+            </w:r>
+          </w:p>
+        </w:tc>
+        <w:tc>
+          <w:tcPr>
+            <w:tcW w:type="dxa" w:w="7370"/>
+          </w:tcPr>
+          <w:p>
+            <w:r>
+              <w:t>Forties, red hair under a cap pushed back, a beard, orange coveralls.</w:t>
+            </w:r>
+          </w:p>
+        </w:tc>
+      </w:tr>
+      <w:tr>
+        <w:tc>
+          <w:tcPr>
+            <w:tcW w:type="dxa" w:w="1984"/>
+          </w:tcPr>
+          <w:p>
+            <w:r>
+              <w:t>Bubble colour</w:t>
+            </w:r>
+          </w:p>
+        </w:tc>
+        <w:tc>
+          <w:tcPr>
+            <w:tcW w:type="dxa" w:w="7370"/>
+          </w:tcPr>
+          <w:p>
+            <w:r>
+              <w:t>#6ac0ff</w:t>
+            </w:r>
+          </w:p>
+        </w:tc>
+      </w:tr>
+      <w:tr>
+        <w:tc>
+          <w:tcPr>
+            <w:tcW w:type="dxa" w:w="1984"/>
+          </w:tcPr>
+          <w:p>
+            <w:r>
+              <w:t>In the city</w:t>
+            </w:r>
+          </w:p>
+        </w:tc>
+        <w:tc>
+          <w:tcPr>
+            <w:tcW w:type="dxa" w:w="7370"/>
+          </w:tcPr>
+          <w:p>
+            <w:r>
+              <w:t>shirt #ff7a1a, trousers #2a3a5a</w:t>
+            </w:r>
+          </w:p>
+        </w:tc>
+      </w:tr>
+      <w:tr>
+        <w:tc>
+          <w:tcPr>
+            <w:tcW w:type="dxa" w:w="1984"/>
+          </w:tcPr>
+          <w:p>
+            <w:r>
+              <w:t>Portrait recipe</w:t>
+            </w:r>
+          </w:p>
+        </w:tc>
+        <w:tc>
+          <w:tcPr>
+            <w:tcW w:type="dxa" w:w="7370"/>
+          </w:tcPr>
+          <w:p>
+            <w:r>
+              <w:t>skin #f0c8a8; hair #c0502a (short); facial hair: beard; eyes #3a6a3a; hat: flatcap; glasses: none; top: jumpsuit (#ff7a1a / #2a3a5a); extras: rag; mid, broad build</w:t>
+            </w:r>
+          </w:p>
+        </w:tc>
+      </w:tr>
+      <w:tr>
+        <w:tc>
+          <w:tcPr>
+            <w:tcW w:type="dxa" w:w="1984"/>
+          </w:tcPr>
+          <w:p>
+            <w:r>
+              <w:t>Mumble</w:t>
+            </w:r>
+          </w:p>
+        </w:tc>
+        <w:tc>
+          <w:tcPr>
+            <w:tcW w:type="dxa" w:w="7370"/>
+          </w:tcPr>
+          <w:p>
+            <w:r>
+              <w:t>triangle wave, 140-220 Hz, 13 syllables a second, pauses 0.05 s</w:t>
+            </w:r>
+          </w:p>
+        </w:tc>
+      </w:tr>
+    </w:tbl>
+    <w:p>
+      <w:pPr>
+        <w:pStyle w:val="Heading1"/>
+      </w:pPr>
+      <w:r>
+        <w:t>DANA VOSS  (D)</w:t>
+      </w:r>
+    </w:p>
+    <w:p>
+      <w:r>
+        <w:drawing>
+          <wp:inline xmlns:a="http://schemas.openxmlformats.org/drawingml/2006/main" xmlns:pic="http://schemas.openxmlformats.org/drawingml/2006/picture">
+            <wp:extent cx="936000" cy="1462500"/>
+            <wp:docPr id="133" name="Picture 133"/>
+            <wp:cNvGraphicFramePr>
+              <a:graphicFrameLocks noChangeAspect="1"/>
+            </wp:cNvGraphicFramePr>
+            <a:graphic>
+              <a:graphicData uri="http://schemas.openxmlformats.org/drawingml/2006/picture">
+                <pic:pic>
+                  <pic:nvPicPr>
+                    <pic:cNvPr id="0" name="voss-calm.png"/>
+                    <pic:cNvPicPr/>
+                  </pic:nvPicPr>
+                  <pic:blipFill>
+                    <a:blip r:embed="rId141"/>
+                    <a:stretch>
+                      <a:fillRect/>
+                    </a:stretch>
+                  </pic:blipFill>
+                  <pic:spPr>
+                    <a:xfrm>
+                      <a:off x="0" y="0"/>
+                      <a:ext cx="936000" cy="1462500"/>
+                    </a:xfrm>
+                    <a:prstGeom prst="rect"/>
+                  </pic:spPr>
+                </pic:pic>
+              </a:graphicData>
+            </a:graphic>
+          </wp:inline>
+        </w:drawing>
+      </w:r>
+      <w:r>
+        <w:t xml:space="preserve">  </w:t>
+      </w:r>
+      <w:r>
+        <w:drawing>
+          <wp:inline xmlns:a="http://schemas.openxmlformats.org/drawingml/2006/main" xmlns:pic="http://schemas.openxmlformats.org/drawingml/2006/picture">
+            <wp:extent cx="936000" cy="1462500"/>
+            <wp:docPr id="134" name="Picture 134"/>
+            <wp:cNvGraphicFramePr>
+              <a:graphicFrameLocks noChangeAspect="1"/>
+            </wp:cNvGraphicFramePr>
+            <a:graphic>
+              <a:graphicData uri="http://schemas.openxmlformats.org/drawingml/2006/picture">
+                <pic:pic>
+                  <pic:nvPicPr>
+                    <pic:cNvPr id="0" name="voss-angry.png"/>
+                    <pic:cNvPicPr/>
+                  </pic:nvPicPr>
+                  <pic:blipFill>
+                    <a:blip r:embed="rId142"/>
+                    <a:stretch>
+                      <a:fillRect/>
+                    </a:stretch>
+                  </pic:blipFill>
+                  <pic:spPr>
+                    <a:xfrm>
+                      <a:off x="0" y="0"/>
+                      <a:ext cx="936000" cy="1462500"/>
+                    </a:xfrm>
+                    <a:prstGeom prst="rect"/>
+                  </pic:spPr>
+                </pic:pic>
+              </a:graphicData>
+            </a:graphic>
+          </wp:inline>
+        </w:drawing>
+      </w:r>
+      <w:r>
+        <w:t xml:space="preserve">  </w:t>
+      </w:r>
+      <w:r>
+        <w:drawing>
+          <wp:inline xmlns:a="http://schemas.openxmlformats.org/drawingml/2006/main" xmlns:pic="http://schemas.openxmlformats.org/drawingml/2006/picture">
+            <wp:extent cx="936000" cy="1462500"/>
+            <wp:docPr id="135" name="Picture 135"/>
+            <wp:cNvGraphicFramePr>
+              <a:graphicFrameLocks noChangeAspect="1"/>
+            </wp:cNvGraphicFramePr>
+            <a:graphic>
+              <a:graphicData uri="http://schemas.openxmlformats.org/drawingml/2006/picture">
+                <pic:pic>
+                  <pic:nvPicPr>
+                    <pic:cNvPr id="0" name="voss-smile.png"/>
+                    <pic:cNvPicPr/>
+                  </pic:nvPicPr>
+                  <pic:blipFill>
+                    <a:blip r:embed="rId143"/>
+                    <a:stretch>
+                      <a:fillRect/>
+                    </a:stretch>
+                  </pic:blipFill>
+                  <pic:spPr>
+                    <a:xfrm>
+                      <a:off x="0" y="0"/>
+                      <a:ext cx="936000" cy="1462500"/>
+                    </a:xfrm>
+                    <a:prstGeom prst="rect"/>
+                  </pic:spPr>
+                </pic:pic>
+              </a:graphicData>
+            </a:graphic>
+          </wp:inline>
+        </w:drawing>
+      </w:r>
+      <w:r>
+        <w:t xml:space="preserve">  </w:t>
+      </w:r>
+    </w:p>
+    <w:p>
+      <w:r>
+        <w:rPr>
+          <w:sz w:val="16"/>
+        </w:rPr>
+        <w:t>calm - angry - smiling</w:t>
+      </w:r>
+    </w:p>
+    <w:tbl>
+      <w:tblPr>
+        <w:tblStyle w:val="LightGrid-Accent1"/>
+        <w:tblW w:type="auto" w:w="0"/>
+        <w:tblLook w:firstColumn="1" w:firstRow="1" w:lastColumn="0" w:lastRow="0" w:noHBand="0" w:noVBand="1" w:val="04A0"/>
+      </w:tblPr>
+      <w:tblGrid>
+        <w:gridCol w:w="4320"/>
+        <w:gridCol w:w="4320"/>
+      </w:tblGrid>
+      <w:tr>
+        <w:tc>
+          <w:tcPr>
+            <w:tcW w:type="dxa" w:w="1984"/>
+          </w:tcPr>
+          <w:p>
+            <w:r>
+              <w:t>Who</w:t>
+            </w:r>
+          </w:p>
+        </w:tc>
+        <w:tc>
+          <w:tcPr>
+            <w:tcW w:type="dxa" w:w="7370"/>
+          </w:tcPr>
+          <w:p>
+            <w:r>
+              <w:t>The guidance engineer, cool and clever - Crane's real mole at the space center; she runs with the launch codes (S5).</w:t>
+            </w:r>
+          </w:p>
+        </w:tc>
+      </w:tr>
+      <w:tr>
+        <w:tc>
+          <w:tcPr>
+            <w:tcW w:type="dxa" w:w="1984"/>
+          </w:tcPr>
+          <w:p>
+            <w:r>
+              <w:t>Looks</w:t>
+            </w:r>
+          </w:p>
+        </w:tc>
+        <w:tc>
+          <w:tcPr>
+            <w:tcW w:type="dxa" w:w="7370"/>
+          </w:tcPr>
+          <w:p>
+            <w:r>
+              <w:t>Thirties, a sleek black bob, thin-rimmed square glasses, a lab coat over a black turtleneck.</w:t>
+            </w:r>
+          </w:p>
+        </w:tc>
+      </w:tr>
+      <w:tr>
+        <w:tc>
+          <w:tcPr>
+            <w:tcW w:type="dxa" w:w="1984"/>
+          </w:tcPr>
+          <w:p>
+            <w:r>
+              <w:t>Bubble colour</w:t>
+            </w:r>
+          </w:p>
+        </w:tc>
+        <w:tc>
+          <w:tcPr>
+            <w:tcW w:type="dxa" w:w="7370"/>
+          </w:tcPr>
+          <w:p>
+            <w:r>
+              <w:t>#b07cff</w:t>
+            </w:r>
+          </w:p>
+        </w:tc>
+      </w:tr>
+      <w:tr>
+        <w:tc>
+          <w:tcPr>
+            <w:tcW w:type="dxa" w:w="1984"/>
+          </w:tcPr>
+          <w:p>
+            <w:r>
+              <w:t>In the city</w:t>
+            </w:r>
+          </w:p>
+        </w:tc>
+        <w:tc>
+          <w:tcPr>
+            <w:tcW w:type="dxa" w:w="7370"/>
+          </w:tcPr>
+          <w:p>
+            <w:r>
+              <w:t>shirt #f4f6f8, trousers #3a3a44</w:t>
+            </w:r>
+          </w:p>
+        </w:tc>
+      </w:tr>
+      <w:tr>
+        <w:tc>
+          <w:tcPr>
+            <w:tcW w:type="dxa" w:w="1984"/>
+          </w:tcPr>
+          <w:p>
+            <w:r>
+              <w:t>Portrait recipe</w:t>
+            </w:r>
+          </w:p>
+        </w:tc>
+        <w:tc>
+          <w:tcPr>
+            <w:tcW w:type="dxa" w:w="7370"/>
+          </w:tcPr>
+          <w:p>
+            <w:r>
+              <w:t>skin #e8c8a8; hair #121014 (bob); facial hair: none; eyes #3a2a1a; hat: none; glasses: square; top: labcoat (#f4f6f8 / #14141a); extras: lipstick; mid, slim build</w:t>
+            </w:r>
+          </w:p>
+        </w:tc>
+      </w:tr>
+      <w:tr>
+        <w:tc>
+          <w:tcPr>
+            <w:tcW w:type="dxa" w:w="1984"/>
+          </w:tcPr>
+          <w:p>
+            <w:r>
+              <w:t>Mumble</w:t>
+            </w:r>
+          </w:p>
+        </w:tc>
+        <w:tc>
+          <w:tcPr>
+            <w:tcW w:type="dxa" w:w="7370"/>
+          </w:tcPr>
+          <w:p>
+            <w:r>
+              <w:t>sine wave, 220-340 Hz, 14 syllables a second, pauses 0.05 s</w:t>
             </w:r>
           </w:p>
         </w:tc>

</xml_diff>

<commit_message>
Chapter 5 docs: Word pages for M25-M30, README (chapter 5, Crane's estate, the lockers, the FBI office, the credits, after the finale), Help lines, STORY.md rows and connectors, Characters.docx; quest page names keep their digits (Locker 47)
Co-Authored-By: Claude <noreply@anthropic.com>
Claude-Session: https://claude.ai/code/session_01RpWbq89r71C1p9HP7EcbZ5
</commit_message>
<xml_diff>
--- a/docs/Characters.docx
+++ b/docs/Characters.docx
@@ -12255,6 +12255,278 @@
           <w:p>
             <w:r>
               <w:t>sine wave, 220-340 Hz, 14 syllables a second, pauses 0.05 s</w:t>
+            </w:r>
+          </w:p>
+        </w:tc>
+      </w:tr>
+    </w:tbl>
+    <w:p>
+      <w:pPr>
+        <w:pStyle w:val="Heading1"/>
+      </w:pPr>
+      <w:r>
+        <w:t>SPECIAL AGENT REYES  (F)</w:t>
+      </w:r>
+    </w:p>
+    <w:p>
+      <w:r>
+        <w:drawing>
+          <wp:inline xmlns:a="http://schemas.openxmlformats.org/drawingml/2006/main" xmlns:pic="http://schemas.openxmlformats.org/drawingml/2006/picture">
+            <wp:extent cx="936000" cy="1462500"/>
+            <wp:docPr id="136" name="Picture 136"/>
+            <wp:cNvGraphicFramePr>
+              <a:graphicFrameLocks noChangeAspect="1"/>
+            </wp:cNvGraphicFramePr>
+            <a:graphic>
+              <a:graphicData uri="http://schemas.openxmlformats.org/drawingml/2006/picture">
+                <pic:pic>
+                  <pic:nvPicPr>
+                    <pic:cNvPr id="0" name="agent-calm.png"/>
+                    <pic:cNvPicPr/>
+                  </pic:nvPicPr>
+                  <pic:blipFill>
+                    <a:blip r:embed="rId144"/>
+                    <a:stretch>
+                      <a:fillRect/>
+                    </a:stretch>
+                  </pic:blipFill>
+                  <pic:spPr>
+                    <a:xfrm>
+                      <a:off x="0" y="0"/>
+                      <a:ext cx="936000" cy="1462500"/>
+                    </a:xfrm>
+                    <a:prstGeom prst="rect"/>
+                  </pic:spPr>
+                </pic:pic>
+              </a:graphicData>
+            </a:graphic>
+          </wp:inline>
+        </w:drawing>
+      </w:r>
+      <w:r>
+        <w:t xml:space="preserve">  </w:t>
+      </w:r>
+      <w:r>
+        <w:drawing>
+          <wp:inline xmlns:a="http://schemas.openxmlformats.org/drawingml/2006/main" xmlns:pic="http://schemas.openxmlformats.org/drawingml/2006/picture">
+            <wp:extent cx="936000" cy="1462500"/>
+            <wp:docPr id="137" name="Picture 137"/>
+            <wp:cNvGraphicFramePr>
+              <a:graphicFrameLocks noChangeAspect="1"/>
+            </wp:cNvGraphicFramePr>
+            <a:graphic>
+              <a:graphicData uri="http://schemas.openxmlformats.org/drawingml/2006/picture">
+                <pic:pic>
+                  <pic:nvPicPr>
+                    <pic:cNvPr id="0" name="agent-angry.png"/>
+                    <pic:cNvPicPr/>
+                  </pic:nvPicPr>
+                  <pic:blipFill>
+                    <a:blip r:embed="rId145"/>
+                    <a:stretch>
+                      <a:fillRect/>
+                    </a:stretch>
+                  </pic:blipFill>
+                  <pic:spPr>
+                    <a:xfrm>
+                      <a:off x="0" y="0"/>
+                      <a:ext cx="936000" cy="1462500"/>
+                    </a:xfrm>
+                    <a:prstGeom prst="rect"/>
+                  </pic:spPr>
+                </pic:pic>
+              </a:graphicData>
+            </a:graphic>
+          </wp:inline>
+        </w:drawing>
+      </w:r>
+      <w:r>
+        <w:t xml:space="preserve">  </w:t>
+      </w:r>
+      <w:r>
+        <w:drawing>
+          <wp:inline xmlns:a="http://schemas.openxmlformats.org/drawingml/2006/main" xmlns:pic="http://schemas.openxmlformats.org/drawingml/2006/picture">
+            <wp:extent cx="936000" cy="1462500"/>
+            <wp:docPr id="138" name="Picture 138"/>
+            <wp:cNvGraphicFramePr>
+              <a:graphicFrameLocks noChangeAspect="1"/>
+            </wp:cNvGraphicFramePr>
+            <a:graphic>
+              <a:graphicData uri="http://schemas.openxmlformats.org/drawingml/2006/picture">
+                <pic:pic>
+                  <pic:nvPicPr>
+                    <pic:cNvPr id="0" name="agent-smile.png"/>
+                    <pic:cNvPicPr/>
+                  </pic:nvPicPr>
+                  <pic:blipFill>
+                    <a:blip r:embed="rId146"/>
+                    <a:stretch>
+                      <a:fillRect/>
+                    </a:stretch>
+                  </pic:blipFill>
+                  <pic:spPr>
+                    <a:xfrm>
+                      <a:off x="0" y="0"/>
+                      <a:ext cx="936000" cy="1462500"/>
+                    </a:xfrm>
+                    <a:prstGeom prst="rect"/>
+                  </pic:spPr>
+                </pic:pic>
+              </a:graphicData>
+            </a:graphic>
+          </wp:inline>
+        </w:drawing>
+      </w:r>
+      <w:r>
+        <w:t xml:space="preserve">  </w:t>
+      </w:r>
+    </w:p>
+    <w:p>
+      <w:r>
+        <w:rPr>
+          <w:sz w:val="16"/>
+        </w:rPr>
+        <w:t>calm - angry - smiling</w:t>
+      </w:r>
+    </w:p>
+    <w:tbl>
+      <w:tblPr>
+        <w:tblStyle w:val="LightGrid-Accent1"/>
+        <w:tblW w:type="auto" w:w="0"/>
+        <w:tblLook w:firstColumn="1" w:firstRow="1" w:lastColumn="0" w:lastRow="0" w:noHBand="0" w:noVBand="1" w:val="04A0"/>
+      </w:tblPr>
+      <w:tblGrid>
+        <w:gridCol w:w="4320"/>
+        <w:gridCol w:w="4320"/>
+      </w:tblGrid>
+      <w:tr>
+        <w:tc>
+          <w:tcPr>
+            <w:tcW w:type="dxa" w:w="1984"/>
+          </w:tcPr>
+          <w:p>
+            <w:r>
+              <w:t>Who</w:t>
+            </w:r>
+          </w:p>
+        </w:tc>
+        <w:tc>
+          <w:tcPr>
+            <w:tcW w:type="dxa" w:w="7370"/>
+          </w:tcPr>
+          <w:p>
+            <w:r>
+              <w:t>The FBI's special agent in Miravista: by the book, tired of Crane's lawyers. With Choice 4's FBI way, her agents fight at the estate's gate (M29) and make the arrest (M30).</w:t>
+            </w:r>
+          </w:p>
+        </w:tc>
+      </w:tr>
+      <w:tr>
+        <w:tc>
+          <w:tcPr>
+            <w:tcW w:type="dxa" w:w="1984"/>
+          </w:tcPr>
+          <w:p>
+            <w:r>
+              <w:t>Looks</w:t>
+            </w:r>
+          </w:p>
+        </w:tc>
+        <w:tc>
+          <w:tcPr>
+            <w:tcW w:type="dxa" w:w="7370"/>
+          </w:tcPr>
+          <w:p>
+            <w:r>
+              <w:t>Forties, black hair pulled back, aviator shades, a navy FBI windbreaker over a grey suit.</w:t>
+            </w:r>
+          </w:p>
+        </w:tc>
+      </w:tr>
+      <w:tr>
+        <w:tc>
+          <w:tcPr>
+            <w:tcW w:type="dxa" w:w="1984"/>
+          </w:tcPr>
+          <w:p>
+            <w:r>
+              <w:t>Bubble colour</w:t>
+            </w:r>
+          </w:p>
+        </w:tc>
+        <w:tc>
+          <w:tcPr>
+            <w:tcW w:type="dxa" w:w="7370"/>
+          </w:tcPr>
+          <w:p>
+            <w:r>
+              <w:t>#4a7ad8</w:t>
+            </w:r>
+          </w:p>
+        </w:tc>
+      </w:tr>
+      <w:tr>
+        <w:tc>
+          <w:tcPr>
+            <w:tcW w:type="dxa" w:w="1984"/>
+          </w:tcPr>
+          <w:p>
+            <w:r>
+              <w:t>In the city</w:t>
+            </w:r>
+          </w:p>
+        </w:tc>
+        <w:tc>
+          <w:tcPr>
+            <w:tcW w:type="dxa" w:w="7370"/>
+          </w:tcPr>
+          <w:p>
+            <w:r>
+              <w:t>shirt #2a3a6a, trousers #3a3d47</w:t>
+            </w:r>
+          </w:p>
+        </w:tc>
+      </w:tr>
+      <w:tr>
+        <w:tc>
+          <w:tcPr>
+            <w:tcW w:type="dxa" w:w="1984"/>
+          </w:tcPr>
+          <w:p>
+            <w:r>
+              <w:t>Portrait recipe</w:t>
+            </w:r>
+          </w:p>
+        </w:tc>
+        <w:tc>
+          <w:tcPr>
+            <w:tcW w:type="dxa" w:w="7370"/>
+          </w:tcPr>
+          <w:p>
+            <w:r>
+              <w:t>skin #c8946a; hair #1a1414 (pulled); facial hair: none; eyes #4a3a2a; hat: none; glasses: shades; top: windbreaker (#2a3a6a / #f4d23f); extras: none; mid, slim build</w:t>
+            </w:r>
+          </w:p>
+        </w:tc>
+      </w:tr>
+      <w:tr>
+        <w:tc>
+          <w:tcPr>
+            <w:tcW w:type="dxa" w:w="1984"/>
+          </w:tcPr>
+          <w:p>
+            <w:r>
+              <w:t>Mumble</w:t>
+            </w:r>
+          </w:p>
+        </w:tc>
+        <w:tc>
+          <w:tcPr>
+            <w:tcW w:type="dxa" w:w="7370"/>
+          </w:tcPr>
+          <w:p>
+            <w:r>
+              <w:t>square wave, 130-190 Hz, 10 syllables a second, pauses 0.08 s</w:t>
             </w:r>
           </w:p>
         </w:tc>

</xml_diff>